<commit_message>
Pridaný kód firmwaru + úpravy schéma a DPS s anglickým prekladom.
</commit_message>
<xml_diff>
--- a/docs/prirucka.docx
+++ b/docs/prirucka.docx
@@ -248,17 +248,15 @@
     <w:p>
       <w:pPr>
         <w:rPr>
+          <w:lang w:val="cs-CZ"/>
+        </w:rPr>
+      </w:pPr>
+      <w:r>
+        <w:rPr>
           <w:b/>
           <w:bCs/>
           <w:lang w:val="cs-CZ"/>
         </w:rPr>
-      </w:pPr>
-      <w:r>
-        <w:rPr>
-          <w:b/>
-          <w:bCs/>
-          <w:lang w:val="cs-CZ"/>
-        </w:rPr>
         <w:br/>
         <w:t>Spolupracovali</w:t>
       </w:r>
@@ -343,6 +341,21 @@
           <w:lang w:val="cs-CZ"/>
         </w:rPr>
         <w:br/>
+        <w:t xml:space="preserve">- Jozef </w:t>
+      </w:r>
+      <w:proofErr w:type="spellStart"/>
+      <w:r>
+        <w:rPr>
+          <w:lang w:val="cs-CZ"/>
+        </w:rPr>
+        <w:t>Hroš</w:t>
+      </w:r>
+      <w:proofErr w:type="spellEnd"/>
+      <w:r>
+        <w:rPr>
+          <w:lang w:val="cs-CZ"/>
+        </w:rPr>
+        <w:br/>
         <w:t xml:space="preserve">- </w:t>
       </w:r>
       <w:proofErr w:type="spellStart"/>
@@ -433,6 +446,20 @@
           <w:lang w:val="cs-CZ"/>
         </w:rPr>
         <w:t>Dragúň</w:t>
+      </w:r>
+      <w:proofErr w:type="spellEnd"/>
+      <w:r>
+        <w:rPr>
+          <w:lang w:val="cs-CZ"/>
+        </w:rPr>
+        <w:t xml:space="preserve">, Ing. Dušan </w:t>
+      </w:r>
+      <w:proofErr w:type="spellStart"/>
+      <w:r>
+        <w:rPr>
+          <w:lang w:val="cs-CZ"/>
+        </w:rPr>
+        <w:t>Šrenkel</w:t>
       </w:r>
       <w:proofErr w:type="spellEnd"/>
       <w:r>
@@ -565,6 +592,12 @@
           <w:lang w:val="cs-CZ"/>
         </w:rPr>
         <w:t>, Techfun.sk</w:t>
+      </w:r>
+      <w:r>
+        <w:rPr>
+          <w:lang w:val="cs-CZ"/>
+        </w:rPr>
+        <w:t>, tomshardware.sk</w:t>
       </w:r>
       <w:r>
         <w:rPr>

</xml_diff>

<commit_message>
Zase po dlhej dobe nejaký zálohovací commit.
</commit_message>
<xml_diff>
--- a/docs/prirucka.docx
+++ b/docs/prirucka.docx
@@ -6,42 +6,172 @@
       <w:pPr>
         <w:jc w:val="center"/>
         <w:rPr>
+          <w:rFonts w:ascii="Courier New" w:hAnsi="Courier New" w:cs="Courier New"/>
           <w:b/>
           <w:bCs/>
           <w:sz w:val="48"/>
           <w:szCs w:val="48"/>
-          <w:lang w:val="cs-CZ"/>
-        </w:rPr>
-      </w:pPr>
-      <w:proofErr w:type="spellStart"/>
-      <w:r>
-        <w:rPr>
+        </w:rPr>
+      </w:pPr>
+    </w:p>
+    <w:p>
+      <w:pPr>
+        <w:jc w:val="right"/>
+        <w:rPr>
+          <w:rFonts w:ascii="Courier New" w:hAnsi="Courier New" w:cs="Courier New"/>
+          <w:b/>
+          <w:bCs/>
+          <w:i/>
+          <w:iCs/>
+          <w:sz w:val="72"/>
+          <w:szCs w:val="72"/>
+        </w:rPr>
+      </w:pPr>
+      <w:r>
+        <w:rPr>
+          <w:rFonts w:ascii="Courier New" w:hAnsi="Courier New" w:cs="Courier New"/>
+          <w:b/>
+          <w:bCs/>
+          <w:noProof/>
+          <w:sz w:val="48"/>
+          <w:szCs w:val="48"/>
+        </w:rPr>
+        <w:drawing>
+          <wp:anchor distT="0" distB="0" distL="114300" distR="114300" simplePos="0" relativeHeight="251658240" behindDoc="1" locked="0" layoutInCell="1" allowOverlap="1" wp14:anchorId="1E3E3FDF" wp14:editId="68EE810E">
+            <wp:simplePos x="0" y="0"/>
+            <wp:positionH relativeFrom="column">
+              <wp:posOffset>509905</wp:posOffset>
+            </wp:positionH>
+            <wp:positionV relativeFrom="paragraph">
+              <wp:posOffset>598805</wp:posOffset>
+            </wp:positionV>
+            <wp:extent cx="4762500" cy="4762500"/>
+            <wp:effectExtent l="0" t="0" r="0" b="0"/>
+            <wp:wrapTopAndBottom/>
+            <wp:docPr id="1648837134" name="Obrázek 2"/>
+            <wp:cNvGraphicFramePr>
+              <a:graphicFrameLocks xmlns:a="http://schemas.openxmlformats.org/drawingml/2006/main" noChangeAspect="1"/>
+            </wp:cNvGraphicFramePr>
+            <a:graphic xmlns:a="http://schemas.openxmlformats.org/drawingml/2006/main">
+              <a:graphicData uri="http://schemas.openxmlformats.org/drawingml/2006/picture">
+                <pic:pic xmlns:pic="http://schemas.openxmlformats.org/drawingml/2006/picture">
+                  <pic:nvPicPr>
+                    <pic:cNvPr id="1648837134" name="Obrázek 1648837134"/>
+                    <pic:cNvPicPr/>
+                  </pic:nvPicPr>
+                  <pic:blipFill>
+                    <a:blip r:embed="rId6">
+                      <a:extLst>
+                        <a:ext uri="{28A0092B-C50C-407E-A947-70E740481C1C}">
+                          <a14:useLocalDpi xmlns:a14="http://schemas.microsoft.com/office/drawing/2010/main" val="0"/>
+                        </a:ext>
+                      </a:extLst>
+                    </a:blip>
+                    <a:stretch>
+                      <a:fillRect/>
+                    </a:stretch>
+                  </pic:blipFill>
+                  <pic:spPr>
+                    <a:xfrm>
+                      <a:off x="0" y="0"/>
+                      <a:ext cx="4762500" cy="4762500"/>
+                    </a:xfrm>
+                    <a:prstGeom prst="rect">
+                      <a:avLst/>
+                    </a:prstGeom>
+                  </pic:spPr>
+                </pic:pic>
+              </a:graphicData>
+            </a:graphic>
+          </wp:anchor>
+        </w:drawing>
+      </w:r>
+      <w:r>
+        <w:rPr>
+          <w:rFonts w:ascii="Courier New" w:hAnsi="Courier New" w:cs="Courier New"/>
+          <w:b/>
+          <w:bCs/>
+          <w:sz w:val="72"/>
+          <w:szCs w:val="72"/>
+        </w:rPr>
+        <w:br/>
+      </w:r>
+    </w:p>
+    <w:p>
+      <w:pPr>
+        <w:jc w:val="center"/>
+        <w:rPr>
+          <w:rFonts w:ascii="Courier New" w:hAnsi="Courier New" w:cs="Courier New"/>
+          <w:b/>
+          <w:bCs/>
+          <w:sz w:val="72"/>
+          <w:szCs w:val="72"/>
+        </w:rPr>
+      </w:pPr>
+      <w:r>
+        <w:rPr>
+          <w:rFonts w:ascii="Courier New" w:hAnsi="Courier New" w:cs="Courier New"/>
+          <w:b/>
+          <w:bCs/>
+          <w:i/>
+          <w:iCs/>
+          <w:sz w:val="72"/>
+          <w:szCs w:val="72"/>
+        </w:rPr>
+        <w:t>Návod k obsluhe</w:t>
+      </w:r>
+      <w:r>
+        <w:rPr>
+          <w:rFonts w:ascii="Courier New" w:hAnsi="Courier New" w:cs="Courier New"/>
+          <w:b/>
+          <w:bCs/>
+          <w:sz w:val="72"/>
+          <w:szCs w:val="72"/>
+        </w:rPr>
+        <w:br w:type="page"/>
+      </w:r>
+    </w:p>
+    <w:p>
+      <w:pPr>
+        <w:jc w:val="center"/>
+        <w:rPr>
+          <w:rFonts w:ascii="Courier New" w:hAnsi="Courier New" w:cs="Courier New"/>
           <w:b/>
           <w:bCs/>
           <w:sz w:val="48"/>
           <w:szCs w:val="48"/>
-          <w:lang w:val="cs-CZ"/>
-        </w:rPr>
-        <w:t>Numeri</w:t>
-      </w:r>
-      <w:proofErr w:type="spellEnd"/>
-      <w:r>
-        <w:rPr>
+        </w:rPr>
+      </w:pPr>
+      <w:proofErr w:type="spellStart"/>
+      <w:r>
+        <w:rPr>
+          <w:rFonts w:ascii="Courier New" w:hAnsi="Courier New" w:cs="Courier New"/>
           <w:b/>
           <w:bCs/>
           <w:sz w:val="48"/>
           <w:szCs w:val="48"/>
-          <w:lang w:val="cs-CZ"/>
-        </w:rPr>
-        <w:t xml:space="preserve"> </w:t>
-      </w:r>
-      <w:r>
-        <w:rPr>
+        </w:rPr>
+        <w:lastRenderedPageBreak/>
+        <w:t>Numeri</w:t>
+      </w:r>
+      <w:proofErr w:type="spellEnd"/>
+      <w:r>
+        <w:rPr>
+          <w:rFonts w:ascii="Courier New" w:hAnsi="Courier New" w:cs="Courier New"/>
           <w:b/>
           <w:bCs/>
           <w:sz w:val="48"/>
           <w:szCs w:val="48"/>
-          <w:lang w:val="cs-CZ"/>
+        </w:rPr>
+        <w:t xml:space="preserve"> </w:t>
+      </w:r>
+      <w:r>
+        <w:rPr>
+          <w:rFonts w:ascii="Courier New" w:hAnsi="Courier New" w:cs="Courier New"/>
+          <w:b/>
+          <w:bCs/>
+          <w:sz w:val="48"/>
+          <w:szCs w:val="48"/>
         </w:rPr>
         <w:t>13.6.</w:t>
       </w:r>
@@ -49,16 +179,16 @@
     <w:p>
       <w:pPr>
         <w:rPr>
+          <w:rFonts w:ascii="Courier New" w:hAnsi="Courier New" w:cs="Courier New"/>
           <w:b/>
           <w:bCs/>
-          <w:lang w:val="cs-CZ"/>
-        </w:rPr>
-      </w:pPr>
-      <w:r>
-        <w:rPr>
+        </w:rPr>
+      </w:pPr>
+      <w:r>
+        <w:rPr>
+          <w:rFonts w:ascii="Courier New" w:hAnsi="Courier New" w:cs="Courier New"/>
           <w:b/>
           <w:bCs/>
-          <w:lang w:val="cs-CZ"/>
         </w:rPr>
         <w:t>&lt;HISTORIA NUMITRONOV&gt;</w:t>
       </w:r>
@@ -66,12 +196,12 @@
     <w:p>
       <w:pPr>
         <w:rPr>
-          <w:lang w:val="cs-CZ"/>
-        </w:rPr>
-      </w:pPr>
-      <w:r>
-        <w:rPr>
-          <w:lang w:val="cs-CZ"/>
+          <w:rFonts w:ascii="Courier New" w:hAnsi="Courier New" w:cs="Courier New"/>
+        </w:rPr>
+      </w:pPr>
+      <w:r>
+        <w:rPr>
+          <w:rFonts w:ascii="Courier New" w:hAnsi="Courier New" w:cs="Courier New"/>
         </w:rPr>
         <w:t>&lt;OVLÁDANIE&gt;</w:t>
       </w:r>
@@ -79,99 +209,101 @@
     <w:p>
       <w:pPr>
         <w:rPr>
+          <w:rFonts w:ascii="Courier New" w:hAnsi="Courier New" w:cs="Courier New"/>
+        </w:rPr>
+      </w:pPr>
+      <w:r>
+        <w:rPr>
+          <w:rFonts w:ascii="Courier New" w:hAnsi="Courier New" w:cs="Courier New"/>
           <w:b/>
           <w:bCs/>
-          <w:lang w:val="cs-CZ"/>
-        </w:rPr>
-      </w:pPr>
-      <w:proofErr w:type="spellStart"/>
-      <w:r>
-        <w:rPr>
+        </w:rPr>
+        <w:t>Firmvér</w:t>
+      </w:r>
+      <w:r>
+        <w:rPr>
+          <w:rFonts w:ascii="Courier New" w:hAnsi="Courier New" w:cs="Courier New"/>
+        </w:rPr>
+        <w:br/>
+        <w:t xml:space="preserve">Hodiny sú riadené čipom </w:t>
+      </w:r>
+      <w:r>
+        <w:rPr>
+          <w:rFonts w:ascii="Courier New" w:hAnsi="Courier New" w:cs="Courier New"/>
+        </w:rPr>
+        <w:t xml:space="preserve">ATmega328-P </w:t>
+      </w:r>
+      <w:r>
+        <w:rPr>
+          <w:rFonts w:ascii="Courier New" w:hAnsi="Courier New" w:cs="Courier New"/>
+        </w:rPr>
+        <w:t>s </w:t>
+      </w:r>
+      <w:r>
+        <w:rPr>
+          <w:rFonts w:ascii="Courier New" w:hAnsi="Courier New" w:cs="Courier New"/>
+        </w:rPr>
+        <w:t>p</w:t>
+      </w:r>
+      <w:r>
+        <w:rPr>
+          <w:rFonts w:ascii="Courier New" w:hAnsi="Courier New" w:cs="Courier New"/>
+        </w:rPr>
+        <w:t>r</w:t>
+      </w:r>
+      <w:r>
+        <w:rPr>
+          <w:rFonts w:ascii="Courier New" w:hAnsi="Courier New" w:cs="Courier New"/>
+        </w:rPr>
+        <w:t>edin</w:t>
+      </w:r>
+      <w:r>
+        <w:rPr>
+          <w:rFonts w:ascii="Courier New" w:hAnsi="Courier New" w:cs="Courier New"/>
+        </w:rPr>
+        <w:t>š</w:t>
+      </w:r>
+      <w:r>
+        <w:rPr>
+          <w:rFonts w:ascii="Courier New" w:hAnsi="Courier New" w:cs="Courier New"/>
+        </w:rPr>
+        <w:t>talovaným</w:t>
+      </w:r>
+      <w:r>
+        <w:rPr>
+          <w:rFonts w:ascii="Courier New" w:hAnsi="Courier New" w:cs="Courier New"/>
+        </w:rPr>
+        <w:t xml:space="preserve"> firmvérom KRONOS II</w:t>
+      </w:r>
+      <w:r>
+        <w:rPr>
+          <w:rFonts w:ascii="Courier New" w:hAnsi="Courier New" w:cs="Courier New"/>
           <w:b/>
           <w:bCs/>
-          <w:lang w:val="cs-CZ"/>
-        </w:rPr>
-        <w:t>Firmvér</w:t>
-      </w:r>
-      <w:proofErr w:type="spellEnd"/>
-      <w:r>
-        <w:rPr>
-          <w:lang w:val="cs-CZ"/>
         </w:rPr>
         <w:br/>
-        <w:t xml:space="preserve">Hodiny sú </w:t>
-      </w:r>
-      <w:proofErr w:type="spellStart"/>
-      <w:r>
-        <w:rPr>
-          <w:lang w:val="cs-CZ"/>
-        </w:rPr>
-        <w:t>riadené</w:t>
-      </w:r>
-      <w:proofErr w:type="spellEnd"/>
-      <w:r>
-        <w:rPr>
-          <w:lang w:val="cs-CZ"/>
-        </w:rPr>
-        <w:t xml:space="preserve"> </w:t>
-      </w:r>
-      <w:proofErr w:type="spellStart"/>
-      <w:r>
-        <w:rPr>
-          <w:lang w:val="cs-CZ"/>
-        </w:rPr>
-        <w:t>čipom</w:t>
-      </w:r>
-      <w:proofErr w:type="spellEnd"/>
-      <w:r>
-        <w:rPr>
-          <w:lang w:val="cs-CZ"/>
-        </w:rPr>
-        <w:t xml:space="preserve"> ATtiny24</w:t>
-      </w:r>
-      <w:r>
-        <w:rPr>
-          <w:lang w:val="cs-CZ"/>
-        </w:rPr>
-        <w:t>-PU</w:t>
-      </w:r>
-      <w:r>
-        <w:rPr>
-          <w:lang w:val="cs-CZ"/>
-        </w:rPr>
-        <w:t xml:space="preserve"> s </w:t>
-      </w:r>
-      <w:r>
-        <w:rPr>
-          <w:lang w:val="cs-CZ"/>
-        </w:rPr>
-        <w:t>předinstalovaným</w:t>
-      </w:r>
-      <w:r>
-        <w:rPr>
-          <w:lang w:val="cs-CZ"/>
-        </w:rPr>
-        <w:t xml:space="preserve"> </w:t>
-      </w:r>
-      <w:proofErr w:type="spellStart"/>
-      <w:r>
-        <w:rPr>
-          <w:lang w:val="cs-CZ"/>
-        </w:rPr>
-        <w:t>firmvérom</w:t>
-      </w:r>
-      <w:proofErr w:type="spellEnd"/>
-      <w:r>
-        <w:rPr>
-          <w:lang w:val="cs-CZ"/>
-        </w:rPr>
-        <w:t xml:space="preserve"> KRONOS II</w:t>
-      </w:r>
-      <w:r>
-        <w:rPr>
+      </w:r>
+      <w:r>
+        <w:rPr>
+          <w:rFonts w:ascii="Courier New" w:hAnsi="Courier New" w:cs="Courier New"/>
           <w:b/>
           <w:bCs/>
-          <w:lang w:val="cs-CZ"/>
+        </w:rPr>
+        <w:br/>
+        <w:t>Programovanie</w:t>
+      </w:r>
+      <w:r>
+        <w:rPr>
+          <w:rFonts w:ascii="Courier New" w:hAnsi="Courier New" w:cs="Courier New"/>
+        </w:rPr>
+        <w:br/>
+        <w:t>Hodiny je možné v prípade potreby preinštalovať pomocou zabudovanej ICSP zbernice na doske hodín...</w:t>
+      </w:r>
+      <w:r>
+        <w:rPr>
+          <w:rFonts w:ascii="Courier New" w:hAnsi="Courier New" w:cs="Courier New"/>
+          <w:b/>
+          <w:bCs/>
         </w:rPr>
         <w:br/>
       </w:r>
@@ -179,486 +311,470 @@
     <w:p>
       <w:pPr>
         <w:rPr>
-          <w:lang w:val="cs-CZ"/>
-        </w:rPr>
-      </w:pPr>
-      <w:r>
-        <w:rPr>
-          <w:lang w:val="cs-CZ"/>
-        </w:rPr>
-        <w:t>V </w:t>
-      </w:r>
-      <w:proofErr w:type="spellStart"/>
-      <w:r>
-        <w:rPr>
-          <w:lang w:val="cs-CZ"/>
-        </w:rPr>
-        <w:t>prípade</w:t>
-      </w:r>
-      <w:proofErr w:type="spellEnd"/>
-      <w:r>
-        <w:rPr>
-          <w:lang w:val="cs-CZ"/>
-        </w:rPr>
-        <w:t xml:space="preserve"> poruchy </w:t>
-      </w:r>
-      <w:proofErr w:type="spellStart"/>
-      <w:r>
-        <w:rPr>
-          <w:lang w:val="cs-CZ"/>
-        </w:rPr>
-        <w:t>volajte</w:t>
-      </w:r>
-      <w:proofErr w:type="spellEnd"/>
-      <w:r>
-        <w:rPr>
-          <w:lang w:val="cs-CZ"/>
-        </w:rPr>
-        <w:t xml:space="preserve"> na tel. číslo +421 950 368 559 </w:t>
-      </w:r>
-      <w:proofErr w:type="spellStart"/>
-      <w:r>
-        <w:rPr>
-          <w:lang w:val="cs-CZ"/>
-        </w:rPr>
-        <w:t>alebo</w:t>
-      </w:r>
-      <w:proofErr w:type="spellEnd"/>
-      <w:r>
-        <w:rPr>
-          <w:lang w:val="cs-CZ"/>
-        </w:rPr>
-        <w:t xml:space="preserve"> navštivte </w:t>
-      </w:r>
-      <w:proofErr w:type="spellStart"/>
-      <w:r>
-        <w:rPr>
-          <w:lang w:val="cs-CZ"/>
-        </w:rPr>
-        <w:t>našu</w:t>
-      </w:r>
-      <w:proofErr w:type="spellEnd"/>
-      <w:r>
-        <w:rPr>
-          <w:lang w:val="cs-CZ"/>
-        </w:rPr>
-        <w:t xml:space="preserve"> pobočku v Korni.</w:t>
+          <w:rFonts w:ascii="Courier New" w:hAnsi="Courier New" w:cs="Courier New"/>
+          <w:b/>
+          <w:bCs/>
+        </w:rPr>
+      </w:pPr>
+      <w:r>
+        <w:rPr>
+          <w:rFonts w:ascii="Courier New" w:hAnsi="Courier New" w:cs="Courier New"/>
+          <w:b/>
+          <w:bCs/>
+        </w:rPr>
+        <w:t>Diagnostika problémov</w:t>
       </w:r>
     </w:p>
     <w:p>
       <w:pPr>
-        <w:rPr>
-          <w:lang w:val="cs-CZ"/>
-        </w:rPr>
-      </w:pPr>
-      <w:r>
-        <w:rPr>
+        <w:pStyle w:val="Odstavecseseznamem"/>
+        <w:numPr>
+          <w:ilvl w:val="0"/>
+          <w:numId w:val="3"/>
+        </w:numPr>
+        <w:rPr>
+          <w:rFonts w:ascii="Courier New" w:hAnsi="Courier New" w:cs="Courier New"/>
+        </w:rPr>
+      </w:pPr>
+      <w:r>
+        <w:rPr>
+          <w:rFonts w:ascii="Courier New" w:hAnsi="Courier New" w:cs="Courier New"/>
+        </w:rPr>
+        <w:t>Batéria</w:t>
+      </w:r>
+    </w:p>
+    <w:p>
+      <w:pPr>
+        <w:pStyle w:val="Odstavecseseznamem"/>
+        <w:numPr>
+          <w:ilvl w:val="0"/>
+          <w:numId w:val="3"/>
+        </w:numPr>
+        <w:rPr>
+          <w:rFonts w:ascii="Courier New" w:hAnsi="Courier New" w:cs="Courier New"/>
+        </w:rPr>
+      </w:pPr>
+      <w:r>
+        <w:rPr>
+          <w:rFonts w:ascii="Courier New" w:hAnsi="Courier New" w:cs="Courier New"/>
+        </w:rPr>
+        <w:t>Segmenty</w:t>
+      </w:r>
+    </w:p>
+    <w:p>
+      <w:pPr>
+        <w:rPr>
+          <w:rFonts w:ascii="Courier New" w:hAnsi="Courier New" w:cs="Courier New"/>
+        </w:rPr>
+      </w:pPr>
+    </w:p>
+    <w:p>
+      <w:pPr>
+        <w:rPr>
+          <w:rFonts w:ascii="Courier New" w:hAnsi="Courier New" w:cs="Courier New"/>
+        </w:rPr>
+      </w:pPr>
+      <w:r>
+        <w:rPr>
+          <w:rFonts w:ascii="Courier New" w:hAnsi="Courier New" w:cs="Courier New"/>
+        </w:rPr>
+        <w:t xml:space="preserve">Synchronizácia s atómovými hodinami v nemeckom </w:t>
+      </w:r>
+      <w:proofErr w:type="spellStart"/>
+      <w:r>
+        <w:rPr>
+          <w:rFonts w:ascii="Courier New" w:hAnsi="Courier New" w:cs="Courier New"/>
+        </w:rPr>
+        <w:t>Mainflingene</w:t>
+      </w:r>
+      <w:proofErr w:type="spellEnd"/>
+      <w:r>
+        <w:rPr>
+          <w:rFonts w:ascii="Courier New" w:hAnsi="Courier New" w:cs="Courier New"/>
+        </w:rPr>
+        <w:t>,</w:t>
+      </w:r>
+    </w:p>
+    <w:p>
+      <w:pPr>
+        <w:rPr>
+          <w:rFonts w:ascii="Courier New" w:hAnsi="Courier New" w:cs="Courier New"/>
+        </w:rPr>
+      </w:pPr>
+    </w:p>
+    <w:p>
+      <w:pPr>
+        <w:rPr>
+          <w:rFonts w:ascii="Courier New" w:hAnsi="Courier New" w:cs="Courier New"/>
+        </w:rPr>
+      </w:pPr>
+      <w:r>
+        <w:rPr>
+          <w:rFonts w:ascii="Courier New" w:hAnsi="Courier New" w:cs="Courier New"/>
+        </w:rPr>
+        <w:t xml:space="preserve">V prípade poruchy volajte na tel. číslo +421 950 368 559 alebo </w:t>
+      </w:r>
+      <w:r>
+        <w:rPr>
+          <w:rFonts w:ascii="Courier New" w:hAnsi="Courier New" w:cs="Courier New"/>
+        </w:rPr>
+        <w:t>navštívte</w:t>
+      </w:r>
+      <w:r>
+        <w:rPr>
+          <w:rFonts w:ascii="Courier New" w:hAnsi="Courier New" w:cs="Courier New"/>
+        </w:rPr>
+        <w:t xml:space="preserve"> našu pobočku v Korni.</w:t>
+      </w:r>
+    </w:p>
+    <w:p>
+      <w:pPr>
+        <w:rPr>
+          <w:rFonts w:ascii="Courier New" w:hAnsi="Courier New" w:cs="Courier New"/>
+        </w:rPr>
+      </w:pPr>
+      <w:r>
+        <w:rPr>
+          <w:rFonts w:ascii="Courier New" w:hAnsi="Courier New" w:cs="Courier New"/>
           <w:b/>
           <w:bCs/>
-          <w:lang w:val="cs-CZ"/>
         </w:rPr>
         <w:br/>
         <w:t>Spolupracovali</w:t>
       </w:r>
       <w:r>
         <w:rPr>
-          <w:lang w:val="cs-CZ"/>
+          <w:rFonts w:ascii="Courier New" w:hAnsi="Courier New" w:cs="Courier New"/>
         </w:rPr>
         <w:t>:</w:t>
       </w:r>
       <w:r>
         <w:rPr>
-          <w:lang w:val="cs-CZ"/>
+          <w:rFonts w:ascii="Courier New" w:hAnsi="Courier New" w:cs="Courier New"/>
         </w:rPr>
         <w:br/>
       </w:r>
       <w:r>
         <w:rPr>
-          <w:lang w:val="cs-CZ"/>
+          <w:rFonts w:ascii="Courier New" w:hAnsi="Courier New" w:cs="Courier New"/>
         </w:rPr>
         <w:t xml:space="preserve">- </w:t>
       </w:r>
       <w:r>
         <w:rPr>
-          <w:lang w:val="cs-CZ"/>
+          <w:rFonts w:ascii="Courier New" w:hAnsi="Courier New" w:cs="Courier New"/>
         </w:rPr>
         <w:t>Schéma</w:t>
       </w:r>
       <w:r>
         <w:rPr>
-          <w:lang w:val="cs-CZ"/>
+          <w:rFonts w:ascii="Courier New" w:hAnsi="Courier New" w:cs="Courier New"/>
         </w:rPr>
         <w:t>,</w:t>
       </w:r>
       <w:r>
         <w:rPr>
-          <w:lang w:val="cs-CZ"/>
+          <w:rFonts w:ascii="Courier New" w:hAnsi="Courier New" w:cs="Courier New"/>
         </w:rPr>
         <w:t xml:space="preserve"> návrh DPS</w:t>
       </w:r>
       <w:r>
         <w:rPr>
-          <w:lang w:val="cs-CZ"/>
+          <w:rFonts w:ascii="Courier New" w:hAnsi="Courier New" w:cs="Courier New"/>
         </w:rPr>
         <w:t>,</w:t>
       </w:r>
       <w:r>
         <w:rPr>
-          <w:lang w:val="cs-CZ"/>
-        </w:rPr>
-        <w:t xml:space="preserve"> </w:t>
-      </w:r>
-      <w:proofErr w:type="spellStart"/>
-      <w:r>
-        <w:rPr>
-          <w:lang w:val="cs-CZ"/>
-        </w:rPr>
-        <w:t>príručka</w:t>
-      </w:r>
-      <w:proofErr w:type="spellEnd"/>
-      <w:r>
-        <w:rPr>
-          <w:lang w:val="cs-CZ"/>
-        </w:rPr>
-        <w:t xml:space="preserve"> + </w:t>
-      </w:r>
-      <w:proofErr w:type="spellStart"/>
-      <w:r>
-        <w:rPr>
-          <w:lang w:val="cs-CZ"/>
-        </w:rPr>
-        <w:t>firmvér</w:t>
-      </w:r>
-      <w:proofErr w:type="spellEnd"/>
-      <w:r>
-        <w:rPr>
-          <w:lang w:val="cs-CZ"/>
+          <w:rFonts w:ascii="Courier New" w:hAnsi="Courier New" w:cs="Courier New"/>
+        </w:rPr>
+        <w:t xml:space="preserve"> príručka</w:t>
+      </w:r>
+      <w:r>
+        <w:rPr>
+          <w:rFonts w:ascii="Courier New" w:hAnsi="Courier New" w:cs="Courier New"/>
+        </w:rPr>
+        <w:t xml:space="preserve"> + firmvér</w:t>
+      </w:r>
+      <w:r>
+        <w:rPr>
+          <w:rFonts w:ascii="Courier New" w:hAnsi="Courier New" w:cs="Courier New"/>
         </w:rPr>
         <w:t>: Filip Mitka</w:t>
       </w:r>
       <w:r>
         <w:rPr>
-          <w:lang w:val="cs-CZ"/>
-        </w:rPr>
-        <w:br/>
-        <w:t xml:space="preserve">- Jozef </w:t>
-      </w:r>
-      <w:proofErr w:type="spellStart"/>
-      <w:r>
-        <w:rPr>
-          <w:lang w:val="cs-CZ"/>
-        </w:rPr>
-        <w:t>Hroš</w:t>
-      </w:r>
-      <w:proofErr w:type="spellEnd"/>
-      <w:r>
-        <w:rPr>
-          <w:lang w:val="cs-CZ"/>
+          <w:rFonts w:ascii="Courier New" w:hAnsi="Courier New" w:cs="Courier New"/>
         </w:rPr>
         <w:br/>
         <w:t xml:space="preserve">- </w:t>
       </w:r>
+      <w:r>
+        <w:rPr>
+          <w:rFonts w:ascii="Courier New" w:hAnsi="Courier New" w:cs="Courier New"/>
+        </w:rPr>
+        <w:t xml:space="preserve">Projektový manažér: </w:t>
+      </w:r>
+      <w:r>
+        <w:rPr>
+          <w:rFonts w:ascii="Courier New" w:hAnsi="Courier New" w:cs="Courier New"/>
+        </w:rPr>
+        <w:t xml:space="preserve">Jozef </w:t>
+      </w:r>
       <w:proofErr w:type="spellStart"/>
       <w:r>
         <w:rPr>
-          <w:lang w:val="cs-CZ"/>
+          <w:rFonts w:ascii="Courier New" w:hAnsi="Courier New" w:cs="Courier New"/>
+        </w:rPr>
+        <w:t>Hroš</w:t>
+      </w:r>
+      <w:proofErr w:type="spellEnd"/>
+      <w:r>
+        <w:rPr>
+          <w:rFonts w:ascii="Courier New" w:hAnsi="Courier New" w:cs="Courier New"/>
+        </w:rPr>
+        <w:br/>
+        <w:t xml:space="preserve">- </w:t>
+      </w:r>
+      <w:proofErr w:type="spellStart"/>
+      <w:r>
+        <w:rPr>
+          <w:rFonts w:ascii="Courier New" w:hAnsi="Courier New" w:cs="Courier New"/>
         </w:rPr>
         <w:t>Pajkovanie</w:t>
       </w:r>
       <w:proofErr w:type="spellEnd"/>
       <w:r>
         <w:rPr>
-          <w:lang w:val="cs-CZ"/>
+          <w:rFonts w:ascii="Courier New" w:hAnsi="Courier New" w:cs="Courier New"/>
         </w:rPr>
         <w:t xml:space="preserve"> + návrhy: Kristián </w:t>
       </w:r>
       <w:proofErr w:type="spellStart"/>
       <w:r>
         <w:rPr>
-          <w:lang w:val="cs-CZ"/>
+          <w:rFonts w:ascii="Courier New" w:hAnsi="Courier New" w:cs="Courier New"/>
         </w:rPr>
         <w:t>Perďoch</w:t>
       </w:r>
       <w:proofErr w:type="spellEnd"/>
       <w:r>
         <w:rPr>
-          <w:lang w:val="cs-CZ"/>
+          <w:rFonts w:ascii="Courier New" w:hAnsi="Courier New" w:cs="Courier New"/>
         </w:rPr>
         <w:br/>
       </w:r>
       <w:r>
         <w:rPr>
-          <w:lang w:val="cs-CZ"/>
-        </w:rPr>
-        <w:t>- Kritici</w:t>
-      </w:r>
-      <w:r>
-        <w:rPr>
-          <w:lang w:val="cs-CZ"/>
-        </w:rPr>
-        <w:t xml:space="preserve"> </w:t>
+          <w:rFonts w:ascii="Courier New" w:hAnsi="Courier New" w:cs="Courier New"/>
+        </w:rPr>
+        <w:t>-</w:t>
+      </w:r>
+      <w:r>
+        <w:rPr>
+          <w:rFonts w:ascii="Courier New" w:hAnsi="Courier New" w:cs="Courier New"/>
+        </w:rPr>
+        <w:t>Kritika a konzultácie ohľadne hardvéru</w:t>
+      </w:r>
+      <w:r>
+        <w:rPr>
+          <w:rFonts w:ascii="Courier New" w:hAnsi="Courier New" w:cs="Courier New"/>
+        </w:rPr>
+        <w:t xml:space="preserve">: Ing. Viliam </w:t>
       </w:r>
       <w:proofErr w:type="spellStart"/>
       <w:r>
         <w:rPr>
-          <w:lang w:val="cs-CZ"/>
-        </w:rPr>
-        <w:t>schémy</w:t>
+          <w:rFonts w:ascii="Courier New" w:hAnsi="Courier New" w:cs="Courier New"/>
+        </w:rPr>
+        <w:t>Koprda</w:t>
       </w:r>
       <w:proofErr w:type="spellEnd"/>
       <w:r>
         <w:rPr>
-          <w:lang w:val="cs-CZ"/>
-        </w:rPr>
-        <w:t xml:space="preserve">: Ing. Viliam </w:t>
+          <w:rFonts w:ascii="Courier New" w:hAnsi="Courier New" w:cs="Courier New"/>
+        </w:rPr>
+        <w:t xml:space="preserve">, Ing. Dušan </w:t>
       </w:r>
       <w:proofErr w:type="spellStart"/>
       <w:r>
         <w:rPr>
-          <w:lang w:val="cs-CZ"/>
-        </w:rPr>
-        <w:t>Koprda</w:t>
+          <w:rFonts w:ascii="Courier New" w:hAnsi="Courier New" w:cs="Courier New"/>
+        </w:rPr>
+        <w:t>Dragúň</w:t>
       </w:r>
       <w:proofErr w:type="spellEnd"/>
       <w:r>
         <w:rPr>
-          <w:lang w:val="cs-CZ"/>
-        </w:rPr>
-        <w:t xml:space="preserve">, Ing. Ivan </w:t>
+          <w:rFonts w:ascii="Courier New" w:hAnsi="Courier New" w:cs="Courier New"/>
+        </w:rPr>
+        <w:t xml:space="preserve">, Ing. Dušan </w:t>
       </w:r>
       <w:proofErr w:type="spellStart"/>
       <w:r>
         <w:rPr>
-          <w:lang w:val="cs-CZ"/>
-        </w:rPr>
-        <w:t>Hundák</w:t>
+          <w:rFonts w:ascii="Courier New" w:hAnsi="Courier New" w:cs="Courier New"/>
+        </w:rPr>
+        <w:t>Šrenkel</w:t>
       </w:r>
       <w:proofErr w:type="spellEnd"/>
       <w:r>
         <w:rPr>
-          <w:lang w:val="cs-CZ"/>
-        </w:rPr>
-        <w:t xml:space="preserve">, Ing. Dušan </w:t>
-      </w:r>
-      <w:proofErr w:type="spellStart"/>
-      <w:r>
-        <w:rPr>
-          <w:lang w:val="cs-CZ"/>
-        </w:rPr>
-        <w:t>Dragúň</w:t>
-      </w:r>
-      <w:proofErr w:type="spellEnd"/>
-      <w:r>
-        <w:rPr>
-          <w:lang w:val="cs-CZ"/>
-        </w:rPr>
-        <w:t xml:space="preserve">, Ing. Dušan </w:t>
-      </w:r>
-      <w:proofErr w:type="spellStart"/>
-      <w:r>
-        <w:rPr>
-          <w:lang w:val="cs-CZ"/>
-        </w:rPr>
-        <w:t>Šrenkel</w:t>
-      </w:r>
-      <w:proofErr w:type="spellEnd"/>
-      <w:r>
-        <w:rPr>
-          <w:lang w:val="cs-CZ"/>
+          <w:rFonts w:ascii="Courier New" w:hAnsi="Courier New" w:cs="Courier New"/>
         </w:rPr>
         <w:br/>
         <w:t xml:space="preserve">- Kritik </w:t>
       </w:r>
+      <w:r>
+        <w:rPr>
+          <w:rFonts w:ascii="Courier New" w:hAnsi="Courier New" w:cs="Courier New"/>
+        </w:rPr>
+        <w:t xml:space="preserve">a konzultácie ohľadne </w:t>
+      </w:r>
+      <w:r>
+        <w:rPr>
+          <w:rFonts w:ascii="Courier New" w:hAnsi="Courier New" w:cs="Courier New"/>
+        </w:rPr>
+        <w:t xml:space="preserve">firmvéru: Ing. Peter </w:t>
+      </w:r>
       <w:proofErr w:type="spellStart"/>
       <w:r>
         <w:rPr>
-          <w:lang w:val="cs-CZ"/>
-        </w:rPr>
-        <w:t>firmvéru</w:t>
+          <w:rFonts w:ascii="Courier New" w:hAnsi="Courier New" w:cs="Courier New"/>
+        </w:rPr>
+        <w:t>Remiš</w:t>
       </w:r>
       <w:proofErr w:type="spellEnd"/>
       <w:r>
         <w:rPr>
-          <w:lang w:val="cs-CZ"/>
-        </w:rPr>
-        <w:t xml:space="preserve">: Ing. Peter </w:t>
-      </w:r>
-      <w:proofErr w:type="spellStart"/>
-      <w:r>
-        <w:rPr>
-          <w:lang w:val="cs-CZ"/>
-        </w:rPr>
-        <w:t>Remiš</w:t>
-      </w:r>
-      <w:proofErr w:type="spellEnd"/>
-      <w:r>
-        <w:rPr>
-          <w:lang w:val="cs-CZ"/>
+          <w:rFonts w:ascii="Courier New" w:hAnsi="Courier New" w:cs="Courier New"/>
         </w:rPr>
         <w:br/>
         <w:t xml:space="preserve">- </w:t>
       </w:r>
       <w:r>
         <w:rPr>
-          <w:lang w:val="cs-CZ"/>
+          <w:rFonts w:ascii="Courier New" w:hAnsi="Courier New" w:cs="Courier New"/>
         </w:rPr>
         <w:t xml:space="preserve">Manažér marketingu: Šimon </w:t>
       </w:r>
       <w:proofErr w:type="spellStart"/>
       <w:r>
         <w:rPr>
-          <w:lang w:val="cs-CZ"/>
+          <w:rFonts w:ascii="Courier New" w:hAnsi="Courier New" w:cs="Courier New"/>
         </w:rPr>
         <w:t>Šinal</w:t>
       </w:r>
       <w:proofErr w:type="spellEnd"/>
       <w:r>
         <w:rPr>
-          <w:lang w:val="cs-CZ"/>
+          <w:rFonts w:ascii="Courier New" w:hAnsi="Courier New" w:cs="Courier New"/>
         </w:rPr>
         <w:br/>
         <w:t>-</w:t>
       </w:r>
       <w:r>
         <w:rPr>
-          <w:lang w:val="cs-CZ"/>
+          <w:rFonts w:ascii="Courier New" w:hAnsi="Courier New" w:cs="Courier New"/>
         </w:rPr>
         <w:t xml:space="preserve"> Výroba </w:t>
       </w:r>
-      <w:proofErr w:type="spellStart"/>
-      <w:r>
-        <w:rPr>
-          <w:lang w:val="cs-CZ"/>
-        </w:rPr>
-        <w:t>púzdra</w:t>
-      </w:r>
-      <w:proofErr w:type="spellEnd"/>
-      <w:r>
-        <w:rPr>
-          <w:lang w:val="cs-CZ"/>
+      <w:r>
+        <w:rPr>
+          <w:rFonts w:ascii="Courier New" w:hAnsi="Courier New" w:cs="Courier New"/>
+        </w:rPr>
+        <w:t>puzdra</w:t>
+      </w:r>
+      <w:r>
+        <w:rPr>
+          <w:rFonts w:ascii="Courier New" w:hAnsi="Courier New" w:cs="Courier New"/>
         </w:rPr>
         <w:t>: Bartolomej Mikula</w:t>
       </w:r>
       <w:r>
         <w:rPr>
-          <w:lang w:val="cs-CZ"/>
+          <w:rFonts w:ascii="Courier New" w:hAnsi="Courier New" w:cs="Courier New"/>
         </w:rPr>
         <w:br/>
         <w:t>- Biblista a historik na ZSSR: Kristián Straka</w:t>
       </w:r>
       <w:r>
         <w:rPr>
-          <w:lang w:val="cs-CZ"/>
+          <w:rFonts w:ascii="Courier New" w:hAnsi="Courier New" w:cs="Courier New"/>
         </w:rPr>
         <w:br/>
-        <w:t xml:space="preserve">- </w:t>
+        <w:t xml:space="preserve">- Súčiastky: MB </w:t>
       </w:r>
       <w:proofErr w:type="spellStart"/>
       <w:r>
         <w:rPr>
-          <w:lang w:val="cs-CZ"/>
-        </w:rPr>
-        <w:t>Súčiastky</w:t>
+          <w:rFonts w:ascii="Courier New" w:hAnsi="Courier New" w:cs="Courier New"/>
+        </w:rPr>
+        <w:t>Electronic</w:t>
       </w:r>
       <w:proofErr w:type="spellEnd"/>
       <w:r>
         <w:rPr>
-          <w:lang w:val="cs-CZ"/>
-        </w:rPr>
-        <w:t xml:space="preserve">: MB </w:t>
+          <w:rFonts w:ascii="Courier New" w:hAnsi="Courier New" w:cs="Courier New"/>
+        </w:rPr>
+        <w:t xml:space="preserve"> Žilina, </w:t>
+      </w:r>
+      <w:r>
+        <w:rPr>
+          <w:rFonts w:ascii="Courier New" w:hAnsi="Courier New" w:cs="Courier New"/>
+        </w:rPr>
+        <w:t>LM Litoměřice</w:t>
+      </w:r>
+      <w:r>
+        <w:rPr>
+          <w:rFonts w:ascii="Courier New" w:hAnsi="Courier New" w:cs="Courier New"/>
+        </w:rPr>
+        <w:t>, Techfun.sk</w:t>
+      </w:r>
+      <w:r>
+        <w:rPr>
+          <w:rFonts w:ascii="Courier New" w:hAnsi="Courier New" w:cs="Courier New"/>
+        </w:rPr>
+        <w:t>, tomshardware.sk</w:t>
+      </w:r>
+      <w:r>
+        <w:rPr>
+          <w:rFonts w:ascii="Courier New" w:hAnsi="Courier New" w:cs="Courier New"/>
+        </w:rPr>
+        <w:br/>
+        <w:t xml:space="preserve">- Poskytovateľ </w:t>
       </w:r>
       <w:proofErr w:type="spellStart"/>
       <w:r>
         <w:rPr>
-          <w:lang w:val="cs-CZ"/>
-        </w:rPr>
-        <w:t>Electronic</w:t>
+          <w:rFonts w:ascii="Courier New" w:hAnsi="Courier New" w:cs="Courier New"/>
+        </w:rPr>
+        <w:t>numitronov</w:t>
       </w:r>
       <w:proofErr w:type="spellEnd"/>
       <w:r>
         <w:rPr>
-          <w:lang w:val="cs-CZ"/>
-        </w:rPr>
-        <w:t xml:space="preserve"> Žilina, </w:t>
-      </w:r>
-      <w:r>
-        <w:rPr>
-          <w:lang w:val="cs-CZ"/>
-        </w:rPr>
-        <w:t>LM Litoměřice</w:t>
-      </w:r>
-      <w:r>
-        <w:rPr>
-          <w:lang w:val="cs-CZ"/>
-        </w:rPr>
-        <w:t>, Techfun.sk</w:t>
-      </w:r>
-      <w:r>
-        <w:rPr>
-          <w:lang w:val="cs-CZ"/>
-        </w:rPr>
-        <w:t>, tomshardware.sk</w:t>
-      </w:r>
-      <w:r>
-        <w:rPr>
-          <w:lang w:val="cs-CZ"/>
-        </w:rPr>
-        <w:br/>
-        <w:t xml:space="preserve">- </w:t>
+          <w:rFonts w:ascii="Courier New" w:hAnsi="Courier New" w:cs="Courier New"/>
+        </w:rPr>
+        <w:t xml:space="preserve"> a dokumentácie</w:t>
+      </w:r>
+      <w:r>
+        <w:rPr>
+          <w:rFonts w:ascii="Courier New" w:hAnsi="Courier New" w:cs="Courier New"/>
+        </w:rPr>
+        <w:t xml:space="preserve">: Robert </w:t>
       </w:r>
       <w:proofErr w:type="spellStart"/>
       <w:r>
         <w:rPr>
-          <w:lang w:val="cs-CZ"/>
-        </w:rPr>
-        <w:t>Poskytovateľ</w:t>
+          <w:rFonts w:ascii="Courier New" w:hAnsi="Courier New" w:cs="Courier New"/>
+        </w:rPr>
+        <w:t>Ziedins</w:t>
       </w:r>
       <w:proofErr w:type="spellEnd"/>
       <w:r>
         <w:rPr>
-          <w:lang w:val="cs-CZ"/>
-        </w:rPr>
-        <w:t xml:space="preserve"> </w:t>
-      </w:r>
-      <w:proofErr w:type="spellStart"/>
-      <w:r>
-        <w:rPr>
-          <w:lang w:val="cs-CZ"/>
-        </w:rPr>
-        <w:t>numitronov</w:t>
-      </w:r>
-      <w:proofErr w:type="spellEnd"/>
-      <w:r>
-        <w:rPr>
-          <w:lang w:val="cs-CZ"/>
-        </w:rPr>
-        <w:t xml:space="preserve"> a </w:t>
-      </w:r>
-      <w:proofErr w:type="spellStart"/>
-      <w:r>
-        <w:rPr>
-          <w:lang w:val="cs-CZ"/>
-        </w:rPr>
-        <w:t>dokumentácie</w:t>
-      </w:r>
-      <w:proofErr w:type="spellEnd"/>
-      <w:r>
-        <w:rPr>
-          <w:lang w:val="cs-CZ"/>
-        </w:rPr>
-        <w:t xml:space="preserve">: Robert </w:t>
-      </w:r>
-      <w:proofErr w:type="spellStart"/>
-      <w:r>
-        <w:rPr>
-          <w:lang w:val="cs-CZ"/>
-        </w:rPr>
-        <w:t>Ziedins</w:t>
-      </w:r>
-      <w:proofErr w:type="spellEnd"/>
-      <w:r>
-        <w:rPr>
-          <w:lang w:val="cs-CZ"/>
+          <w:rFonts w:ascii="Courier New" w:hAnsi="Courier New" w:cs="Courier New"/>
         </w:rPr>
         <w:t>, Litva</w:t>
       </w:r>
@@ -666,50 +782,29 @@
     <w:p>
       <w:pPr>
         <w:rPr>
-          <w:lang w:val="cs-CZ"/>
+          <w:rFonts w:ascii="Courier New" w:hAnsi="Courier New" w:cs="Courier New"/>
         </w:rPr>
       </w:pPr>
     </w:p>
     <w:p>
       <w:pPr>
         <w:rPr>
-          <w:lang w:val="cs-CZ"/>
+          <w:rFonts w:ascii="Courier New" w:hAnsi="Courier New" w:cs="Courier New"/>
         </w:rPr>
       </w:pPr>
     </w:p>
     <w:p>
       <w:pPr>
         <w:rPr>
-          <w:lang w:val="cs-CZ"/>
-        </w:rPr>
-      </w:pPr>
-      <w:proofErr w:type="spellStart"/>
-      <w:r>
-        <w:rPr>
-          <w:lang w:val="cs-CZ"/>
-        </w:rPr>
-        <w:t>Napísané</w:t>
-      </w:r>
-      <w:proofErr w:type="spellEnd"/>
-      <w:r>
-        <w:rPr>
-          <w:lang w:val="cs-CZ"/>
-        </w:rPr>
-        <w:t xml:space="preserve"> v Korni </w:t>
-      </w:r>
-      <w:proofErr w:type="spellStart"/>
-      <w:r>
-        <w:rPr>
-          <w:lang w:val="cs-CZ"/>
-        </w:rPr>
-        <w:t>dňa</w:t>
-      </w:r>
-      <w:proofErr w:type="spellEnd"/>
-      <w:r>
-        <w:rPr>
-          <w:lang w:val="cs-CZ"/>
-        </w:rPr>
-        <w:t xml:space="preserve"> 15.05.2025</w:t>
+          <w:rFonts w:ascii="Courier New" w:hAnsi="Courier New" w:cs="Courier New"/>
+        </w:rPr>
+      </w:pPr>
+      <w:r>
+        <w:rPr>
+          <w:rFonts w:ascii="Courier New" w:hAnsi="Courier New" w:cs="Courier New"/>
+        </w:rPr>
+        <w:lastRenderedPageBreak/>
+        <w:t>Napísané v Korni dňa 15.05.2025</w:t>
       </w:r>
     </w:p>
     <w:sectPr>
@@ -725,6 +820,118 @@
 <file path=word/numbering.xml><?xml version="1.0" encoding="utf-8"?>
 <w:numbering xmlns:wpc="http://schemas.microsoft.com/office/word/2010/wordprocessingCanvas" xmlns:cx="http://schemas.microsoft.com/office/drawing/2014/chartex" xmlns:cx1="http://schemas.microsoft.com/office/drawing/2015/9/8/chartex" xmlns:cx2="http://schemas.microsoft.com/office/drawing/2015/10/21/chartex" xmlns:cx3="http://schemas.microsoft.com/office/drawing/2016/5/9/chartex" xmlns:cx4="http://schemas.microsoft.com/office/drawing/2016/5/10/chartex" xmlns:cx5="http://schemas.microsoft.com/office/drawing/2016/5/11/chartex" xmlns:cx6="http://schemas.microsoft.com/office/drawing/2016/5/12/chartex" xmlns:cx7="http://schemas.microsoft.com/office/drawing/2016/5/13/chartex" xmlns:cx8="http://schemas.microsoft.com/office/drawing/2016/5/14/chartex" xmlns:mc="http://schemas.openxmlformats.org/markup-compatibility/2006" xmlns:aink="http://schemas.microsoft.com/office/drawing/2016/ink" xmlns:am3d="http://schemas.microsoft.com/office/drawing/2017/model3d" xmlns:o="urn:schemas-microsoft-com:office:office" xmlns:oel="http://schemas.microsoft.com/office/2019/extlst" xmlns:r="http://schemas.openxmlformats.org/officeDocument/2006/relationships" xmlns:m="http://schemas.openxmlformats.org/officeDocument/2006/math" xmlns:v="urn:schemas-microsoft-com:vml" xmlns:wp14="http://schemas.microsoft.com/office/word/2010/wordprocessingDrawing" xmlns:wp="http://schemas.openxmlformats.org/drawingml/2006/wordprocessingDrawing" xmlns:w10="urn:schemas-microsoft-com:office:word" xmlns:w="http://schemas.openxmlformats.org/wordprocessingml/2006/main" xmlns:w14="http://schemas.microsoft.com/office/word/2010/wordml" xmlns:w15="http://schemas.microsoft.com/office/word/2012/wordml" xmlns:w16cex="http://schemas.microsoft.com/office/word/2018/wordml/cex" xmlns:w16cid="http://schemas.microsoft.com/office/word/2016/wordml/cid" xmlns:w16="http://schemas.microsoft.com/office/word/2018/wordml" xmlns:w16du="http://schemas.microsoft.com/office/word/2023/wordml/word16du" xmlns:w16sdtdh="http://schemas.microsoft.com/office/word/2020/wordml/sdtdatahash" xmlns:w16sdtfl="http://schemas.microsoft.com/office/word/2024/wordml/sdtformatlock" xmlns:w16se="http://schemas.microsoft.com/office/word/2015/wordml/symex" xmlns:wpg="http://schemas.microsoft.com/office/word/2010/wordprocessingGroup" xmlns:wpi="http://schemas.microsoft.com/office/word/2010/wordprocessingInk" xmlns:wne="http://schemas.microsoft.com/office/word/2006/wordml" xmlns:wps="http://schemas.microsoft.com/office/word/2010/wordprocessingShape" mc:Ignorable="w14 w15 w16se w16cid w16 w16cex w16sdtdh w16sdtfl w16du wp14">
   <w:abstractNum w:abstractNumId="0" w15:restartNumberingAfterBreak="0">
+    <w:nsid w:val="146F1469"/>
+    <w:multiLevelType w:val="hybridMultilevel"/>
+    <w:tmpl w:val="4FAE5B74"/>
+    <w:lvl w:ilvl="0" w:tplc="806A0634">
+      <w:numFmt w:val="bullet"/>
+      <w:lvlText w:val="-"/>
+      <w:lvlJc w:val="left"/>
+      <w:pPr>
+        <w:ind w:left="720" w:hanging="360"/>
+      </w:pPr>
+      <w:rPr>
+        <w:rFonts w:ascii="Calibri" w:eastAsiaTheme="minorHAnsi" w:hAnsi="Calibri" w:cs="Calibri" w:hint="default"/>
+      </w:rPr>
+    </w:lvl>
+    <w:lvl w:ilvl="1" w:tplc="041B0003" w:tentative="1">
+      <w:start w:val="1"/>
+      <w:numFmt w:val="bullet"/>
+      <w:lvlText w:val="o"/>
+      <w:lvlJc w:val="left"/>
+      <w:pPr>
+        <w:ind w:left="1440" w:hanging="360"/>
+      </w:pPr>
+      <w:rPr>
+        <w:rFonts w:ascii="Courier New" w:hAnsi="Courier New" w:cs="Courier New" w:hint="default"/>
+      </w:rPr>
+    </w:lvl>
+    <w:lvl w:ilvl="2" w:tplc="041B0005" w:tentative="1">
+      <w:start w:val="1"/>
+      <w:numFmt w:val="bullet"/>
+      <w:lvlText w:val=""/>
+      <w:lvlJc w:val="left"/>
+      <w:pPr>
+        <w:ind w:left="2160" w:hanging="360"/>
+      </w:pPr>
+      <w:rPr>
+        <w:rFonts w:ascii="Wingdings" w:hAnsi="Wingdings" w:hint="default"/>
+      </w:rPr>
+    </w:lvl>
+    <w:lvl w:ilvl="3" w:tplc="041B0001" w:tentative="1">
+      <w:start w:val="1"/>
+      <w:numFmt w:val="bullet"/>
+      <w:lvlText w:val=""/>
+      <w:lvlJc w:val="left"/>
+      <w:pPr>
+        <w:ind w:left="2880" w:hanging="360"/>
+      </w:pPr>
+      <w:rPr>
+        <w:rFonts w:ascii="Symbol" w:hAnsi="Symbol" w:hint="default"/>
+      </w:rPr>
+    </w:lvl>
+    <w:lvl w:ilvl="4" w:tplc="041B0003" w:tentative="1">
+      <w:start w:val="1"/>
+      <w:numFmt w:val="bullet"/>
+      <w:lvlText w:val="o"/>
+      <w:lvlJc w:val="left"/>
+      <w:pPr>
+        <w:ind w:left="3600" w:hanging="360"/>
+      </w:pPr>
+      <w:rPr>
+        <w:rFonts w:ascii="Courier New" w:hAnsi="Courier New" w:cs="Courier New" w:hint="default"/>
+      </w:rPr>
+    </w:lvl>
+    <w:lvl w:ilvl="5" w:tplc="041B0005" w:tentative="1">
+      <w:start w:val="1"/>
+      <w:numFmt w:val="bullet"/>
+      <w:lvlText w:val=""/>
+      <w:lvlJc w:val="left"/>
+      <w:pPr>
+        <w:ind w:left="4320" w:hanging="360"/>
+      </w:pPr>
+      <w:rPr>
+        <w:rFonts w:ascii="Wingdings" w:hAnsi="Wingdings" w:hint="default"/>
+      </w:rPr>
+    </w:lvl>
+    <w:lvl w:ilvl="6" w:tplc="041B0001" w:tentative="1">
+      <w:start w:val="1"/>
+      <w:numFmt w:val="bullet"/>
+      <w:lvlText w:val=""/>
+      <w:lvlJc w:val="left"/>
+      <w:pPr>
+        <w:ind w:left="5040" w:hanging="360"/>
+      </w:pPr>
+      <w:rPr>
+        <w:rFonts w:ascii="Symbol" w:hAnsi="Symbol" w:hint="default"/>
+      </w:rPr>
+    </w:lvl>
+    <w:lvl w:ilvl="7" w:tplc="041B0003" w:tentative="1">
+      <w:start w:val="1"/>
+      <w:numFmt w:val="bullet"/>
+      <w:lvlText w:val="o"/>
+      <w:lvlJc w:val="left"/>
+      <w:pPr>
+        <w:ind w:left="5760" w:hanging="360"/>
+      </w:pPr>
+      <w:rPr>
+        <w:rFonts w:ascii="Courier New" w:hAnsi="Courier New" w:cs="Courier New" w:hint="default"/>
+      </w:rPr>
+    </w:lvl>
+    <w:lvl w:ilvl="8" w:tplc="041B0005" w:tentative="1">
+      <w:start w:val="1"/>
+      <w:numFmt w:val="bullet"/>
+      <w:lvlText w:val=""/>
+      <w:lvlJc w:val="left"/>
+      <w:pPr>
+        <w:ind w:left="6480" w:hanging="360"/>
+      </w:pPr>
+      <w:rPr>
+        <w:rFonts w:ascii="Wingdings" w:hAnsi="Wingdings" w:hint="default"/>
+      </w:rPr>
+    </w:lvl>
+  </w:abstractNum>
+  <w:abstractNum w:abstractNumId="1" w15:restartNumberingAfterBreak="0">
     <w:nsid w:val="287D0549"/>
     <w:multiLevelType w:val="hybridMultilevel"/>
     <w:tmpl w:val="FF3099F6"/>
@@ -810,7 +1017,7 @@
       </w:pPr>
     </w:lvl>
   </w:abstractNum>
-  <w:abstractNum w:abstractNumId="1" w15:restartNumberingAfterBreak="0">
+  <w:abstractNum w:abstractNumId="2" w15:restartNumberingAfterBreak="0">
     <w:nsid w:val="42590A7B"/>
     <w:multiLevelType w:val="hybridMultilevel"/>
     <w:tmpl w:val="A364DCF8"/>
@@ -924,9 +1131,12 @@
     </w:lvl>
   </w:abstractNum>
   <w:num w:numId="1" w16cid:durableId="1015428120">
+    <w:abstractNumId w:val="2"/>
+  </w:num>
+  <w:num w:numId="2" w16cid:durableId="999650285">
     <w:abstractNumId w:val="1"/>
   </w:num>
-  <w:num w:numId="2" w16cid:durableId="999650285">
+  <w:num w:numId="3" w16cid:durableId="87315886">
     <w:abstractNumId w:val="0"/>
   </w:num>
 </w:numbering>
@@ -1849,6 +2059,29 @@
       <w:spacing w:val="5"/>
     </w:rPr>
   </w:style>
+  <w:style w:type="character" w:styleId="Hypertextovodkaz">
+    <w:name w:val="Hyperlink"/>
+    <w:basedOn w:val="Standardnpsmoodstavce"/>
+    <w:uiPriority w:val="99"/>
+    <w:unhideWhenUsed/>
+    <w:rsid w:val="00D53DCC"/>
+    <w:rPr>
+      <w:color w:val="0563C1" w:themeColor="hyperlink"/>
+      <w:u w:val="single"/>
+    </w:rPr>
+  </w:style>
+  <w:style w:type="character" w:styleId="Nevyeenzmnka">
+    <w:name w:val="Unresolved Mention"/>
+    <w:basedOn w:val="Standardnpsmoodstavce"/>
+    <w:uiPriority w:val="99"/>
+    <w:semiHidden/>
+    <w:unhideWhenUsed/>
+    <w:rsid w:val="00D53DCC"/>
+    <w:rPr>
+      <w:color w:val="605E5C"/>
+      <w:shd w:val="clear" w:color="auto" w:fill="E1DFDD"/>
+    </w:rPr>
+  </w:style>
 </w:styles>
 </file>
 
@@ -2145,4 +2378,16 @@
     </a:ext>
   </a:extLst>
 </a:theme>
+</file>
+
+<file path=customXml/item1.xml><?xml version="1.0" encoding="utf-8"?>
+<b:Sources xmlns:b="http://schemas.openxmlformats.org/officeDocument/2006/bibliography" xmlns="http://schemas.openxmlformats.org/officeDocument/2006/bibliography" SelectedStyle="\APASixthEditionOfficeOnline.xsl" StyleName="APA" Version="6"/>
+</file>
+
+<file path=customXml/itemProps1.xml><?xml version="1.0" encoding="utf-8"?>
+<ds:datastoreItem xmlns:ds="http://schemas.openxmlformats.org/officeDocument/2006/customXml" ds:itemID="{D81F211E-049D-45EA-8018-6B312E3E0AD2}">
+  <ds:schemaRefs>
+    <ds:schemaRef ds:uri="http://schemas.openxmlformats.org/officeDocument/2006/bibliography"/>
+  </ds:schemaRefs>
+</ds:datastoreItem>
 </file>
</xml_diff>

<commit_message>
Aktualizovaný manuál a nejaké menšie zmeny.
</commit_message>
<xml_diff>
--- a/docs/prirucka.docx
+++ b/docs/prirucka.docx
@@ -173,7 +173,7 @@
           <w:sz w:val="48"/>
           <w:szCs w:val="48"/>
         </w:rPr>
-        <w:t>13.6.</w:t>
+        <w:t>50</w:t>
       </w:r>
     </w:p>
     <w:p>
@@ -231,7 +231,19 @@
         <w:rPr>
           <w:rFonts w:ascii="Courier New" w:hAnsi="Courier New" w:cs="Courier New"/>
         </w:rPr>
-        <w:t xml:space="preserve">ATmega328-P </w:t>
+        <w:t>ATmega328</w:t>
+      </w:r>
+      <w:r>
+        <w:rPr>
+          <w:rFonts w:ascii="Courier New" w:hAnsi="Courier New" w:cs="Courier New"/>
+        </w:rPr>
+        <w:t>P</w:t>
+      </w:r>
+      <w:r>
+        <w:rPr>
+          <w:rFonts w:ascii="Courier New" w:hAnsi="Courier New" w:cs="Courier New"/>
+        </w:rPr>
+        <w:t xml:space="preserve"> </w:t>
       </w:r>
       <w:r>
         <w:rPr>
@@ -273,7 +285,75 @@
         <w:rPr>
           <w:rFonts w:ascii="Courier New" w:hAnsi="Courier New" w:cs="Courier New"/>
         </w:rPr>
-        <w:t xml:space="preserve"> firmvérom KRONOS II</w:t>
+        <w:t xml:space="preserve"> firmvérom KRONOS I</w:t>
+      </w:r>
+      <w:r>
+        <w:rPr>
+          <w:rFonts w:ascii="Courier New" w:hAnsi="Courier New" w:cs="Courier New"/>
+        </w:rPr>
+        <w:t>I, ktorý je možné v prípade potreby preinštalovať pomocou ICSP zbernice osadenej na doske hodín.</w:t>
+      </w:r>
+    </w:p>
+    <w:p>
+      <w:pPr>
+        <w:rPr>
+          <w:rFonts w:ascii="Courier New" w:hAnsi="Courier New" w:cs="Courier New"/>
+        </w:rPr>
+      </w:pPr>
+    </w:p>
+    <w:p>
+      <w:pPr>
+        <w:rPr>
+          <w:rFonts w:ascii="Courier New" w:hAnsi="Courier New" w:cs="Courier New"/>
+          <w:b/>
+          <w:bCs/>
+        </w:rPr>
+      </w:pPr>
+      <w:r>
+        <w:rPr>
+          <w:rFonts w:ascii="Courier New" w:hAnsi="Courier New" w:cs="Courier New"/>
+          <w:b/>
+          <w:bCs/>
+        </w:rPr>
+        <w:t>Manuálne nastavovanie</w:t>
+      </w:r>
+    </w:p>
+    <w:p>
+      <w:pPr>
+        <w:jc w:val="both"/>
+        <w:rPr>
+          <w:rFonts w:ascii="Courier New" w:hAnsi="Courier New" w:cs="Courier New"/>
+        </w:rPr>
+      </w:pPr>
+      <w:r>
+        <w:rPr>
+          <w:rFonts w:ascii="Courier New" w:hAnsi="Courier New" w:cs="Courier New"/>
+        </w:rPr>
+        <w:t>Na zadnej strane hodín sú osadené dve tlačidlá ktorými je možné hodiny nastavovať manuálne. Jedno tlačidlo posúva kurzor a druhé hodnotu na mieste kurzora. Stlačením oboch tlačidiel naraz sa prepína nastavovací režim. Podržaním jedného z tlačidiel sa nastavuje jas.</w:t>
+      </w:r>
+    </w:p>
+    <w:p>
+      <w:pPr>
+        <w:jc w:val="both"/>
+        <w:rPr>
+          <w:rFonts w:ascii="Courier New" w:hAnsi="Courier New" w:cs="Courier New"/>
+        </w:rPr>
+      </w:pPr>
+    </w:p>
+    <w:p>
+      <w:pPr>
+        <w:jc w:val="both"/>
+        <w:rPr>
+          <w:rFonts w:ascii="Courier New" w:hAnsi="Courier New" w:cs="Courier New"/>
+        </w:rPr>
+      </w:pPr>
+      <w:r>
+        <w:rPr>
+          <w:rFonts w:ascii="Courier New" w:hAnsi="Courier New" w:cs="Courier New"/>
+          <w:b/>
+          <w:bCs/>
+        </w:rPr>
+        <w:t>Napájanie</w:t>
       </w:r>
       <w:r>
         <w:rPr>
@@ -286,79 +366,8 @@
       <w:r>
         <w:rPr>
           <w:rFonts w:ascii="Courier New" w:hAnsi="Courier New" w:cs="Courier New"/>
-          <w:b/>
-          <w:bCs/>
-        </w:rPr>
-        <w:br/>
-        <w:t>Programovanie</w:t>
-      </w:r>
-      <w:r>
-        <w:rPr>
-          <w:rFonts w:ascii="Courier New" w:hAnsi="Courier New" w:cs="Courier New"/>
-        </w:rPr>
-        <w:br/>
-        <w:t>Hodiny je možné v prípade potreby preinštalovať pomocou zabudovanej ICSP zbernice na doske hodín...</w:t>
-      </w:r>
-      <w:r>
-        <w:rPr>
-          <w:rFonts w:ascii="Courier New" w:hAnsi="Courier New" w:cs="Courier New"/>
-          <w:b/>
-          <w:bCs/>
-        </w:rPr>
-        <w:br/>
-      </w:r>
-    </w:p>
-    <w:p>
-      <w:pPr>
-        <w:rPr>
-          <w:rFonts w:ascii="Courier New" w:hAnsi="Courier New" w:cs="Courier New"/>
-          <w:b/>
-          <w:bCs/>
-        </w:rPr>
-      </w:pPr>
-      <w:r>
-        <w:rPr>
-          <w:rFonts w:ascii="Courier New" w:hAnsi="Courier New" w:cs="Courier New"/>
-          <w:b/>
-          <w:bCs/>
-        </w:rPr>
-        <w:t>Diagnostika problémov</w:t>
-      </w:r>
-    </w:p>
-    <w:p>
-      <w:pPr>
-        <w:pStyle w:val="Odstavecseseznamem"/>
-        <w:numPr>
-          <w:ilvl w:val="0"/>
-          <w:numId w:val="3"/>
-        </w:numPr>
-        <w:rPr>
-          <w:rFonts w:ascii="Courier New" w:hAnsi="Courier New" w:cs="Courier New"/>
-        </w:rPr>
-      </w:pPr>
-      <w:r>
-        <w:rPr>
-          <w:rFonts w:ascii="Courier New" w:hAnsi="Courier New" w:cs="Courier New"/>
-        </w:rPr>
-        <w:t>Batéria</w:t>
-      </w:r>
-    </w:p>
-    <w:p>
-      <w:pPr>
-        <w:pStyle w:val="Odstavecseseznamem"/>
-        <w:numPr>
-          <w:ilvl w:val="0"/>
-          <w:numId w:val="3"/>
-        </w:numPr>
-        <w:rPr>
-          <w:rFonts w:ascii="Courier New" w:hAnsi="Courier New" w:cs="Courier New"/>
-        </w:rPr>
-      </w:pPr>
-      <w:r>
-        <w:rPr>
-          <w:rFonts w:ascii="Courier New" w:hAnsi="Courier New" w:cs="Courier New"/>
-        </w:rPr>
-        <w:t>Segmenty</w:t>
+        </w:rPr>
+        <w:t>Hodiny sa napájajú zo zdroja s výstupom 5V schopným dodať aspoň 10W. Zdroj by mal byť ideálne spínaný pre čo najnižšiu stratovosť s frekvenciou spínania vyššou ako 77.5 kHz aby sa predišlo rušeniu DCF77 prijímača.</w:t>
       </w:r>
     </w:p>
     <w:p>
@@ -406,6 +415,103 @@
       <w:pPr>
         <w:rPr>
           <w:rFonts w:ascii="Courier New" w:hAnsi="Courier New" w:cs="Courier New"/>
+          <w:b/>
+          <w:bCs/>
+        </w:rPr>
+      </w:pPr>
+      <w:r>
+        <w:rPr>
+          <w:rFonts w:ascii="Courier New" w:hAnsi="Courier New" w:cs="Courier New"/>
+          <w:b/>
+          <w:bCs/>
+        </w:rPr>
+        <w:t>Záložná batéria</w:t>
+      </w:r>
+    </w:p>
+    <w:p>
+      <w:pPr>
+        <w:rPr>
+          <w:rFonts w:ascii="Courier New" w:hAnsi="Courier New" w:cs="Courier New"/>
+        </w:rPr>
+      </w:pPr>
+      <w:r>
+        <w:rPr>
+          <w:rFonts w:ascii="Courier New" w:hAnsi="Courier New" w:cs="Courier New"/>
+        </w:rPr>
+        <w:t xml:space="preserve">Napája elektroniku zodpovednú za udržovanie aktuálneho času po vypojení z el. siete. Pri bežných podmienkach by mala vydržať približne 5 rokov. </w:t>
+      </w:r>
+      <w:r>
+        <w:rPr>
+          <w:rFonts w:ascii="Courier New" w:hAnsi="Courier New" w:cs="Courier New"/>
+        </w:rPr>
+        <w:t>Ak si hodiny nezachovávajú správny čas po vypojení zo siete, batériu je treba vymeniť. Pri výmene použite kvalitnú mincovú batériu CR2032.</w:t>
+      </w:r>
+    </w:p>
+    <w:p>
+      <w:pPr>
+        <w:rPr>
+          <w:rFonts w:ascii="Courier New" w:hAnsi="Courier New" w:cs="Courier New"/>
+        </w:rPr>
+      </w:pPr>
+    </w:p>
+    <w:p>
+      <w:pPr>
+        <w:rPr>
+          <w:rFonts w:ascii="Courier New" w:hAnsi="Courier New" w:cs="Courier New"/>
+          <w:b/>
+          <w:bCs/>
+        </w:rPr>
+      </w:pPr>
+      <w:r>
+        <w:rPr>
+          <w:rFonts w:ascii="Courier New" w:hAnsi="Courier New" w:cs="Courier New"/>
+          <w:b/>
+          <w:bCs/>
+        </w:rPr>
+        <w:t>Poistka</w:t>
+      </w:r>
+    </w:p>
+    <w:p>
+      <w:pPr>
+        <w:rPr>
+          <w:rFonts w:ascii="Courier New" w:hAnsi="Courier New" w:cs="Courier New"/>
+        </w:rPr>
+      </w:pPr>
+      <w:r>
+        <w:rPr>
+          <w:rFonts w:ascii="Courier New" w:hAnsi="Courier New" w:cs="Courier New"/>
+        </w:rPr>
+        <w:t>Hlavná poistka je dimenzovaná tak aby sa vypálila len ak dôjde k závažnej chybe v elektronike hodín. Teda v prípade, že je vypálená, odporúčame problém riešiť servisne.</w:t>
+      </w:r>
+    </w:p>
+    <w:p>
+      <w:pPr>
+        <w:rPr>
+          <w:rFonts w:ascii="Courier New" w:hAnsi="Courier New" w:cs="Courier New"/>
+        </w:rPr>
+      </w:pPr>
+    </w:p>
+    <w:p>
+      <w:pPr>
+        <w:rPr>
+          <w:rFonts w:ascii="Courier New" w:hAnsi="Courier New" w:cs="Courier New"/>
+          <w:b/>
+          <w:bCs/>
+        </w:rPr>
+      </w:pPr>
+      <w:r>
+        <w:rPr>
+          <w:rFonts w:ascii="Courier New" w:hAnsi="Courier New" w:cs="Courier New"/>
+          <w:b/>
+          <w:bCs/>
+        </w:rPr>
+        <w:t>Servis</w:t>
+      </w:r>
+    </w:p>
+    <w:p>
+      <w:pPr>
+        <w:rPr>
+          <w:rFonts w:ascii="Courier New" w:hAnsi="Courier New" w:cs="Courier New"/>
         </w:rPr>
       </w:pPr>
       <w:r>
@@ -431,14 +537,32 @@
       <w:pPr>
         <w:rPr>
           <w:rFonts w:ascii="Courier New" w:hAnsi="Courier New" w:cs="Courier New"/>
-        </w:rPr>
-      </w:pPr>
-      <w:r>
-        <w:rPr>
-          <w:rFonts w:ascii="Courier New" w:hAnsi="Courier New" w:cs="Courier New"/>
-          <w:b/>
-          <w:bCs/>
-        </w:rPr>
+          <w:b/>
+          <w:bCs/>
+        </w:rPr>
+      </w:pPr>
+      <w:r>
+        <w:rPr>
+          <w:rFonts w:ascii="Courier New" w:hAnsi="Courier New" w:cs="Courier New"/>
+          <w:b/>
+          <w:bCs/>
+        </w:rPr>
+        <w:br w:type="page"/>
+      </w:r>
+    </w:p>
+    <w:p>
+      <w:pPr>
+        <w:rPr>
+          <w:rFonts w:ascii="Courier New" w:hAnsi="Courier New" w:cs="Courier New"/>
+        </w:rPr>
+      </w:pPr>
+      <w:r>
+        <w:rPr>
+          <w:rFonts w:ascii="Courier New" w:hAnsi="Courier New" w:cs="Courier New"/>
+          <w:b/>
+          <w:bCs/>
+        </w:rPr>
+        <w:lastRenderedPageBreak/>
         <w:br/>
         <w:t>Spolupracovali</w:t>
       </w:r>
@@ -803,7 +927,6 @@
         <w:rPr>
           <w:rFonts w:ascii="Courier New" w:hAnsi="Courier New" w:cs="Courier New"/>
         </w:rPr>
-        <w:lastRenderedPageBreak/>
         <w:t>Napísané v Korni dňa 15.05.2025</w:t>
       </w:r>
     </w:p>

</xml_diff>

<commit_message>
Nové fotky a úpravy stránky.
</commit_message>
<xml_diff>
--- a/docs/prirucka.docx
+++ b/docs/prirucka.docx
@@ -175,7 +175,14 @@
     <w:sdt>
       <w:sdtPr>
         <w:rPr>
-          <w:lang w:val="cs-CZ"/>
+          <w:rFonts w:eastAsiaTheme="minorHAnsi" w:cstheme="minorBidi"/>
+          <w:b w:val="0"/>
+          <w:color w:val="auto"/>
+          <w:kern w:val="2"/>
+          <w:sz w:val="24"/>
+          <w:szCs w:val="24"/>
+          <w:lang w:val="cs-CZ" w:eastAsia="en-US"/>
+          <w14:ligatures w14:val="standardContextual"/>
         </w:rPr>
         <w:id w:val="1360478617"/>
         <w:docPartObj>
@@ -185,14 +192,7 @@
       </w:sdtPr>
       <w:sdtEndPr>
         <w:rPr>
-          <w:rFonts w:eastAsiaTheme="minorHAnsi" w:cstheme="minorBidi"/>
           <w:bCs/>
-          <w:color w:val="auto"/>
-          <w:kern w:val="2"/>
-          <w:sz w:val="24"/>
-          <w:szCs w:val="24"/>
-          <w:lang w:eastAsia="en-US"/>
-          <w14:ligatures w14:val="standardContextual"/>
         </w:rPr>
       </w:sdtEndPr>
       <w:sdtContent>
@@ -283,7 +283,7 @@
                 <w:noProof/>
                 <w:webHidden/>
               </w:rPr>
-              <w:t>3</w:t>
+              <w:t>5</w:t>
             </w:r>
             <w:r>
               <w:rPr>
@@ -353,7 +353,7 @@
                 <w:noProof/>
                 <w:webHidden/>
               </w:rPr>
-              <w:t>3</w:t>
+              <w:t>5</w:t>
             </w:r>
             <w:r>
               <w:rPr>
@@ -423,7 +423,7 @@
                 <w:noProof/>
                 <w:webHidden/>
               </w:rPr>
-              <w:t>3</w:t>
+              <w:t>5</w:t>
             </w:r>
             <w:r>
               <w:rPr>
@@ -493,7 +493,7 @@
                 <w:noProof/>
                 <w:webHidden/>
               </w:rPr>
-              <w:t>3</w:t>
+              <w:t>5</w:t>
             </w:r>
             <w:r>
               <w:rPr>
@@ -563,7 +563,7 @@
                 <w:noProof/>
                 <w:webHidden/>
               </w:rPr>
-              <w:t>3</w:t>
+              <w:t>5</w:t>
             </w:r>
             <w:r>
               <w:rPr>
@@ -633,7 +633,7 @@
                 <w:noProof/>
                 <w:webHidden/>
               </w:rPr>
-              <w:t>3</w:t>
+              <w:t>6</w:t>
             </w:r>
             <w:r>
               <w:rPr>
@@ -703,7 +703,7 @@
                 <w:noProof/>
                 <w:webHidden/>
               </w:rPr>
-              <w:t>3</w:t>
+              <w:t>6</w:t>
             </w:r>
             <w:r>
               <w:rPr>
@@ -773,7 +773,7 @@
                 <w:noProof/>
                 <w:webHidden/>
               </w:rPr>
-              <w:t>3</w:t>
+              <w:t>7</w:t>
             </w:r>
             <w:r>
               <w:rPr>
@@ -843,7 +843,7 @@
                 <w:noProof/>
                 <w:webHidden/>
               </w:rPr>
-              <w:t>4</w:t>
+              <w:t>8</w:t>
             </w:r>
             <w:r>
               <w:rPr>
@@ -913,7 +913,7 @@
                 <w:noProof/>
                 <w:webHidden/>
               </w:rPr>
-              <w:t>4</w:t>
+              <w:t>8</w:t>
             </w:r>
             <w:r>
               <w:rPr>
@@ -983,7 +983,7 @@
                 <w:noProof/>
                 <w:webHidden/>
               </w:rPr>
-              <w:t>5</w:t>
+              <w:t>9</w:t>
             </w:r>
             <w:r>
               <w:rPr>
@@ -1039,73 +1039,305 @@
           <w:bCs/>
         </w:rPr>
       </w:pPr>
-      <w:bookmarkStart w:id="1" w:name="_Toc206799303"/>
       <w:r>
         <w:rPr>
           <w:rStyle w:val="Nadpis2Char"/>
         </w:rPr>
-        <w:t>&lt;HISTORIA NUMITRONOV&gt;</w:t>
-      </w:r>
-      <w:bookmarkEnd w:id="1"/>
+        <w:t xml:space="preserve">História </w:t>
+      </w:r>
+      <w:proofErr w:type="spellStart"/>
+      <w:r>
+        <w:rPr>
+          <w:rStyle w:val="Nadpis2Char"/>
+        </w:rPr>
+        <w:t>numitronov</w:t>
+      </w:r>
+      <w:proofErr w:type="spellEnd"/>
       <w:r>
         <w:rPr>
           <w:rFonts w:cs="Courier New"/>
           <w:b/>
           <w:bCs/>
         </w:rPr>
+        <w:t xml:space="preserve"> IV-9</w:t>
+      </w:r>
+      <w:r>
+        <w:rPr>
+          <w:rFonts w:cs="Courier New"/>
+          <w:b/>
+          <w:bCs/>
+        </w:rPr>
         <w:br/>
       </w:r>
       <w:r>
         <w:rPr>
           <w:rFonts w:cs="Courier New"/>
         </w:rPr>
-        <w:t>Treba</w:t>
-      </w:r>
-      <w:r>
-        <w:rPr>
-          <w:rFonts w:cs="Courier New"/>
-        </w:rPr>
-        <w:t xml:space="preserve"> dorobiť, že Straka.</w:t>
-      </w:r>
-      <w:r>
-        <w:rPr>
-          <w:rFonts w:cs="Courier New"/>
-        </w:rPr>
-        <w:t>..</w:t>
+        <w:t>TODO</w:t>
+      </w:r>
+      <w:bookmarkStart w:id="1" w:name="_Toc206799304"/>
+    </w:p>
+    <w:bookmarkEnd w:id="1"/>
+    <w:p>
+      <w:pPr>
+        <w:pStyle w:val="Nadpis2"/>
+      </w:pPr>
+      <w:r>
+        <w:t>Ovládanie</w:t>
       </w:r>
     </w:p>
     <w:p>
+      <w:r>
+        <w:t>TODO</w:t>
+      </w:r>
+    </w:p>
+    <w:p/>
+    <w:p>
       <w:pPr>
         <w:pStyle w:val="Nadpis2"/>
       </w:pPr>
-      <w:bookmarkStart w:id="2" w:name="_Toc206799304"/>
-      <w:r>
-        <w:t>&lt;OVLÁDANIE&gt;</w:t>
-      </w:r>
-      <w:bookmarkEnd w:id="2"/>
+      <w:bookmarkStart w:id="2" w:name="_Toc206799305"/>
+      <w:r>
+        <w:t>Nastavenia:</w:t>
+      </w:r>
     </w:p>
     <w:p>
       <w:r>
-        <w:t>Treba dorobiť</w:t>
-      </w:r>
-      <w:r>
-        <w:t>...</w:t>
+        <w:rPr>
+          <w:noProof/>
+        </w:rPr>
+        <mc:AlternateContent>
+          <mc:Choice Requires="wpi">
+            <w:drawing>
+              <wp:anchor distT="0" distB="0" distL="114300" distR="114300" simplePos="0" relativeHeight="251682816" behindDoc="0" locked="0" layoutInCell="1" allowOverlap="1" wp14:anchorId="2C7CA7DB" wp14:editId="10D20E26">
+                <wp:simplePos x="0" y="0"/>
+                <wp:positionH relativeFrom="column">
+                  <wp:posOffset>48895</wp:posOffset>
+                </wp:positionH>
+                <wp:positionV relativeFrom="paragraph">
+                  <wp:posOffset>195580</wp:posOffset>
+                </wp:positionV>
+                <wp:extent cx="723265" cy="728345"/>
+                <wp:effectExtent l="57150" t="57150" r="57785" b="52705"/>
+                <wp:wrapNone/>
+                <wp:docPr id="360315689" name="Rukopis 32"/>
+                <wp:cNvGraphicFramePr/>
+                <a:graphic xmlns:a="http://schemas.openxmlformats.org/drawingml/2006/main">
+                  <a:graphicData uri="http://schemas.microsoft.com/office/word/2010/wordprocessingInk">
+                    <w14:contentPart bwMode="auto" r:id="rId7">
+                      <w14:nvContentPartPr>
+                        <w14:cNvContentPartPr/>
+                      </w14:nvContentPartPr>
+                      <w14:xfrm>
+                        <a:off x="0" y="0"/>
+                        <a:ext cx="723265" cy="728345"/>
+                      </w14:xfrm>
+                    </w14:contentPart>
+                  </a:graphicData>
+                </a:graphic>
+              </wp:anchor>
+            </w:drawing>
+          </mc:Choice>
+          <mc:Fallback>
+            <w:pict>
+              <v:shapetype w14:anchorId="245086E7" id="_x0000_t75" coordsize="21600,21600" o:spt="75" o:preferrelative="t" path="m@4@5l@4@11@9@11@9@5xe" filled="f" stroked="f">
+                <v:stroke joinstyle="miter"/>
+                <v:formulas>
+                  <v:f eqn="if lineDrawn pixelLineWidth 0"/>
+                  <v:f eqn="sum @0 1 0"/>
+                  <v:f eqn="sum 0 0 @1"/>
+                  <v:f eqn="prod @2 1 2"/>
+                  <v:f eqn="prod @3 21600 pixelWidth"/>
+                  <v:f eqn="prod @3 21600 pixelHeight"/>
+                  <v:f eqn="sum @0 0 1"/>
+                  <v:f eqn="prod @6 1 2"/>
+                  <v:f eqn="prod @7 21600 pixelWidth"/>
+                  <v:f eqn="sum @8 21600 0"/>
+                  <v:f eqn="prod @7 21600 pixelHeight"/>
+                  <v:f eqn="sum @10 21600 0"/>
+                </v:formulas>
+                <v:path o:extrusionok="f" gradientshapeok="t" o:connecttype="rect"/>
+                <o:lock v:ext="edit" aspectratio="t"/>
+              </v:shapetype>
+              <v:shape id="Rukopis 32" o:spid="_x0000_s1026" type="#_x0000_t75" style="position:absolute;margin-left:3.15pt;margin-top:14.7pt;width:58.35pt;height:58.75pt;z-index:251682816;visibility:visible;mso-wrap-style:square;mso-wrap-distance-left:9pt;mso-wrap-distance-top:0;mso-wrap-distance-right:9pt;mso-wrap-distance-bottom:0;mso-position-horizontal:absolute;mso-position-horizontal-relative:text;mso-position-vertical:absolute;mso-position-vertical-relative:text" o:gfxdata="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">
+                <v:imagedata r:id="rId8" o:title=""/>
+              </v:shape>
+            </w:pict>
+          </mc:Fallback>
+        </mc:AlternateContent>
+      </w:r>
+      <w:r>
+        <w:rPr>
+          <w:noProof/>
+        </w:rPr>
+        <mc:AlternateContent>
+          <mc:Choice Requires="wpi">
+            <w:drawing>
+              <wp:anchor distT="0" distB="0" distL="114300" distR="114300" simplePos="0" relativeHeight="251669504" behindDoc="0" locked="0" layoutInCell="1" allowOverlap="1" wp14:anchorId="600E4092" wp14:editId="04DC1679">
+                <wp:simplePos x="0" y="0"/>
+                <wp:positionH relativeFrom="column">
+                  <wp:posOffset>227965</wp:posOffset>
+                </wp:positionH>
+                <wp:positionV relativeFrom="paragraph">
+                  <wp:posOffset>255270</wp:posOffset>
+                </wp:positionV>
+                <wp:extent cx="635" cy="446405"/>
+                <wp:effectExtent l="57150" t="57150" r="56515" b="48895"/>
+                <wp:wrapNone/>
+                <wp:docPr id="310120420" name="Rukopis 17"/>
+                <wp:cNvGraphicFramePr/>
+                <a:graphic xmlns:a="http://schemas.openxmlformats.org/drawingml/2006/main">
+                  <a:graphicData uri="http://schemas.microsoft.com/office/word/2010/wordprocessingInk">
+                    <w14:contentPart bwMode="auto" r:id="rId9">
+                      <w14:nvContentPartPr>
+                        <w14:cNvContentPartPr/>
+                      </w14:nvContentPartPr>
+                      <w14:xfrm>
+                        <a:off x="0" y="0"/>
+                        <a:ext cx="635" cy="446405"/>
+                      </w14:xfrm>
+                    </w14:contentPart>
+                  </a:graphicData>
+                </a:graphic>
+                <wp14:sizeRelH relativeFrom="margin">
+                  <wp14:pctWidth>0</wp14:pctWidth>
+                </wp14:sizeRelH>
+                <wp14:sizeRelV relativeFrom="margin">
+                  <wp14:pctHeight>0</wp14:pctHeight>
+                </wp14:sizeRelV>
+              </wp:anchor>
+            </w:drawing>
+          </mc:Choice>
+          <mc:Fallback>
+            <w:pict>
+              <v:shape w14:anchorId="2423784D" id="Rukopis 17" o:spid="_x0000_s1026" type="#_x0000_t75" style="position:absolute;margin-left:16.7pt;margin-top:19.4pt;width:2.5pt;height:36.55pt;z-index:251669504;visibility:visible;mso-wrap-style:square;mso-width-percent:0;mso-height-percent:0;mso-wrap-distance-left:9pt;mso-wrap-distance-top:0;mso-wrap-distance-right:9pt;mso-wrap-distance-bottom:0;mso-position-horizontal:absolute;mso-position-horizontal-relative:text;mso-position-vertical:absolute;mso-position-vertical-relative:text;mso-width-percent:0;mso-height-percent:0;mso-width-relative:margin;mso-height-relative:margin" o:gfxdata="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">
+                <v:imagedata r:id="rId10" o:title=""/>
+              </v:shape>
+            </w:pict>
+          </mc:Fallback>
+        </mc:AlternateContent>
+      </w:r>
+      <w:r>
+        <w:rPr>
+          <w:noProof/>
+        </w:rPr>
+        <mc:AlternateContent>
+          <mc:Choice Requires="wpi">
+            <w:drawing>
+              <wp:anchor distT="0" distB="0" distL="114300" distR="114300" simplePos="0" relativeHeight="251667456" behindDoc="0" locked="0" layoutInCell="1" allowOverlap="1" wp14:anchorId="558F3C6D" wp14:editId="7B687DC8">
+                <wp:simplePos x="0" y="0"/>
+                <wp:positionH relativeFrom="column">
+                  <wp:posOffset>193040</wp:posOffset>
+                </wp:positionH>
+                <wp:positionV relativeFrom="paragraph">
+                  <wp:posOffset>244475</wp:posOffset>
+                </wp:positionV>
+                <wp:extent cx="59725" cy="78105"/>
+                <wp:effectExtent l="57150" t="57150" r="54610" b="55245"/>
+                <wp:wrapNone/>
+                <wp:docPr id="1490805726" name="Rukopis 15"/>
+                <wp:cNvGraphicFramePr/>
+                <a:graphic xmlns:a="http://schemas.openxmlformats.org/drawingml/2006/main">
+                  <a:graphicData uri="http://schemas.microsoft.com/office/word/2010/wordprocessingInk">
+                    <w14:contentPart bwMode="auto" r:id="rId11">
+                      <w14:nvContentPartPr>
+                        <w14:cNvContentPartPr/>
+                      </w14:nvContentPartPr>
+                      <w14:xfrm>
+                        <a:off x="0" y="0"/>
+                        <a:ext cx="59725" cy="78105"/>
+                      </w14:xfrm>
+                    </w14:contentPart>
+                  </a:graphicData>
+                </a:graphic>
+              </wp:anchor>
+            </w:drawing>
+          </mc:Choice>
+          <mc:Fallback>
+            <w:pict>
+              <v:shape w14:anchorId="649EDC2E" id="Rukopis 15" o:spid="_x0000_s1026" type="#_x0000_t75" style="position:absolute;margin-left:14.5pt;margin-top:18.55pt;width:6.1pt;height:7.55pt;z-index:251667456;visibility:visible;mso-wrap-style:square;mso-wrap-distance-left:9pt;mso-wrap-distance-top:0;mso-wrap-distance-right:9pt;mso-wrap-distance-bottom:0;mso-position-horizontal:absolute;mso-position-horizontal-relative:text;mso-position-vertical:absolute;mso-position-vertical-relative:text" o:gfxdata="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">
+                <v:imagedata r:id="rId12" o:title=""/>
+              </v:shape>
+            </w:pict>
+          </mc:Fallback>
+        </mc:AlternateContent>
+      </w:r>
+      <w:r>
+        <w:rPr>
+          <w:noProof/>
+        </w:rPr>
+        <mc:AlternateContent>
+          <mc:Choice Requires="wpi">
+            <w:drawing>
+              <wp:anchor distT="0" distB="0" distL="114300" distR="114300" simplePos="0" relativeHeight="251661312" behindDoc="0" locked="0" layoutInCell="1" allowOverlap="1" wp14:anchorId="06C2F5F2" wp14:editId="72D29301">
+                <wp:simplePos x="0" y="0"/>
+                <wp:positionH relativeFrom="column">
+                  <wp:posOffset>26670</wp:posOffset>
+                </wp:positionH>
+                <wp:positionV relativeFrom="paragraph">
+                  <wp:posOffset>212090</wp:posOffset>
+                </wp:positionV>
+                <wp:extent cx="75145" cy="124460"/>
+                <wp:effectExtent l="57150" t="57150" r="20320" b="46990"/>
+                <wp:wrapNone/>
+                <wp:docPr id="935777902" name="Rukopis 9"/>
+                <wp:cNvGraphicFramePr/>
+                <a:graphic xmlns:a="http://schemas.openxmlformats.org/drawingml/2006/main">
+                  <a:graphicData uri="http://schemas.microsoft.com/office/word/2010/wordprocessingInk">
+                    <w14:contentPart bwMode="auto" r:id="rId13">
+                      <w14:nvContentPartPr>
+                        <w14:cNvContentPartPr/>
+                      </w14:nvContentPartPr>
+                      <w14:xfrm>
+                        <a:off x="0" y="0"/>
+                        <a:ext cx="75145" cy="124460"/>
+                      </w14:xfrm>
+                    </w14:contentPart>
+                  </a:graphicData>
+                </a:graphic>
+              </wp:anchor>
+            </w:drawing>
+          </mc:Choice>
+          <mc:Fallback>
+            <w:pict>
+              <v:shape w14:anchorId="3F255B95" id="Rukopis 9" o:spid="_x0000_s1026" type="#_x0000_t75" style="position:absolute;margin-left:1.4pt;margin-top:16pt;width:7.3pt;height:11.2pt;z-index:251661312;visibility:visible;mso-wrap-style:square;mso-wrap-distance-left:9pt;mso-wrap-distance-top:0;mso-wrap-distance-right:9pt;mso-wrap-distance-bottom:0;mso-position-horizontal:absolute;mso-position-horizontal-relative:text;mso-position-vertical:absolute;mso-position-vertical-relative:text" o:gfxdata="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">
+                <v:imagedata r:id="rId14" o:title=""/>
+              </v:shape>
+            </w:pict>
+          </mc:Fallback>
+        </mc:AlternateContent>
+      </w:r>
+      <w:r>
+        <w:t>1|2|3|4</w:t>
+      </w:r>
+      <w:r>
+        <w:br/>
+        <w:t xml:space="preserve">| | | |- </w:t>
+      </w:r>
+      <w:r>
+        <w:br/>
+        <w:t xml:space="preserve">| | |--- </w:t>
+      </w:r>
+      <w:r>
+        <w:br/>
+        <w:t xml:space="preserve">| |----- [1/0] </w:t>
+      </w:r>
+      <w:r>
+        <w:br/>
+        <w:t xml:space="preserve">| ------ </w:t>
+      </w:r>
+      <w:r>
+        <w:t>2 – 12 hodinový režim, 4 – 24 hodinový režim</w:t>
       </w:r>
     </w:p>
     <w:p>
-      <w:pPr>
-        <w:rPr>
-          <w:rFonts w:cs="Courier New"/>
-        </w:rPr>
-      </w:pPr>
-      <w:bookmarkStart w:id="3" w:name="_Toc206799305"/>
       <w:r>
         <w:rPr>
           <w:rStyle w:val="Nadpis2Char"/>
         </w:rPr>
         <w:t>Firmvér</w:t>
       </w:r>
-      <w:bookmarkEnd w:id="3"/>
+      <w:bookmarkEnd w:id="2"/>
       <w:r>
         <w:rPr>
           <w:rFonts w:cs="Courier New"/>
@@ -1180,22 +1412,30 @@
         <w:t>I, ktorý je možné v prípade potreby preinštalovať pomocou ICSP zbernice osadenej na doske hodín.</w:t>
       </w:r>
     </w:p>
+    <w:p/>
     <w:p>
       <w:pPr>
-        <w:rPr>
-          <w:rFonts w:cs="Courier New"/>
-        </w:rPr>
-      </w:pPr>
+        <w:pStyle w:val="Nadpis2"/>
+      </w:pPr>
+      <w:bookmarkStart w:id="3" w:name="_Toc206799306"/>
+      <w:r>
+        <w:t>Manuálne nastavovanie</w:t>
+      </w:r>
+      <w:bookmarkEnd w:id="3"/>
     </w:p>
     <w:p>
       <w:pPr>
-        <w:pStyle w:val="Nadpis2"/>
-      </w:pPr>
-      <w:bookmarkStart w:id="4" w:name="_Toc206799306"/>
-      <w:r>
-        <w:t>Manuálne nastavovanie</w:t>
-      </w:r>
-      <w:bookmarkEnd w:id="4"/>
+        <w:jc w:val="both"/>
+        <w:rPr>
+          <w:rFonts w:cs="Courier New"/>
+        </w:rPr>
+      </w:pPr>
+      <w:r>
+        <w:rPr>
+          <w:rFonts w:cs="Courier New"/>
+        </w:rPr>
+        <w:t>Na zadnej strane hodín sú osadené dve tlačidlá ktorými je možné hodiny nastavovať manuálne. Jedno tlačidlo posúva kurzor a druhé hodnotu na mieste kurzora. Stlačením oboch tlačidiel naraz sa prepína nastavovací režim. Podržaním jedného z tlačidiel sa nastavuje jas.</w:t>
+      </w:r>
     </w:p>
     <w:p>
       <w:pPr>
@@ -1204,12 +1444,6 @@
           <w:rFonts w:cs="Courier New"/>
         </w:rPr>
       </w:pPr>
-      <w:r>
-        <w:rPr>
-          <w:rFonts w:cs="Courier New"/>
-        </w:rPr>
-        <w:t>Na zadnej strane hodín sú osadené dve tlačidlá ktorými je možné hodiny nastavovať manuálne. Jedno tlačidlo posúva kurzor a druhé hodnotu na mieste kurzora. Stlačením oboch tlačidiel naraz sa prepína nastavovací režim. Podržaním jedného z tlačidiel sa nastavuje jas.</w:t>
-      </w:r>
     </w:p>
     <w:p>
       <w:pPr>
@@ -1218,35 +1452,124 @@
           <w:rFonts w:cs="Courier New"/>
         </w:rPr>
       </w:pPr>
+      <w:bookmarkStart w:id="4" w:name="_Toc206799307"/>
+      <w:r>
+        <w:rPr>
+          <w:rStyle w:val="Nadpis2Char"/>
+        </w:rPr>
+        <w:t>Napájanie</w:t>
+      </w:r>
+      <w:bookmarkEnd w:id="4"/>
+      <w:r>
+        <w:rPr>
+          <w:rFonts w:cs="Courier New"/>
+          <w:b/>
+          <w:bCs/>
+        </w:rPr>
+        <w:br/>
+      </w:r>
+      <w:r>
+        <w:rPr>
+          <w:rFonts w:cs="Courier New"/>
+        </w:rPr>
+        <w:t>Hodiny sa napájajú zo zdroja s výstupom 5V schopným dodať aspoň 10W. Zdroj by mal byť ideálne spínaný pre čo najnižšiu stratovosť s frekvenciou spínania vyššou ako 77.5 kHz aby sa predišlo rušeniu DCF77 prijímača.</w:t>
+      </w:r>
     </w:p>
     <w:p>
       <w:pPr>
-        <w:jc w:val="both"/>
-        <w:rPr>
-          <w:rFonts w:cs="Courier New"/>
-        </w:rPr>
-      </w:pPr>
-      <w:bookmarkStart w:id="5" w:name="_Toc206799307"/>
-      <w:r>
-        <w:rPr>
-          <w:rStyle w:val="Nadpis2Char"/>
-        </w:rPr>
-        <w:t>Napájanie</w:t>
-      </w:r>
-      <w:bookmarkEnd w:id="5"/>
-      <w:r>
+        <w:rPr>
+          <w:rFonts w:cs="Courier New"/>
+        </w:rPr>
+      </w:pPr>
+    </w:p>
+    <w:p>
+      <w:pPr>
         <w:rPr>
           <w:rFonts w:cs="Courier New"/>
           <w:b/>
           <w:bCs/>
         </w:rPr>
+      </w:pPr>
+      <w:bookmarkStart w:id="5" w:name="_Toc206799308"/>
+      <w:r>
+        <w:rPr>
+          <w:rStyle w:val="Nadpis2Char"/>
+        </w:rPr>
+        <w:t>Pr</w:t>
+      </w:r>
+      <w:r>
+        <w:rPr>
+          <w:rStyle w:val="Nadpis2Char"/>
+        </w:rPr>
+        <w:t>i</w:t>
+      </w:r>
+      <w:r>
+        <w:rPr>
+          <w:rStyle w:val="Nadpis2Char"/>
+        </w:rPr>
+        <w:t>j</w:t>
+      </w:r>
+      <w:r>
+        <w:rPr>
+          <w:rStyle w:val="Nadpis2Char"/>
+        </w:rPr>
+        <w:t>í</w:t>
+      </w:r>
+      <w:r>
+        <w:rPr>
+          <w:rStyle w:val="Nadpis2Char"/>
+        </w:rPr>
+        <w:t>mač DCF77</w:t>
+      </w:r>
+      <w:bookmarkEnd w:id="5"/>
+      <w:r>
+        <w:rPr>
+          <w:rFonts w:cs="Courier New"/>
+          <w:b/>
+          <w:bCs/>
+        </w:rPr>
         <w:br/>
       </w:r>
       <w:r>
         <w:rPr>
           <w:rFonts w:cs="Courier New"/>
         </w:rPr>
-        <w:t>Hodiny sa napájajú zo zdroja s výstupom 5V schopným dodať aspoň 10W. Zdroj by mal byť ideálne spínaný pre čo najnižšiu stratovosť s frekvenciou spínania vyššou ako 77.5 kHz aby sa predišlo rušeniu DCF77 prijímača.</w:t>
+        <w:t xml:space="preserve">Synchronizácia s atómovými hodinami v nemeckom </w:t>
+      </w:r>
+      <w:proofErr w:type="spellStart"/>
+      <w:r>
+        <w:rPr>
+          <w:rFonts w:cs="Courier New"/>
+        </w:rPr>
+        <w:t>Mainflingene</w:t>
+      </w:r>
+      <w:proofErr w:type="spellEnd"/>
+      <w:r>
+        <w:rPr>
+          <w:rFonts w:cs="Courier New"/>
+        </w:rPr>
+        <w:t>,</w:t>
+      </w:r>
+      <w:r>
+        <w:rPr>
+          <w:rFonts w:cs="Courier New"/>
+          <w:b/>
+          <w:bCs/>
+        </w:rPr>
+        <w:br/>
+      </w:r>
+      <w:r>
+        <w:rPr>
+          <w:rFonts w:cs="Courier New"/>
+        </w:rPr>
+        <w:t>&lt;POPIS indikačnej LED&gt;</w:t>
+      </w:r>
+      <w:r>
+        <w:rPr>
+          <w:rFonts w:cs="Courier New"/>
+        </w:rPr>
+        <w:br/>
+        <w:t>&lt;POPIS ZAHAJENIA MANULANEJ SYNCHRONIZACIE&gt;</w:t>
       </w:r>
     </w:p>
     <w:p>
@@ -1258,155 +1581,126 @@
     </w:p>
     <w:p>
       <w:pPr>
+        <w:pStyle w:val="Nadpis2"/>
+      </w:pPr>
+      <w:bookmarkStart w:id="6" w:name="_Toc206799309"/>
+      <w:r>
+        <w:t>Záložná batéria</w:t>
+      </w:r>
+      <w:bookmarkEnd w:id="6"/>
+    </w:p>
+    <w:p>
+      <w:pPr>
+        <w:jc w:val="both"/>
+        <w:rPr>
+          <w:rFonts w:cs="Courier New"/>
+        </w:rPr>
+      </w:pPr>
+      <w:r>
+        <w:rPr>
+          <w:rFonts w:cs="Courier New"/>
+        </w:rPr>
+        <w:t xml:space="preserve">Napája elektroniku zodpovednú za udržovanie aktuálneho času po vypojení z el. siete. Pri bežných podmienkach by mala vydržať približne 5 rokov. </w:t>
+      </w:r>
+      <w:r>
+        <w:rPr>
+          <w:rFonts w:cs="Courier New"/>
+        </w:rPr>
+        <w:t xml:space="preserve">Ak si hodiny nezachovávajú správny čas po vypojení zo siete, batériu je treba </w:t>
+      </w:r>
+      <w:r>
+        <w:rPr>
+          <w:rFonts w:cs="Courier New"/>
+        </w:rPr>
+        <w:t xml:space="preserve">vymeniť za </w:t>
+      </w:r>
+      <w:r>
+        <w:rPr>
+          <w:rFonts w:cs="Courier New"/>
+        </w:rPr>
+        <w:t>kvalitnú mincovú batériu CR2032.</w:t>
+      </w:r>
+    </w:p>
+    <w:p>
+      <w:pPr>
         <w:rPr>
           <w:rFonts w:cs="Courier New"/>
           <w:b/>
           <w:bCs/>
         </w:rPr>
       </w:pPr>
-      <w:bookmarkStart w:id="6" w:name="_Toc206799308"/>
-      <w:r>
-        <w:rPr>
-          <w:rStyle w:val="Nadpis2Char"/>
-        </w:rPr>
-        <w:t>Pr</w:t>
-      </w:r>
-      <w:r>
-        <w:rPr>
-          <w:rStyle w:val="Nadpis2Char"/>
-        </w:rPr>
-        <w:t>i</w:t>
-      </w:r>
-      <w:r>
-        <w:rPr>
-          <w:rStyle w:val="Nadpis2Char"/>
-        </w:rPr>
-        <w:t>j</w:t>
-      </w:r>
-      <w:r>
-        <w:rPr>
-          <w:rStyle w:val="Nadpis2Char"/>
-        </w:rPr>
-        <w:t>í</w:t>
-      </w:r>
-      <w:r>
-        <w:rPr>
-          <w:rStyle w:val="Nadpis2Char"/>
-        </w:rPr>
-        <w:t>mač DCF77</w:t>
-      </w:r>
-      <w:bookmarkEnd w:id="6"/>
       <w:r>
         <w:rPr>
           <w:rFonts w:cs="Courier New"/>
           <w:b/>
           <w:bCs/>
         </w:rPr>
-        <w:br/>
-      </w:r>
-      <w:r>
-        <w:rPr>
-          <w:rFonts w:cs="Courier New"/>
-        </w:rPr>
-        <w:t xml:space="preserve">Synchronizácia s atómovými hodinami v nemeckom </w:t>
-      </w:r>
-      <w:proofErr w:type="spellStart"/>
-      <w:r>
-        <w:rPr>
-          <w:rFonts w:cs="Courier New"/>
-        </w:rPr>
-        <w:t>Mainflingene</w:t>
-      </w:r>
-      <w:proofErr w:type="spellEnd"/>
-      <w:r>
-        <w:rPr>
-          <w:rFonts w:cs="Courier New"/>
-        </w:rPr>
-        <w:t>,</w:t>
-      </w:r>
-      <w:r>
-        <w:rPr>
-          <w:rFonts w:cs="Courier New"/>
-          <w:b/>
-          <w:bCs/>
-        </w:rPr>
-        <w:br/>
-      </w:r>
-      <w:r>
-        <w:rPr>
-          <w:rFonts w:cs="Courier New"/>
-        </w:rPr>
-        <w:t>&lt;POPIS indikačnej LED&gt;</w:t>
-      </w:r>
-      <w:r>
-        <w:rPr>
-          <w:rFonts w:cs="Courier New"/>
-        </w:rPr>
-        <w:br/>
-        <w:t>&lt;POPIS ZAHAJENIA MANULANEJ SYNCHRONIZACIE&gt;</w:t>
+        <w:br w:type="page"/>
       </w:r>
     </w:p>
     <w:p>
       <w:pPr>
-        <w:rPr>
-          <w:rFonts w:cs="Courier New"/>
-        </w:rPr>
-      </w:pPr>
-    </w:p>
-    <w:p>
-      <w:pPr>
         <w:pStyle w:val="Nadpis2"/>
       </w:pPr>
-      <w:bookmarkStart w:id="7" w:name="_Toc206799309"/>
-      <w:r>
-        <w:t>Záložná batéria</w:t>
+      <w:bookmarkStart w:id="7" w:name="_Toc206799310"/>
+      <w:r>
+        <w:lastRenderedPageBreak/>
+        <w:t>Poistka</w:t>
       </w:r>
       <w:bookmarkEnd w:id="7"/>
     </w:p>
     <w:p>
       <w:pPr>
-        <w:rPr>
-          <w:rFonts w:cs="Courier New"/>
-        </w:rPr>
-      </w:pPr>
-      <w:r>
-        <w:rPr>
-          <w:rFonts w:cs="Courier New"/>
-        </w:rPr>
-        <w:t xml:space="preserve">Napája elektroniku zodpovednú za udržovanie aktuálneho času po vypojení z el. siete. Pri bežných podmienkach by mala vydržať približne 5 rokov. </w:t>
-      </w:r>
-      <w:r>
-        <w:rPr>
-          <w:rFonts w:cs="Courier New"/>
-        </w:rPr>
-        <w:t>Ak si hodiny nezachovávajú správny čas po vypojení zo siete, batériu je treba vymeniť. Pri výmene použite kvalitnú mincovú batériu CR2032.</w:t>
+        <w:jc w:val="both"/>
+        <w:rPr>
+          <w:rFonts w:cs="Courier New"/>
+        </w:rPr>
+      </w:pPr>
+      <w:r>
+        <w:rPr>
+          <w:rFonts w:cs="Courier New"/>
+        </w:rPr>
+        <w:t xml:space="preserve">Hlavná poistka je dimenzovaná tak aby sa vypálila len </w:t>
+      </w:r>
+      <w:r>
+        <w:rPr>
+          <w:rFonts w:cs="Courier New"/>
+        </w:rPr>
+        <w:t>pri</w:t>
+      </w:r>
+      <w:r>
+        <w:rPr>
+          <w:rFonts w:cs="Courier New"/>
+        </w:rPr>
+        <w:t xml:space="preserve"> k závažnej chybe v elektronike hodín. Teda</w:t>
+      </w:r>
+      <w:r>
+        <w:rPr>
+          <w:rFonts w:cs="Courier New"/>
+        </w:rPr>
+        <w:t xml:space="preserve"> pri vypálení</w:t>
+      </w:r>
+      <w:r>
+        <w:rPr>
+          <w:rFonts w:cs="Courier New"/>
+        </w:rPr>
+        <w:t>, odporúčame problém riešiť servisne.</w:t>
       </w:r>
     </w:p>
     <w:p>
       <w:pPr>
         <w:rPr>
           <w:rFonts w:cs="Courier New"/>
-          <w:b/>
-          <w:bCs/>
-        </w:rPr>
-      </w:pPr>
-      <w:r>
-        <w:rPr>
-          <w:rFonts w:cs="Courier New"/>
-          <w:b/>
-          <w:bCs/>
-        </w:rPr>
-        <w:br w:type="page"/>
-      </w:r>
+        </w:rPr>
+      </w:pPr>
     </w:p>
     <w:p>
       <w:pPr>
         <w:pStyle w:val="Nadpis2"/>
       </w:pPr>
-      <w:bookmarkStart w:id="8" w:name="_Toc206799310"/>
-      <w:r>
-        <w:lastRenderedPageBreak/>
-        <w:t>Poistka</w:t>
+      <w:bookmarkStart w:id="8" w:name="_Toc206799311"/>
+      <w:r>
+        <w:t>Servis</w:t>
       </w:r>
       <w:bookmarkEnd w:id="8"/>
     </w:p>
@@ -1420,25 +1714,470 @@
         <w:rPr>
           <w:rFonts w:cs="Courier New"/>
         </w:rPr>
-        <w:t>Hlavná poistka je dimenzovaná tak aby sa vypálila len ak dôjde k závažnej chybe v elektronike hodín. Teda v prípade, že je vypálená, odporúčame problém riešiť servisne.</w:t>
+        <w:t xml:space="preserve">V prípade poruchy volajte na tel. číslo +421 950 368 559 alebo </w:t>
+      </w:r>
+      <w:r>
+        <w:rPr>
+          <w:rFonts w:cs="Courier New"/>
+        </w:rPr>
+        <w:t>navštívte</w:t>
+      </w:r>
+      <w:r>
+        <w:rPr>
+          <w:rFonts w:cs="Courier New"/>
+        </w:rPr>
+        <w:t xml:space="preserve"> našu pobočku v Korni.</w:t>
       </w:r>
     </w:p>
     <w:p>
       <w:pPr>
         <w:rPr>
           <w:rFonts w:cs="Courier New"/>
-        </w:rPr>
-      </w:pPr>
+          <w:b/>
+          <w:bCs/>
+        </w:rPr>
+      </w:pPr>
+      <w:r>
+        <w:rPr>
+          <w:rFonts w:cs="Courier New"/>
+          <w:b/>
+          <w:bCs/>
+        </w:rPr>
+        <w:br w:type="page"/>
+      </w:r>
     </w:p>
     <w:p>
       <w:pPr>
-        <w:pStyle w:val="Nadpis2"/>
-      </w:pPr>
-      <w:bookmarkStart w:id="9" w:name="_Toc206799311"/>
-      <w:r>
-        <w:t>Servis</w:t>
+        <w:rPr>
+          <w:rFonts w:cs="Courier New"/>
+        </w:rPr>
+      </w:pPr>
+      <w:r>
+        <w:rPr>
+          <w:rFonts w:cs="Courier New"/>
+          <w:b/>
+          <w:bCs/>
+        </w:rPr>
+        <w:lastRenderedPageBreak/>
+        <w:br/>
+      </w:r>
+      <w:bookmarkStart w:id="9" w:name="_Toc206799312"/>
+      <w:r>
+        <w:rPr>
+          <w:rStyle w:val="Nadpis2Char"/>
+        </w:rPr>
+        <w:t>Spolupracovali</w:t>
       </w:r>
       <w:bookmarkEnd w:id="9"/>
+      <w:r>
+        <w:rPr>
+          <w:rFonts w:cs="Courier New"/>
+        </w:rPr>
+        <w:br/>
+      </w:r>
+      <w:r>
+        <w:rPr>
+          <w:rFonts w:cs="Courier New"/>
+        </w:rPr>
+        <w:t xml:space="preserve">- </w:t>
+      </w:r>
+      <w:r>
+        <w:rPr>
+          <w:rFonts w:cs="Courier New"/>
+          <w:u w:val="single"/>
+        </w:rPr>
+        <w:t>Vedúci projektu</w:t>
+      </w:r>
+      <w:r>
+        <w:rPr>
+          <w:rFonts w:cs="Courier New"/>
+          <w:u w:val="single"/>
+        </w:rPr>
+        <w:t>:</w:t>
+      </w:r>
+      <w:r>
+        <w:rPr>
+          <w:rFonts w:cs="Courier New"/>
+        </w:rPr>
+        <w:t xml:space="preserve"> Filip Mitka</w:t>
+      </w:r>
+      <w:r>
+        <w:rPr>
+          <w:rFonts w:cs="Courier New"/>
+        </w:rPr>
+        <w:br/>
+        <w:t>-</w:t>
+      </w:r>
+      <w:r>
+        <w:rPr>
+          <w:rFonts w:cs="Courier New"/>
+        </w:rPr>
+        <w:t xml:space="preserve"> </w:t>
+      </w:r>
+      <w:r>
+        <w:rPr>
+          <w:rFonts w:cs="Courier New"/>
+          <w:u w:val="single"/>
+        </w:rPr>
+        <w:t>Vedúci výroby</w:t>
+      </w:r>
+      <w:r>
+        <w:rPr>
+          <w:rFonts w:cs="Courier New"/>
+          <w:u w:val="single"/>
+        </w:rPr>
+        <w:t>:</w:t>
+      </w:r>
+      <w:r>
+        <w:rPr>
+          <w:rFonts w:cs="Courier New"/>
+        </w:rPr>
+        <w:t xml:space="preserve"> Kristián </w:t>
+      </w:r>
+      <w:proofErr w:type="spellStart"/>
+      <w:r>
+        <w:rPr>
+          <w:rFonts w:cs="Courier New"/>
+        </w:rPr>
+        <w:t>Perďoch</w:t>
+      </w:r>
+      <w:proofErr w:type="spellEnd"/>
+      <w:r>
+        <w:rPr>
+          <w:rFonts w:cs="Courier New"/>
+        </w:rPr>
+        <w:br/>
+      </w:r>
+      <w:r>
+        <w:rPr>
+          <w:rFonts w:cs="Courier New"/>
+        </w:rPr>
+        <w:t>-</w:t>
+      </w:r>
+      <w:r>
+        <w:rPr>
+          <w:rFonts w:cs="Courier New"/>
+        </w:rPr>
+        <w:t xml:space="preserve"> </w:t>
+      </w:r>
+      <w:r>
+        <w:rPr>
+          <w:rFonts w:cs="Courier New"/>
+          <w:u w:val="single"/>
+        </w:rPr>
+        <w:t>Drevovýroba a modelovanie:</w:t>
+      </w:r>
+      <w:r>
+        <w:rPr>
+          <w:rFonts w:cs="Courier New"/>
+        </w:rPr>
+        <w:t xml:space="preserve"> Bartolomej Mikula</w:t>
+      </w:r>
+      <w:r>
+        <w:rPr>
+          <w:rFonts w:cs="Courier New"/>
+        </w:rPr>
+        <w:br/>
+      </w:r>
+      <w:r>
+        <w:rPr>
+          <w:rFonts w:cs="Courier New"/>
+        </w:rPr>
+        <w:t>-</w:t>
+      </w:r>
+      <w:r>
+        <w:rPr>
+          <w:rFonts w:cs="Courier New"/>
+        </w:rPr>
+        <w:t xml:space="preserve"> </w:t>
+      </w:r>
+      <w:proofErr w:type="spellStart"/>
+      <w:r>
+        <w:rPr>
+          <w:rFonts w:cs="Courier New"/>
+          <w:u w:val="single"/>
+        </w:rPr>
+        <w:t>Biblistika</w:t>
+      </w:r>
+      <w:proofErr w:type="spellEnd"/>
+      <w:r>
+        <w:rPr>
+          <w:rFonts w:cs="Courier New"/>
+          <w:u w:val="single"/>
+        </w:rPr>
+        <w:t>:</w:t>
+      </w:r>
+      <w:r>
+        <w:rPr>
+          <w:rFonts w:cs="Courier New"/>
+        </w:rPr>
+        <w:t xml:space="preserve"> Jozef </w:t>
+      </w:r>
+      <w:proofErr w:type="spellStart"/>
+      <w:r>
+        <w:rPr>
+          <w:rFonts w:cs="Courier New"/>
+        </w:rPr>
+        <w:t>Hroš</w:t>
+      </w:r>
+      <w:proofErr w:type="spellEnd"/>
+      <w:r>
+        <w:rPr>
+          <w:rFonts w:cs="Courier New"/>
+        </w:rPr>
+        <w:br/>
+      </w:r>
+      <w:r>
+        <w:rPr>
+          <w:rFonts w:cs="Courier New"/>
+        </w:rPr>
+        <w:t xml:space="preserve">- </w:t>
+      </w:r>
+      <w:r>
+        <w:rPr>
+          <w:rFonts w:cs="Courier New"/>
+          <w:u w:val="single"/>
+        </w:rPr>
+        <w:t>Manažér marketingu:</w:t>
+      </w:r>
+      <w:r>
+        <w:rPr>
+          <w:rFonts w:cs="Courier New"/>
+        </w:rPr>
+        <w:t xml:space="preserve"> Šimon </w:t>
+      </w:r>
+      <w:proofErr w:type="spellStart"/>
+      <w:r>
+        <w:rPr>
+          <w:rFonts w:cs="Courier New"/>
+        </w:rPr>
+        <w:t>Šinal</w:t>
+      </w:r>
+      <w:proofErr w:type="spellEnd"/>
+      <w:r>
+        <w:rPr>
+          <w:rFonts w:cs="Courier New"/>
+        </w:rPr>
+        <w:br/>
+      </w:r>
+      <w:r>
+        <w:rPr>
+          <w:rFonts w:cs="Courier New"/>
+        </w:rPr>
+        <w:t>-</w:t>
+      </w:r>
+      <w:r>
+        <w:rPr>
+          <w:rFonts w:cs="Courier New"/>
+        </w:rPr>
+        <w:t xml:space="preserve"> </w:t>
+      </w:r>
+      <w:r>
+        <w:rPr>
+          <w:rFonts w:cs="Courier New"/>
+          <w:u w:val="single"/>
+        </w:rPr>
+        <w:t>Kritika</w:t>
+      </w:r>
+      <w:r>
+        <w:rPr>
+          <w:rFonts w:cs="Courier New"/>
+          <w:u w:val="single"/>
+        </w:rPr>
+        <w:t xml:space="preserve"> hardvéru</w:t>
+      </w:r>
+      <w:r>
+        <w:rPr>
+          <w:rFonts w:cs="Courier New"/>
+          <w:u w:val="single"/>
+        </w:rPr>
+        <w:t>:</w:t>
+      </w:r>
+      <w:r>
+        <w:rPr>
+          <w:rFonts w:cs="Courier New"/>
+        </w:rPr>
+        <w:t xml:space="preserve"> Ing. Viliam </w:t>
+      </w:r>
+      <w:proofErr w:type="spellStart"/>
+      <w:r>
+        <w:rPr>
+          <w:rFonts w:cs="Courier New"/>
+        </w:rPr>
+        <w:t>Koprda</w:t>
+      </w:r>
+      <w:proofErr w:type="spellEnd"/>
+      <w:r>
+        <w:rPr>
+          <w:rFonts w:cs="Courier New"/>
+        </w:rPr>
+        <w:t xml:space="preserve">, Ing. Dušan </w:t>
+      </w:r>
+      <w:proofErr w:type="spellStart"/>
+      <w:r>
+        <w:rPr>
+          <w:rFonts w:cs="Courier New"/>
+        </w:rPr>
+        <w:t>Dragúň</w:t>
+      </w:r>
+      <w:proofErr w:type="spellEnd"/>
+      <w:r>
+        <w:rPr>
+          <w:rFonts w:cs="Courier New"/>
+        </w:rPr>
+        <w:br/>
+        <w:t xml:space="preserve">- </w:t>
+      </w:r>
+      <w:r>
+        <w:rPr>
+          <w:rFonts w:cs="Courier New"/>
+          <w:u w:val="single"/>
+        </w:rPr>
+        <w:t>Súčiastky:</w:t>
+      </w:r>
+      <w:r>
+        <w:rPr>
+          <w:rFonts w:cs="Courier New"/>
+        </w:rPr>
+        <w:t xml:space="preserve"> MB </w:t>
+      </w:r>
+      <w:proofErr w:type="spellStart"/>
+      <w:r>
+        <w:rPr>
+          <w:rFonts w:cs="Courier New"/>
+        </w:rPr>
+        <w:t>Electronic</w:t>
+      </w:r>
+      <w:proofErr w:type="spellEnd"/>
+      <w:r>
+        <w:rPr>
+          <w:rFonts w:cs="Courier New"/>
+        </w:rPr>
+        <w:t xml:space="preserve"> Žilina, </w:t>
+      </w:r>
+      <w:r>
+        <w:rPr>
+          <w:rFonts w:cs="Courier New"/>
+        </w:rPr>
+        <w:t>VP Centrum</w:t>
+      </w:r>
+      <w:r>
+        <w:rPr>
+          <w:rFonts w:cs="Courier New"/>
+        </w:rPr>
+        <w:t xml:space="preserve"> Litoměřice</w:t>
+      </w:r>
+      <w:r>
+        <w:rPr>
+          <w:rFonts w:cs="Courier New"/>
+        </w:rPr>
+        <w:t>, Techfun.sk</w:t>
+      </w:r>
+      <w:r>
+        <w:rPr>
+          <w:rFonts w:cs="Courier New"/>
+        </w:rPr>
+        <w:t>, tomshardware.sk</w:t>
+      </w:r>
+      <w:r>
+        <w:rPr>
+          <w:rFonts w:cs="Courier New"/>
+        </w:rPr>
+        <w:t xml:space="preserve">, tme.eu, PS </w:t>
+      </w:r>
+      <w:proofErr w:type="spellStart"/>
+      <w:r>
+        <w:rPr>
+          <w:rFonts w:cs="Courier New"/>
+        </w:rPr>
+        <w:t>Electronic</w:t>
+      </w:r>
+      <w:proofErr w:type="spellEnd"/>
+      <w:r>
+        <w:rPr>
+          <w:rFonts w:cs="Courier New"/>
+        </w:rPr>
+        <w:br/>
+        <w:t xml:space="preserve">- </w:t>
+      </w:r>
+      <w:r>
+        <w:rPr>
+          <w:rFonts w:cs="Courier New"/>
+          <w:u w:val="single"/>
+        </w:rPr>
+        <w:t>Chémia na leptanie DPS:</w:t>
+      </w:r>
+      <w:r>
+        <w:rPr>
+          <w:rFonts w:cs="Courier New"/>
+        </w:rPr>
+        <w:t xml:space="preserve"> Ladislav </w:t>
+      </w:r>
+      <w:proofErr w:type="spellStart"/>
+      <w:r>
+        <w:rPr>
+          <w:rFonts w:cs="Courier New"/>
+        </w:rPr>
+        <w:t>Zimka</w:t>
+      </w:r>
+      <w:proofErr w:type="spellEnd"/>
+      <w:r>
+        <w:rPr>
+          <w:rFonts w:cs="Courier New"/>
+        </w:rPr>
+        <w:br/>
+        <w:t xml:space="preserve">- </w:t>
+      </w:r>
+      <w:r>
+        <w:rPr>
+          <w:rFonts w:cs="Courier New"/>
+          <w:u w:val="single"/>
+        </w:rPr>
+        <w:t xml:space="preserve">Poskytovateľ </w:t>
+      </w:r>
+      <w:proofErr w:type="spellStart"/>
+      <w:r>
+        <w:rPr>
+          <w:rFonts w:cs="Courier New"/>
+          <w:u w:val="single"/>
+        </w:rPr>
+        <w:t>numitrono</w:t>
+      </w:r>
+      <w:r>
+        <w:rPr>
+          <w:rFonts w:cs="Courier New"/>
+          <w:u w:val="single"/>
+        </w:rPr>
+        <w:t>v</w:t>
+      </w:r>
+      <w:proofErr w:type="spellEnd"/>
+      <w:r>
+        <w:rPr>
+          <w:rFonts w:cs="Courier New"/>
+          <w:u w:val="single"/>
+        </w:rPr>
+        <w:t>:</w:t>
+      </w:r>
+      <w:r>
+        <w:rPr>
+          <w:rFonts w:cs="Courier New"/>
+        </w:rPr>
+        <w:t xml:space="preserve"> Robert </w:t>
+      </w:r>
+      <w:proofErr w:type="spellStart"/>
+      <w:r>
+        <w:rPr>
+          <w:rFonts w:cs="Courier New"/>
+        </w:rPr>
+        <w:t>Ziedins</w:t>
+      </w:r>
+      <w:proofErr w:type="spellEnd"/>
+      <w:r>
+        <w:rPr>
+          <w:rFonts w:cs="Courier New"/>
+        </w:rPr>
+        <w:t>, Litva</w:t>
+      </w:r>
     </w:p>
     <w:p>
       <w:pPr>
@@ -1446,41 +2185,13 @@
           <w:rFonts w:cs="Courier New"/>
         </w:rPr>
       </w:pPr>
-      <w:r>
-        <w:rPr>
-          <w:rFonts w:cs="Courier New"/>
-        </w:rPr>
-        <w:t xml:space="preserve">V prípade poruchy volajte na tel. číslo +421 950 368 559 alebo </w:t>
-      </w:r>
-      <w:r>
-        <w:rPr>
-          <w:rFonts w:cs="Courier New"/>
-        </w:rPr>
-        <w:t>navštívte</w:t>
-      </w:r>
-      <w:r>
-        <w:rPr>
-          <w:rFonts w:cs="Courier New"/>
-        </w:rPr>
-        <w:t xml:space="preserve"> našu pobočku v Korni.</w:t>
-      </w:r>
     </w:p>
     <w:p>
       <w:pPr>
         <w:rPr>
           <w:rFonts w:cs="Courier New"/>
-          <w:b/>
-          <w:bCs/>
-        </w:rPr>
-      </w:pPr>
-      <w:r>
-        <w:rPr>
-          <w:rFonts w:cs="Courier New"/>
-          <w:b/>
-          <w:bCs/>
-        </w:rPr>
-        <w:br w:type="page"/>
-      </w:r>
+        </w:rPr>
+      </w:pPr>
     </w:p>
     <w:p>
       <w:pPr>
@@ -1491,391 +2202,13 @@
       <w:r>
         <w:rPr>
           <w:rFonts w:cs="Courier New"/>
-          <w:b/>
-          <w:bCs/>
-        </w:rPr>
-        <w:lastRenderedPageBreak/>
-        <w:br/>
-      </w:r>
-      <w:bookmarkStart w:id="10" w:name="_Toc206799312"/>
-      <w:r>
-        <w:rPr>
-          <w:rStyle w:val="Nadpis2Char"/>
-        </w:rPr>
-        <w:t>Spolupracovali</w:t>
-      </w:r>
-      <w:bookmarkEnd w:id="10"/>
-      <w:r>
-        <w:rPr>
-          <w:rFonts w:cs="Courier New"/>
-        </w:rPr>
-        <w:br/>
-      </w:r>
-      <w:r>
-        <w:rPr>
-          <w:rFonts w:cs="Courier New"/>
-        </w:rPr>
-        <w:t>-</w:t>
-      </w:r>
-      <w:r>
-        <w:rPr>
-          <w:rFonts w:cs="Courier New"/>
-        </w:rPr>
-        <w:t xml:space="preserve"> Vedúci projektu</w:t>
-      </w:r>
-      <w:r>
-        <w:rPr>
-          <w:rFonts w:cs="Courier New"/>
-        </w:rPr>
-        <w:t>: Filip Mitka</w:t>
-      </w:r>
-      <w:r>
-        <w:rPr>
-          <w:rFonts w:cs="Courier New"/>
-        </w:rPr>
-        <w:br/>
-        <w:t>-</w:t>
-      </w:r>
-      <w:r>
-        <w:rPr>
-          <w:rFonts w:cs="Courier New"/>
-        </w:rPr>
-        <w:t xml:space="preserve"> Vedúci výroby</w:t>
-      </w:r>
-      <w:r>
-        <w:rPr>
-          <w:rFonts w:cs="Courier New"/>
-        </w:rPr>
-        <w:t xml:space="preserve">: Kristián </w:t>
-      </w:r>
-      <w:proofErr w:type="spellStart"/>
-      <w:r>
-        <w:rPr>
-          <w:rFonts w:cs="Courier New"/>
-        </w:rPr>
-        <w:t>Perďoch</w:t>
-      </w:r>
-      <w:proofErr w:type="spellEnd"/>
-      <w:r>
-        <w:rPr>
-          <w:rFonts w:cs="Courier New"/>
-        </w:rPr>
-        <w:br/>
-      </w:r>
-      <w:r>
-        <w:rPr>
-          <w:rFonts w:cs="Courier New"/>
-        </w:rPr>
-        <w:t>-</w:t>
-      </w:r>
-      <w:r>
-        <w:rPr>
-          <w:rFonts w:cs="Courier New"/>
-        </w:rPr>
-        <w:t xml:space="preserve"> Drevovýroba a modelovanie</w:t>
-      </w:r>
-      <w:r>
-        <w:rPr>
-          <w:rFonts w:cs="Courier New"/>
-        </w:rPr>
-        <w:t>: Bartolomej Mikula</w:t>
-      </w:r>
-      <w:r>
-        <w:rPr>
-          <w:rFonts w:cs="Courier New"/>
-        </w:rPr>
-        <w:br/>
-        <w:t>- Biblista a historik na ZSSR: Kristián Straka</w:t>
-      </w:r>
-      <w:r>
-        <w:rPr>
-          <w:rFonts w:cs="Courier New"/>
-        </w:rPr>
-        <w:br/>
-      </w:r>
-      <w:r>
-        <w:rPr>
-          <w:rFonts w:cs="Courier New"/>
-        </w:rPr>
-        <w:t>-</w:t>
-      </w:r>
-      <w:r>
-        <w:rPr>
-          <w:rFonts w:cs="Courier New"/>
-        </w:rPr>
-        <w:t xml:space="preserve"> Organizácia</w:t>
-      </w:r>
-      <w:r>
-        <w:rPr>
-          <w:rFonts w:cs="Courier New"/>
-        </w:rPr>
-        <w:t xml:space="preserve">: Jozef </w:t>
-      </w:r>
-      <w:proofErr w:type="spellStart"/>
-      <w:r>
-        <w:rPr>
-          <w:rFonts w:cs="Courier New"/>
-        </w:rPr>
-        <w:t>Hroš</w:t>
-      </w:r>
-      <w:proofErr w:type="spellEnd"/>
-      <w:r>
-        <w:rPr>
-          <w:rFonts w:cs="Courier New"/>
-        </w:rPr>
-        <w:br/>
-      </w:r>
-      <w:r>
-        <w:rPr>
-          <w:rFonts w:cs="Courier New"/>
-        </w:rPr>
-        <w:t xml:space="preserve">- Manažér marketingu: Šimon </w:t>
-      </w:r>
-      <w:proofErr w:type="spellStart"/>
-      <w:r>
-        <w:rPr>
-          <w:rFonts w:cs="Courier New"/>
-        </w:rPr>
-        <w:t>Šinal</w:t>
-      </w:r>
-      <w:proofErr w:type="spellEnd"/>
-      <w:r>
-        <w:rPr>
-          <w:rFonts w:cs="Courier New"/>
-        </w:rPr>
-        <w:br/>
-      </w:r>
-      <w:r>
-        <w:rPr>
-          <w:rFonts w:cs="Courier New"/>
-        </w:rPr>
-        <w:t>-</w:t>
-      </w:r>
-      <w:r>
-        <w:rPr>
-          <w:rFonts w:cs="Courier New"/>
-        </w:rPr>
-        <w:t xml:space="preserve"> </w:t>
-      </w:r>
-      <w:r>
-        <w:rPr>
-          <w:rFonts w:cs="Courier New"/>
-        </w:rPr>
-        <w:t>Kritika</w:t>
-      </w:r>
-      <w:r>
-        <w:rPr>
-          <w:rFonts w:cs="Courier New"/>
-        </w:rPr>
-        <w:t xml:space="preserve"> hardvéru</w:t>
-      </w:r>
-      <w:r>
-        <w:rPr>
-          <w:rFonts w:cs="Courier New"/>
-        </w:rPr>
-        <w:t xml:space="preserve">: Ing. Viliam </w:t>
-      </w:r>
-      <w:proofErr w:type="spellStart"/>
-      <w:r>
-        <w:rPr>
-          <w:rFonts w:cs="Courier New"/>
-        </w:rPr>
-        <w:t>Koprda</w:t>
-      </w:r>
-      <w:proofErr w:type="spellEnd"/>
-      <w:r>
-        <w:rPr>
-          <w:rFonts w:cs="Courier New"/>
-        </w:rPr>
-        <w:t xml:space="preserve">, Ing. Dušan </w:t>
-      </w:r>
-      <w:proofErr w:type="spellStart"/>
-      <w:r>
-        <w:rPr>
-          <w:rFonts w:cs="Courier New"/>
-        </w:rPr>
-        <w:t>Dragúň</w:t>
-      </w:r>
-      <w:proofErr w:type="spellEnd"/>
-      <w:r>
-        <w:rPr>
-          <w:rFonts w:cs="Courier New"/>
-        </w:rPr>
-        <w:t xml:space="preserve">, Ing. Dušan </w:t>
-      </w:r>
-      <w:proofErr w:type="spellStart"/>
-      <w:r>
-        <w:rPr>
-          <w:rFonts w:cs="Courier New"/>
-        </w:rPr>
-        <w:t>Šrenkel</w:t>
-      </w:r>
-      <w:proofErr w:type="spellEnd"/>
-      <w:r>
-        <w:rPr>
-          <w:rFonts w:cs="Courier New"/>
-        </w:rPr>
-        <w:br/>
-        <w:t>- Kritik</w:t>
-      </w:r>
-      <w:r>
-        <w:rPr>
-          <w:rFonts w:cs="Courier New"/>
-        </w:rPr>
-        <w:t>a</w:t>
-      </w:r>
-      <w:r>
-        <w:rPr>
-          <w:rFonts w:cs="Courier New"/>
-        </w:rPr>
-        <w:t xml:space="preserve"> firmvéru</w:t>
-      </w:r>
-      <w:r>
-        <w:rPr>
-          <w:rFonts w:cs="Courier New"/>
-        </w:rPr>
-        <w:t xml:space="preserve">: Ing. Peter </w:t>
-      </w:r>
-      <w:proofErr w:type="spellStart"/>
-      <w:r>
-        <w:rPr>
-          <w:rFonts w:cs="Courier New"/>
-        </w:rPr>
-        <w:t>Remiš</w:t>
-      </w:r>
-      <w:proofErr w:type="spellEnd"/>
-      <w:r>
-        <w:rPr>
-          <w:rFonts w:cs="Courier New"/>
-        </w:rPr>
-        <w:br/>
-        <w:t xml:space="preserve">- Súčiastky: MB </w:t>
-      </w:r>
-      <w:proofErr w:type="spellStart"/>
-      <w:r>
-        <w:rPr>
-          <w:rFonts w:cs="Courier New"/>
-        </w:rPr>
-        <w:t>Electronic</w:t>
-      </w:r>
-      <w:proofErr w:type="spellEnd"/>
-      <w:r>
-        <w:rPr>
-          <w:rFonts w:cs="Courier New"/>
-        </w:rPr>
-        <w:t xml:space="preserve"> Žilina, </w:t>
-      </w:r>
-      <w:r>
-        <w:rPr>
-          <w:rFonts w:cs="Courier New"/>
-        </w:rPr>
-        <w:t>VP Centrum</w:t>
-      </w:r>
-      <w:r>
-        <w:rPr>
-          <w:rFonts w:cs="Courier New"/>
-        </w:rPr>
-        <w:t xml:space="preserve"> Litoměřice</w:t>
-      </w:r>
-      <w:r>
-        <w:rPr>
-          <w:rFonts w:cs="Courier New"/>
-        </w:rPr>
-        <w:t>, Techfun.sk</w:t>
-      </w:r>
-      <w:r>
-        <w:rPr>
-          <w:rFonts w:cs="Courier New"/>
-        </w:rPr>
-        <w:t>, tomshardware.sk</w:t>
-      </w:r>
-      <w:r>
-        <w:rPr>
-          <w:rFonts w:cs="Courier New"/>
-        </w:rPr>
-        <w:br/>
-        <w:t xml:space="preserve">- Chémia na leptanie DPS: Ladislav </w:t>
-      </w:r>
-      <w:proofErr w:type="spellStart"/>
-      <w:r>
-        <w:rPr>
-          <w:rFonts w:cs="Courier New"/>
-        </w:rPr>
-        <w:t>Zimka</w:t>
-      </w:r>
-      <w:proofErr w:type="spellEnd"/>
-      <w:r>
-        <w:rPr>
-          <w:rFonts w:cs="Courier New"/>
-        </w:rPr>
-        <w:br/>
-        <w:t xml:space="preserve">- Poskytovateľ </w:t>
-      </w:r>
-      <w:proofErr w:type="spellStart"/>
-      <w:r>
-        <w:rPr>
-          <w:rFonts w:cs="Courier New"/>
-        </w:rPr>
-        <w:t>numitronov</w:t>
-      </w:r>
-      <w:proofErr w:type="spellEnd"/>
-      <w:r>
-        <w:rPr>
-          <w:rFonts w:cs="Courier New"/>
-        </w:rPr>
-        <w:t xml:space="preserve"> a dokumentácie</w:t>
-      </w:r>
-      <w:r>
-        <w:rPr>
-          <w:rFonts w:cs="Courier New"/>
-        </w:rPr>
-        <w:t xml:space="preserve">: Robert </w:t>
-      </w:r>
-      <w:proofErr w:type="spellStart"/>
-      <w:r>
-        <w:rPr>
-          <w:rFonts w:cs="Courier New"/>
-        </w:rPr>
-        <w:t>Ziedins</w:t>
-      </w:r>
-      <w:proofErr w:type="spellEnd"/>
-      <w:r>
-        <w:rPr>
-          <w:rFonts w:cs="Courier New"/>
-        </w:rPr>
-        <w:t>, Litva</w:t>
-      </w:r>
-    </w:p>
-    <w:p>
-      <w:pPr>
-        <w:rPr>
-          <w:rFonts w:cs="Courier New"/>
-        </w:rPr>
-      </w:pPr>
-    </w:p>
-    <w:p>
-      <w:pPr>
-        <w:rPr>
-          <w:rFonts w:cs="Courier New"/>
-        </w:rPr>
-      </w:pPr>
-    </w:p>
-    <w:p>
-      <w:pPr>
-        <w:rPr>
-          <w:rFonts w:cs="Courier New"/>
-        </w:rPr>
-      </w:pPr>
-      <w:r>
-        <w:rPr>
-          <w:rFonts w:cs="Courier New"/>
         </w:rPr>
         <w:t>Napísané v Korni dňa 15.05.2025</w:t>
       </w:r>
     </w:p>
     <w:sectPr>
-      <w:pgSz w:w="11906" w:h="16838"/>
-      <w:pgMar w:top="1417" w:right="1417" w:bottom="1417" w:left="1417" w:header="708" w:footer="708" w:gutter="0"/>
+      <w:pgSz w:w="11906" w:h="16838" w:code="9"/>
+      <w:pgMar w:top="720" w:right="720" w:bottom="720" w:left="720" w:header="709" w:footer="709" w:gutter="0"/>
       <w:cols w:space="708"/>
       <w:docGrid w:linePitch="360"/>
     </w:sectPr>
@@ -3548,6 +3881,125 @@
 </w:styles>
 </file>
 
+<file path=word/ink/ink1.xml><?xml version="1.0" encoding="utf-8"?>
+<inkml:ink xmlns:inkml="http://www.w3.org/2003/InkML">
+  <inkml:definitions>
+    <inkml:context xml:id="ctx0">
+      <inkml:inkSource xml:id="inkSrc0">
+        <inkml:traceFormat>
+          <inkml:channel name="X" type="integer" min="-2.14748E9" max="2.14748E9" units="cm"/>
+          <inkml:channel name="Y" type="integer" min="-2.14748E9" max="2.14748E9" units="cm"/>
+          <inkml:channel name="F" type="integer" max="32767" units="dev"/>
+        </inkml:traceFormat>
+        <inkml:channelProperties>
+          <inkml:channelProperty channel="X" name="resolution" value="1000" units="1/cm"/>
+          <inkml:channelProperty channel="Y" name="resolution" value="1000" units="1/cm"/>
+          <inkml:channelProperty channel="F" name="resolution" value="0" units="1/dev"/>
+        </inkml:channelProperties>
+      </inkml:inkSource>
+      <inkml:timestamp xml:id="ts0" timeString="2025-09-02T14:14:58.202"/>
+    </inkml:context>
+    <inkml:brush xml:id="br0">
+      <inkml:brushProperty name="width" value="0.05" units="cm"/>
+      <inkml:brushProperty name="height" value="0.05" units="cm"/>
+    </inkml:brush>
+  </inkml:definitions>
+  <inkml:trace contextRef="#ctx0" brushRef="#br0">14 137 24575,'0'1180'0,"16"-1029"0,-17 406-1365</inkml:trace>
+  <inkml:trace contextRef="#ctx0" brushRef="#br0" timeOffset="2299.65">0 1905 24575,'1438'0'0,"-1413"2"0,0 1 0,-1 1 0,1 1 0,35 12 0,-35-9 0,-1-1 0,1-2 0,0 0 0,35 1 0,-16-6-1365,-32-1-5461</inkml:trace>
+  <inkml:trace contextRef="#ctx0" brushRef="#br0" timeOffset="14410.5">484 1408 24575,'14'-1'0,"1"-1"0,0-1 0,-1 0 0,18-6 0,1 0 0,31-7 0,0 4 0,0 2 0,126-2 0,116 1 0,-10 7 0,-178 5 0,2 14-1365,-107-14-5461</inkml:trace>
+  <inkml:trace contextRef="#ctx0" brushRef="#br0" timeOffset="16568.64">1013 122 24575,'0'3'0,"0"3"0,0 3 0,0 3 0,-3 2 0,0 1 0,-3 0 0,-3 1 0,1 0 0,-2-3 0,-1-1 0,-2 0 0,0 1 0,1 0 0,3 1 0,3-2-8191</inkml:trace>
+  <inkml:trace contextRef="#ctx0" brushRef="#br0" timeOffset="17869.73">982 137 24575,'4'1'0,"-1"1"0,0-1 0,0 1 0,0 0 0,0 0 0,0 0 0,0 0 0,0 1 0,-1-1 0,1 1 0,-1-1 0,0 1 0,3 3 0,4 5 0,15 13 0,-18-16 0,1-1 0,0 1 0,0-2 0,1 1 0,0-1 0,0 0 0,18 8 0,-15-8-1365,-1 0-5461</inkml:trace>
+  <inkml:trace contextRef="#ctx0" brushRef="#br0" timeOffset="19965.24">981 92 24575,'-1'101'0,"3"109"0,5-129 0,1 59 0,-9-111 0,1 1 0,2 0 0,1 0 0,1-1 0,8 33 0,-6-45-118,-1-1-194,-1 0 0,0 0 1,2 25-1,-5-29-6514</inkml:trace>
+  <inkml:trace contextRef="#ctx0" brushRef="#br0" timeOffset="21068.94">1058 832 24575,'20'-1'0,"-1"-1"0,33-7 0,11-2 0,424 1 0,-292 13 0,-91-3-1365,-92 0-5461</inkml:trace>
+  <inkml:trace contextRef="#ctx0" brushRef="#br0" timeOffset="27445.84">1542 0 24575,'-3'2'0,"0"0"0,1 0 0,-1 0 0,0 0 0,1 0 0,0 0 0,-1 1 0,1-1 0,0 1 0,0 0 0,0-1 0,-2 6 0,-4 4 0,4-7 0,1 0 0,0 1 0,0-1 0,1 0 0,-1 1 0,1 0 0,-1 6 0,-15 31 0,-8-1-1365,19-30-5461</inkml:trace>
+  <inkml:trace contextRef="#ctx0" brushRef="#br0" timeOffset="28998.65">1526 46 24575,'1'8'0,"-1"0"0,1 0 0,0-1 0,0 1 0,1 0 0,0-1 0,1 1 0,0-1 0,0 0 0,0 1 0,1-2 0,0 1 0,9 11 0,-10-15 12,1-1-1,-1 1 1,1-1-1,0 0 1,0 0-1,0 0 1,0-1-1,0 1 1,5 0-1,-5-1-145,0 0-1,0 0 1,-1 1-1,1-1 1,0 1-1,-1 0 0,1 0 1,-1 0-1,1 0 1,3 4-1,-1 2-6691</inkml:trace>
+  <inkml:trace contextRef="#ctx0" brushRef="#br0" timeOffset="30898.23">1496 92 24575,'1'7'0,"1"0"0,-1-1 0,1 1 0,0-1 0,1 1 0,0-1 0,5 10 0,6 14 0,-11-21 0,3 8 0,0 0 0,5 30 0,-9-37 0,-1 0 0,2 0 0,5 16 0,-6-26 0,1 1 0,0-1 0,0 0 0,0 0 0,0-1 0,0 1 0,0 0 0,0-1 0,0 0 0,0 1 0,4-4 0,-2 3 0,33-9 0,-17 3 0,1 2 0,1 0 0,-1 1 0,28 0 0,124 5-1365,-161-1-5461</inkml:trace>
+</inkml:ink>
+</file>
+
+<file path=word/ink/ink2.xml><?xml version="1.0" encoding="utf-8"?>
+<inkml:ink xmlns:inkml="http://www.w3.org/2003/InkML">
+  <inkml:definitions>
+    <inkml:context xml:id="ctx0">
+      <inkml:inkSource xml:id="inkSrc0">
+        <inkml:traceFormat>
+          <inkml:channel name="X" type="integer" min="-2.14748E9" max="2.14748E9" units="cm"/>
+          <inkml:channel name="Y" type="integer" min="-2.14748E9" max="2.14748E9" units="cm"/>
+          <inkml:channel name="F" type="integer" max="32767" units="dev"/>
+        </inkml:traceFormat>
+        <inkml:channelProperties>
+          <inkml:channelProperty channel="X" name="resolution" value="1000" units="1/cm"/>
+          <inkml:channelProperty channel="Y" name="resolution" value="1000" units="1/cm"/>
+          <inkml:channelProperty channel="F" name="resolution" value="0" units="1/dev"/>
+        </inkml:channelProperties>
+      </inkml:inkSource>
+      <inkml:timestamp xml:id="ts0" timeString="2025-09-02T14:15:09.226"/>
+    </inkml:context>
+    <inkml:brush xml:id="br0">
+      <inkml:brushProperty name="width" value="0.05" units="cm"/>
+      <inkml:brushProperty name="height" value="0.05" units="cm"/>
+    </inkml:brush>
+  </inkml:definitions>
+  <inkml:trace contextRef="#ctx0" brushRef="#br0">13 1 23706,'0'1240'0</inkml:trace>
+</inkml:ink>
+</file>
+
+<file path=word/ink/ink3.xml><?xml version="1.0" encoding="utf-8"?>
+<inkml:ink xmlns:inkml="http://www.w3.org/2003/InkML">
+  <inkml:definitions>
+    <inkml:context xml:id="ctx0">
+      <inkml:inkSource xml:id="inkSrc0">
+        <inkml:traceFormat>
+          <inkml:channel name="X" type="integer" min="-2.14748E9" max="2.14748E9" units="cm"/>
+          <inkml:channel name="Y" type="integer" min="-2.14748E9" max="2.14748E9" units="cm"/>
+          <inkml:channel name="F" type="integer" max="32767" units="dev"/>
+        </inkml:traceFormat>
+        <inkml:channelProperties>
+          <inkml:channelProperty channel="X" name="resolution" value="1000" units="1/cm"/>
+          <inkml:channelProperty channel="Y" name="resolution" value="1000" units="1/cm"/>
+          <inkml:channelProperty channel="F" name="resolution" value="0" units="1/dev"/>
+        </inkml:channelProperties>
+      </inkml:inkSource>
+      <inkml:timestamp xml:id="ts0" timeString="2025-09-02T14:15:03.993"/>
+    </inkml:context>
+    <inkml:brush xml:id="br0">
+      <inkml:brushProperty name="width" value="0.05" units="cm"/>
+      <inkml:brushProperty name="height" value="0.05" units="cm"/>
+    </inkml:brush>
+  </inkml:definitions>
+  <inkml:trace contextRef="#ctx0" brushRef="#br0">84 1 24575,'-1'6'0,"1"1"0,-1-1 0,0 1 0,0-1 0,-1 0 0,0 1 0,0-1 0,-4 8 0,-1 3 0,0 4 0,5-15 0,0-1 0,1 0 0,-2 0 0,1 1 0,-1-1 0,0-1 0,0 1 0,-5 7 0,6-10 2,-1 1 0,2 0 0,-1 0 0,0 1 0,0-1 0,1 0-1,0 0 1,0 1 0,-1 4 0,-4 8-1386,2-7-5442</inkml:trace>
+  <inkml:trace contextRef="#ctx0" brushRef="#br0" timeOffset="1776.11">84 17 24575,'0'2'0,"0"4"0,0 4 0,2 1 0,2 3 0,1-2 0,1 1 0,2-3 0,-1-1 0,-1 2 0,0-2 0,0 0 0,-1 2 0,1-2 0,-1 1 0,2-2 0,2-2 0</inkml:trace>
+</inkml:ink>
+</file>
+
+<file path=word/ink/ink4.xml><?xml version="1.0" encoding="utf-8"?>
+<inkml:ink xmlns:inkml="http://www.w3.org/2003/InkML">
+  <inkml:definitions>
+    <inkml:context xml:id="ctx0">
+      <inkml:inkSource xml:id="inkSrc0">
+        <inkml:traceFormat>
+          <inkml:channel name="X" type="integer" min="-2.14748E9" max="2.14748E9" units="cm"/>
+          <inkml:channel name="Y" type="integer" min="-2.14748E9" max="2.14748E9" units="cm"/>
+          <inkml:channel name="F" type="integer" max="32767" units="dev"/>
+        </inkml:traceFormat>
+        <inkml:channelProperties>
+          <inkml:channelProperty channel="X" name="resolution" value="1000" units="1/cm"/>
+          <inkml:channelProperty channel="Y" name="resolution" value="1000" units="1/cm"/>
+          <inkml:channelProperty channel="F" name="resolution" value="0" units="1/dev"/>
+        </inkml:channelProperties>
+      </inkml:inkSource>
+      <inkml:timestamp xml:id="ts0" timeString="2025-09-02T14:14:53.336"/>
+    </inkml:context>
+    <inkml:brush xml:id="br0">
+      <inkml:brushProperty name="width" value="0.05" units="cm"/>
+      <inkml:brushProperty name="height" value="0.05" units="cm"/>
+    </inkml:brush>
+  </inkml:definitions>
+  <inkml:trace contextRef="#ctx0" brushRef="#br0">46 60 24575,'-15'121'0,"14"-107"33,-1 0-1,-1 1 1,-6 23-1,4-23-530,2 0-1,-4 26 1,6-28-6328</inkml:trace>
+  <inkml:trace contextRef="#ctx0" brushRef="#br0" timeOffset="1506.42">62 0 24575,'7'8'0,"-1"1"0,0 0 0,-1 0 0,0 0 0,0 1 0,-1-1 0,0 1 0,-1 0 0,0 1 0,2 12 0,-2-9 0,1 0 0,0 0 0,1 0 0,13 23 0,-2-8-682,23 58-1,-35-78-6143</inkml:trace>
+</inkml:ink>
+</file>
+
 <file path=word/theme/theme1.xml><?xml version="1.0" encoding="utf-8"?>
 <a:theme xmlns:a="http://schemas.openxmlformats.org/drawingml/2006/main" name="Motiv Office">
   <a:themeElements>

</xml_diff>

<commit_message>
Mierne úpravy schémy, dopísanie niektorých častí príručky a pomerne rozsiahle opravy a optimalizácie firmvéru.
</commit_message>
<xml_diff>
--- a/docs/prirucka.docx
+++ b/docs/prirucka.docx
@@ -219,7 +219,7 @@
           <w:pPr>
             <w:pStyle w:val="Obsah1"/>
             <w:tabs>
-              <w:tab w:val="right" w:leader="dot" w:pos="9062"/>
+              <w:tab w:val="right" w:leader="dot" w:pos="10456"/>
             </w:tabs>
             <w:rPr>
               <w:rFonts w:asciiTheme="minorHAnsi" w:eastAsiaTheme="minorEastAsia" w:hAnsiTheme="minorHAnsi"/>
@@ -236,7 +236,7 @@
           <w:r>
             <w:fldChar w:fldCharType="separate"/>
           </w:r>
-          <w:hyperlink w:anchor="_Toc206799302" w:history="1">
+          <w:hyperlink w:anchor="_Toc211153204" w:history="1">
             <w:r>
               <w:rPr>
                 <w:rStyle w:val="Hypertextovodkaz"/>
@@ -263,7 +263,7 @@
                 <w:noProof/>
                 <w:webHidden/>
               </w:rPr>
-              <w:instrText xml:space="preserve"> PAGEREF _Toc206799302 \h </w:instrText>
+              <w:instrText xml:space="preserve"> PAGEREF _Toc211153204 \h </w:instrText>
             </w:r>
             <w:r>
               <w:rPr>
@@ -283,7 +283,7 @@
                 <w:noProof/>
                 <w:webHidden/>
               </w:rPr>
-              <w:t>5</w:t>
+              <w:t>3</w:t>
             </w:r>
             <w:r>
               <w:rPr>
@@ -298,7 +298,7 @@
           <w:pPr>
             <w:pStyle w:val="Obsah2"/>
             <w:tabs>
-              <w:tab w:val="right" w:leader="dot" w:pos="9062"/>
+              <w:tab w:val="right" w:leader="dot" w:pos="10456"/>
             </w:tabs>
             <w:rPr>
               <w:rFonts w:asciiTheme="minorHAnsi" w:eastAsiaTheme="minorEastAsia" w:hAnsiTheme="minorHAnsi"/>
@@ -306,13 +306,13 @@
               <w:lang w:eastAsia="sk-SK"/>
             </w:rPr>
           </w:pPr>
-          <w:hyperlink w:anchor="_Toc206799303" w:history="1">
+          <w:hyperlink w:anchor="_Toc211153205" w:history="1">
             <w:r>
               <w:rPr>
                 <w:rStyle w:val="Hypertextovodkaz"/>
                 <w:noProof/>
               </w:rPr>
-              <w:t>&lt;HISTORIA NUMITRONOV&gt;</w:t>
+              <w:t>História numitronov</w:t>
             </w:r>
             <w:r>
               <w:rPr>
@@ -333,7 +333,7 @@
                 <w:noProof/>
                 <w:webHidden/>
               </w:rPr>
-              <w:instrText xml:space="preserve"> PAGEREF _Toc206799303 \h </w:instrText>
+              <w:instrText xml:space="preserve"> PAGEREF _Toc211153205 \h </w:instrText>
             </w:r>
             <w:r>
               <w:rPr>
@@ -353,7 +353,7 @@
                 <w:noProof/>
                 <w:webHidden/>
               </w:rPr>
-              <w:t>5</w:t>
+              <w:t>3</w:t>
             </w:r>
             <w:r>
               <w:rPr>
@@ -368,7 +368,7 @@
           <w:pPr>
             <w:pStyle w:val="Obsah2"/>
             <w:tabs>
-              <w:tab w:val="right" w:leader="dot" w:pos="9062"/>
+              <w:tab w:val="right" w:leader="dot" w:pos="10456"/>
             </w:tabs>
             <w:rPr>
               <w:rFonts w:asciiTheme="minorHAnsi" w:eastAsiaTheme="minorEastAsia" w:hAnsiTheme="minorHAnsi"/>
@@ -376,13 +376,13 @@
               <w:lang w:eastAsia="sk-SK"/>
             </w:rPr>
           </w:pPr>
-          <w:hyperlink w:anchor="_Toc206799304" w:history="1">
+          <w:hyperlink w:anchor="_Toc211153206" w:history="1">
             <w:r>
               <w:rPr>
                 <w:rStyle w:val="Hypertextovodkaz"/>
                 <w:noProof/>
               </w:rPr>
-              <w:t>&lt;OVLÁDANIE&gt;</w:t>
+              <w:t>Ovládanie</w:t>
             </w:r>
             <w:r>
               <w:rPr>
@@ -403,7 +403,7 @@
                 <w:noProof/>
                 <w:webHidden/>
               </w:rPr>
-              <w:instrText xml:space="preserve"> PAGEREF _Toc206799304 \h </w:instrText>
+              <w:instrText xml:space="preserve"> PAGEREF _Toc211153206 \h </w:instrText>
             </w:r>
             <w:r>
               <w:rPr>
@@ -423,7 +423,7 @@
                 <w:noProof/>
                 <w:webHidden/>
               </w:rPr>
-              <w:t>5</w:t>
+              <w:t>3</w:t>
             </w:r>
             <w:r>
               <w:rPr>
@@ -438,7 +438,7 @@
           <w:pPr>
             <w:pStyle w:val="Obsah2"/>
             <w:tabs>
-              <w:tab w:val="right" w:leader="dot" w:pos="9062"/>
+              <w:tab w:val="right" w:leader="dot" w:pos="10456"/>
             </w:tabs>
             <w:rPr>
               <w:rFonts w:asciiTheme="minorHAnsi" w:eastAsiaTheme="minorEastAsia" w:hAnsiTheme="minorHAnsi"/>
@@ -446,13 +446,13 @@
               <w:lang w:eastAsia="sk-SK"/>
             </w:rPr>
           </w:pPr>
-          <w:hyperlink w:anchor="_Toc206799305" w:history="1">
+          <w:hyperlink w:anchor="_Toc211153207" w:history="1">
             <w:r>
               <w:rPr>
                 <w:rStyle w:val="Hypertextovodkaz"/>
                 <w:noProof/>
               </w:rPr>
-              <w:t>Firmvér</w:t>
+              <w:t>Nastavenia:</w:t>
             </w:r>
             <w:r>
               <w:rPr>
@@ -473,7 +473,7 @@
                 <w:noProof/>
                 <w:webHidden/>
               </w:rPr>
-              <w:instrText xml:space="preserve"> PAGEREF _Toc206799305 \h </w:instrText>
+              <w:instrText xml:space="preserve"> PAGEREF _Toc211153207 \h </w:instrText>
             </w:r>
             <w:r>
               <w:rPr>
@@ -493,7 +493,7 @@
                 <w:noProof/>
                 <w:webHidden/>
               </w:rPr>
-              <w:t>5</w:t>
+              <w:t>3</w:t>
             </w:r>
             <w:r>
               <w:rPr>
@@ -508,7 +508,7 @@
           <w:pPr>
             <w:pStyle w:val="Obsah2"/>
             <w:tabs>
-              <w:tab w:val="right" w:leader="dot" w:pos="9062"/>
+              <w:tab w:val="right" w:leader="dot" w:pos="10456"/>
             </w:tabs>
             <w:rPr>
               <w:rFonts w:asciiTheme="minorHAnsi" w:eastAsiaTheme="minorEastAsia" w:hAnsiTheme="minorHAnsi"/>
@@ -516,13 +516,13 @@
               <w:lang w:eastAsia="sk-SK"/>
             </w:rPr>
           </w:pPr>
-          <w:hyperlink w:anchor="_Toc206799306" w:history="1">
+          <w:hyperlink w:anchor="_Toc211153208" w:history="1">
             <w:r>
               <w:rPr>
                 <w:rStyle w:val="Hypertextovodkaz"/>
                 <w:noProof/>
               </w:rPr>
-              <w:t>Manuálne nastavovanie</w:t>
+              <w:t>Firmvér</w:t>
             </w:r>
             <w:r>
               <w:rPr>
@@ -543,7 +543,7 @@
                 <w:noProof/>
                 <w:webHidden/>
               </w:rPr>
-              <w:instrText xml:space="preserve"> PAGEREF _Toc206799306 \h </w:instrText>
+              <w:instrText xml:space="preserve"> PAGEREF _Toc211153208 \h </w:instrText>
             </w:r>
             <w:r>
               <w:rPr>
@@ -563,7 +563,7 @@
                 <w:noProof/>
                 <w:webHidden/>
               </w:rPr>
-              <w:t>5</w:t>
+              <w:t>3</w:t>
             </w:r>
             <w:r>
               <w:rPr>
@@ -578,7 +578,7 @@
           <w:pPr>
             <w:pStyle w:val="Obsah2"/>
             <w:tabs>
-              <w:tab w:val="right" w:leader="dot" w:pos="9062"/>
+              <w:tab w:val="right" w:leader="dot" w:pos="10456"/>
             </w:tabs>
             <w:rPr>
               <w:rFonts w:asciiTheme="minorHAnsi" w:eastAsiaTheme="minorEastAsia" w:hAnsiTheme="minorHAnsi"/>
@@ -586,13 +586,13 @@
               <w:lang w:eastAsia="sk-SK"/>
             </w:rPr>
           </w:pPr>
-          <w:hyperlink w:anchor="_Toc206799307" w:history="1">
+          <w:hyperlink w:anchor="_Toc211153209" w:history="1">
             <w:r>
               <w:rPr>
                 <w:rStyle w:val="Hypertextovodkaz"/>
                 <w:noProof/>
               </w:rPr>
-              <w:t>Napájanie</w:t>
+              <w:t>Manuálne nastavovanie</w:t>
             </w:r>
             <w:r>
               <w:rPr>
@@ -613,7 +613,7 @@
                 <w:noProof/>
                 <w:webHidden/>
               </w:rPr>
-              <w:instrText xml:space="preserve"> PAGEREF _Toc206799307 \h </w:instrText>
+              <w:instrText xml:space="preserve"> PAGEREF _Toc211153209 \h </w:instrText>
             </w:r>
             <w:r>
               <w:rPr>
@@ -633,7 +633,7 @@
                 <w:noProof/>
                 <w:webHidden/>
               </w:rPr>
-              <w:t>6</w:t>
+              <w:t>3</w:t>
             </w:r>
             <w:r>
               <w:rPr>
@@ -648,7 +648,7 @@
           <w:pPr>
             <w:pStyle w:val="Obsah2"/>
             <w:tabs>
-              <w:tab w:val="right" w:leader="dot" w:pos="9062"/>
+              <w:tab w:val="right" w:leader="dot" w:pos="10456"/>
             </w:tabs>
             <w:rPr>
               <w:rFonts w:asciiTheme="minorHAnsi" w:eastAsiaTheme="minorEastAsia" w:hAnsiTheme="minorHAnsi"/>
@@ -656,13 +656,13 @@
               <w:lang w:eastAsia="sk-SK"/>
             </w:rPr>
           </w:pPr>
-          <w:hyperlink w:anchor="_Toc206799308" w:history="1">
+          <w:hyperlink w:anchor="_Toc211153210" w:history="1">
             <w:r>
               <w:rPr>
                 <w:rStyle w:val="Hypertextovodkaz"/>
                 <w:noProof/>
               </w:rPr>
-              <w:t>Prijímač DCF77</w:t>
+              <w:t>Napájanie</w:t>
             </w:r>
             <w:r>
               <w:rPr>
@@ -683,7 +683,7 @@
                 <w:noProof/>
                 <w:webHidden/>
               </w:rPr>
-              <w:instrText xml:space="preserve"> PAGEREF _Toc206799308 \h </w:instrText>
+              <w:instrText xml:space="preserve"> PAGEREF _Toc211153210 \h </w:instrText>
             </w:r>
             <w:r>
               <w:rPr>
@@ -703,7 +703,7 @@
                 <w:noProof/>
                 <w:webHidden/>
               </w:rPr>
-              <w:t>6</w:t>
+              <w:t>3</w:t>
             </w:r>
             <w:r>
               <w:rPr>
@@ -718,7 +718,7 @@
           <w:pPr>
             <w:pStyle w:val="Obsah2"/>
             <w:tabs>
-              <w:tab w:val="right" w:leader="dot" w:pos="9062"/>
+              <w:tab w:val="right" w:leader="dot" w:pos="10456"/>
             </w:tabs>
             <w:rPr>
               <w:rFonts w:asciiTheme="minorHAnsi" w:eastAsiaTheme="minorEastAsia" w:hAnsiTheme="minorHAnsi"/>
@@ -726,13 +726,13 @@
               <w:lang w:eastAsia="sk-SK"/>
             </w:rPr>
           </w:pPr>
-          <w:hyperlink w:anchor="_Toc206799309" w:history="1">
+          <w:hyperlink w:anchor="_Toc211153211" w:history="1">
             <w:r>
               <w:rPr>
                 <w:rStyle w:val="Hypertextovodkaz"/>
                 <w:noProof/>
               </w:rPr>
-              <w:t>Záložná batéria</w:t>
+              <w:t>Prijímač DCF77</w:t>
             </w:r>
             <w:r>
               <w:rPr>
@@ -753,7 +753,7 @@
                 <w:noProof/>
                 <w:webHidden/>
               </w:rPr>
-              <w:instrText xml:space="preserve"> PAGEREF _Toc206799309 \h </w:instrText>
+              <w:instrText xml:space="preserve"> PAGEREF _Toc211153211 \h </w:instrText>
             </w:r>
             <w:r>
               <w:rPr>
@@ -773,7 +773,7 @@
                 <w:noProof/>
                 <w:webHidden/>
               </w:rPr>
-              <w:t>7</w:t>
+              <w:t>3</w:t>
             </w:r>
             <w:r>
               <w:rPr>
@@ -788,7 +788,7 @@
           <w:pPr>
             <w:pStyle w:val="Obsah2"/>
             <w:tabs>
-              <w:tab w:val="right" w:leader="dot" w:pos="9062"/>
+              <w:tab w:val="right" w:leader="dot" w:pos="10456"/>
             </w:tabs>
             <w:rPr>
               <w:rFonts w:asciiTheme="minorHAnsi" w:eastAsiaTheme="minorEastAsia" w:hAnsiTheme="minorHAnsi"/>
@@ -796,13 +796,13 @@
               <w:lang w:eastAsia="sk-SK"/>
             </w:rPr>
           </w:pPr>
-          <w:hyperlink w:anchor="_Toc206799310" w:history="1">
+          <w:hyperlink w:anchor="_Toc211153212" w:history="1">
             <w:r>
               <w:rPr>
                 <w:rStyle w:val="Hypertextovodkaz"/>
                 <w:noProof/>
               </w:rPr>
-              <w:t>Poistka</w:t>
+              <w:t>Záložná batéria</w:t>
             </w:r>
             <w:r>
               <w:rPr>
@@ -823,7 +823,7 @@
                 <w:noProof/>
                 <w:webHidden/>
               </w:rPr>
-              <w:instrText xml:space="preserve"> PAGEREF _Toc206799310 \h </w:instrText>
+              <w:instrText xml:space="preserve"> PAGEREF _Toc211153212 \h </w:instrText>
             </w:r>
             <w:r>
               <w:rPr>
@@ -843,7 +843,7 @@
                 <w:noProof/>
                 <w:webHidden/>
               </w:rPr>
-              <w:t>8</w:t>
+              <w:t>4</w:t>
             </w:r>
             <w:r>
               <w:rPr>
@@ -858,7 +858,7 @@
           <w:pPr>
             <w:pStyle w:val="Obsah2"/>
             <w:tabs>
-              <w:tab w:val="right" w:leader="dot" w:pos="9062"/>
+              <w:tab w:val="right" w:leader="dot" w:pos="10456"/>
             </w:tabs>
             <w:rPr>
               <w:rFonts w:asciiTheme="minorHAnsi" w:eastAsiaTheme="minorEastAsia" w:hAnsiTheme="minorHAnsi"/>
@@ -866,13 +866,13 @@
               <w:lang w:eastAsia="sk-SK"/>
             </w:rPr>
           </w:pPr>
-          <w:hyperlink w:anchor="_Toc206799311" w:history="1">
+          <w:hyperlink w:anchor="_Toc211153213" w:history="1">
             <w:r>
               <w:rPr>
                 <w:rStyle w:val="Hypertextovodkaz"/>
                 <w:noProof/>
               </w:rPr>
-              <w:t>Servis</w:t>
+              <w:t>Úložný priestor</w:t>
             </w:r>
             <w:r>
               <w:rPr>
@@ -893,7 +893,7 @@
                 <w:noProof/>
                 <w:webHidden/>
               </w:rPr>
-              <w:instrText xml:space="preserve"> PAGEREF _Toc206799311 \h </w:instrText>
+              <w:instrText xml:space="preserve"> PAGEREF _Toc211153213 \h </w:instrText>
             </w:r>
             <w:r>
               <w:rPr>
@@ -913,7 +913,7 @@
                 <w:noProof/>
                 <w:webHidden/>
               </w:rPr>
-              <w:t>8</w:t>
+              <w:t>4</w:t>
             </w:r>
             <w:r>
               <w:rPr>
@@ -928,7 +928,7 @@
           <w:pPr>
             <w:pStyle w:val="Obsah2"/>
             <w:tabs>
-              <w:tab w:val="right" w:leader="dot" w:pos="9062"/>
+              <w:tab w:val="right" w:leader="dot" w:pos="10456"/>
             </w:tabs>
             <w:rPr>
               <w:rFonts w:asciiTheme="minorHAnsi" w:eastAsiaTheme="minorEastAsia" w:hAnsiTheme="minorHAnsi"/>
@@ -936,12 +936,152 @@
               <w:lang w:eastAsia="sk-SK"/>
             </w:rPr>
           </w:pPr>
-          <w:hyperlink w:anchor="_Toc206799312" w:history="1">
+          <w:hyperlink w:anchor="_Toc211153214" w:history="1">
             <w:r>
               <w:rPr>
                 <w:rStyle w:val="Hypertextovodkaz"/>
                 <w:noProof/>
               </w:rPr>
+              <w:t>Poistka</w:t>
+            </w:r>
+            <w:r>
+              <w:rPr>
+                <w:noProof/>
+                <w:webHidden/>
+              </w:rPr>
+              <w:tab/>
+            </w:r>
+            <w:r>
+              <w:rPr>
+                <w:noProof/>
+                <w:webHidden/>
+              </w:rPr>
+              <w:fldChar w:fldCharType="begin"/>
+            </w:r>
+            <w:r>
+              <w:rPr>
+                <w:noProof/>
+                <w:webHidden/>
+              </w:rPr>
+              <w:instrText xml:space="preserve"> PAGEREF _Toc211153214 \h </w:instrText>
+            </w:r>
+            <w:r>
+              <w:rPr>
+                <w:noProof/>
+                <w:webHidden/>
+              </w:rPr>
+            </w:r>
+            <w:r>
+              <w:rPr>
+                <w:noProof/>
+                <w:webHidden/>
+              </w:rPr>
+              <w:fldChar w:fldCharType="separate"/>
+            </w:r>
+            <w:r>
+              <w:rPr>
+                <w:noProof/>
+                <w:webHidden/>
+              </w:rPr>
+              <w:t>4</w:t>
+            </w:r>
+            <w:r>
+              <w:rPr>
+                <w:noProof/>
+                <w:webHidden/>
+              </w:rPr>
+              <w:fldChar w:fldCharType="end"/>
+            </w:r>
+          </w:hyperlink>
+        </w:p>
+        <w:p>
+          <w:pPr>
+            <w:pStyle w:val="Obsah2"/>
+            <w:tabs>
+              <w:tab w:val="right" w:leader="dot" w:pos="10456"/>
+            </w:tabs>
+            <w:rPr>
+              <w:rFonts w:asciiTheme="minorHAnsi" w:eastAsiaTheme="minorEastAsia" w:hAnsiTheme="minorHAnsi"/>
+              <w:noProof/>
+              <w:lang w:eastAsia="sk-SK"/>
+            </w:rPr>
+          </w:pPr>
+          <w:hyperlink w:anchor="_Toc211153215" w:history="1">
+            <w:r>
+              <w:rPr>
+                <w:rStyle w:val="Hypertextovodkaz"/>
+                <w:noProof/>
+              </w:rPr>
+              <w:t>Servis</w:t>
+            </w:r>
+            <w:r>
+              <w:rPr>
+                <w:noProof/>
+                <w:webHidden/>
+              </w:rPr>
+              <w:tab/>
+            </w:r>
+            <w:r>
+              <w:rPr>
+                <w:noProof/>
+                <w:webHidden/>
+              </w:rPr>
+              <w:fldChar w:fldCharType="begin"/>
+            </w:r>
+            <w:r>
+              <w:rPr>
+                <w:noProof/>
+                <w:webHidden/>
+              </w:rPr>
+              <w:instrText xml:space="preserve"> PAGEREF _Toc211153215 \h </w:instrText>
+            </w:r>
+            <w:r>
+              <w:rPr>
+                <w:noProof/>
+                <w:webHidden/>
+              </w:rPr>
+            </w:r>
+            <w:r>
+              <w:rPr>
+                <w:noProof/>
+                <w:webHidden/>
+              </w:rPr>
+              <w:fldChar w:fldCharType="separate"/>
+            </w:r>
+            <w:r>
+              <w:rPr>
+                <w:noProof/>
+                <w:webHidden/>
+              </w:rPr>
+              <w:t>4</w:t>
+            </w:r>
+            <w:r>
+              <w:rPr>
+                <w:noProof/>
+                <w:webHidden/>
+              </w:rPr>
+              <w:fldChar w:fldCharType="end"/>
+            </w:r>
+          </w:hyperlink>
+        </w:p>
+        <w:p>
+          <w:pPr>
+            <w:pStyle w:val="Obsah2"/>
+            <w:tabs>
+              <w:tab w:val="right" w:leader="dot" w:pos="10456"/>
+            </w:tabs>
+            <w:rPr>
+              <w:rFonts w:asciiTheme="minorHAnsi" w:eastAsiaTheme="minorEastAsia" w:hAnsiTheme="minorHAnsi"/>
+              <w:noProof/>
+              <w:lang w:eastAsia="sk-SK"/>
+            </w:rPr>
+          </w:pPr>
+          <w:hyperlink w:anchor="_Toc211153216" w:history="1">
+            <w:r>
+              <w:rPr>
+                <w:rStyle w:val="Hypertextovodkaz"/>
+                <w:noProof/>
+              </w:rPr>
               <w:t>Spolupracovali</w:t>
             </w:r>
             <w:r>
@@ -963,7 +1103,7 @@
                 <w:noProof/>
                 <w:webHidden/>
               </w:rPr>
-              <w:instrText xml:space="preserve"> PAGEREF _Toc206799312 \h </w:instrText>
+              <w:instrText xml:space="preserve"> PAGEREF _Toc211153216 \h </w:instrText>
             </w:r>
             <w:r>
               <w:rPr>
@@ -983,7 +1123,7 @@
                 <w:noProof/>
                 <w:webHidden/>
               </w:rPr>
-              <w:t>9</w:t>
+              <w:t>5</w:t>
             </w:r>
             <w:r>
               <w:rPr>
@@ -1015,7 +1155,7 @@
       <w:pPr>
         <w:pStyle w:val="Nadpis1"/>
       </w:pPr>
-      <w:bookmarkStart w:id="0" w:name="_Toc206799302"/>
+      <w:bookmarkStart w:id="0" w:name="_Toc211153204"/>
       <w:r>
         <w:lastRenderedPageBreak/>
         <w:t>N</w:t>
@@ -1035,15 +1175,31 @@
       <w:pPr>
         <w:rPr>
           <w:rFonts w:cs="Courier New"/>
+        </w:rPr>
+      </w:pPr>
+      <w:bookmarkStart w:id="1" w:name="_Toc211153205"/>
+      <w:r>
+        <w:rPr>
+          <w:rStyle w:val="Nadpis2Char"/>
+        </w:rPr>
+        <w:t xml:space="preserve">História </w:t>
+      </w:r>
+      <w:proofErr w:type="spellStart"/>
+      <w:r>
+        <w:rPr>
+          <w:rStyle w:val="Nadpis2Char"/>
+        </w:rPr>
+        <w:t>numitronov</w:t>
+      </w:r>
+      <w:bookmarkEnd w:id="1"/>
+      <w:proofErr w:type="spellEnd"/>
+      <w:r>
+        <w:rPr>
+          <w:rFonts w:cs="Courier New"/>
           <w:b/>
           <w:bCs/>
         </w:rPr>
-      </w:pPr>
-      <w:r>
-        <w:rPr>
-          <w:rStyle w:val="Nadpis2Char"/>
-        </w:rPr>
-        <w:t>História numitronov</w:t>
+        <w:t xml:space="preserve"> IV-9</w:t>
       </w:r>
       <w:r>
         <w:rPr>
@@ -1051,25 +1207,25 @@
           <w:b/>
           <w:bCs/>
         </w:rPr>
-        <w:t xml:space="preserve"> IV-9</w:t>
-      </w:r>
-      <w:r>
+        <w:br/>
+      </w:r>
+      <w:r>
+        <w:rPr>
+          <w:rFonts w:cs="Courier New"/>
+        </w:rPr>
+        <w:t>TODO</w:t>
+      </w:r>
+      <w:bookmarkStart w:id="2" w:name="_Toc211153206"/>
+    </w:p>
+    <w:p>
+      <w:pPr>
         <w:rPr>
           <w:rFonts w:cs="Courier New"/>
           <w:b/>
           <w:bCs/>
         </w:rPr>
-        <w:br/>
-      </w:r>
-      <w:r>
-        <w:rPr>
-          <w:rFonts w:cs="Courier New"/>
-        </w:rPr>
-        <w:t>TODO</w:t>
-      </w:r>
-      <w:bookmarkStart w:id="1" w:name="_Toc206799304"/>
+      </w:pPr>
     </w:p>
-    <w:bookmarkEnd w:id="1"/>
     <w:p>
       <w:pPr>
         <w:pStyle w:val="Nadpis2"/>
@@ -1077,6 +1233,7 @@
       <w:r>
         <w:t>Ovládanie</w:t>
       </w:r>
+      <w:bookmarkEnd w:id="2"/>
     </w:p>
     <w:p>
       <w:r>
@@ -1088,10 +1245,11 @@
       <w:pPr>
         <w:pStyle w:val="Nadpis2"/>
       </w:pPr>
-      <w:bookmarkStart w:id="2" w:name="_Toc206799305"/>
+      <w:bookmarkStart w:id="3" w:name="_Toc211153207"/>
       <w:r>
         <w:t>Nastavenia:</w:t>
       </w:r>
+      <w:bookmarkEnd w:id="3"/>
     </w:p>
     <w:p>
       <w:r>
@@ -1323,13 +1481,21 @@
       </w:r>
     </w:p>
     <w:p>
-      <w:r>
+      <w:pPr>
         <w:rPr>
           <w:rStyle w:val="Nadpis2Char"/>
         </w:rPr>
+      </w:pPr>
+    </w:p>
+    <w:p>
+      <w:bookmarkStart w:id="4" w:name="_Toc211153208"/>
+      <w:r>
+        <w:rPr>
+          <w:rStyle w:val="Nadpis2Char"/>
+        </w:rPr>
         <w:t>Firmvér</w:t>
       </w:r>
-      <w:bookmarkEnd w:id="2"/>
+      <w:bookmarkEnd w:id="4"/>
       <w:r>
         <w:rPr>
           <w:rFonts w:cs="Courier New"/>
@@ -1402,6 +1568,12 @@
           <w:rFonts w:cs="Courier New"/>
         </w:rPr>
         <w:t>I, ktorý je možné v prípade potreby preinštalovať pomocou ICSP zbernice osadenej na doske hodín.</w:t>
+      </w:r>
+      <w:r>
+        <w:rPr>
+          <w:rFonts w:cs="Courier New"/>
+        </w:rPr>
+        <w:t xml:space="preserve"> Pri nahrávaní nového programu do čipu hodín svieti indikačná LED-ka jasnou modrou farbou.</w:t>
       </w:r>
     </w:p>
     <w:p/>
@@ -1409,11 +1581,11 @@
       <w:pPr>
         <w:pStyle w:val="Nadpis2"/>
       </w:pPr>
-      <w:bookmarkStart w:id="3" w:name="_Toc206799306"/>
+      <w:bookmarkStart w:id="5" w:name="_Toc211153209"/>
       <w:r>
         <w:t>Manuálne nastavovanie</w:t>
       </w:r>
-      <w:bookmarkEnd w:id="3"/>
+      <w:bookmarkEnd w:id="5"/>
     </w:p>
     <w:p>
       <w:pPr>
@@ -1444,14 +1616,14 @@
           <w:rFonts w:cs="Courier New"/>
         </w:rPr>
       </w:pPr>
-      <w:bookmarkStart w:id="4" w:name="_Toc206799307"/>
+      <w:bookmarkStart w:id="6" w:name="_Toc211153210"/>
       <w:r>
         <w:rPr>
           <w:rStyle w:val="Nadpis2Char"/>
         </w:rPr>
         <w:t>Napájanie</w:t>
       </w:r>
-      <w:bookmarkEnd w:id="4"/>
+      <w:bookmarkEnd w:id="6"/>
       <w:r>
         <w:rPr>
           <w:rFonts w:cs="Courier New"/>
@@ -1464,7 +1636,49 @@
         <w:rPr>
           <w:rFonts w:cs="Courier New"/>
         </w:rPr>
-        <w:t>Hodiny sa napájajú zo zdroja s výstupom 5V schopným dodať aspoň 10W. Zdroj by mal byť ideálne spínaný pre čo najnižšiu stratovosť s frekvenciou spínania vyššou ako 77.5 kHz aby sa predišlo rušeniu DCF77 prijímača.</w:t>
+        <w:t>Hodiny sa napájajú zo zdroja s výstupom 5</w:t>
+      </w:r>
+      <w:r>
+        <w:rPr>
+          <w:rFonts w:cs="Courier New"/>
+        </w:rPr>
+        <w:t xml:space="preserve"> </w:t>
+      </w:r>
+      <w:r>
+        <w:rPr>
+          <w:rFonts w:cs="Courier New"/>
+        </w:rPr>
+        <w:t xml:space="preserve">V schopným dodať aspoň </w:t>
+      </w:r>
+      <w:r>
+        <w:rPr>
+          <w:rFonts w:cs="Courier New"/>
+        </w:rPr>
+        <w:t>5</w:t>
+      </w:r>
+      <w:r>
+        <w:rPr>
+          <w:rFonts w:cs="Courier New"/>
+        </w:rPr>
+        <w:t xml:space="preserve"> </w:t>
+      </w:r>
+      <w:r>
+        <w:rPr>
+          <w:rFonts w:cs="Courier New"/>
+        </w:rPr>
+        <w:t>W. Zdroj by mal byť ideálne spínaný pre čo najnižšiu stratovosť s frekvenciou spínania</w:t>
+      </w:r>
+      <w:r>
+        <w:rPr>
+          <w:rFonts w:cs="Courier New"/>
+        </w:rPr>
+        <w:t xml:space="preserve"> rádovo</w:t>
+      </w:r>
+      <w:r>
+        <w:rPr>
+          <w:rFonts w:cs="Courier New"/>
+        </w:rPr>
+        <w:t xml:space="preserve"> vyššou ako 77.5 kHz aby sa predišlo rušeniu DCF77 prijímača.</w:t>
       </w:r>
     </w:p>
     <w:p>
@@ -1480,7 +1694,7 @@
           <w:rFonts w:cs="Courier New"/>
         </w:rPr>
       </w:pPr>
-      <w:bookmarkStart w:id="5" w:name="_Toc206799308"/>
+      <w:bookmarkStart w:id="7" w:name="_Toc211153211"/>
       <w:r>
         <w:rPr>
           <w:rStyle w:val="Nadpis2Char"/>
@@ -1511,7 +1725,7 @@
         </w:rPr>
         <w:t>mač DCF77</w:t>
       </w:r>
-      <w:bookmarkEnd w:id="5"/>
+      <w:bookmarkEnd w:id="7"/>
       <w:r>
         <w:rPr>
           <w:rFonts w:cs="Courier New"/>
@@ -1524,7 +1738,33 @@
         <w:rPr>
           <w:rFonts w:cs="Courier New"/>
         </w:rPr>
-        <w:t>V podstavci je umiestnená 140 milimetrová feritová anténa vlastnej výroby, odladená tak aby rezonovala pri frekvencii 77,5kHz na ktorej vysielajú atómové hodiny z Mainflingenu (Nemecko) svoj časový signál. Tento signál používajú hodiny k automatickému nastaveniu času a prechodu zo zimného času na letný a naopak.</w:t>
+        <w:t>V podstavci je umiestnená 140 milimetrová feritová anténa vlastnej výroby, odladená tak aby rezonovala pri frekvencii 77,5</w:t>
+      </w:r>
+      <w:r>
+        <w:rPr>
+          <w:rFonts w:cs="Courier New"/>
+        </w:rPr>
+        <w:t xml:space="preserve"> </w:t>
+      </w:r>
+      <w:r>
+        <w:rPr>
+          <w:rFonts w:cs="Courier New"/>
+        </w:rPr>
+        <w:t>kHz na ktorej vysielajú atómové hodiny z </w:t>
+      </w:r>
+      <w:proofErr w:type="spellStart"/>
+      <w:r>
+        <w:rPr>
+          <w:rFonts w:cs="Courier New"/>
+        </w:rPr>
+        <w:t>Mainflingenu</w:t>
+      </w:r>
+      <w:proofErr w:type="spellEnd"/>
+      <w:r>
+        <w:rPr>
+          <w:rFonts w:cs="Courier New"/>
+        </w:rPr>
+        <w:t xml:space="preserve"> (Nemecko) svoj časový signál. Tento signál používajú hodiny k automatickému nastaveniu času a prechodu zo zimného času na letný a naopak.</w:t>
       </w:r>
       <w:r>
         <w:rPr>
@@ -1536,14 +1776,20 @@
         <w:rPr>
           <w:rFonts w:cs="Courier New"/>
         </w:rPr>
-        <w:t>&lt;POPIS indikačnej LED&gt;</w:t>
-      </w:r>
-      <w:r>
-        <w:rPr>
-          <w:rFonts w:cs="Courier New"/>
-        </w:rPr>
         <w:br/>
-        <w:t>&lt;POPIS ZAHAJENIA MANULANEJ SYNCHRONIZACIE&gt;</w:t>
+        <w:t xml:space="preserve">Keďže feritové antény sú </w:t>
+      </w:r>
+      <w:r>
+        <w:rPr>
+          <w:rFonts w:cs="Courier New"/>
+        </w:rPr>
+        <w:t xml:space="preserve">z povahy </w:t>
+      </w:r>
+      <w:r>
+        <w:rPr>
+          <w:rFonts w:cs="Courier New"/>
+        </w:rPr>
+        <w:t>závislé od orientácie, odporúčame mať hodiny otočené čelom na server alebo juh.</w:t>
       </w:r>
     </w:p>
     <w:p>
@@ -1552,172 +1798,334 @@
           <w:rFonts w:cs="Courier New"/>
         </w:rPr>
       </w:pPr>
+      <w:r>
+        <w:rPr>
+          <w:rFonts w:cs="Courier New"/>
+        </w:rPr>
+        <w:lastRenderedPageBreak/>
+        <w:t>Počas synchronizácie, bliká indikačná LED-ka červenou farbou. Pri dobrej kvalite signálu a správnej orientácii hodín, by mala byť frekvencia blikanie 1 Hz. Po úspešnej synchronizácii času, svieti LED-ka stálou zelenou farbou. V prípade potreby sa tejto indikačnej LED-</w:t>
+      </w:r>
+      <w:proofErr w:type="spellStart"/>
+      <w:r>
+        <w:rPr>
+          <w:rFonts w:cs="Courier New"/>
+        </w:rPr>
+        <w:t>ke</w:t>
+      </w:r>
+      <w:proofErr w:type="spellEnd"/>
+      <w:r>
+        <w:rPr>
+          <w:rFonts w:cs="Courier New"/>
+        </w:rPr>
+        <w:t xml:space="preserve"> dá upraviť jas alebo sa dá kompletne vypnúť v nastaveniach.</w:t>
+      </w:r>
     </w:p>
     <w:p>
       <w:pPr>
-        <w:pStyle w:val="Nadpis2"/>
-      </w:pPr>
-      <w:bookmarkStart w:id="6" w:name="_Toc206799309"/>
-      <w:r>
-        <w:t>Záložná batéria</w:t>
-      </w:r>
-      <w:bookmarkEnd w:id="6"/>
+        <w:rPr>
+          <w:rFonts w:cs="Courier New"/>
+        </w:rPr>
+      </w:pPr>
+      <w:r>
+        <w:rPr>
+          <w:rFonts w:cs="Courier New"/>
+        </w:rPr>
+        <w:t xml:space="preserve">Hodiny sa synchronizujú automaticky v pravidelných intervaloch (zvyčajne v noci). </w:t>
+      </w:r>
+      <w:r>
+        <w:rPr>
+          <w:rFonts w:cs="Courier New"/>
+        </w:rPr>
+        <w:t>Ak chcete synchronizáciu vynútiť, v nastaveniach vypnite DCF77 modul a opäť ho zapnite.</w:t>
+      </w:r>
     </w:p>
     <w:p>
       <w:pPr>
-        <w:jc w:val="both"/>
-        <w:rPr>
-          <w:rFonts w:cs="Courier New"/>
-        </w:rPr>
-      </w:pPr>
-      <w:r>
-        <w:rPr>
-          <w:rFonts w:cs="Courier New"/>
-        </w:rPr>
-        <w:t xml:space="preserve">Napája elektroniku zodpovednú za udržovanie aktuálneho času po vypojení z el. siete. Pri bežných podmienkach by mala vydržať približne 5 rokov. </w:t>
-      </w:r>
-      <w:r>
-        <w:rPr>
-          <w:rFonts w:cs="Courier New"/>
-        </w:rPr>
-        <w:lastRenderedPageBreak/>
-        <w:t xml:space="preserve">Ak si hodiny nezachovávajú správny čas po vypojení zo siete, batériu je treba </w:t>
-      </w:r>
-      <w:r>
-        <w:rPr>
-          <w:rFonts w:cs="Courier New"/>
-        </w:rPr>
-        <w:t xml:space="preserve">vymeniť za </w:t>
-      </w:r>
-      <w:r>
-        <w:rPr>
-          <w:rFonts w:cs="Courier New"/>
-        </w:rPr>
-        <w:t>kvalitnú mincovú batériu CR2032.</w:t>
-      </w:r>
+        <w:rPr>
+          <w:rFonts w:cs="Courier New"/>
+        </w:rPr>
+      </w:pPr>
     </w:p>
     <w:p>
       <w:pPr>
-        <w:rPr>
-          <w:rFonts w:cs="Courier New"/>
-          <w:b/>
-          <w:bCs/>
-        </w:rPr>
-      </w:pPr>
-      <w:r>
-        <w:rPr>
-          <w:rFonts w:cs="Courier New"/>
-          <w:b/>
-          <w:bCs/>
-        </w:rPr>
-        <w:br w:type="page"/>
-      </w:r>
-    </w:p>
-    <w:p>
-      <w:pPr>
         <w:pStyle w:val="Nadpis2"/>
       </w:pPr>
-      <w:bookmarkStart w:id="7" w:name="_Toc206799310"/>
-      <w:r>
-        <w:lastRenderedPageBreak/>
-        <w:t>Poistka</w:t>
-      </w:r>
-      <w:bookmarkEnd w:id="7"/>
-    </w:p>
-    <w:p>
-      <w:pPr>
-        <w:jc w:val="both"/>
-        <w:rPr>
-          <w:rFonts w:cs="Courier New"/>
-        </w:rPr>
-      </w:pPr>
-      <w:r>
-        <w:rPr>
-          <w:rFonts w:cs="Courier New"/>
-        </w:rPr>
-        <w:t xml:space="preserve">Hlavná poistka je dimenzovaná tak aby sa vypálila len </w:t>
-      </w:r>
-      <w:r>
-        <w:rPr>
-          <w:rFonts w:cs="Courier New"/>
-        </w:rPr>
-        <w:t>pri</w:t>
-      </w:r>
-      <w:r>
-        <w:rPr>
-          <w:rFonts w:cs="Courier New"/>
-        </w:rPr>
-        <w:t xml:space="preserve"> k závažnej chybe v elektronike hodín. Teda</w:t>
-      </w:r>
-      <w:r>
-        <w:rPr>
-          <w:rFonts w:cs="Courier New"/>
-        </w:rPr>
-        <w:t xml:space="preserve"> pri vypálení</w:t>
-      </w:r>
-      <w:r>
-        <w:rPr>
-          <w:rFonts w:cs="Courier New"/>
-        </w:rPr>
-        <w:t>, odporúčame problém riešiť servisne.</w:t>
-      </w:r>
-    </w:p>
-    <w:p>
-      <w:pPr>
-        <w:rPr>
-          <w:rFonts w:cs="Courier New"/>
-        </w:rPr>
-      </w:pPr>
-    </w:p>
-    <w:p>
-      <w:pPr>
-        <w:pStyle w:val="Nadpis2"/>
-      </w:pPr>
-      <w:bookmarkStart w:id="8" w:name="_Toc206799311"/>
-      <w:r>
-        <w:t>Servis</w:t>
+      <w:bookmarkStart w:id="8" w:name="_Toc211153212"/>
+      <w:r>
+        <w:t>Záložná batéria</w:t>
       </w:r>
       <w:bookmarkEnd w:id="8"/>
     </w:p>
     <w:p>
       <w:pPr>
-        <w:rPr>
-          <w:rFonts w:cs="Courier New"/>
-        </w:rPr>
-      </w:pPr>
-      <w:r>
-        <w:rPr>
-          <w:rFonts w:cs="Courier New"/>
-        </w:rPr>
-        <w:t xml:space="preserve">V prípade poruchy volajte na tel. číslo +421 950 368 559 alebo </w:t>
-      </w:r>
-      <w:r>
-        <w:rPr>
-          <w:rFonts w:cs="Courier New"/>
-        </w:rPr>
-        <w:t>navštívte</w:t>
-      </w:r>
-      <w:r>
-        <w:rPr>
-          <w:rFonts w:cs="Courier New"/>
-        </w:rPr>
-        <w:t xml:space="preserve"> našu pobočku v Korni.</w:t>
+        <w:jc w:val="both"/>
+        <w:rPr>
+          <w:rFonts w:cs="Courier New"/>
+        </w:rPr>
+      </w:pPr>
+      <w:r>
+        <w:rPr>
+          <w:rFonts w:cs="Courier New"/>
+        </w:rPr>
+        <w:t xml:space="preserve">Napája elektroniku zodpovednú za udržovanie aktuálneho času po vypojení z el. siete. Pri bežných podmienkach by mala vydržať približne 5 rokov. </w:t>
+      </w:r>
+      <w:r>
+        <w:rPr>
+          <w:rFonts w:cs="Courier New"/>
+        </w:rPr>
+        <w:t xml:space="preserve">Ak si hodiny nezachovávajú správny čas po vypojení zo siete, batériu je treba </w:t>
+      </w:r>
+      <w:r>
+        <w:rPr>
+          <w:rFonts w:cs="Courier New"/>
+        </w:rPr>
+        <w:t xml:space="preserve">vymeniť za </w:t>
+      </w:r>
+      <w:r>
+        <w:rPr>
+          <w:rFonts w:cs="Courier New"/>
+        </w:rPr>
+        <w:t>kvalitnú mincovú batériu CR2032.</w:t>
       </w:r>
     </w:p>
     <w:p>
       <w:pPr>
+        <w:jc w:val="both"/>
         <w:rPr>
           <w:rFonts w:cs="Courier New"/>
           <w:b/>
           <w:bCs/>
         </w:rPr>
       </w:pPr>
-      <w:r>
+    </w:p>
+    <w:p>
+      <w:pPr>
+        <w:pStyle w:val="Nadpis2"/>
+      </w:pPr>
+      <w:bookmarkStart w:id="9" w:name="_Toc211152844"/>
+      <w:bookmarkStart w:id="10" w:name="_Toc211153213"/>
+      <w:r>
+        <w:t>Úložný priestor</w:t>
+      </w:r>
+      <w:bookmarkEnd w:id="9"/>
+      <w:bookmarkEnd w:id="10"/>
+    </w:p>
+    <w:p>
+      <w:pPr>
+        <w:jc w:val="both"/>
+        <w:rPr>
+          <w:rFonts w:cs="Courier New"/>
+        </w:rPr>
+      </w:pPr>
+      <w:r>
+        <w:rPr>
+          <w:rFonts w:cs="Courier New"/>
+        </w:rPr>
+        <w:t>Súčasťou podstavca je aj úložný priestor na náhradné diely a nástroje na obhospodarovanie hodín.</w:t>
+      </w:r>
+    </w:p>
+    <w:p>
+      <w:pPr>
+        <w:jc w:val="both"/>
+        <w:rPr>
+          <w:rFonts w:cs="Courier New"/>
+        </w:rPr>
+      </w:pPr>
+      <w:r>
+        <w:rPr>
+          <w:rFonts w:cs="Courier New"/>
+        </w:rPr>
+        <w:t>Od výroby obsahuje:</w:t>
+      </w:r>
+    </w:p>
+    <w:p>
+      <w:pPr>
+        <w:pStyle w:val="Odstavecseseznamem"/>
+        <w:numPr>
+          <w:ilvl w:val="0"/>
+          <w:numId w:val="7"/>
+        </w:numPr>
+        <w:jc w:val="both"/>
+        <w:rPr>
+          <w:rFonts w:cs="Courier New"/>
+        </w:rPr>
+      </w:pPr>
+      <w:r>
+        <w:rPr>
+          <w:rFonts w:cs="Courier New"/>
+        </w:rPr>
+        <w:t>1x skrutkovač na nastavovanie trimrov</w:t>
+      </w:r>
+    </w:p>
+    <w:p>
+      <w:pPr>
+        <w:pStyle w:val="Odstavecseseznamem"/>
+        <w:numPr>
+          <w:ilvl w:val="0"/>
+          <w:numId w:val="7"/>
+        </w:numPr>
+        <w:jc w:val="both"/>
+        <w:rPr>
+          <w:rFonts w:cs="Courier New"/>
+        </w:rPr>
+      </w:pPr>
+      <w:r>
+        <w:rPr>
+          <w:rFonts w:cs="Courier New"/>
+        </w:rPr>
+        <w:t>1x náhradný numitron osadený na pätici</w:t>
+      </w:r>
+    </w:p>
+    <w:p>
+      <w:pPr>
+        <w:pStyle w:val="Odstavecseseznamem"/>
+        <w:numPr>
+          <w:ilvl w:val="0"/>
+          <w:numId w:val="7"/>
+        </w:numPr>
+        <w:jc w:val="both"/>
+        <w:rPr>
+          <w:rFonts w:cs="Courier New"/>
+        </w:rPr>
+      </w:pPr>
+      <w:r>
+        <w:rPr>
+          <w:rFonts w:cs="Courier New"/>
+        </w:rPr>
+        <w:t>1x imbusový kľúč</w:t>
+      </w:r>
+    </w:p>
+    <w:p>
+      <w:pPr>
+        <w:pStyle w:val="Odstavecseseznamem"/>
+        <w:numPr>
+          <w:ilvl w:val="0"/>
+          <w:numId w:val="7"/>
+        </w:numPr>
+        <w:jc w:val="both"/>
+        <w:rPr>
+          <w:rFonts w:cs="Courier New"/>
+        </w:rPr>
+      </w:pPr>
+      <w:r>
+        <w:rPr>
+          <w:rFonts w:cs="Courier New"/>
+        </w:rPr>
+        <w:t>1x náhradná mincová batéria CR2032</w:t>
+      </w:r>
+    </w:p>
+    <w:p>
+      <w:pPr>
+        <w:jc w:val="both"/>
+        <w:rPr>
+          <w:rFonts w:cs="Courier New"/>
+        </w:rPr>
+      </w:pPr>
+    </w:p>
+    <w:p>
+      <w:pPr>
+        <w:pStyle w:val="Nadpis2"/>
+      </w:pPr>
+      <w:bookmarkStart w:id="11" w:name="_Toc211153214"/>
+      <w:r>
+        <w:t>Poistka</w:t>
+      </w:r>
+      <w:bookmarkEnd w:id="11"/>
+    </w:p>
+    <w:p>
+      <w:pPr>
+        <w:jc w:val="both"/>
+        <w:rPr>
+          <w:rFonts w:cs="Courier New"/>
+        </w:rPr>
+      </w:pPr>
+      <w:r>
+        <w:rPr>
+          <w:rFonts w:cs="Courier New"/>
+        </w:rPr>
+        <w:t xml:space="preserve">Hlavná poistka je dimenzovaná tak aby sa vypálila len </w:t>
+      </w:r>
+      <w:r>
+        <w:rPr>
+          <w:rFonts w:cs="Courier New"/>
+        </w:rPr>
+        <w:t>pri</w:t>
+      </w:r>
+      <w:r>
+        <w:rPr>
+          <w:rFonts w:cs="Courier New"/>
+        </w:rPr>
+        <w:t xml:space="preserve"> k závažnej chybe v elektronike hodín. Teda</w:t>
+      </w:r>
+      <w:r>
+        <w:rPr>
+          <w:rFonts w:cs="Courier New"/>
+        </w:rPr>
+        <w:t xml:space="preserve"> pri vypálení</w:t>
+      </w:r>
+      <w:r>
+        <w:rPr>
+          <w:rFonts w:cs="Courier New"/>
+        </w:rPr>
+        <w:t>, odporúčame problém riešiť servisne.</w:t>
+      </w:r>
+    </w:p>
+    <w:p>
+      <w:pPr>
+        <w:rPr>
+          <w:rFonts w:cs="Courier New"/>
+        </w:rPr>
+      </w:pPr>
+    </w:p>
+    <w:p>
+      <w:pPr>
+        <w:pStyle w:val="Nadpis2"/>
+      </w:pPr>
+      <w:bookmarkStart w:id="12" w:name="_Toc211153215"/>
+      <w:r>
+        <w:t>Servis</w:t>
+      </w:r>
+      <w:bookmarkEnd w:id="12"/>
+    </w:p>
+    <w:p>
+      <w:pPr>
+        <w:rPr>
+          <w:rFonts w:cs="Courier New"/>
+        </w:rPr>
+      </w:pPr>
+      <w:r>
+        <w:rPr>
+          <w:rFonts w:cs="Courier New"/>
+        </w:rPr>
+        <w:t xml:space="preserve">V prípade poruchy volajte na tel. číslo +421 950 368 559 alebo </w:t>
+      </w:r>
+      <w:r>
+        <w:rPr>
+          <w:rFonts w:cs="Courier New"/>
+        </w:rPr>
+        <w:t>navštívte</w:t>
+      </w:r>
+      <w:r>
+        <w:rPr>
+          <w:rFonts w:cs="Courier New"/>
+        </w:rPr>
+        <w:t xml:space="preserve"> našu pobočku v Korni.</w:t>
+      </w:r>
+    </w:p>
+    <w:p>
+      <w:pPr>
         <w:rPr>
           <w:rFonts w:cs="Courier New"/>
           <w:b/>
           <w:bCs/>
         </w:rPr>
+      </w:pPr>
+      <w:r>
+        <w:rPr>
+          <w:rFonts w:cs="Courier New"/>
+          <w:b/>
+          <w:bCs/>
+        </w:rPr>
         <w:br w:type="page"/>
       </w:r>
     </w:p>
@@ -1736,14 +2144,14 @@
         <w:lastRenderedPageBreak/>
         <w:br/>
       </w:r>
-      <w:bookmarkStart w:id="9" w:name="_Toc206799312"/>
+      <w:bookmarkStart w:id="13" w:name="_Toc211153216"/>
       <w:r>
         <w:rPr>
           <w:rStyle w:val="Nadpis2Char"/>
         </w:rPr>
         <w:t>Spolupracovali</w:t>
       </w:r>
-      <w:bookmarkEnd w:id="9"/>
+      <w:bookmarkEnd w:id="13"/>
       <w:r>
         <w:rPr>
           <w:rFonts w:cs="Courier New"/>
@@ -1807,8 +2215,16 @@
         <w:rPr>
           <w:rFonts w:cs="Courier New"/>
         </w:rPr>
-        <w:t xml:space="preserve"> Kristián Perďoch</w:t>
-      </w:r>
+        <w:t xml:space="preserve"> Kristián </w:t>
+      </w:r>
+      <w:proofErr w:type="spellStart"/>
+      <w:r>
+        <w:rPr>
+          <w:rFonts w:cs="Courier New"/>
+        </w:rPr>
+        <w:t>Perďoch</w:t>
+      </w:r>
+      <w:proofErr w:type="spellEnd"/>
       <w:r>
         <w:rPr>
           <w:rFonts w:cs="Courier New"/>
@@ -1858,6 +2274,7 @@
         </w:rPr>
         <w:t xml:space="preserve"> </w:t>
       </w:r>
+      <w:proofErr w:type="spellStart"/>
       <w:r>
         <w:rPr>
           <w:rFonts w:cs="Courier New"/>
@@ -1865,6 +2282,7 @@
         </w:rPr>
         <w:t>Biblistika</w:t>
       </w:r>
+      <w:proofErr w:type="spellEnd"/>
       <w:r>
         <w:rPr>
           <w:rFonts w:cs="Courier New"/>
@@ -1876,8 +2294,16 @@
         <w:rPr>
           <w:rFonts w:cs="Courier New"/>
         </w:rPr>
-        <w:t xml:space="preserve"> Jozef Hroš</w:t>
-      </w:r>
+        <w:t xml:space="preserve"> Jozef </w:t>
+      </w:r>
+      <w:proofErr w:type="spellStart"/>
+      <w:r>
+        <w:rPr>
+          <w:rFonts w:cs="Courier New"/>
+        </w:rPr>
+        <w:t>Hroš</w:t>
+      </w:r>
+      <w:proofErr w:type="spellEnd"/>
       <w:r>
         <w:rPr>
           <w:rFonts w:cs="Courier New"/>
@@ -1901,53 +2327,16 @@
         <w:rPr>
           <w:rFonts w:cs="Courier New"/>
         </w:rPr>
-        <w:t xml:space="preserve"> Šimon Šinal</w:t>
-      </w:r>
-      <w:r>
-        <w:rPr>
-          <w:rFonts w:cs="Courier New"/>
-        </w:rPr>
-        <w:br/>
-      </w:r>
-      <w:r>
-        <w:rPr>
-          <w:rFonts w:cs="Courier New"/>
-        </w:rPr>
-        <w:t>-</w:t>
-      </w:r>
-      <w:r>
-        <w:rPr>
-          <w:rFonts w:cs="Courier New"/>
-        </w:rPr>
-        <w:t xml:space="preserve"> </w:t>
-      </w:r>
-      <w:r>
-        <w:rPr>
-          <w:rFonts w:cs="Courier New"/>
-          <w:u w:val="single"/>
-        </w:rPr>
-        <w:t>Kritika</w:t>
-      </w:r>
-      <w:r>
-        <w:rPr>
-          <w:rFonts w:cs="Courier New"/>
-          <w:u w:val="single"/>
-        </w:rPr>
-        <w:t xml:space="preserve"> hardvéru</w:t>
-      </w:r>
-      <w:r>
-        <w:rPr>
-          <w:rFonts w:cs="Courier New"/>
-          <w:u w:val="single"/>
-        </w:rPr>
-        <w:t>:</w:t>
-      </w:r>
-      <w:r>
-        <w:rPr>
-          <w:rFonts w:cs="Courier New"/>
-        </w:rPr>
-        <w:t xml:space="preserve"> Ing. Viliam Koprda, Ing. Dušan Dragúň</w:t>
-      </w:r>
+        <w:t xml:space="preserve"> Šimon </w:t>
+      </w:r>
+      <w:proofErr w:type="spellStart"/>
+      <w:r>
+        <w:rPr>
+          <w:rFonts w:cs="Courier New"/>
+        </w:rPr>
+        <w:t>Šinal</w:t>
+      </w:r>
+      <w:proofErr w:type="spellEnd"/>
       <w:r>
         <w:rPr>
           <w:rFonts w:cs="Courier New"/>
@@ -1960,44 +2349,89 @@
           <w:rFonts w:cs="Courier New"/>
           <w:u w:val="single"/>
         </w:rPr>
-        <w:t>Súčiastky:</w:t>
-      </w:r>
-      <w:r>
-        <w:rPr>
-          <w:rFonts w:cs="Courier New"/>
-        </w:rPr>
-        <w:t xml:space="preserve"> MB Electronic Žilina, </w:t>
-      </w:r>
-      <w:r>
-        <w:rPr>
-          <w:rFonts w:cs="Courier New"/>
-        </w:rPr>
-        <w:t>VP Centrum</w:t>
-      </w:r>
-      <w:r>
-        <w:rPr>
-          <w:rFonts w:cs="Courier New"/>
-        </w:rPr>
-        <w:t xml:space="preserve"> Litoměřice</w:t>
-      </w:r>
-      <w:r>
-        <w:rPr>
-          <w:rFonts w:cs="Courier New"/>
-        </w:rPr>
-        <w:t>, Techfun.sk</w:t>
-      </w:r>
-      <w:r>
-        <w:rPr>
-          <w:rFonts w:cs="Courier New"/>
-        </w:rPr>
-        <w:t>, tomshardware.sk</w:t>
-      </w:r>
-      <w:r>
-        <w:rPr>
-          <w:rFonts w:cs="Courier New"/>
-        </w:rPr>
-        <w:t>, tme.eu, PS Electronic</w:t>
-      </w:r>
+        <w:t>Drevo materiál</w:t>
+      </w:r>
+      <w:r>
+        <w:rPr>
+          <w:rFonts w:cs="Courier New"/>
+        </w:rPr>
+        <w:t xml:space="preserve">: Bohuš </w:t>
+      </w:r>
+      <w:proofErr w:type="spellStart"/>
+      <w:r>
+        <w:rPr>
+          <w:rFonts w:cs="Courier New"/>
+        </w:rPr>
+        <w:t>Jaroš</w:t>
+      </w:r>
+      <w:proofErr w:type="spellEnd"/>
+      <w:r>
+        <w:rPr>
+          <w:rFonts w:cs="Courier New"/>
+        </w:rPr>
+        <w:br/>
+      </w:r>
+      <w:r>
+        <w:rPr>
+          <w:rFonts w:cs="Courier New"/>
+        </w:rPr>
+        <w:t>-</w:t>
+      </w:r>
+      <w:r>
+        <w:rPr>
+          <w:rFonts w:cs="Courier New"/>
+        </w:rPr>
+        <w:t xml:space="preserve"> </w:t>
+      </w:r>
+      <w:r>
+        <w:rPr>
+          <w:rFonts w:cs="Courier New"/>
+          <w:u w:val="single"/>
+        </w:rPr>
+        <w:t>Kritika</w:t>
+      </w:r>
+      <w:r>
+        <w:rPr>
+          <w:rFonts w:cs="Courier New"/>
+          <w:u w:val="single"/>
+        </w:rPr>
+        <w:t xml:space="preserve"> hardvéru</w:t>
+      </w:r>
+      <w:r>
+        <w:rPr>
+          <w:rFonts w:cs="Courier New"/>
+          <w:u w:val="single"/>
+        </w:rPr>
+        <w:t>:</w:t>
+      </w:r>
+      <w:r>
+        <w:rPr>
+          <w:rFonts w:cs="Courier New"/>
+        </w:rPr>
+        <w:t xml:space="preserve"> Ing. Viliam </w:t>
+      </w:r>
+      <w:proofErr w:type="spellStart"/>
+      <w:r>
+        <w:rPr>
+          <w:rFonts w:cs="Courier New"/>
+        </w:rPr>
+        <w:t>Koprda</w:t>
+      </w:r>
+      <w:proofErr w:type="spellEnd"/>
+      <w:r>
+        <w:rPr>
+          <w:rFonts w:cs="Courier New"/>
+        </w:rPr>
+        <w:t xml:space="preserve">, Ing. Dušan </w:t>
+      </w:r>
+      <w:proofErr w:type="spellStart"/>
+      <w:r>
+        <w:rPr>
+          <w:rFonts w:cs="Courier New"/>
+        </w:rPr>
+        <w:t>Dragúň</w:t>
+      </w:r>
+      <w:proofErr w:type="spellEnd"/>
       <w:r>
         <w:rPr>
           <w:rFonts w:cs="Courier New"/>
@@ -2010,13 +2444,71 @@
           <w:rFonts w:cs="Courier New"/>
           <w:u w:val="single"/>
         </w:rPr>
-        <w:t>Chémia na leptanie DPS:</w:t>
-      </w:r>
-      <w:r>
-        <w:rPr>
-          <w:rFonts w:cs="Courier New"/>
-        </w:rPr>
-        <w:t xml:space="preserve"> Ladislav Zimka</w:t>
+        <w:t>Súčiastky:</w:t>
+      </w:r>
+      <w:r>
+        <w:rPr>
+          <w:rFonts w:cs="Courier New"/>
+        </w:rPr>
+        <w:t xml:space="preserve"> MB </w:t>
+      </w:r>
+      <w:proofErr w:type="spellStart"/>
+      <w:r>
+        <w:rPr>
+          <w:rFonts w:cs="Courier New"/>
+        </w:rPr>
+        <w:t>Electronic</w:t>
+      </w:r>
+      <w:proofErr w:type="spellEnd"/>
+      <w:r>
+        <w:rPr>
+          <w:rFonts w:cs="Courier New"/>
+        </w:rPr>
+        <w:t xml:space="preserve"> Žilina, </w:t>
+      </w:r>
+      <w:r>
+        <w:rPr>
+          <w:rFonts w:cs="Courier New"/>
+        </w:rPr>
+        <w:t>VP Centrum</w:t>
+      </w:r>
+      <w:r>
+        <w:rPr>
+          <w:rFonts w:cs="Courier New"/>
+        </w:rPr>
+        <w:t xml:space="preserve"> Litoměřice</w:t>
+      </w:r>
+      <w:r>
+        <w:rPr>
+          <w:rFonts w:cs="Courier New"/>
+        </w:rPr>
+        <w:t>, Techfun.sk</w:t>
+      </w:r>
+      <w:r>
+        <w:rPr>
+          <w:rFonts w:cs="Courier New"/>
+        </w:rPr>
+        <w:t>, tomshardware.sk</w:t>
+      </w:r>
+      <w:r>
+        <w:rPr>
+          <w:rFonts w:cs="Courier New"/>
+        </w:rPr>
+        <w:t xml:space="preserve">, tme.eu, PS </w:t>
+      </w:r>
+      <w:proofErr w:type="spellStart"/>
+      <w:r>
+        <w:rPr>
+          <w:rFonts w:cs="Courier New"/>
+        </w:rPr>
+        <w:t>Electronic</w:t>
+      </w:r>
+      <w:proofErr w:type="spellEnd"/>
+      <w:r>
+        <w:rPr>
+          <w:rFonts w:cs="Courier New"/>
+        </w:rPr>
+        <w:t xml:space="preserve"> Praha</w:t>
       </w:r>
       <w:r>
         <w:rPr>
@@ -2030,15 +2522,52 @@
           <w:rFonts w:cs="Courier New"/>
           <w:u w:val="single"/>
         </w:rPr>
-        <w:t>Poskytovateľ numitrono</w:t>
+        <w:t>Chémia na leptanie DPS:</w:t>
+      </w:r>
+      <w:r>
+        <w:rPr>
+          <w:rFonts w:cs="Courier New"/>
+        </w:rPr>
+        <w:t xml:space="preserve"> Ladislav </w:t>
+      </w:r>
+      <w:proofErr w:type="spellStart"/>
+      <w:r>
+        <w:rPr>
+          <w:rFonts w:cs="Courier New"/>
+        </w:rPr>
+        <w:t>Zimka</w:t>
+      </w:r>
+      <w:proofErr w:type="spellEnd"/>
+      <w:r>
+        <w:rPr>
+          <w:rFonts w:cs="Courier New"/>
+        </w:rPr>
+        <w:br/>
+        <w:t xml:space="preserve">- </w:t>
       </w:r>
       <w:r>
         <w:rPr>
           <w:rFonts w:cs="Courier New"/>
           <w:u w:val="single"/>
         </w:rPr>
+        <w:t xml:space="preserve">Poskytovateľ </w:t>
+      </w:r>
+      <w:proofErr w:type="spellStart"/>
+      <w:r>
+        <w:rPr>
+          <w:rFonts w:cs="Courier New"/>
+          <w:u w:val="single"/>
+        </w:rPr>
+        <w:t>numitrono</w:t>
+      </w:r>
+      <w:r>
+        <w:rPr>
+          <w:rFonts w:cs="Courier New"/>
+          <w:u w:val="single"/>
+        </w:rPr>
         <w:t>v</w:t>
       </w:r>
+      <w:proofErr w:type="spellEnd"/>
       <w:r>
         <w:rPr>
           <w:rFonts w:cs="Courier New"/>
@@ -2050,7 +2579,21 @@
         <w:rPr>
           <w:rFonts w:cs="Courier New"/>
         </w:rPr>
-        <w:t xml:space="preserve"> Robert Ziedins, Litva</w:t>
+        <w:t xml:space="preserve"> Robert </w:t>
+      </w:r>
+      <w:proofErr w:type="spellStart"/>
+      <w:r>
+        <w:rPr>
+          <w:rFonts w:cs="Courier New"/>
+        </w:rPr>
+        <w:t>Ziedins</w:t>
+      </w:r>
+      <w:proofErr w:type="spellEnd"/>
+      <w:r>
+        <w:rPr>
+          <w:rFonts w:cs="Courier New"/>
+        </w:rPr>
+        <w:t>, Litva</w:t>
       </w:r>
     </w:p>
     <w:p>
@@ -2739,6 +3282,118 @@
       </w:rPr>
     </w:lvl>
   </w:abstractNum>
+  <w:abstractNum w:abstractNumId="6" w15:restartNumberingAfterBreak="0">
+    <w:nsid w:val="506A446F"/>
+    <w:multiLevelType w:val="hybridMultilevel"/>
+    <w:tmpl w:val="4DE80CD8"/>
+    <w:lvl w:ilvl="0" w:tplc="50CE7CCE">
+      <w:numFmt w:val="bullet"/>
+      <w:lvlText w:val="-"/>
+      <w:lvlJc w:val="left"/>
+      <w:pPr>
+        <w:ind w:left="720" w:hanging="360"/>
+      </w:pPr>
+      <w:rPr>
+        <w:rFonts w:ascii="Courier New" w:eastAsiaTheme="minorHAnsi" w:hAnsi="Courier New" w:cs="Courier New" w:hint="default"/>
+      </w:rPr>
+    </w:lvl>
+    <w:lvl w:ilvl="1" w:tplc="041B0003" w:tentative="1">
+      <w:start w:val="1"/>
+      <w:numFmt w:val="bullet"/>
+      <w:lvlText w:val="o"/>
+      <w:lvlJc w:val="left"/>
+      <w:pPr>
+        <w:ind w:left="1440" w:hanging="360"/>
+      </w:pPr>
+      <w:rPr>
+        <w:rFonts w:ascii="Courier New" w:hAnsi="Courier New" w:cs="Courier New" w:hint="default"/>
+      </w:rPr>
+    </w:lvl>
+    <w:lvl w:ilvl="2" w:tplc="041B0005" w:tentative="1">
+      <w:start w:val="1"/>
+      <w:numFmt w:val="bullet"/>
+      <w:lvlText w:val=""/>
+      <w:lvlJc w:val="left"/>
+      <w:pPr>
+        <w:ind w:left="2160" w:hanging="360"/>
+      </w:pPr>
+      <w:rPr>
+        <w:rFonts w:ascii="Wingdings" w:hAnsi="Wingdings" w:hint="default"/>
+      </w:rPr>
+    </w:lvl>
+    <w:lvl w:ilvl="3" w:tplc="041B0001" w:tentative="1">
+      <w:start w:val="1"/>
+      <w:numFmt w:val="bullet"/>
+      <w:lvlText w:val=""/>
+      <w:lvlJc w:val="left"/>
+      <w:pPr>
+        <w:ind w:left="2880" w:hanging="360"/>
+      </w:pPr>
+      <w:rPr>
+        <w:rFonts w:ascii="Symbol" w:hAnsi="Symbol" w:hint="default"/>
+      </w:rPr>
+    </w:lvl>
+    <w:lvl w:ilvl="4" w:tplc="041B0003" w:tentative="1">
+      <w:start w:val="1"/>
+      <w:numFmt w:val="bullet"/>
+      <w:lvlText w:val="o"/>
+      <w:lvlJc w:val="left"/>
+      <w:pPr>
+        <w:ind w:left="3600" w:hanging="360"/>
+      </w:pPr>
+      <w:rPr>
+        <w:rFonts w:ascii="Courier New" w:hAnsi="Courier New" w:cs="Courier New" w:hint="default"/>
+      </w:rPr>
+    </w:lvl>
+    <w:lvl w:ilvl="5" w:tplc="041B0005" w:tentative="1">
+      <w:start w:val="1"/>
+      <w:numFmt w:val="bullet"/>
+      <w:lvlText w:val=""/>
+      <w:lvlJc w:val="left"/>
+      <w:pPr>
+        <w:ind w:left="4320" w:hanging="360"/>
+      </w:pPr>
+      <w:rPr>
+        <w:rFonts w:ascii="Wingdings" w:hAnsi="Wingdings" w:hint="default"/>
+      </w:rPr>
+    </w:lvl>
+    <w:lvl w:ilvl="6" w:tplc="041B0001" w:tentative="1">
+      <w:start w:val="1"/>
+      <w:numFmt w:val="bullet"/>
+      <w:lvlText w:val=""/>
+      <w:lvlJc w:val="left"/>
+      <w:pPr>
+        <w:ind w:left="5040" w:hanging="360"/>
+      </w:pPr>
+      <w:rPr>
+        <w:rFonts w:ascii="Symbol" w:hAnsi="Symbol" w:hint="default"/>
+      </w:rPr>
+    </w:lvl>
+    <w:lvl w:ilvl="7" w:tplc="041B0003" w:tentative="1">
+      <w:start w:val="1"/>
+      <w:numFmt w:val="bullet"/>
+      <w:lvlText w:val="o"/>
+      <w:lvlJc w:val="left"/>
+      <w:pPr>
+        <w:ind w:left="5760" w:hanging="360"/>
+      </w:pPr>
+      <w:rPr>
+        <w:rFonts w:ascii="Courier New" w:hAnsi="Courier New" w:cs="Courier New" w:hint="default"/>
+      </w:rPr>
+    </w:lvl>
+    <w:lvl w:ilvl="8" w:tplc="041B0005" w:tentative="1">
+      <w:start w:val="1"/>
+      <w:numFmt w:val="bullet"/>
+      <w:lvlText w:val=""/>
+      <w:lvlJc w:val="left"/>
+      <w:pPr>
+        <w:ind w:left="6480" w:hanging="360"/>
+      </w:pPr>
+      <w:rPr>
+        <w:rFonts w:ascii="Wingdings" w:hAnsi="Wingdings" w:hint="default"/>
+      </w:rPr>
+    </w:lvl>
+  </w:abstractNum>
   <w:num w:numId="1" w16cid:durableId="1015428120">
     <w:abstractNumId w:val="5"/>
   </w:num>
@@ -2756,6 +3411,9 @@
   </w:num>
   <w:num w:numId="6" w16cid:durableId="1355427557">
     <w:abstractNumId w:val="2"/>
+  </w:num>
+  <w:num w:numId="7" w16cid:durableId="1247307226">
+    <w:abstractNumId w:val="6"/>
   </w:num>
 </w:numbering>
 </file>

</xml_diff>

<commit_message>
Preventívne uloženie na github.
</commit_message>
<xml_diff>
--- a/docs/prirucka.docx
+++ b/docs/prirucka.docx
@@ -4,21 +4,8 @@
   <w:body>
     <w:p>
       <w:pPr>
-        <w:jc w:val="center"/>
-        <w:rPr>
-          <w:rFonts w:cs="Courier New"/>
-          <w:b/>
-          <w:bCs/>
-          <w:sz w:val="48"/>
-          <w:szCs w:val="48"/>
-        </w:rPr>
-      </w:pPr>
-    </w:p>
-    <w:p>
-      <w:pPr>
-        <w:jc w:val="right"/>
-        <w:rPr>
-          <w:rFonts w:cs="Courier New"/>
+        <w:rPr>
+          <w:rFonts w:ascii="Special Elite" w:hAnsi="Special Elite" w:cs="Courier New"/>
           <w:b/>
           <w:bCs/>
           <w:i/>
@@ -29,26 +16,110 @@
       </w:pPr>
       <w:r>
         <w:rPr>
-          <w:rFonts w:cs="Courier New"/>
+          <w:rFonts w:ascii="Special Elite" w:hAnsi="Special Elite" w:cs="Courier New"/>
           <w:b/>
           <w:bCs/>
+          <w:sz w:val="72"/>
+          <w:szCs w:val="72"/>
+        </w:rPr>
+        <w:br/>
+      </w:r>
+    </w:p>
+    <w:p>
+      <w:pPr>
+        <w:jc w:val="center"/>
+        <w:rPr>
+          <w:rFonts w:ascii="Special Elite" w:hAnsi="Special Elite" w:cs="Courier New"/>
+          <w:b/>
+          <w:bCs/>
+          <w:i/>
+          <w:iCs/>
+          <w:sz w:val="72"/>
+          <w:szCs w:val="72"/>
+        </w:rPr>
+      </w:pPr>
+      <w:r>
+        <w:rPr>
+          <w:rFonts w:ascii="Special Elite" w:hAnsi="Special Elite" w:cs="Courier New"/>
+          <w:b/>
+          <w:bCs/>
+          <w:i/>
+          <w:iCs/>
+          <w:sz w:val="72"/>
+          <w:szCs w:val="72"/>
+        </w:rPr>
+        <w:t>Návod k</w:t>
+      </w:r>
+      <w:r>
+        <w:rPr>
+          <w:rFonts w:ascii="Special Elite" w:hAnsi="Special Elite" w:cs="Courier New"/>
+          <w:b/>
+          <w:bCs/>
+          <w:i/>
+          <w:iCs/>
+          <w:sz w:val="72"/>
+          <w:szCs w:val="72"/>
+        </w:rPr>
+        <w:t> </w:t>
+      </w:r>
+      <w:r>
+        <w:rPr>
+          <w:rFonts w:ascii="Special Elite" w:hAnsi="Special Elite" w:cs="Courier New"/>
+          <w:b/>
+          <w:bCs/>
+          <w:i/>
+          <w:iCs/>
+          <w:sz w:val="72"/>
+          <w:szCs w:val="72"/>
+        </w:rPr>
+        <w:t>obsluhe</w:t>
+      </w:r>
+    </w:p>
+    <w:p>
+      <w:pPr>
+        <w:rPr>
+          <w:rFonts w:ascii="Special Elite" w:hAnsi="Special Elite" w:cs="Courier New"/>
+          <w:b/>
+          <w:bCs/>
+          <w:i/>
+          <w:iCs/>
+          <w:sz w:val="72"/>
+          <w:szCs w:val="72"/>
+        </w:rPr>
+      </w:pPr>
+      <w:r>
+        <w:rPr>
+          <w:rFonts w:ascii="Special Elite" w:hAnsi="Special Elite" w:cs="Courier New"/>
+          <w:b/>
+          <w:bCs/>
+          <w:i/>
+          <w:iCs/>
           <w:noProof/>
-          <w:sz w:val="48"/>
-          <w:szCs w:val="48"/>
-        </w:rPr>
+          <w:sz w:val="72"/>
+          <w:szCs w:val="72"/>
+        </w:rPr>
+        <w:lastRenderedPageBreak/>
         <w:drawing>
-          <wp:anchor distT="0" distB="0" distL="114300" distR="114300" simplePos="0" relativeHeight="251658240" behindDoc="1" locked="0" layoutInCell="1" allowOverlap="1" wp14:anchorId="1E3E3FDF" wp14:editId="68EE810E">
+          <wp:anchor distT="0" distB="0" distL="114300" distR="114300" simplePos="0" relativeHeight="251683840" behindDoc="1" locked="0" layoutInCell="1" allowOverlap="1" wp14:anchorId="26EEBF54" wp14:editId="06E9D43F">
             <wp:simplePos x="0" y="0"/>
             <wp:positionH relativeFrom="column">
-              <wp:posOffset>509905</wp:posOffset>
+              <wp:posOffset>962660</wp:posOffset>
             </wp:positionH>
             <wp:positionV relativeFrom="paragraph">
-              <wp:posOffset>598805</wp:posOffset>
+              <wp:posOffset>0</wp:posOffset>
             </wp:positionV>
-            <wp:extent cx="4762500" cy="4762500"/>
-            <wp:effectExtent l="0" t="0" r="0" b="0"/>
-            <wp:wrapTopAndBottom/>
-            <wp:docPr id="1648837134" name="Obrázek 2"/>
+            <wp:extent cx="3009900" cy="2225280"/>
+            <wp:effectExtent l="0" t="0" r="0" b="3810"/>
+            <wp:wrapTight wrapText="bothSides">
+              <wp:wrapPolygon edited="0">
+                <wp:start x="0" y="0"/>
+                <wp:lineTo x="0" y="21452"/>
+                <wp:lineTo x="21463" y="21452"/>
+                <wp:lineTo x="21463" y="0"/>
+                <wp:lineTo x="0" y="0"/>
+              </wp:wrapPolygon>
+            </wp:wrapTight>
+            <wp:docPr id="1924783381" name="Obrázek 11"/>
             <wp:cNvGraphicFramePr>
               <a:graphicFrameLocks xmlns:a="http://schemas.openxmlformats.org/drawingml/2006/main" noChangeAspect="1"/>
             </wp:cNvGraphicFramePr>
@@ -56,29 +127,41 @@
               <a:graphicData uri="http://schemas.openxmlformats.org/drawingml/2006/picture">
                 <pic:pic xmlns:pic="http://schemas.openxmlformats.org/drawingml/2006/picture">
                   <pic:nvPicPr>
-                    <pic:cNvPr id="1648837134" name="Obrázek 1648837134"/>
-                    <pic:cNvPicPr/>
+                    <pic:cNvPr id="0" name="Picture 2"/>
+                    <pic:cNvPicPr>
+                      <a:picLocks noChangeAspect="1" noChangeArrowheads="1"/>
+                    </pic:cNvPicPr>
                   </pic:nvPicPr>
-                  <pic:blipFill>
-                    <a:blip r:embed="rId6">
+                  <pic:blipFill rotWithShape="1">
+                    <a:blip r:embed="rId6" cstate="print">
                       <a:extLst>
                         <a:ext uri="{28A0092B-C50C-407E-A947-70E740481C1C}">
                           <a14:useLocalDpi xmlns:a14="http://schemas.microsoft.com/office/drawing/2010/main" val="0"/>
                         </a:ext>
                       </a:extLst>
                     </a:blip>
+                    <a:srcRect l="1794" t="17344" r="6699" b="15002"/>
                     <a:stretch>
                       <a:fillRect/>
                     </a:stretch>
                   </pic:blipFill>
-                  <pic:spPr>
+                  <pic:spPr bwMode="auto">
                     <a:xfrm>
                       <a:off x="0" y="0"/>
-                      <a:ext cx="4762500" cy="4762500"/>
+                      <a:ext cx="3009900" cy="2225280"/>
                     </a:xfrm>
                     <a:prstGeom prst="rect">
                       <a:avLst/>
                     </a:prstGeom>
+                    <a:noFill/>
+                    <a:ln>
+                      <a:noFill/>
+                    </a:ln>
+                    <a:extLst>
+                      <a:ext uri="{53640926-AAD7-44D8-BBD7-CCE9431645EC}">
+                        <a14:shadowObscured xmlns:a14="http://schemas.microsoft.com/office/drawing/2010/main"/>
+                      </a:ext>
+                    </a:extLst>
                   </pic:spPr>
                 </pic:pic>
               </a:graphicData>
@@ -88,20 +171,7 @@
       </w:r>
       <w:r>
         <w:rPr>
-          <w:rFonts w:cs="Courier New"/>
-          <w:b/>
-          <w:bCs/>
-          <w:sz w:val="72"/>
-          <w:szCs w:val="72"/>
-        </w:rPr>
-        <w:br/>
-      </w:r>
-    </w:p>
-    <w:p>
-      <w:pPr>
-        <w:jc w:val="center"/>
-        <w:rPr>
-          <w:rFonts w:cs="Courier New"/>
+          <w:rFonts w:ascii="Special Elite" w:hAnsi="Special Elite" w:cs="Courier New"/>
           <w:b/>
           <w:bCs/>
           <w:i/>
@@ -109,73 +179,13 @@
           <w:sz w:val="72"/>
           <w:szCs w:val="72"/>
         </w:rPr>
-      </w:pPr>
-      <w:r>
-        <w:rPr>
-          <w:rFonts w:cs="Courier New"/>
-          <w:b/>
-          <w:bCs/>
-          <w:i/>
-          <w:iCs/>
-          <w:sz w:val="72"/>
-          <w:szCs w:val="72"/>
-        </w:rPr>
-        <w:t>Návod k</w:t>
-      </w:r>
-      <w:r>
-        <w:rPr>
-          <w:rFonts w:cs="Courier New"/>
-          <w:b/>
-          <w:bCs/>
-          <w:i/>
-          <w:iCs/>
-          <w:sz w:val="72"/>
-          <w:szCs w:val="72"/>
-        </w:rPr>
-        <w:t> </w:t>
-      </w:r>
-      <w:r>
-        <w:rPr>
-          <w:rFonts w:cs="Courier New"/>
-          <w:b/>
-          <w:bCs/>
-          <w:i/>
-          <w:iCs/>
-          <w:sz w:val="72"/>
-          <w:szCs w:val="72"/>
-        </w:rPr>
-        <w:t>obsluhe</w:t>
-      </w:r>
-    </w:p>
-    <w:p>
-      <w:pPr>
-        <w:rPr>
-          <w:rFonts w:cs="Courier New"/>
-          <w:b/>
-          <w:bCs/>
-          <w:i/>
-          <w:iCs/>
-          <w:sz w:val="72"/>
-          <w:szCs w:val="72"/>
-        </w:rPr>
-      </w:pPr>
-      <w:r>
-        <w:rPr>
-          <w:rFonts w:cs="Courier New"/>
-          <w:b/>
-          <w:bCs/>
-          <w:i/>
-          <w:iCs/>
-          <w:sz w:val="72"/>
-          <w:szCs w:val="72"/>
-        </w:rPr>
         <w:br w:type="page"/>
       </w:r>
     </w:p>
     <w:sdt>
       <w:sdtPr>
         <w:rPr>
-          <w:rFonts w:eastAsiaTheme="minorHAnsi" w:cstheme="minorBidi"/>
+          <w:rFonts w:ascii="Special Elite" w:eastAsiaTheme="minorHAnsi" w:hAnsi="Special Elite" w:cstheme="minorBidi"/>
           <w:b w:val="0"/>
           <w:color w:val="auto"/>
           <w:kern w:val="2"/>
@@ -201,6 +211,7 @@
             <w:pStyle w:val="Nadpisobsahu"/>
             <w:rPr>
               <w:rStyle w:val="Nadpis1Char"/>
+              <w:rFonts w:ascii="Special Elite" w:hAnsi="Special Elite"/>
               <w:b/>
               <w:bCs/>
               <w:u w:val="single"/>
@@ -209,6 +220,7 @@
           <w:r>
             <w:rPr>
               <w:rStyle w:val="Nadpis1Char"/>
+              <w:rFonts w:ascii="Special Elite" w:hAnsi="Special Elite"/>
               <w:b/>
               <w:bCs/>
             </w:rPr>
@@ -222,30 +234,41 @@
               <w:tab w:val="right" w:leader="dot" w:pos="10456"/>
             </w:tabs>
             <w:rPr>
-              <w:rFonts w:asciiTheme="minorHAnsi" w:eastAsiaTheme="minorEastAsia" w:hAnsiTheme="minorHAnsi"/>
+              <w:rFonts w:ascii="Special Elite" w:eastAsiaTheme="minorEastAsia" w:hAnsi="Special Elite"/>
               <w:noProof/>
               <w:lang w:eastAsia="sk-SK"/>
             </w:rPr>
           </w:pPr>
           <w:r>
+            <w:rPr>
+              <w:rFonts w:ascii="Special Elite" w:hAnsi="Special Elite"/>
+            </w:rPr>
             <w:fldChar w:fldCharType="begin"/>
           </w:r>
           <w:r>
+            <w:rPr>
+              <w:rFonts w:ascii="Special Elite" w:hAnsi="Special Elite"/>
+            </w:rPr>
             <w:instrText xml:space="preserve"> TOC \o "1-3" \h \z \u </w:instrText>
           </w:r>
           <w:r>
+            <w:rPr>
+              <w:rFonts w:ascii="Special Elite" w:hAnsi="Special Elite"/>
+            </w:rPr>
             <w:fldChar w:fldCharType="separate"/>
           </w:r>
           <w:hyperlink w:anchor="_Toc211153204" w:history="1">
             <w:r>
               <w:rPr>
                 <w:rStyle w:val="Hypertextovodkaz"/>
+                <w:rFonts w:ascii="Special Elite" w:hAnsi="Special Elite"/>
                 <w:noProof/>
               </w:rPr>
               <w:t>NUMERI 50</w:t>
             </w:r>
             <w:r>
               <w:rPr>
+                <w:rFonts w:ascii="Special Elite" w:hAnsi="Special Elite"/>
                 <w:noProof/>
                 <w:webHidden/>
               </w:rPr>
@@ -253,6 +276,7 @@
             </w:r>
             <w:r>
               <w:rPr>
+                <w:rFonts w:ascii="Special Elite" w:hAnsi="Special Elite"/>
                 <w:noProof/>
                 <w:webHidden/>
               </w:rPr>
@@ -260,6 +284,7 @@
             </w:r>
             <w:r>
               <w:rPr>
+                <w:rFonts w:ascii="Special Elite" w:hAnsi="Special Elite"/>
                 <w:noProof/>
                 <w:webHidden/>
               </w:rPr>
@@ -267,12 +292,14 @@
             </w:r>
             <w:r>
               <w:rPr>
-                <w:noProof/>
-                <w:webHidden/>
-              </w:rPr>
-            </w:r>
-            <w:r>
-              <w:rPr>
+                <w:rFonts w:ascii="Special Elite" w:hAnsi="Special Elite"/>
+                <w:noProof/>
+                <w:webHidden/>
+              </w:rPr>
+            </w:r>
+            <w:r>
+              <w:rPr>
+                <w:rFonts w:ascii="Special Elite" w:hAnsi="Special Elite"/>
                 <w:noProof/>
                 <w:webHidden/>
               </w:rPr>
@@ -280,6 +307,7 @@
             </w:r>
             <w:r>
               <w:rPr>
+                <w:rFonts w:ascii="Special Elite" w:hAnsi="Special Elite"/>
                 <w:noProof/>
                 <w:webHidden/>
               </w:rPr>
@@ -287,6 +315,7 @@
             </w:r>
             <w:r>
               <w:rPr>
+                <w:rFonts w:ascii="Special Elite" w:hAnsi="Special Elite"/>
                 <w:noProof/>
                 <w:webHidden/>
               </w:rPr>
@@ -301,7 +330,7 @@
               <w:tab w:val="right" w:leader="dot" w:pos="10456"/>
             </w:tabs>
             <w:rPr>
-              <w:rFonts w:asciiTheme="minorHAnsi" w:eastAsiaTheme="minorEastAsia" w:hAnsiTheme="minorHAnsi"/>
+              <w:rFonts w:ascii="Special Elite" w:eastAsiaTheme="minorEastAsia" w:hAnsi="Special Elite"/>
               <w:noProof/>
               <w:lang w:eastAsia="sk-SK"/>
             </w:rPr>
@@ -310,12 +339,14 @@
             <w:r>
               <w:rPr>
                 <w:rStyle w:val="Hypertextovodkaz"/>
+                <w:rFonts w:ascii="Special Elite" w:hAnsi="Special Elite"/>
                 <w:noProof/>
               </w:rPr>
               <w:t>História numitronov</w:t>
             </w:r>
             <w:r>
               <w:rPr>
+                <w:rFonts w:ascii="Special Elite" w:hAnsi="Special Elite"/>
                 <w:noProof/>
                 <w:webHidden/>
               </w:rPr>
@@ -323,6 +354,7 @@
             </w:r>
             <w:r>
               <w:rPr>
+                <w:rFonts w:ascii="Special Elite" w:hAnsi="Special Elite"/>
                 <w:noProof/>
                 <w:webHidden/>
               </w:rPr>
@@ -330,6 +362,7 @@
             </w:r>
             <w:r>
               <w:rPr>
+                <w:rFonts w:ascii="Special Elite" w:hAnsi="Special Elite"/>
                 <w:noProof/>
                 <w:webHidden/>
               </w:rPr>
@@ -337,12 +370,14 @@
             </w:r>
             <w:r>
               <w:rPr>
-                <w:noProof/>
-                <w:webHidden/>
-              </w:rPr>
-            </w:r>
-            <w:r>
-              <w:rPr>
+                <w:rFonts w:ascii="Special Elite" w:hAnsi="Special Elite"/>
+                <w:noProof/>
+                <w:webHidden/>
+              </w:rPr>
+            </w:r>
+            <w:r>
+              <w:rPr>
+                <w:rFonts w:ascii="Special Elite" w:hAnsi="Special Elite"/>
                 <w:noProof/>
                 <w:webHidden/>
               </w:rPr>
@@ -350,6 +385,7 @@
             </w:r>
             <w:r>
               <w:rPr>
+                <w:rFonts w:ascii="Special Elite" w:hAnsi="Special Elite"/>
                 <w:noProof/>
                 <w:webHidden/>
               </w:rPr>
@@ -357,6 +393,7 @@
             </w:r>
             <w:r>
               <w:rPr>
+                <w:rFonts w:ascii="Special Elite" w:hAnsi="Special Elite"/>
                 <w:noProof/>
                 <w:webHidden/>
               </w:rPr>
@@ -371,7 +408,7 @@
               <w:tab w:val="right" w:leader="dot" w:pos="10456"/>
             </w:tabs>
             <w:rPr>
-              <w:rFonts w:asciiTheme="minorHAnsi" w:eastAsiaTheme="minorEastAsia" w:hAnsiTheme="minorHAnsi"/>
+              <w:rFonts w:ascii="Special Elite" w:eastAsiaTheme="minorEastAsia" w:hAnsi="Special Elite"/>
               <w:noProof/>
               <w:lang w:eastAsia="sk-SK"/>
             </w:rPr>
@@ -380,12 +417,14 @@
             <w:r>
               <w:rPr>
                 <w:rStyle w:val="Hypertextovodkaz"/>
+                <w:rFonts w:ascii="Special Elite" w:hAnsi="Special Elite"/>
                 <w:noProof/>
               </w:rPr>
               <w:t>Ovládanie</w:t>
             </w:r>
             <w:r>
               <w:rPr>
+                <w:rFonts w:ascii="Special Elite" w:hAnsi="Special Elite"/>
                 <w:noProof/>
                 <w:webHidden/>
               </w:rPr>
@@ -393,6 +432,7 @@
             </w:r>
             <w:r>
               <w:rPr>
+                <w:rFonts w:ascii="Special Elite" w:hAnsi="Special Elite"/>
                 <w:noProof/>
                 <w:webHidden/>
               </w:rPr>
@@ -400,6 +440,7 @@
             </w:r>
             <w:r>
               <w:rPr>
+                <w:rFonts w:ascii="Special Elite" w:hAnsi="Special Elite"/>
                 <w:noProof/>
                 <w:webHidden/>
               </w:rPr>
@@ -407,12 +448,14 @@
             </w:r>
             <w:r>
               <w:rPr>
-                <w:noProof/>
-                <w:webHidden/>
-              </w:rPr>
-            </w:r>
-            <w:r>
-              <w:rPr>
+                <w:rFonts w:ascii="Special Elite" w:hAnsi="Special Elite"/>
+                <w:noProof/>
+                <w:webHidden/>
+              </w:rPr>
+            </w:r>
+            <w:r>
+              <w:rPr>
+                <w:rFonts w:ascii="Special Elite" w:hAnsi="Special Elite"/>
                 <w:noProof/>
                 <w:webHidden/>
               </w:rPr>
@@ -420,6 +463,7 @@
             </w:r>
             <w:r>
               <w:rPr>
+                <w:rFonts w:ascii="Special Elite" w:hAnsi="Special Elite"/>
                 <w:noProof/>
                 <w:webHidden/>
               </w:rPr>
@@ -427,6 +471,7 @@
             </w:r>
             <w:r>
               <w:rPr>
+                <w:rFonts w:ascii="Special Elite" w:hAnsi="Special Elite"/>
                 <w:noProof/>
                 <w:webHidden/>
               </w:rPr>
@@ -441,7 +486,7 @@
               <w:tab w:val="right" w:leader="dot" w:pos="10456"/>
             </w:tabs>
             <w:rPr>
-              <w:rFonts w:asciiTheme="minorHAnsi" w:eastAsiaTheme="minorEastAsia" w:hAnsiTheme="minorHAnsi"/>
+              <w:rFonts w:ascii="Special Elite" w:eastAsiaTheme="minorEastAsia" w:hAnsi="Special Elite"/>
               <w:noProof/>
               <w:lang w:eastAsia="sk-SK"/>
             </w:rPr>
@@ -450,12 +495,14 @@
             <w:r>
               <w:rPr>
                 <w:rStyle w:val="Hypertextovodkaz"/>
+                <w:rFonts w:ascii="Special Elite" w:hAnsi="Special Elite"/>
                 <w:noProof/>
               </w:rPr>
               <w:t>Nastavenia:</w:t>
             </w:r>
             <w:r>
               <w:rPr>
+                <w:rFonts w:ascii="Special Elite" w:hAnsi="Special Elite"/>
                 <w:noProof/>
                 <w:webHidden/>
               </w:rPr>
@@ -463,6 +510,7 @@
             </w:r>
             <w:r>
               <w:rPr>
+                <w:rFonts w:ascii="Special Elite" w:hAnsi="Special Elite"/>
                 <w:noProof/>
                 <w:webHidden/>
               </w:rPr>
@@ -470,6 +518,7 @@
             </w:r>
             <w:r>
               <w:rPr>
+                <w:rFonts w:ascii="Special Elite" w:hAnsi="Special Elite"/>
                 <w:noProof/>
                 <w:webHidden/>
               </w:rPr>
@@ -477,12 +526,14 @@
             </w:r>
             <w:r>
               <w:rPr>
-                <w:noProof/>
-                <w:webHidden/>
-              </w:rPr>
-            </w:r>
-            <w:r>
-              <w:rPr>
+                <w:rFonts w:ascii="Special Elite" w:hAnsi="Special Elite"/>
+                <w:noProof/>
+                <w:webHidden/>
+              </w:rPr>
+            </w:r>
+            <w:r>
+              <w:rPr>
+                <w:rFonts w:ascii="Special Elite" w:hAnsi="Special Elite"/>
                 <w:noProof/>
                 <w:webHidden/>
               </w:rPr>
@@ -490,6 +541,7 @@
             </w:r>
             <w:r>
               <w:rPr>
+                <w:rFonts w:ascii="Special Elite" w:hAnsi="Special Elite"/>
                 <w:noProof/>
                 <w:webHidden/>
               </w:rPr>
@@ -497,6 +549,7 @@
             </w:r>
             <w:r>
               <w:rPr>
+                <w:rFonts w:ascii="Special Elite" w:hAnsi="Special Elite"/>
                 <w:noProof/>
                 <w:webHidden/>
               </w:rPr>
@@ -511,7 +564,7 @@
               <w:tab w:val="right" w:leader="dot" w:pos="10456"/>
             </w:tabs>
             <w:rPr>
-              <w:rFonts w:asciiTheme="minorHAnsi" w:eastAsiaTheme="minorEastAsia" w:hAnsiTheme="minorHAnsi"/>
+              <w:rFonts w:ascii="Special Elite" w:eastAsiaTheme="minorEastAsia" w:hAnsi="Special Elite"/>
               <w:noProof/>
               <w:lang w:eastAsia="sk-SK"/>
             </w:rPr>
@@ -520,12 +573,14 @@
             <w:r>
               <w:rPr>
                 <w:rStyle w:val="Hypertextovodkaz"/>
+                <w:rFonts w:ascii="Special Elite" w:hAnsi="Special Elite"/>
                 <w:noProof/>
               </w:rPr>
               <w:t>Firmvér</w:t>
             </w:r>
             <w:r>
               <w:rPr>
+                <w:rFonts w:ascii="Special Elite" w:hAnsi="Special Elite"/>
                 <w:noProof/>
                 <w:webHidden/>
               </w:rPr>
@@ -533,6 +588,7 @@
             </w:r>
             <w:r>
               <w:rPr>
+                <w:rFonts w:ascii="Special Elite" w:hAnsi="Special Elite"/>
                 <w:noProof/>
                 <w:webHidden/>
               </w:rPr>
@@ -540,6 +596,7 @@
             </w:r>
             <w:r>
               <w:rPr>
+                <w:rFonts w:ascii="Special Elite" w:hAnsi="Special Elite"/>
                 <w:noProof/>
                 <w:webHidden/>
               </w:rPr>
@@ -547,12 +604,14 @@
             </w:r>
             <w:r>
               <w:rPr>
-                <w:noProof/>
-                <w:webHidden/>
-              </w:rPr>
-            </w:r>
-            <w:r>
-              <w:rPr>
+                <w:rFonts w:ascii="Special Elite" w:hAnsi="Special Elite"/>
+                <w:noProof/>
+                <w:webHidden/>
+              </w:rPr>
+            </w:r>
+            <w:r>
+              <w:rPr>
+                <w:rFonts w:ascii="Special Elite" w:hAnsi="Special Elite"/>
                 <w:noProof/>
                 <w:webHidden/>
               </w:rPr>
@@ -560,6 +619,7 @@
             </w:r>
             <w:r>
               <w:rPr>
+                <w:rFonts w:ascii="Special Elite" w:hAnsi="Special Elite"/>
                 <w:noProof/>
                 <w:webHidden/>
               </w:rPr>
@@ -567,6 +627,7 @@
             </w:r>
             <w:r>
               <w:rPr>
+                <w:rFonts w:ascii="Special Elite" w:hAnsi="Special Elite"/>
                 <w:noProof/>
                 <w:webHidden/>
               </w:rPr>
@@ -581,7 +642,7 @@
               <w:tab w:val="right" w:leader="dot" w:pos="10456"/>
             </w:tabs>
             <w:rPr>
-              <w:rFonts w:asciiTheme="minorHAnsi" w:eastAsiaTheme="minorEastAsia" w:hAnsiTheme="minorHAnsi"/>
+              <w:rFonts w:ascii="Special Elite" w:eastAsiaTheme="minorEastAsia" w:hAnsi="Special Elite"/>
               <w:noProof/>
               <w:lang w:eastAsia="sk-SK"/>
             </w:rPr>
@@ -590,12 +651,14 @@
             <w:r>
               <w:rPr>
                 <w:rStyle w:val="Hypertextovodkaz"/>
+                <w:rFonts w:ascii="Special Elite" w:hAnsi="Special Elite"/>
                 <w:noProof/>
               </w:rPr>
               <w:t>Manuálne nastavovanie</w:t>
             </w:r>
             <w:r>
               <w:rPr>
+                <w:rFonts w:ascii="Special Elite" w:hAnsi="Special Elite"/>
                 <w:noProof/>
                 <w:webHidden/>
               </w:rPr>
@@ -603,6 +666,7 @@
             </w:r>
             <w:r>
               <w:rPr>
+                <w:rFonts w:ascii="Special Elite" w:hAnsi="Special Elite"/>
                 <w:noProof/>
                 <w:webHidden/>
               </w:rPr>
@@ -610,6 +674,7 @@
             </w:r>
             <w:r>
               <w:rPr>
+                <w:rFonts w:ascii="Special Elite" w:hAnsi="Special Elite"/>
                 <w:noProof/>
                 <w:webHidden/>
               </w:rPr>
@@ -617,12 +682,14 @@
             </w:r>
             <w:r>
               <w:rPr>
-                <w:noProof/>
-                <w:webHidden/>
-              </w:rPr>
-            </w:r>
-            <w:r>
-              <w:rPr>
+                <w:rFonts w:ascii="Special Elite" w:hAnsi="Special Elite"/>
+                <w:noProof/>
+                <w:webHidden/>
+              </w:rPr>
+            </w:r>
+            <w:r>
+              <w:rPr>
+                <w:rFonts w:ascii="Special Elite" w:hAnsi="Special Elite"/>
                 <w:noProof/>
                 <w:webHidden/>
               </w:rPr>
@@ -630,6 +697,7 @@
             </w:r>
             <w:r>
               <w:rPr>
+                <w:rFonts w:ascii="Special Elite" w:hAnsi="Special Elite"/>
                 <w:noProof/>
                 <w:webHidden/>
               </w:rPr>
@@ -637,6 +705,7 @@
             </w:r>
             <w:r>
               <w:rPr>
+                <w:rFonts w:ascii="Special Elite" w:hAnsi="Special Elite"/>
                 <w:noProof/>
                 <w:webHidden/>
               </w:rPr>
@@ -651,7 +720,7 @@
               <w:tab w:val="right" w:leader="dot" w:pos="10456"/>
             </w:tabs>
             <w:rPr>
-              <w:rFonts w:asciiTheme="minorHAnsi" w:eastAsiaTheme="minorEastAsia" w:hAnsiTheme="minorHAnsi"/>
+              <w:rFonts w:ascii="Special Elite" w:eastAsiaTheme="minorEastAsia" w:hAnsi="Special Elite"/>
               <w:noProof/>
               <w:lang w:eastAsia="sk-SK"/>
             </w:rPr>
@@ -660,12 +729,14 @@
             <w:r>
               <w:rPr>
                 <w:rStyle w:val="Hypertextovodkaz"/>
+                <w:rFonts w:ascii="Special Elite" w:hAnsi="Special Elite"/>
                 <w:noProof/>
               </w:rPr>
               <w:t>Napájanie</w:t>
             </w:r>
             <w:r>
               <w:rPr>
+                <w:rFonts w:ascii="Special Elite" w:hAnsi="Special Elite"/>
                 <w:noProof/>
                 <w:webHidden/>
               </w:rPr>
@@ -673,6 +744,7 @@
             </w:r>
             <w:r>
               <w:rPr>
+                <w:rFonts w:ascii="Special Elite" w:hAnsi="Special Elite"/>
                 <w:noProof/>
                 <w:webHidden/>
               </w:rPr>
@@ -680,6 +752,7 @@
             </w:r>
             <w:r>
               <w:rPr>
+                <w:rFonts w:ascii="Special Elite" w:hAnsi="Special Elite"/>
                 <w:noProof/>
                 <w:webHidden/>
               </w:rPr>
@@ -687,12 +760,14 @@
             </w:r>
             <w:r>
               <w:rPr>
-                <w:noProof/>
-                <w:webHidden/>
-              </w:rPr>
-            </w:r>
-            <w:r>
-              <w:rPr>
+                <w:rFonts w:ascii="Special Elite" w:hAnsi="Special Elite"/>
+                <w:noProof/>
+                <w:webHidden/>
+              </w:rPr>
+            </w:r>
+            <w:r>
+              <w:rPr>
+                <w:rFonts w:ascii="Special Elite" w:hAnsi="Special Elite"/>
                 <w:noProof/>
                 <w:webHidden/>
               </w:rPr>
@@ -700,13 +775,15 @@
             </w:r>
             <w:r>
               <w:rPr>
-                <w:noProof/>
-                <w:webHidden/>
-              </w:rPr>
-              <w:t>3</w:t>
-            </w:r>
-            <w:r>
-              <w:rPr>
+                <w:rFonts w:ascii="Special Elite" w:hAnsi="Special Elite"/>
+                <w:noProof/>
+                <w:webHidden/>
+              </w:rPr>
+              <w:t>4</w:t>
+            </w:r>
+            <w:r>
+              <w:rPr>
+                <w:rFonts w:ascii="Special Elite" w:hAnsi="Special Elite"/>
                 <w:noProof/>
                 <w:webHidden/>
               </w:rPr>
@@ -721,7 +798,7 @@
               <w:tab w:val="right" w:leader="dot" w:pos="10456"/>
             </w:tabs>
             <w:rPr>
-              <w:rFonts w:asciiTheme="minorHAnsi" w:eastAsiaTheme="minorEastAsia" w:hAnsiTheme="minorHAnsi"/>
+              <w:rFonts w:ascii="Special Elite" w:eastAsiaTheme="minorEastAsia" w:hAnsi="Special Elite"/>
               <w:noProof/>
               <w:lang w:eastAsia="sk-SK"/>
             </w:rPr>
@@ -730,12 +807,14 @@
             <w:r>
               <w:rPr>
                 <w:rStyle w:val="Hypertextovodkaz"/>
+                <w:rFonts w:ascii="Special Elite" w:hAnsi="Special Elite"/>
                 <w:noProof/>
               </w:rPr>
               <w:t>Prijímač DCF77</w:t>
             </w:r>
             <w:r>
               <w:rPr>
+                <w:rFonts w:ascii="Special Elite" w:hAnsi="Special Elite"/>
                 <w:noProof/>
                 <w:webHidden/>
               </w:rPr>
@@ -743,6 +822,7 @@
             </w:r>
             <w:r>
               <w:rPr>
+                <w:rFonts w:ascii="Special Elite" w:hAnsi="Special Elite"/>
                 <w:noProof/>
                 <w:webHidden/>
               </w:rPr>
@@ -750,6 +830,7 @@
             </w:r>
             <w:r>
               <w:rPr>
+                <w:rFonts w:ascii="Special Elite" w:hAnsi="Special Elite"/>
                 <w:noProof/>
                 <w:webHidden/>
               </w:rPr>
@@ -757,12 +838,14 @@
             </w:r>
             <w:r>
               <w:rPr>
-                <w:noProof/>
-                <w:webHidden/>
-              </w:rPr>
-            </w:r>
-            <w:r>
-              <w:rPr>
+                <w:rFonts w:ascii="Special Elite" w:hAnsi="Special Elite"/>
+                <w:noProof/>
+                <w:webHidden/>
+              </w:rPr>
+            </w:r>
+            <w:r>
+              <w:rPr>
+                <w:rFonts w:ascii="Special Elite" w:hAnsi="Special Elite"/>
                 <w:noProof/>
                 <w:webHidden/>
               </w:rPr>
@@ -770,13 +853,15 @@
             </w:r>
             <w:r>
               <w:rPr>
-                <w:noProof/>
-                <w:webHidden/>
-              </w:rPr>
-              <w:t>3</w:t>
-            </w:r>
-            <w:r>
-              <w:rPr>
+                <w:rFonts w:ascii="Special Elite" w:hAnsi="Special Elite"/>
+                <w:noProof/>
+                <w:webHidden/>
+              </w:rPr>
+              <w:t>5</w:t>
+            </w:r>
+            <w:r>
+              <w:rPr>
+                <w:rFonts w:ascii="Special Elite" w:hAnsi="Special Elite"/>
                 <w:noProof/>
                 <w:webHidden/>
               </w:rPr>
@@ -791,7 +876,7 @@
               <w:tab w:val="right" w:leader="dot" w:pos="10456"/>
             </w:tabs>
             <w:rPr>
-              <w:rFonts w:asciiTheme="minorHAnsi" w:eastAsiaTheme="minorEastAsia" w:hAnsiTheme="minorHAnsi"/>
+              <w:rFonts w:ascii="Special Elite" w:eastAsiaTheme="minorEastAsia" w:hAnsi="Special Elite"/>
               <w:noProof/>
               <w:lang w:eastAsia="sk-SK"/>
             </w:rPr>
@@ -800,12 +885,14 @@
             <w:r>
               <w:rPr>
                 <w:rStyle w:val="Hypertextovodkaz"/>
+                <w:rFonts w:ascii="Special Elite" w:hAnsi="Special Elite"/>
                 <w:noProof/>
               </w:rPr>
               <w:t>Záložná batéria</w:t>
             </w:r>
             <w:r>
               <w:rPr>
+                <w:rFonts w:ascii="Special Elite" w:hAnsi="Special Elite"/>
                 <w:noProof/>
                 <w:webHidden/>
               </w:rPr>
@@ -813,6 +900,7 @@
             </w:r>
             <w:r>
               <w:rPr>
+                <w:rFonts w:ascii="Special Elite" w:hAnsi="Special Elite"/>
                 <w:noProof/>
                 <w:webHidden/>
               </w:rPr>
@@ -820,6 +908,7 @@
             </w:r>
             <w:r>
               <w:rPr>
+                <w:rFonts w:ascii="Special Elite" w:hAnsi="Special Elite"/>
                 <w:noProof/>
                 <w:webHidden/>
               </w:rPr>
@@ -827,12 +916,14 @@
             </w:r>
             <w:r>
               <w:rPr>
-                <w:noProof/>
-                <w:webHidden/>
-              </w:rPr>
-            </w:r>
-            <w:r>
-              <w:rPr>
+                <w:rFonts w:ascii="Special Elite" w:hAnsi="Special Elite"/>
+                <w:noProof/>
+                <w:webHidden/>
+              </w:rPr>
+            </w:r>
+            <w:r>
+              <w:rPr>
+                <w:rFonts w:ascii="Special Elite" w:hAnsi="Special Elite"/>
                 <w:noProof/>
                 <w:webHidden/>
               </w:rPr>
@@ -840,13 +931,15 @@
             </w:r>
             <w:r>
               <w:rPr>
-                <w:noProof/>
-                <w:webHidden/>
-              </w:rPr>
-              <w:t>4</w:t>
-            </w:r>
-            <w:r>
-              <w:rPr>
+                <w:rFonts w:ascii="Special Elite" w:hAnsi="Special Elite"/>
+                <w:noProof/>
+                <w:webHidden/>
+              </w:rPr>
+              <w:t>5</w:t>
+            </w:r>
+            <w:r>
+              <w:rPr>
+                <w:rFonts w:ascii="Special Elite" w:hAnsi="Special Elite"/>
                 <w:noProof/>
                 <w:webHidden/>
               </w:rPr>
@@ -861,7 +954,7 @@
               <w:tab w:val="right" w:leader="dot" w:pos="10456"/>
             </w:tabs>
             <w:rPr>
-              <w:rFonts w:asciiTheme="minorHAnsi" w:eastAsiaTheme="minorEastAsia" w:hAnsiTheme="minorHAnsi"/>
+              <w:rFonts w:ascii="Special Elite" w:eastAsiaTheme="minorEastAsia" w:hAnsi="Special Elite"/>
               <w:noProof/>
               <w:lang w:eastAsia="sk-SK"/>
             </w:rPr>
@@ -870,12 +963,14 @@
             <w:r>
               <w:rPr>
                 <w:rStyle w:val="Hypertextovodkaz"/>
+                <w:rFonts w:ascii="Special Elite" w:hAnsi="Special Elite"/>
                 <w:noProof/>
               </w:rPr>
               <w:t>Úložný priestor</w:t>
             </w:r>
             <w:r>
               <w:rPr>
+                <w:rFonts w:ascii="Special Elite" w:hAnsi="Special Elite"/>
                 <w:noProof/>
                 <w:webHidden/>
               </w:rPr>
@@ -883,6 +978,7 @@
             </w:r>
             <w:r>
               <w:rPr>
+                <w:rFonts w:ascii="Special Elite" w:hAnsi="Special Elite"/>
                 <w:noProof/>
                 <w:webHidden/>
               </w:rPr>
@@ -890,6 +986,7 @@
             </w:r>
             <w:r>
               <w:rPr>
+                <w:rFonts w:ascii="Special Elite" w:hAnsi="Special Elite"/>
                 <w:noProof/>
                 <w:webHidden/>
               </w:rPr>
@@ -897,12 +994,14 @@
             </w:r>
             <w:r>
               <w:rPr>
-                <w:noProof/>
-                <w:webHidden/>
-              </w:rPr>
-            </w:r>
-            <w:r>
-              <w:rPr>
+                <w:rFonts w:ascii="Special Elite" w:hAnsi="Special Elite"/>
+                <w:noProof/>
+                <w:webHidden/>
+              </w:rPr>
+            </w:r>
+            <w:r>
+              <w:rPr>
+                <w:rFonts w:ascii="Special Elite" w:hAnsi="Special Elite"/>
                 <w:noProof/>
                 <w:webHidden/>
               </w:rPr>
@@ -910,13 +1009,15 @@
             </w:r>
             <w:r>
               <w:rPr>
-                <w:noProof/>
-                <w:webHidden/>
-              </w:rPr>
-              <w:t>4</w:t>
-            </w:r>
-            <w:r>
-              <w:rPr>
+                <w:rFonts w:ascii="Special Elite" w:hAnsi="Special Elite"/>
+                <w:noProof/>
+                <w:webHidden/>
+              </w:rPr>
+              <w:t>5</w:t>
+            </w:r>
+            <w:r>
+              <w:rPr>
+                <w:rFonts w:ascii="Special Elite" w:hAnsi="Special Elite"/>
                 <w:noProof/>
                 <w:webHidden/>
               </w:rPr>
@@ -931,7 +1032,7 @@
               <w:tab w:val="right" w:leader="dot" w:pos="10456"/>
             </w:tabs>
             <w:rPr>
-              <w:rFonts w:asciiTheme="minorHAnsi" w:eastAsiaTheme="minorEastAsia" w:hAnsiTheme="minorHAnsi"/>
+              <w:rFonts w:ascii="Special Elite" w:eastAsiaTheme="minorEastAsia" w:hAnsi="Special Elite"/>
               <w:noProof/>
               <w:lang w:eastAsia="sk-SK"/>
             </w:rPr>
@@ -940,12 +1041,14 @@
             <w:r>
               <w:rPr>
                 <w:rStyle w:val="Hypertextovodkaz"/>
+                <w:rFonts w:ascii="Special Elite" w:hAnsi="Special Elite"/>
                 <w:noProof/>
               </w:rPr>
               <w:t>Poistka</w:t>
             </w:r>
             <w:r>
               <w:rPr>
+                <w:rFonts w:ascii="Special Elite" w:hAnsi="Special Elite"/>
                 <w:noProof/>
                 <w:webHidden/>
               </w:rPr>
@@ -953,6 +1056,7 @@
             </w:r>
             <w:r>
               <w:rPr>
+                <w:rFonts w:ascii="Special Elite" w:hAnsi="Special Elite"/>
                 <w:noProof/>
                 <w:webHidden/>
               </w:rPr>
@@ -960,6 +1064,7 @@
             </w:r>
             <w:r>
               <w:rPr>
+                <w:rFonts w:ascii="Special Elite" w:hAnsi="Special Elite"/>
                 <w:noProof/>
                 <w:webHidden/>
               </w:rPr>
@@ -967,12 +1072,14 @@
             </w:r>
             <w:r>
               <w:rPr>
-                <w:noProof/>
-                <w:webHidden/>
-              </w:rPr>
-            </w:r>
-            <w:r>
-              <w:rPr>
+                <w:rFonts w:ascii="Special Elite" w:hAnsi="Special Elite"/>
+                <w:noProof/>
+                <w:webHidden/>
+              </w:rPr>
+            </w:r>
+            <w:r>
+              <w:rPr>
+                <w:rFonts w:ascii="Special Elite" w:hAnsi="Special Elite"/>
                 <w:noProof/>
                 <w:webHidden/>
               </w:rPr>
@@ -980,13 +1087,15 @@
             </w:r>
             <w:r>
               <w:rPr>
-                <w:noProof/>
-                <w:webHidden/>
-              </w:rPr>
-              <w:t>4</w:t>
-            </w:r>
-            <w:r>
-              <w:rPr>
+                <w:rFonts w:ascii="Special Elite" w:hAnsi="Special Elite"/>
+                <w:noProof/>
+                <w:webHidden/>
+              </w:rPr>
+              <w:t>5</w:t>
+            </w:r>
+            <w:r>
+              <w:rPr>
+                <w:rFonts w:ascii="Special Elite" w:hAnsi="Special Elite"/>
                 <w:noProof/>
                 <w:webHidden/>
               </w:rPr>
@@ -1001,7 +1110,7 @@
               <w:tab w:val="right" w:leader="dot" w:pos="10456"/>
             </w:tabs>
             <w:rPr>
-              <w:rFonts w:asciiTheme="minorHAnsi" w:eastAsiaTheme="minorEastAsia" w:hAnsiTheme="minorHAnsi"/>
+              <w:rFonts w:ascii="Special Elite" w:eastAsiaTheme="minorEastAsia" w:hAnsi="Special Elite"/>
               <w:noProof/>
               <w:lang w:eastAsia="sk-SK"/>
             </w:rPr>
@@ -1010,12 +1119,14 @@
             <w:r>
               <w:rPr>
                 <w:rStyle w:val="Hypertextovodkaz"/>
+                <w:rFonts w:ascii="Special Elite" w:hAnsi="Special Elite"/>
                 <w:noProof/>
               </w:rPr>
               <w:t>Servis</w:t>
             </w:r>
             <w:r>
               <w:rPr>
+                <w:rFonts w:ascii="Special Elite" w:hAnsi="Special Elite"/>
                 <w:noProof/>
                 <w:webHidden/>
               </w:rPr>
@@ -1023,6 +1134,7 @@
             </w:r>
             <w:r>
               <w:rPr>
+                <w:rFonts w:ascii="Special Elite" w:hAnsi="Special Elite"/>
                 <w:noProof/>
                 <w:webHidden/>
               </w:rPr>
@@ -1030,6 +1142,7 @@
             </w:r>
             <w:r>
               <w:rPr>
+                <w:rFonts w:ascii="Special Elite" w:hAnsi="Special Elite"/>
                 <w:noProof/>
                 <w:webHidden/>
               </w:rPr>
@@ -1037,12 +1150,14 @@
             </w:r>
             <w:r>
               <w:rPr>
-                <w:noProof/>
-                <w:webHidden/>
-              </w:rPr>
-            </w:r>
-            <w:r>
-              <w:rPr>
+                <w:rFonts w:ascii="Special Elite" w:hAnsi="Special Elite"/>
+                <w:noProof/>
+                <w:webHidden/>
+              </w:rPr>
+            </w:r>
+            <w:r>
+              <w:rPr>
+                <w:rFonts w:ascii="Special Elite" w:hAnsi="Special Elite"/>
                 <w:noProof/>
                 <w:webHidden/>
               </w:rPr>
@@ -1050,13 +1165,15 @@
             </w:r>
             <w:r>
               <w:rPr>
-                <w:noProof/>
-                <w:webHidden/>
-              </w:rPr>
-              <w:t>4</w:t>
-            </w:r>
-            <w:r>
-              <w:rPr>
+                <w:rFonts w:ascii="Special Elite" w:hAnsi="Special Elite"/>
+                <w:noProof/>
+                <w:webHidden/>
+              </w:rPr>
+              <w:t>6</w:t>
+            </w:r>
+            <w:r>
+              <w:rPr>
+                <w:rFonts w:ascii="Special Elite" w:hAnsi="Special Elite"/>
                 <w:noProof/>
                 <w:webHidden/>
               </w:rPr>
@@ -1071,7 +1188,7 @@
               <w:tab w:val="right" w:leader="dot" w:pos="10456"/>
             </w:tabs>
             <w:rPr>
-              <w:rFonts w:asciiTheme="minorHAnsi" w:eastAsiaTheme="minorEastAsia" w:hAnsiTheme="minorHAnsi"/>
+              <w:rFonts w:ascii="Special Elite" w:eastAsiaTheme="minorEastAsia" w:hAnsi="Special Elite"/>
               <w:noProof/>
               <w:lang w:eastAsia="sk-SK"/>
             </w:rPr>
@@ -1080,12 +1197,14 @@
             <w:r>
               <w:rPr>
                 <w:rStyle w:val="Hypertextovodkaz"/>
+                <w:rFonts w:ascii="Special Elite" w:hAnsi="Special Elite"/>
                 <w:noProof/>
               </w:rPr>
               <w:t>Spolupracovali</w:t>
             </w:r>
             <w:r>
               <w:rPr>
+                <w:rFonts w:ascii="Special Elite" w:hAnsi="Special Elite"/>
                 <w:noProof/>
                 <w:webHidden/>
               </w:rPr>
@@ -1093,6 +1212,7 @@
             </w:r>
             <w:r>
               <w:rPr>
+                <w:rFonts w:ascii="Special Elite" w:hAnsi="Special Elite"/>
                 <w:noProof/>
                 <w:webHidden/>
               </w:rPr>
@@ -1100,6 +1220,7 @@
             </w:r>
             <w:r>
               <w:rPr>
+                <w:rFonts w:ascii="Special Elite" w:hAnsi="Special Elite"/>
                 <w:noProof/>
                 <w:webHidden/>
               </w:rPr>
@@ -1107,12 +1228,14 @@
             </w:r>
             <w:r>
               <w:rPr>
-                <w:noProof/>
-                <w:webHidden/>
-              </w:rPr>
-            </w:r>
-            <w:r>
-              <w:rPr>
+                <w:rFonts w:ascii="Special Elite" w:hAnsi="Special Elite"/>
+                <w:noProof/>
+                <w:webHidden/>
+              </w:rPr>
+            </w:r>
+            <w:r>
+              <w:rPr>
+                <w:rFonts w:ascii="Special Elite" w:hAnsi="Special Elite"/>
                 <w:noProof/>
                 <w:webHidden/>
               </w:rPr>
@@ -1120,13 +1243,15 @@
             </w:r>
             <w:r>
               <w:rPr>
-                <w:noProof/>
-                <w:webHidden/>
-              </w:rPr>
-              <w:t>5</w:t>
-            </w:r>
-            <w:r>
-              <w:rPr>
+                <w:rFonts w:ascii="Special Elite" w:hAnsi="Special Elite"/>
+                <w:noProof/>
+                <w:webHidden/>
+              </w:rPr>
+              <w:t>7</w:t>
+            </w:r>
+            <w:r>
+              <w:rPr>
+                <w:rFonts w:ascii="Special Elite" w:hAnsi="Special Elite"/>
                 <w:noProof/>
                 <w:webHidden/>
               </w:rPr>
@@ -1135,8 +1260,14 @@
           </w:hyperlink>
         </w:p>
         <w:p>
+          <w:pPr>
+            <w:rPr>
+              <w:rFonts w:ascii="Special Elite" w:hAnsi="Special Elite"/>
+            </w:rPr>
+          </w:pPr>
           <w:r>
             <w:rPr>
+              <w:rFonts w:ascii="Special Elite" w:hAnsi="Special Elite"/>
               <w:b/>
               <w:bCs/>
               <w:lang w:val="cs-CZ"/>
@@ -1147,26 +1278,49 @@
       </w:sdtContent>
     </w:sdt>
     <w:p>
-      <w:r>
+      <w:pPr>
+        <w:rPr>
+          <w:rFonts w:ascii="Special Elite" w:hAnsi="Special Elite"/>
+        </w:rPr>
+      </w:pPr>
+      <w:r>
+        <w:rPr>
+          <w:rFonts w:ascii="Special Elite" w:hAnsi="Special Elite"/>
+        </w:rPr>
         <w:br w:type="page"/>
       </w:r>
     </w:p>
     <w:p>
       <w:pPr>
         <w:pStyle w:val="Nadpis1"/>
+        <w:rPr>
+          <w:rFonts w:ascii="Special Elite" w:hAnsi="Special Elite"/>
+        </w:rPr>
       </w:pPr>
       <w:bookmarkStart w:id="0" w:name="_Toc211153204"/>
       <w:r>
+        <w:rPr>
+          <w:rFonts w:ascii="Special Elite" w:hAnsi="Special Elite"/>
+        </w:rPr>
         <w:lastRenderedPageBreak/>
         <w:t>N</w:t>
       </w:r>
       <w:r>
+        <w:rPr>
+          <w:rFonts w:ascii="Special Elite" w:hAnsi="Special Elite"/>
+        </w:rPr>
         <w:t>UMERI</w:t>
       </w:r>
       <w:r>
+        <w:rPr>
+          <w:rFonts w:ascii="Special Elite" w:hAnsi="Special Elite"/>
+        </w:rPr>
         <w:t xml:space="preserve"> </w:t>
       </w:r>
       <w:r>
+        <w:rPr>
+          <w:rFonts w:ascii="Special Elite" w:hAnsi="Special Elite"/>
+        </w:rPr>
         <w:t>50</w:t>
       </w:r>
       <w:bookmarkEnd w:id="0"/>
@@ -1174,13 +1328,14 @@
     <w:p>
       <w:pPr>
         <w:rPr>
-          <w:rFonts w:cs="Courier New"/>
+          <w:rFonts w:ascii="Special Elite" w:hAnsi="Special Elite" w:cs="Courier New"/>
         </w:rPr>
       </w:pPr>
       <w:bookmarkStart w:id="1" w:name="_Toc211153205"/>
       <w:r>
         <w:rPr>
           <w:rStyle w:val="Nadpis2Char"/>
+          <w:rFonts w:ascii="Special Elite" w:hAnsi="Special Elite"/>
         </w:rPr>
         <w:t xml:space="preserve">História </w:t>
       </w:r>
@@ -1188,6 +1343,7 @@
       <w:r>
         <w:rPr>
           <w:rStyle w:val="Nadpis2Char"/>
+          <w:rFonts w:ascii="Special Elite" w:hAnsi="Special Elite"/>
         </w:rPr>
         <w:t>numitronov</w:t>
       </w:r>
@@ -1195,7 +1351,7 @@
       <w:proofErr w:type="spellEnd"/>
       <w:r>
         <w:rPr>
-          <w:rFonts w:cs="Courier New"/>
+          <w:rFonts w:ascii="Special Elite" w:hAnsi="Special Elite" w:cs="Courier New"/>
           <w:b/>
           <w:bCs/>
         </w:rPr>
@@ -1203,7 +1359,7 @@
       </w:r>
       <w:r>
         <w:rPr>
-          <w:rFonts w:cs="Courier New"/>
+          <w:rFonts w:ascii="Special Elite" w:hAnsi="Special Elite" w:cs="Courier New"/>
           <w:b/>
           <w:bCs/>
         </w:rPr>
@@ -1211,7 +1367,7 @@
       </w:r>
       <w:r>
         <w:rPr>
-          <w:rFonts w:cs="Courier New"/>
+          <w:rFonts w:ascii="Special Elite" w:hAnsi="Special Elite" w:cs="Courier New"/>
         </w:rPr>
         <w:t>TODO</w:t>
       </w:r>
@@ -1220,7 +1376,7 @@
     <w:p>
       <w:pPr>
         <w:rPr>
-          <w:rFonts w:cs="Courier New"/>
+          <w:rFonts w:ascii="Special Elite" w:hAnsi="Special Elite" w:cs="Courier New"/>
           <w:b/>
           <w:bCs/>
         </w:rPr>
@@ -1229,31 +1385,91 @@
     <w:p>
       <w:pPr>
         <w:pStyle w:val="Nadpis2"/>
-      </w:pPr>
-      <w:r>
+        <w:rPr>
+          <w:rFonts w:ascii="Special Elite" w:hAnsi="Special Elite"/>
+        </w:rPr>
+      </w:pPr>
+      <w:r>
+        <w:rPr>
+          <w:rFonts w:ascii="Special Elite" w:hAnsi="Special Elite"/>
+        </w:rPr>
         <w:t>Ovládanie</w:t>
       </w:r>
       <w:bookmarkEnd w:id="2"/>
     </w:p>
     <w:p>
-      <w:r>
+      <w:pPr>
+        <w:rPr>
+          <w:rFonts w:ascii="Special Elite" w:hAnsi="Special Elite"/>
+        </w:rPr>
+      </w:pPr>
+      <w:r>
+        <w:rPr>
+          <w:rFonts w:ascii="Special Elite" w:hAnsi="Special Elite"/>
+        </w:rPr>
         <w:t>TODO</w:t>
       </w:r>
-    </w:p>
-    <w:p/>
-    <w:p>
-      <w:pPr>
-        <w:pStyle w:val="Nadpis2"/>
-      </w:pPr>
-      <w:bookmarkStart w:id="3" w:name="_Toc211153207"/>
-      <w:r>
-        <w:t>Nastavenia:</w:t>
-      </w:r>
-      <w:bookmarkEnd w:id="3"/>
     </w:p>
     <w:p>
-      <w:r>
-        <w:rPr>
+      <w:pPr>
+        <w:rPr>
+          <w:rFonts w:ascii="Special Elite" w:hAnsi="Special Elite"/>
+        </w:rPr>
+      </w:pPr>
+    </w:p>
+    <w:p>
+      <w:pPr>
+        <w:pStyle w:val="Nadpis2"/>
+        <w:rPr>
+          <w:rFonts w:ascii="Special Elite" w:hAnsi="Special Elite"/>
+        </w:rPr>
+      </w:pPr>
+      <w:bookmarkStart w:id="3" w:name="_Toc211153207"/>
+      <w:r>
+        <w:rPr>
+          <w:rFonts w:ascii="Special Elite" w:hAnsi="Special Elite"/>
+        </w:rPr>
+        <w:lastRenderedPageBreak/>
+        <w:t>Nastavenia</w:t>
+      </w:r>
+      <w:bookmarkEnd w:id="3"/>
+      <w:r>
+        <w:rPr>
+          <w:rFonts w:ascii="Special Elite" w:hAnsi="Special Elite"/>
+        </w:rPr>
+        <w:t xml:space="preserve"> – 1. strana</w:t>
+      </w:r>
+    </w:p>
+    <w:p>
+      <w:pPr>
+        <w:rPr>
+          <w:rFonts w:ascii="Special Elite" w:hAnsi="Special Elite"/>
+        </w:rPr>
+      </w:pPr>
+    </w:p>
+    <w:p>
+      <w:pPr>
+        <w:rPr>
+          <w:rFonts w:ascii="Special Elite" w:hAnsi="Special Elite"/>
+        </w:rPr>
+      </w:pPr>
+    </w:p>
+    <w:p>
+      <w:pPr>
+        <w:rPr>
+          <w:rFonts w:ascii="Special Elite" w:hAnsi="Special Elite"/>
+        </w:rPr>
+      </w:pPr>
+    </w:p>
+    <w:p>
+      <w:pPr>
+        <w:rPr>
+          <w:rFonts w:ascii="Special Elite" w:hAnsi="Special Elite"/>
+        </w:rPr>
+      </w:pPr>
+      <w:r>
+        <w:rPr>
+          <w:rFonts w:ascii="Special Elite" w:hAnsi="Special Elite"/>
           <w:noProof/>
         </w:rPr>
         <mc:AlternateContent>
@@ -1318,6 +1534,7 @@
       </w:r>
       <w:r>
         <w:rPr>
+          <w:rFonts w:ascii="Special Elite" w:hAnsi="Special Elite"/>
           <w:noProof/>
         </w:rPr>
         <mc:AlternateContent>
@@ -1369,6 +1586,7 @@
       </w:r>
       <w:r>
         <w:rPr>
+          <w:rFonts w:ascii="Special Elite" w:hAnsi="Special Elite"/>
           <w:noProof/>
         </w:rPr>
         <mc:AlternateContent>
@@ -1414,6 +1632,7 @@
       </w:r>
       <w:r>
         <w:rPr>
+          <w:rFonts w:ascii="Special Elite" w:hAnsi="Special Elite"/>
           <w:noProof/>
         </w:rPr>
         <mc:AlternateContent>
@@ -1458,25 +1677,37 @@
         </mc:AlternateContent>
       </w:r>
       <w:r>
-        <w:t>1|2|3|4</w:t>
-      </w:r>
-      <w:r>
+        <w:rPr>
+          <w:rFonts w:ascii="Special Elite" w:hAnsi="Special Elite"/>
+        </w:rPr>
         <w:br/>
         <w:t xml:space="preserve">| | | |- </w:t>
       </w:r>
       <w:r>
+        <w:rPr>
+          <w:rFonts w:ascii="Special Elite" w:hAnsi="Special Elite"/>
+        </w:rPr>
         <w:br/>
         <w:t xml:space="preserve">| | |--- </w:t>
       </w:r>
       <w:r>
+        <w:rPr>
+          <w:rFonts w:ascii="Special Elite" w:hAnsi="Special Elite"/>
+        </w:rPr>
         <w:br/>
         <w:t xml:space="preserve">| |----- [1/0] </w:t>
       </w:r>
       <w:r>
+        <w:rPr>
+          <w:rFonts w:ascii="Special Elite" w:hAnsi="Special Elite"/>
+        </w:rPr>
         <w:br/>
         <w:t xml:space="preserve">| ------ </w:t>
       </w:r>
       <w:r>
+        <w:rPr>
+          <w:rFonts w:ascii="Special Elite" w:hAnsi="Special Elite"/>
+        </w:rPr>
         <w:t>2 – 12 hodinový režim, 4 – 24 hodinový režim</w:t>
       </w:r>
     </w:p>
@@ -1484,105 +1715,211 @@
       <w:pPr>
         <w:rPr>
           <w:rStyle w:val="Nadpis2Char"/>
-        </w:rPr>
-      </w:pPr>
+          <w:rFonts w:ascii="Special Elite" w:eastAsiaTheme="minorHAnsi" w:hAnsi="Special Elite" w:cstheme="minorBidi"/>
+          <w:b w:val="0"/>
+          <w:color w:val="auto"/>
+          <w:szCs w:val="24"/>
+          <w:u w:val="none"/>
+        </w:rPr>
+      </w:pPr>
+      <w:bookmarkStart w:id="4" w:name="_Toc211153208"/>
+      <w:r>
+        <w:rPr>
+          <w:rStyle w:val="Nadpis2Char"/>
+          <w:rFonts w:ascii="Special Elite" w:hAnsi="Special Elite"/>
+        </w:rPr>
+        <w:lastRenderedPageBreak/>
+        <w:t>Firmvér</w:t>
+      </w:r>
+      <w:bookmarkEnd w:id="4"/>
+      <w:r>
+        <w:rPr>
+          <w:rFonts w:ascii="Special Elite" w:hAnsi="Special Elite" w:cs="Courier New"/>
+        </w:rPr>
+        <w:br/>
+        <w:t xml:space="preserve">Hodiny sú riadené čipom </w:t>
+      </w:r>
+      <w:r>
+        <w:rPr>
+          <w:rFonts w:ascii="Special Elite" w:hAnsi="Special Elite" w:cs="Courier New"/>
+        </w:rPr>
+        <w:t>ATmega328</w:t>
+      </w:r>
+      <w:r>
+        <w:rPr>
+          <w:rFonts w:ascii="Special Elite" w:hAnsi="Special Elite" w:cs="Courier New"/>
+        </w:rPr>
+        <w:t>P</w:t>
+      </w:r>
+      <w:r>
+        <w:rPr>
+          <w:rFonts w:ascii="Special Elite" w:hAnsi="Special Elite" w:cs="Courier New"/>
+        </w:rPr>
+        <w:t xml:space="preserve"> </w:t>
+      </w:r>
+      <w:r>
+        <w:rPr>
+          <w:rFonts w:ascii="Special Elite" w:hAnsi="Special Elite" w:cs="Courier New"/>
+        </w:rPr>
+        <w:t>s </w:t>
+      </w:r>
+      <w:r>
+        <w:rPr>
+          <w:rFonts w:ascii="Special Elite" w:hAnsi="Special Elite" w:cs="Courier New"/>
+        </w:rPr>
+        <w:t>p</w:t>
+      </w:r>
+      <w:r>
+        <w:rPr>
+          <w:rFonts w:ascii="Special Elite" w:hAnsi="Special Elite" w:cs="Courier New"/>
+        </w:rPr>
+        <w:t>r</w:t>
+      </w:r>
+      <w:r>
+        <w:rPr>
+          <w:rFonts w:ascii="Special Elite" w:hAnsi="Special Elite" w:cs="Courier New"/>
+        </w:rPr>
+        <w:t>edin</w:t>
+      </w:r>
+      <w:r>
+        <w:rPr>
+          <w:rFonts w:ascii="Special Elite" w:hAnsi="Special Elite" w:cs="Courier New"/>
+        </w:rPr>
+        <w:t>š</w:t>
+      </w:r>
+      <w:r>
+        <w:rPr>
+          <w:rFonts w:ascii="Special Elite" w:hAnsi="Special Elite" w:cs="Courier New"/>
+        </w:rPr>
+        <w:t>talovaným</w:t>
+      </w:r>
+      <w:r>
+        <w:rPr>
+          <w:rFonts w:ascii="Special Elite" w:hAnsi="Special Elite" w:cs="Courier New"/>
+        </w:rPr>
+        <w:t xml:space="preserve"> firmvérom KRONOS I</w:t>
+      </w:r>
+      <w:r>
+        <w:rPr>
+          <w:rFonts w:ascii="Special Elite" w:hAnsi="Special Elite" w:cs="Courier New"/>
+        </w:rPr>
+        <w:t>I, ktorý je možné v prípade potreby preinštalovať pomocou ICSP zbernice osadenej na doske hodín.</w:t>
+      </w:r>
+      <w:r>
+        <w:rPr>
+          <w:rFonts w:ascii="Special Elite" w:hAnsi="Special Elite" w:cs="Courier New"/>
+        </w:rPr>
+        <w:t xml:space="preserve"> Pri nahrávaní nového programu do čipu hodín svieti indikačná LED-ka jasn</w:t>
+      </w:r>
+      <w:r>
+        <w:rPr>
+          <w:rFonts w:ascii="Special Elite" w:hAnsi="Special Elite" w:cs="Courier New"/>
+        </w:rPr>
+        <w:t>e</w:t>
+      </w:r>
+      <w:r>
+        <w:rPr>
+          <w:rFonts w:ascii="Special Elite" w:hAnsi="Special Elite" w:cs="Courier New"/>
+        </w:rPr>
+        <w:t xml:space="preserve"> modrou farbou.</w:t>
+      </w:r>
     </w:p>
     <w:p>
-      <w:bookmarkStart w:id="4" w:name="_Toc211153208"/>
+      <w:pPr>
+        <w:rPr>
+          <w:rFonts w:ascii="Special Elite" w:hAnsi="Special Elite"/>
+        </w:rPr>
+      </w:pPr>
       <w:r>
         <w:rPr>
           <w:rStyle w:val="Nadpis2Char"/>
-        </w:rPr>
-        <w:t>Firmvér</w:t>
-      </w:r>
-      <w:bookmarkEnd w:id="4"/>
-      <w:r>
-        <w:rPr>
-          <w:rFonts w:cs="Courier New"/>
+          <w:rFonts w:ascii="Special Elite" w:hAnsi="Special Elite"/>
+        </w:rPr>
+        <w:t>Pamäť</w:t>
+      </w:r>
+      <w:r>
+        <w:rPr>
+          <w:rStyle w:val="Nadpis2Char"/>
+          <w:rFonts w:ascii="Special Elite" w:hAnsi="Special Elite"/>
         </w:rPr>
         <w:br/>
-        <w:t xml:space="preserve">Hodiny sú riadené čipom </w:t>
-      </w:r>
-      <w:r>
-        <w:rPr>
-          <w:rFonts w:cs="Courier New"/>
-        </w:rPr>
-        <w:t>ATmega328</w:t>
-      </w:r>
-      <w:r>
-        <w:rPr>
-          <w:rFonts w:cs="Courier New"/>
-        </w:rPr>
-        <w:t>P</w:t>
-      </w:r>
-      <w:r>
-        <w:rPr>
-          <w:rFonts w:cs="Courier New"/>
+      </w:r>
+      <w:r>
+        <w:rPr>
+          <w:rFonts w:ascii="Special Elite" w:hAnsi="Special Elite"/>
+        </w:rPr>
+        <w:t xml:space="preserve">Súčasťou čipu je aj 1 </w:t>
+      </w:r>
+      <w:proofErr w:type="spellStart"/>
+      <w:r>
+        <w:rPr>
+          <w:rFonts w:ascii="Special Elite" w:hAnsi="Special Elite"/>
+        </w:rPr>
+        <w:t>kB</w:t>
+      </w:r>
+      <w:proofErr w:type="spellEnd"/>
+      <w:r>
+        <w:rPr>
+          <w:rFonts w:ascii="Special Elite" w:hAnsi="Special Elite"/>
+        </w:rPr>
+        <w:t xml:space="preserve"> EEPROM pamäť ktorá uchováva nastavenia aj po kompletnom vypnutí hodín. Životnosť každej z jej pamäťových bajtových buniek</w:t>
+      </w:r>
+      <w:r>
+        <w:rPr>
+          <w:rFonts w:ascii="Special Elite" w:hAnsi="Special Elite"/>
+        </w:rPr>
+        <w:t xml:space="preserve"> je</w:t>
+      </w:r>
+      <w:r>
+        <w:rPr>
+          <w:rFonts w:ascii="Special Elite" w:hAnsi="Special Elite"/>
+        </w:rPr>
+        <w:t xml:space="preserve"> 100 000 zápisov.</w:t>
+      </w:r>
+      <w:r>
+        <w:rPr>
+          <w:rFonts w:ascii="Special Elite" w:hAnsi="Special Elite"/>
+        </w:rPr>
+        <w:t xml:space="preserve"> Pre zvýšenie životnosti </w:t>
+      </w:r>
+      <w:r>
+        <w:rPr>
+          <w:rFonts w:ascii="Special Elite" w:hAnsi="Special Elite"/>
+        </w:rPr>
+        <w:t xml:space="preserve">zapisujeme </w:t>
+      </w:r>
+      <w:r>
+        <w:rPr>
+          <w:rFonts w:ascii="Special Elite" w:hAnsi="Special Elite"/>
+        </w:rPr>
+        <w:t>dáta cyklicky a nie stále na to isté miesto. Ak sa konfigurácie neukladajú,</w:t>
+      </w:r>
+      <w:r>
+        <w:rPr>
+          <w:rFonts w:ascii="Special Elite" w:hAnsi="Special Elite"/>
         </w:rPr>
         <w:t xml:space="preserve"> </w:t>
       </w:r>
       <w:r>
         <w:rPr>
-          <w:rFonts w:cs="Courier New"/>
-        </w:rPr>
-        <w:t>s </w:t>
-      </w:r>
-      <w:r>
-        <w:rPr>
-          <w:rFonts w:cs="Courier New"/>
-        </w:rPr>
-        <w:t>p</w:t>
-      </w:r>
-      <w:r>
-        <w:rPr>
-          <w:rFonts w:cs="Courier New"/>
-        </w:rPr>
-        <w:t>r</w:t>
-      </w:r>
-      <w:r>
-        <w:rPr>
-          <w:rFonts w:cs="Courier New"/>
-        </w:rPr>
-        <w:t>edin</w:t>
-      </w:r>
-      <w:r>
-        <w:rPr>
-          <w:rFonts w:cs="Courier New"/>
-        </w:rPr>
-        <w:t>š</w:t>
-      </w:r>
-      <w:r>
-        <w:rPr>
-          <w:rFonts w:cs="Courier New"/>
-        </w:rPr>
-        <w:t>talovaným</w:t>
-      </w:r>
-      <w:r>
-        <w:rPr>
-          <w:rFonts w:cs="Courier New"/>
-        </w:rPr>
-        <w:t xml:space="preserve"> firmvérom KRONOS I</w:t>
-      </w:r>
-      <w:r>
-        <w:rPr>
-          <w:rFonts w:cs="Courier New"/>
-        </w:rPr>
-        <w:t>I, ktorý je možné v prípade potreby preinštalovať pomocou ICSP zbernice osadenej na doske hodín.</w:t>
-      </w:r>
-      <w:r>
-        <w:rPr>
-          <w:rFonts w:cs="Courier New"/>
-        </w:rPr>
-        <w:t xml:space="preserve"> Pri nahrávaní nového programu do čipu hodín svieti indikačná LED-ka jasnou modrou farbou.</w:t>
-      </w:r>
+          <w:rFonts w:ascii="Special Elite" w:hAnsi="Special Elite"/>
+        </w:rPr>
+        <w:t>jedinou opravou je výmena celého čipu ATMega328 a opätovné napálenie firmvéru.</w:t>
+      </w:r>
+      <w:bookmarkStart w:id="5" w:name="_Toc211153209"/>
     </w:p>
-    <w:p/>
     <w:p>
       <w:pPr>
         <w:pStyle w:val="Nadpis2"/>
-      </w:pPr>
-      <w:bookmarkStart w:id="5" w:name="_Toc211153209"/>
-      <w:r>
+        <w:rPr>
+          <w:rFonts w:ascii="Special Elite" w:hAnsi="Special Elite"/>
+        </w:rPr>
+      </w:pPr>
+      <w:r>
+        <w:rPr>
+          <w:rFonts w:ascii="Special Elite" w:hAnsi="Special Elite"/>
+        </w:rPr>
+        <w:lastRenderedPageBreak/>
         <w:t>Manuálne nastavovanie</w:t>
       </w:r>
       <w:bookmarkEnd w:id="5"/>
@@ -1591,12 +1928,12 @@
       <w:pPr>
         <w:jc w:val="both"/>
         <w:rPr>
-          <w:rFonts w:cs="Courier New"/>
-        </w:rPr>
-      </w:pPr>
-      <w:r>
-        <w:rPr>
-          <w:rFonts w:cs="Courier New"/>
+          <w:rFonts w:ascii="Special Elite" w:hAnsi="Special Elite" w:cs="Courier New"/>
+        </w:rPr>
+      </w:pPr>
+      <w:r>
+        <w:rPr>
+          <w:rFonts w:ascii="Special Elite" w:hAnsi="Special Elite" w:cs="Courier New"/>
         </w:rPr>
         <w:t>Na zadnej strane hodín sú osadené dve tlačidlá ktorými je možné hodiny nastavovať manuálne. Jedno tlačidlo posúva kurzor a druhé hodnotu na mieste kurzora. Stlačením oboch tlačidiel naraz sa prepína nastavovací režim. Podržaním jedného z tlačidiel sa nastavuje jas.</w:t>
       </w:r>
@@ -1605,306 +1942,315 @@
       <w:pPr>
         <w:jc w:val="both"/>
         <w:rPr>
-          <w:rFonts w:cs="Courier New"/>
-        </w:rPr>
-      </w:pPr>
+          <w:rFonts w:ascii="Special Elite" w:hAnsi="Special Elite" w:cs="Courier New"/>
+        </w:rPr>
+      </w:pPr>
+      <w:bookmarkStart w:id="6" w:name="_Toc211153210"/>
+      <w:r>
+        <w:rPr>
+          <w:rStyle w:val="Nadpis2Char"/>
+          <w:rFonts w:ascii="Special Elite" w:hAnsi="Special Elite"/>
+        </w:rPr>
+        <w:t>Napájanie</w:t>
+      </w:r>
+      <w:bookmarkEnd w:id="6"/>
+      <w:r>
+        <w:rPr>
+          <w:rFonts w:ascii="Special Elite" w:hAnsi="Special Elite" w:cs="Courier New"/>
+          <w:b/>
+          <w:bCs/>
+        </w:rPr>
+        <w:br/>
+      </w:r>
+      <w:r>
+        <w:rPr>
+          <w:rFonts w:ascii="Special Elite" w:hAnsi="Special Elite" w:cs="Courier New"/>
+        </w:rPr>
+        <w:t>Hodiny sa napájajú zo zdroja s výstupom 5</w:t>
+      </w:r>
+      <w:r>
+        <w:rPr>
+          <w:rFonts w:ascii="Special Elite" w:hAnsi="Special Elite" w:cs="Courier New"/>
+        </w:rPr>
+        <w:t xml:space="preserve"> </w:t>
+      </w:r>
+      <w:r>
+        <w:rPr>
+          <w:rFonts w:ascii="Special Elite" w:hAnsi="Special Elite" w:cs="Courier New"/>
+        </w:rPr>
+        <w:t xml:space="preserve">V schopným dodať aspoň </w:t>
+      </w:r>
+      <w:r>
+        <w:rPr>
+          <w:rFonts w:ascii="Special Elite" w:hAnsi="Special Elite" w:cs="Courier New"/>
+        </w:rPr>
+        <w:t>5</w:t>
+      </w:r>
+      <w:r>
+        <w:rPr>
+          <w:rFonts w:ascii="Special Elite" w:hAnsi="Special Elite" w:cs="Courier New"/>
+        </w:rPr>
+        <w:t xml:space="preserve"> </w:t>
+      </w:r>
+      <w:r>
+        <w:rPr>
+          <w:rFonts w:ascii="Special Elite" w:hAnsi="Special Elite" w:cs="Courier New"/>
+        </w:rPr>
+        <w:t>W. Zdroj by mal byť ideálne spínaný pre čo najnižšiu stratovosť s frekvenciou spínania</w:t>
+      </w:r>
+      <w:r>
+        <w:rPr>
+          <w:rFonts w:ascii="Special Elite" w:hAnsi="Special Elite" w:cs="Courier New"/>
+        </w:rPr>
+        <w:t xml:space="preserve"> rádovo</w:t>
+      </w:r>
+      <w:r>
+        <w:rPr>
+          <w:rFonts w:ascii="Special Elite" w:hAnsi="Special Elite" w:cs="Courier New"/>
+        </w:rPr>
+        <w:t xml:space="preserve"> vyššou ako 77.5 kHz aby sa predišlo rušeniu DCF77 prijímača.</w:t>
+      </w:r>
+      <w:r>
+        <w:rPr>
+          <w:rFonts w:ascii="Special Elite" w:hAnsi="Special Elite" w:cs="Courier New"/>
+        </w:rPr>
+        <w:br w:type="page"/>
+      </w:r>
     </w:p>
     <w:p>
       <w:pPr>
         <w:jc w:val="both"/>
         <w:rPr>
-          <w:rFonts w:cs="Courier New"/>
-        </w:rPr>
-      </w:pPr>
-      <w:bookmarkStart w:id="6" w:name="_Toc211153210"/>
-      <w:r>
-        <w:rPr>
           <w:rStyle w:val="Nadpis2Char"/>
-        </w:rPr>
-        <w:t>Napájanie</w:t>
-      </w:r>
-      <w:bookmarkEnd w:id="6"/>
-      <w:r>
-        <w:rPr>
-          <w:rFonts w:cs="Courier New"/>
-          <w:b/>
-          <w:bCs/>
-        </w:rPr>
-        <w:br/>
-      </w:r>
-      <w:r>
-        <w:rPr>
-          <w:rFonts w:cs="Courier New"/>
-        </w:rPr>
-        <w:t>Hodiny sa napájajú zo zdroja s výstupom 5</w:t>
-      </w:r>
-      <w:r>
-        <w:rPr>
-          <w:rFonts w:cs="Courier New"/>
-        </w:rPr>
-        <w:t xml:space="preserve"> </w:t>
-      </w:r>
-      <w:r>
-        <w:rPr>
-          <w:rFonts w:cs="Courier New"/>
-        </w:rPr>
-        <w:t xml:space="preserve">V schopným dodať aspoň </w:t>
-      </w:r>
-      <w:r>
-        <w:rPr>
-          <w:rFonts w:cs="Courier New"/>
-        </w:rPr>
-        <w:t>5</w:t>
-      </w:r>
-      <w:r>
-        <w:rPr>
-          <w:rFonts w:cs="Courier New"/>
-        </w:rPr>
-        <w:t xml:space="preserve"> </w:t>
-      </w:r>
-      <w:r>
-        <w:rPr>
-          <w:rFonts w:cs="Courier New"/>
-        </w:rPr>
-        <w:t>W. Zdroj by mal byť ideálne spínaný pre čo najnižšiu stratovosť s frekvenciou spínania</w:t>
-      </w:r>
-      <w:r>
-        <w:rPr>
-          <w:rFonts w:cs="Courier New"/>
-        </w:rPr>
-        <w:t xml:space="preserve"> rádovo</w:t>
-      </w:r>
-      <w:r>
-        <w:rPr>
-          <w:rFonts w:cs="Courier New"/>
-        </w:rPr>
-        <w:t xml:space="preserve"> vyššou ako 77.5 kHz aby sa predišlo rušeniu DCF77 prijímača.</w:t>
-      </w:r>
+          <w:rFonts w:ascii="Special Elite" w:hAnsi="Special Elite"/>
+        </w:rPr>
+      </w:pPr>
+      <w:bookmarkStart w:id="7" w:name="_Toc211153211"/>
+      <w:r>
+        <w:rPr>
+          <w:rStyle w:val="Nadpis2Char"/>
+          <w:rFonts w:ascii="Special Elite" w:hAnsi="Special Elite"/>
+        </w:rPr>
+        <w:lastRenderedPageBreak/>
+        <w:t>Pr</w:t>
+      </w:r>
+      <w:r>
+        <w:rPr>
+          <w:rStyle w:val="Nadpis2Char"/>
+          <w:rFonts w:ascii="Special Elite" w:hAnsi="Special Elite"/>
+        </w:rPr>
+        <w:t>i</w:t>
+      </w:r>
+      <w:r>
+        <w:rPr>
+          <w:rStyle w:val="Nadpis2Char"/>
+          <w:rFonts w:ascii="Special Elite" w:hAnsi="Special Elite"/>
+        </w:rPr>
+        <w:t>j</w:t>
+      </w:r>
+      <w:r>
+        <w:rPr>
+          <w:rStyle w:val="Nadpis2Char"/>
+          <w:rFonts w:ascii="Special Elite" w:hAnsi="Special Elite"/>
+        </w:rPr>
+        <w:t>í</w:t>
+      </w:r>
+      <w:r>
+        <w:rPr>
+          <w:rStyle w:val="Nadpis2Char"/>
+          <w:rFonts w:ascii="Special Elite" w:hAnsi="Special Elite"/>
+        </w:rPr>
+        <w:t>mač DCF77</w:t>
+      </w:r>
+      <w:bookmarkEnd w:id="7"/>
     </w:p>
     <w:p>
       <w:pPr>
-        <w:rPr>
-          <w:rFonts w:cs="Courier New"/>
-        </w:rPr>
-      </w:pPr>
+        <w:jc w:val="both"/>
+        <w:rPr>
+          <w:rFonts w:ascii="Special Elite" w:hAnsi="Special Elite" w:cs="Courier New"/>
+        </w:rPr>
+      </w:pPr>
+      <w:r>
+        <w:rPr>
+          <w:rFonts w:ascii="Special Elite" w:hAnsi="Special Elite" w:cs="Courier New"/>
+        </w:rPr>
+        <w:t>V podstavci je umiestnená 140 milimetrová feritová anténa vlastnej výroby, odladená tak aby rezonovala pri frekvencii 77,5</w:t>
+      </w:r>
+      <w:r>
+        <w:rPr>
+          <w:rFonts w:ascii="Special Elite" w:hAnsi="Special Elite" w:cs="Courier New"/>
+        </w:rPr>
+        <w:t xml:space="preserve"> </w:t>
+      </w:r>
+      <w:r>
+        <w:rPr>
+          <w:rFonts w:ascii="Special Elite" w:hAnsi="Special Elite" w:cs="Courier New"/>
+        </w:rPr>
+        <w:t>kHz na ktorej vysielajú atómové hodiny z </w:t>
+      </w:r>
+      <w:proofErr w:type="spellStart"/>
+      <w:r>
+        <w:rPr>
+          <w:rFonts w:ascii="Special Elite" w:hAnsi="Special Elite" w:cs="Courier New"/>
+        </w:rPr>
+        <w:t>Mainflingenu</w:t>
+      </w:r>
+      <w:proofErr w:type="spellEnd"/>
+      <w:r>
+        <w:rPr>
+          <w:rFonts w:ascii="Special Elite" w:hAnsi="Special Elite" w:cs="Courier New"/>
+        </w:rPr>
+        <w:t xml:space="preserve"> (Nemecko) svoj časový signál. Tento signál používajú hodiny k automatickému nastaveniu času a prechodu zo zimného času na letný a naopak.</w:t>
+      </w:r>
     </w:p>
     <w:p>
       <w:pPr>
-        <w:rPr>
-          <w:rFonts w:cs="Courier New"/>
-        </w:rPr>
-      </w:pPr>
-      <w:bookmarkStart w:id="7" w:name="_Toc211153211"/>
-      <w:r>
-        <w:rPr>
-          <w:rStyle w:val="Nadpis2Char"/>
-        </w:rPr>
-        <w:t>Pr</w:t>
-      </w:r>
-      <w:r>
-        <w:rPr>
-          <w:rStyle w:val="Nadpis2Char"/>
-        </w:rPr>
-        <w:t>i</w:t>
-      </w:r>
-      <w:r>
-        <w:rPr>
-          <w:rStyle w:val="Nadpis2Char"/>
-        </w:rPr>
-        <w:t>j</w:t>
-      </w:r>
-      <w:r>
-        <w:rPr>
-          <w:rStyle w:val="Nadpis2Char"/>
-        </w:rPr>
-        <w:t>í</w:t>
-      </w:r>
-      <w:r>
-        <w:rPr>
-          <w:rStyle w:val="Nadpis2Char"/>
-        </w:rPr>
-        <w:t>mač DCF77</w:t>
-      </w:r>
-      <w:bookmarkEnd w:id="7"/>
-      <w:r>
-        <w:rPr>
-          <w:rFonts w:cs="Courier New"/>
-          <w:b/>
-          <w:bCs/>
-        </w:rPr>
-        <w:br/>
-      </w:r>
-      <w:r>
-        <w:rPr>
-          <w:rFonts w:cs="Courier New"/>
-        </w:rPr>
-        <w:t>V podstavci je umiestnená 140 milimetrová feritová anténa vlastnej výroby, odladená tak aby rezonovala pri frekvencii 77,5</w:t>
-      </w:r>
-      <w:r>
-        <w:rPr>
-          <w:rFonts w:cs="Courier New"/>
-        </w:rPr>
-        <w:t xml:space="preserve"> </w:t>
-      </w:r>
-      <w:r>
-        <w:rPr>
-          <w:rFonts w:cs="Courier New"/>
-        </w:rPr>
-        <w:t>kHz na ktorej vysielajú atómové hodiny z </w:t>
-      </w:r>
-      <w:proofErr w:type="spellStart"/>
-      <w:r>
-        <w:rPr>
-          <w:rFonts w:cs="Courier New"/>
-        </w:rPr>
-        <w:t>Mainflingenu</w:t>
-      </w:r>
-      <w:proofErr w:type="spellEnd"/>
-      <w:r>
-        <w:rPr>
-          <w:rFonts w:cs="Courier New"/>
-        </w:rPr>
-        <w:t xml:space="preserve"> (Nemecko) svoj časový signál. Tento signál používajú hodiny k automatickému nastaveniu času a prechodu zo zimného času na letný a naopak.</w:t>
-      </w:r>
-      <w:r>
-        <w:rPr>
-          <w:rFonts w:cs="Courier New"/>
-        </w:rPr>
-        <w:br/>
-      </w:r>
-      <w:r>
-        <w:rPr>
-          <w:rFonts w:cs="Courier New"/>
-        </w:rPr>
-        <w:br/>
+        <w:jc w:val="both"/>
+        <w:rPr>
+          <w:rFonts w:ascii="Special Elite" w:hAnsi="Special Elite" w:cs="Courier New"/>
+        </w:rPr>
+      </w:pPr>
+      <w:r>
+        <w:rPr>
+          <w:rFonts w:ascii="Special Elite" w:hAnsi="Special Elite" w:cs="Courier New"/>
+        </w:rPr>
         <w:t xml:space="preserve">Keďže feritové antény sú </w:t>
       </w:r>
       <w:r>
         <w:rPr>
-          <w:rFonts w:cs="Courier New"/>
+          <w:rFonts w:ascii="Special Elite" w:hAnsi="Special Elite" w:cs="Courier New"/>
         </w:rPr>
         <w:t xml:space="preserve">z povahy </w:t>
       </w:r>
       <w:r>
         <w:rPr>
-          <w:rFonts w:cs="Courier New"/>
+          <w:rFonts w:ascii="Special Elite" w:hAnsi="Special Elite" w:cs="Courier New"/>
         </w:rPr>
         <w:t>závislé od orientácie, odporúčame mať hodiny otočené čelom na server alebo juh.</w:t>
       </w:r>
     </w:p>
     <w:p>
       <w:pPr>
-        <w:rPr>
-          <w:rFonts w:cs="Courier New"/>
-        </w:rPr>
-      </w:pPr>
-      <w:r>
-        <w:rPr>
-          <w:rFonts w:cs="Courier New"/>
+        <w:jc w:val="both"/>
+        <w:rPr>
+          <w:rFonts w:ascii="Special Elite" w:hAnsi="Special Elite" w:cs="Courier New"/>
+        </w:rPr>
+      </w:pPr>
+      <w:r>
+        <w:rPr>
+          <w:rFonts w:ascii="Special Elite" w:hAnsi="Special Elite" w:cs="Courier New"/>
+        </w:rPr>
+        <w:t>P</w:t>
+      </w:r>
+      <w:r>
+        <w:rPr>
+          <w:rFonts w:ascii="Special Elite" w:hAnsi="Special Elite" w:cs="Courier New"/>
+        </w:rPr>
+        <w:t xml:space="preserve">očas synchronizácie, bliká indikačná LED-ka červenou farbou. Pri dobrej kvalite signálu a správnej orientácii hodín, by mala byť frekvencia blikanie </w:t>
+      </w:r>
+      <w:r>
+        <w:rPr>
+          <w:rFonts w:ascii="Special Elite" w:hAnsi="Special Elite" w:cs="Courier New"/>
         </w:rPr>
         <w:lastRenderedPageBreak/>
-        <w:t>Počas synchronizácie, bliká indikačná LED-ka červenou farbou. Pri dobrej kvalite signálu a správnej orientácii hodín, by mala byť frekvencia blikanie 1 Hz. Po úspešnej synchronizácii času, svieti LED-ka stálou zelenou farbou. V prípade potreby sa tejto indikačnej LED-</w:t>
+        <w:t>1 Hz. Po úspešnej synchronizácii času, svieti LED-ka stálou zelenou farbou. V prípade potreby sa tejto indikačnej LED-</w:t>
       </w:r>
       <w:proofErr w:type="spellStart"/>
       <w:r>
         <w:rPr>
-          <w:rFonts w:cs="Courier New"/>
+          <w:rFonts w:ascii="Special Elite" w:hAnsi="Special Elite" w:cs="Courier New"/>
         </w:rPr>
         <w:t>ke</w:t>
       </w:r>
       <w:proofErr w:type="spellEnd"/>
       <w:r>
         <w:rPr>
-          <w:rFonts w:cs="Courier New"/>
+          <w:rFonts w:ascii="Special Elite" w:hAnsi="Special Elite" w:cs="Courier New"/>
         </w:rPr>
         <w:t xml:space="preserve"> dá upraviť jas alebo sa dá kompletne vypnúť v nastaveniach.</w:t>
       </w:r>
     </w:p>
     <w:p>
       <w:pPr>
-        <w:rPr>
-          <w:rFonts w:cs="Courier New"/>
-        </w:rPr>
-      </w:pPr>
-      <w:r>
-        <w:rPr>
-          <w:rFonts w:cs="Courier New"/>
+        <w:jc w:val="both"/>
+        <w:rPr>
+          <w:rFonts w:ascii="Special Elite" w:hAnsi="Special Elite" w:cs="Courier New"/>
+        </w:rPr>
+      </w:pPr>
+      <w:r>
+        <w:rPr>
+          <w:rFonts w:ascii="Special Elite" w:hAnsi="Special Elite" w:cs="Courier New"/>
         </w:rPr>
         <w:t xml:space="preserve">Hodiny sa synchronizujú automaticky v pravidelných intervaloch (zvyčajne v noci). </w:t>
       </w:r>
       <w:r>
         <w:rPr>
-          <w:rFonts w:cs="Courier New"/>
+          <w:rFonts w:ascii="Special Elite" w:hAnsi="Special Elite" w:cs="Courier New"/>
         </w:rPr>
         <w:t>Ak chcete synchronizáciu vynútiť, v nastaveniach vypnite DCF77 modul a opäť ho zapnite.</w:t>
       </w:r>
+      <w:bookmarkStart w:id="8" w:name="_Toc211153212"/>
     </w:p>
     <w:p>
       <w:pPr>
         <w:rPr>
-          <w:rFonts w:cs="Courier New"/>
-        </w:rPr>
-      </w:pPr>
+          <w:rFonts w:ascii="Special Elite" w:hAnsi="Special Elite" w:cs="Courier New"/>
+        </w:rPr>
+      </w:pPr>
+      <w:r>
+        <w:rPr>
+          <w:rFonts w:ascii="Special Elite" w:hAnsi="Special Elite"/>
+        </w:rPr>
+        <w:t>Záložná batéria</w:t>
+      </w:r>
+      <w:bookmarkEnd w:id="8"/>
+      <w:r>
+        <w:rPr>
+          <w:rFonts w:ascii="Special Elite" w:hAnsi="Special Elite" w:cs="Courier New"/>
+        </w:rPr>
+        <w:br/>
+        <w:t>Pre zachovanie času aj pri odpojení zo siete</w:t>
+      </w:r>
+      <w:r>
+        <w:rPr>
+          <w:rFonts w:ascii="Special Elite" w:hAnsi="Special Elite" w:cs="Courier New"/>
+        </w:rPr>
+        <w:t xml:space="preserve">. Pri bežných podmienkach by mala vydržať približne 5 rokov. </w:t>
+      </w:r>
+      <w:r>
+        <w:rPr>
+          <w:rFonts w:ascii="Special Elite" w:hAnsi="Special Elite" w:cs="Courier New"/>
+        </w:rPr>
+        <w:t xml:space="preserve">Ak si hodiny nezachovávajú správny čas po vypojení zo siete, batériu je treba </w:t>
+      </w:r>
+      <w:r>
+        <w:rPr>
+          <w:rFonts w:ascii="Special Elite" w:hAnsi="Special Elite" w:cs="Courier New"/>
+        </w:rPr>
+        <w:t xml:space="preserve">vymeniť za </w:t>
+      </w:r>
+      <w:r>
+        <w:rPr>
+          <w:rFonts w:ascii="Special Elite" w:hAnsi="Special Elite" w:cs="Courier New"/>
+        </w:rPr>
+        <w:t>kvalitnú mincovú batériu CR2032.</w:t>
+      </w:r>
     </w:p>
     <w:p>
       <w:pPr>
         <w:pStyle w:val="Nadpis2"/>
-      </w:pPr>
-      <w:bookmarkStart w:id="8" w:name="_Toc211153212"/>
-      <w:r>
-        <w:t>Záložná batéria</w:t>
-      </w:r>
-      <w:bookmarkEnd w:id="8"/>
-    </w:p>
-    <w:p>
-      <w:pPr>
-        <w:jc w:val="both"/>
-        <w:rPr>
-          <w:rFonts w:cs="Courier New"/>
-        </w:rPr>
-      </w:pPr>
-      <w:r>
-        <w:rPr>
-          <w:rFonts w:cs="Courier New"/>
-        </w:rPr>
-        <w:t xml:space="preserve">Napája elektroniku zodpovednú za udržovanie aktuálneho času po vypojení z el. siete. Pri bežných podmienkach by mala vydržať približne 5 rokov. </w:t>
-      </w:r>
-      <w:r>
-        <w:rPr>
-          <w:rFonts w:cs="Courier New"/>
-        </w:rPr>
-        <w:t xml:space="preserve">Ak si hodiny nezachovávajú správny čas po vypojení zo siete, batériu je treba </w:t>
-      </w:r>
-      <w:r>
-        <w:rPr>
-          <w:rFonts w:cs="Courier New"/>
-        </w:rPr>
-        <w:t xml:space="preserve">vymeniť za </w:t>
-      </w:r>
-      <w:r>
-        <w:rPr>
-          <w:rFonts w:cs="Courier New"/>
-        </w:rPr>
-        <w:t>kvalitnú mincovú batériu CR2032.</w:t>
-      </w:r>
-    </w:p>
-    <w:p>
-      <w:pPr>
-        <w:jc w:val="both"/>
-        <w:rPr>
-          <w:rFonts w:cs="Courier New"/>
-          <w:b/>
-          <w:bCs/>
-        </w:rPr>
-      </w:pPr>
-    </w:p>
-    <w:p>
-      <w:pPr>
-        <w:pStyle w:val="Nadpis2"/>
+        <w:rPr>
+          <w:rFonts w:ascii="Special Elite" w:hAnsi="Special Elite"/>
+        </w:rPr>
       </w:pPr>
       <w:bookmarkStart w:id="9" w:name="_Toc211152844"/>
       <w:bookmarkStart w:id="10" w:name="_Toc211153213"/>
       <w:r>
+        <w:rPr>
+          <w:rFonts w:ascii="Special Elite" w:hAnsi="Special Elite"/>
+        </w:rPr>
+        <w:lastRenderedPageBreak/>
         <w:t>Úložný priestor</w:t>
       </w:r>
       <w:bookmarkEnd w:id="9"/>
@@ -1914,12 +2260,12 @@
       <w:pPr>
         <w:jc w:val="both"/>
         <w:rPr>
-          <w:rFonts w:cs="Courier New"/>
-        </w:rPr>
-      </w:pPr>
-      <w:r>
-        <w:rPr>
-          <w:rFonts w:cs="Courier New"/>
+          <w:rFonts w:ascii="Special Elite" w:hAnsi="Special Elite" w:cs="Courier New"/>
+        </w:rPr>
+      </w:pPr>
+      <w:r>
+        <w:rPr>
+          <w:rFonts w:ascii="Special Elite" w:hAnsi="Special Elite" w:cs="Courier New"/>
         </w:rPr>
         <w:t>Súčasťou podstavca je aj úložný priestor na náhradné diely a nástroje na obhospodarovanie hodín.</w:t>
       </w:r>
@@ -1928,12 +2274,12 @@
       <w:pPr>
         <w:jc w:val="both"/>
         <w:rPr>
-          <w:rFonts w:cs="Courier New"/>
-        </w:rPr>
-      </w:pPr>
-      <w:r>
-        <w:rPr>
-          <w:rFonts w:cs="Courier New"/>
+          <w:rFonts w:ascii="Special Elite" w:hAnsi="Special Elite" w:cs="Courier New"/>
+        </w:rPr>
+      </w:pPr>
+      <w:r>
+        <w:rPr>
+          <w:rFonts w:ascii="Special Elite" w:hAnsi="Special Elite" w:cs="Courier New"/>
         </w:rPr>
         <w:t>Od výroby obsahuje:</w:t>
       </w:r>
@@ -1947,12 +2293,12 @@
         </w:numPr>
         <w:jc w:val="both"/>
         <w:rPr>
-          <w:rFonts w:cs="Courier New"/>
-        </w:rPr>
-      </w:pPr>
-      <w:r>
-        <w:rPr>
-          <w:rFonts w:cs="Courier New"/>
+          <w:rFonts w:ascii="Special Elite" w:hAnsi="Special Elite" w:cs="Courier New"/>
+        </w:rPr>
+      </w:pPr>
+      <w:r>
+        <w:rPr>
+          <w:rFonts w:ascii="Special Elite" w:hAnsi="Special Elite" w:cs="Courier New"/>
         </w:rPr>
         <w:t>1x skrutkovač na nastavovanie trimrov</w:t>
       </w:r>
@@ -1966,12 +2312,12 @@
         </w:numPr>
         <w:jc w:val="both"/>
         <w:rPr>
-          <w:rFonts w:cs="Courier New"/>
-        </w:rPr>
-      </w:pPr>
-      <w:r>
-        <w:rPr>
-          <w:rFonts w:cs="Courier New"/>
+          <w:rFonts w:ascii="Special Elite" w:hAnsi="Special Elite" w:cs="Courier New"/>
+        </w:rPr>
+      </w:pPr>
+      <w:r>
+        <w:rPr>
+          <w:rFonts w:ascii="Special Elite" w:hAnsi="Special Elite" w:cs="Courier New"/>
         </w:rPr>
         <w:t>1x náhradný numitron osadený na pätici</w:t>
       </w:r>
@@ -1985,12 +2331,12 @@
         </w:numPr>
         <w:jc w:val="both"/>
         <w:rPr>
-          <w:rFonts w:cs="Courier New"/>
-        </w:rPr>
-      </w:pPr>
-      <w:r>
-        <w:rPr>
-          <w:rFonts w:cs="Courier New"/>
+          <w:rFonts w:ascii="Special Elite" w:hAnsi="Special Elite" w:cs="Courier New"/>
+        </w:rPr>
+      </w:pPr>
+      <w:r>
+        <w:rPr>
+          <w:rFonts w:ascii="Special Elite" w:hAnsi="Special Elite" w:cs="Courier New"/>
         </w:rPr>
         <w:t>1x imbusový kľúč</w:t>
       </w:r>
@@ -2004,12 +2350,12 @@
         </w:numPr>
         <w:jc w:val="both"/>
         <w:rPr>
-          <w:rFonts w:cs="Courier New"/>
-        </w:rPr>
-      </w:pPr>
-      <w:r>
-        <w:rPr>
-          <w:rFonts w:cs="Courier New"/>
+          <w:rFonts w:ascii="Special Elite" w:hAnsi="Special Elite" w:cs="Courier New"/>
+        </w:rPr>
+      </w:pPr>
+      <w:r>
+        <w:rPr>
+          <w:rFonts w:ascii="Special Elite" w:hAnsi="Special Elite" w:cs="Courier New"/>
         </w:rPr>
         <w:t>1x náhradná mincová batéria CR2032</w:t>
       </w:r>
@@ -2018,16 +2364,23 @@
       <w:pPr>
         <w:jc w:val="both"/>
         <w:rPr>
-          <w:rFonts w:cs="Courier New"/>
+          <w:rFonts w:ascii="Special Elite" w:hAnsi="Special Elite" w:cs="Courier New"/>
         </w:rPr>
       </w:pPr>
     </w:p>
     <w:p>
       <w:pPr>
         <w:pStyle w:val="Nadpis2"/>
+        <w:rPr>
+          <w:rFonts w:ascii="Special Elite" w:hAnsi="Special Elite"/>
+        </w:rPr>
       </w:pPr>
       <w:bookmarkStart w:id="11" w:name="_Toc211153214"/>
       <w:r>
+        <w:rPr>
+          <w:rFonts w:ascii="Special Elite" w:hAnsi="Special Elite"/>
+        </w:rPr>
+        <w:lastRenderedPageBreak/>
         <w:t>Poistka</w:t>
       </w:r>
       <w:bookmarkEnd w:id="11"/>
@@ -2036,36 +2389,36 @@
       <w:pPr>
         <w:jc w:val="both"/>
         <w:rPr>
-          <w:rFonts w:cs="Courier New"/>
-        </w:rPr>
-      </w:pPr>
-      <w:r>
-        <w:rPr>
-          <w:rFonts w:cs="Courier New"/>
+          <w:rFonts w:ascii="Special Elite" w:hAnsi="Special Elite" w:cs="Courier New"/>
+        </w:rPr>
+      </w:pPr>
+      <w:r>
+        <w:rPr>
+          <w:rFonts w:ascii="Special Elite" w:hAnsi="Special Elite" w:cs="Courier New"/>
         </w:rPr>
         <w:t xml:space="preserve">Hlavná poistka je dimenzovaná tak aby sa vypálila len </w:t>
       </w:r>
       <w:r>
         <w:rPr>
-          <w:rFonts w:cs="Courier New"/>
+          <w:rFonts w:ascii="Special Elite" w:hAnsi="Special Elite" w:cs="Courier New"/>
         </w:rPr>
         <w:t>pri</w:t>
       </w:r>
       <w:r>
         <w:rPr>
-          <w:rFonts w:cs="Courier New"/>
+          <w:rFonts w:ascii="Special Elite" w:hAnsi="Special Elite" w:cs="Courier New"/>
         </w:rPr>
         <w:t xml:space="preserve"> k závažnej chybe v elektronike hodín. Teda</w:t>
       </w:r>
       <w:r>
         <w:rPr>
-          <w:rFonts w:cs="Courier New"/>
+          <w:rFonts w:ascii="Special Elite" w:hAnsi="Special Elite" w:cs="Courier New"/>
         </w:rPr>
         <w:t xml:space="preserve"> pri vypálení</w:t>
       </w:r>
       <w:r>
         <w:rPr>
-          <w:rFonts w:cs="Courier New"/>
+          <w:rFonts w:ascii="Special Elite" w:hAnsi="Special Elite" w:cs="Courier New"/>
         </w:rPr>
         <w:t>, odporúčame problém riešiť servisne.</w:t>
       </w:r>
@@ -2073,16 +2426,22 @@
     <w:p>
       <w:pPr>
         <w:rPr>
-          <w:rFonts w:cs="Courier New"/>
+          <w:rFonts w:ascii="Special Elite" w:hAnsi="Special Elite" w:cs="Courier New"/>
         </w:rPr>
       </w:pPr>
     </w:p>
     <w:p>
       <w:pPr>
         <w:pStyle w:val="Nadpis2"/>
+        <w:rPr>
+          <w:rFonts w:ascii="Special Elite" w:hAnsi="Special Elite"/>
+        </w:rPr>
       </w:pPr>
       <w:bookmarkStart w:id="12" w:name="_Toc211153215"/>
       <w:r>
+        <w:rPr>
+          <w:rFonts w:ascii="Special Elite" w:hAnsi="Special Elite"/>
+        </w:rPr>
         <w:t>Servis</w:t>
       </w:r>
       <w:bookmarkEnd w:id="12"/>
@@ -2090,24 +2449,24 @@
     <w:p>
       <w:pPr>
         <w:rPr>
-          <w:rFonts w:cs="Courier New"/>
-        </w:rPr>
-      </w:pPr>
-      <w:r>
-        <w:rPr>
-          <w:rFonts w:cs="Courier New"/>
+          <w:rFonts w:ascii="Special Elite" w:hAnsi="Special Elite" w:cs="Courier New"/>
+        </w:rPr>
+      </w:pPr>
+      <w:r>
+        <w:rPr>
+          <w:rFonts w:ascii="Special Elite" w:hAnsi="Special Elite" w:cs="Courier New"/>
         </w:rPr>
         <w:t xml:space="preserve">V prípade poruchy volajte na tel. číslo +421 950 368 559 alebo </w:t>
       </w:r>
       <w:r>
         <w:rPr>
-          <w:rFonts w:cs="Courier New"/>
+          <w:rFonts w:ascii="Special Elite" w:hAnsi="Special Elite" w:cs="Courier New"/>
         </w:rPr>
         <w:t>navštívte</w:t>
       </w:r>
       <w:r>
         <w:rPr>
-          <w:rFonts w:cs="Courier New"/>
+          <w:rFonts w:ascii="Special Elite" w:hAnsi="Special Elite" w:cs="Courier New"/>
         </w:rPr>
         <w:t xml:space="preserve"> našu pobočku v Korni.</w:t>
       </w:r>
@@ -2115,14 +2474,14 @@
     <w:p>
       <w:pPr>
         <w:rPr>
-          <w:rFonts w:cs="Courier New"/>
+          <w:rFonts w:ascii="Special Elite" w:hAnsi="Special Elite" w:cs="Courier New"/>
           <w:b/>
           <w:bCs/>
         </w:rPr>
       </w:pPr>
       <w:r>
         <w:rPr>
-          <w:rFonts w:cs="Courier New"/>
+          <w:rFonts w:ascii="Special Elite" w:hAnsi="Special Elite" w:cs="Courier New"/>
           <w:b/>
           <w:bCs/>
         </w:rPr>
@@ -2132,437 +2491,414 @@
     <w:p>
       <w:pPr>
         <w:rPr>
-          <w:rFonts w:cs="Courier New"/>
-        </w:rPr>
-      </w:pPr>
-      <w:r>
-        <w:rPr>
-          <w:rFonts w:cs="Courier New"/>
-          <w:b/>
-          <w:bCs/>
+          <w:rFonts w:ascii="Special Elite" w:hAnsi="Special Elite" w:cs="Courier New"/>
+        </w:rPr>
+      </w:pPr>
+      <w:bookmarkStart w:id="13" w:name="_Toc211153216"/>
+      <w:r>
+        <w:rPr>
+          <w:rStyle w:val="Nadpis2Char"/>
+          <w:rFonts w:ascii="Special Elite" w:hAnsi="Special Elite"/>
         </w:rPr>
         <w:lastRenderedPageBreak/>
+        <w:t>Spolupracovali</w:t>
+      </w:r>
+      <w:bookmarkEnd w:id="13"/>
+      <w:r>
+        <w:rPr>
+          <w:rFonts w:ascii="Special Elite" w:hAnsi="Special Elite" w:cs="Courier New"/>
+        </w:rPr>
         <w:br/>
       </w:r>
-      <w:bookmarkStart w:id="13" w:name="_Toc211153216"/>
-      <w:r>
-        <w:rPr>
-          <w:rStyle w:val="Nadpis2Char"/>
-        </w:rPr>
-        <w:t>Spolupracovali</w:t>
-      </w:r>
-      <w:bookmarkEnd w:id="13"/>
-      <w:r>
-        <w:rPr>
-          <w:rFonts w:cs="Courier New"/>
-        </w:rPr>
-        <w:br/>
-      </w:r>
-      <w:r>
-        <w:rPr>
-          <w:rFonts w:cs="Courier New"/>
+      <w:r>
+        <w:rPr>
+          <w:rFonts w:ascii="Special Elite" w:hAnsi="Special Elite" w:cs="Courier New"/>
         </w:rPr>
         <w:t xml:space="preserve">- </w:t>
       </w:r>
       <w:r>
         <w:rPr>
-          <w:rFonts w:cs="Courier New"/>
+          <w:rFonts w:ascii="Special Elite" w:hAnsi="Special Elite" w:cs="Courier New"/>
           <w:u w:val="single"/>
         </w:rPr>
         <w:t>Vedúci projektu</w:t>
       </w:r>
       <w:r>
         <w:rPr>
-          <w:rFonts w:cs="Courier New"/>
+          <w:rFonts w:ascii="Special Elite" w:hAnsi="Special Elite" w:cs="Courier New"/>
           <w:u w:val="single"/>
         </w:rPr>
         <w:t>:</w:t>
       </w:r>
       <w:r>
         <w:rPr>
-          <w:rFonts w:cs="Courier New"/>
+          <w:rFonts w:ascii="Special Elite" w:hAnsi="Special Elite" w:cs="Courier New"/>
         </w:rPr>
         <w:t xml:space="preserve"> Filip Mitka</w:t>
       </w:r>
       <w:r>
         <w:rPr>
-          <w:rFonts w:cs="Courier New"/>
+          <w:rFonts w:ascii="Special Elite" w:hAnsi="Special Elite" w:cs="Courier New"/>
         </w:rPr>
         <w:br/>
         <w:t>-</w:t>
       </w:r>
       <w:r>
         <w:rPr>
-          <w:rFonts w:cs="Courier New"/>
+          <w:rFonts w:ascii="Special Elite" w:hAnsi="Special Elite" w:cs="Courier New"/>
         </w:rPr>
         <w:t xml:space="preserve"> </w:t>
       </w:r>
       <w:r>
         <w:rPr>
-          <w:rFonts w:cs="Courier New"/>
+          <w:rFonts w:ascii="Special Elite" w:hAnsi="Special Elite" w:cs="Courier New"/>
           <w:u w:val="single"/>
         </w:rPr>
         <w:t>Vedúci výroby</w:t>
       </w:r>
       <w:r>
         <w:rPr>
-          <w:rFonts w:cs="Courier New"/>
+          <w:rFonts w:ascii="Special Elite" w:hAnsi="Special Elite" w:cs="Courier New"/>
           <w:u w:val="single"/>
         </w:rPr>
         <w:t>:</w:t>
       </w:r>
       <w:r>
         <w:rPr>
-          <w:rFonts w:cs="Courier New"/>
+          <w:rFonts w:ascii="Special Elite" w:hAnsi="Special Elite" w:cs="Courier New"/>
         </w:rPr>
         <w:t xml:space="preserve"> Kristián </w:t>
       </w:r>
       <w:proofErr w:type="spellStart"/>
       <w:r>
         <w:rPr>
-          <w:rFonts w:cs="Courier New"/>
+          <w:rFonts w:ascii="Special Elite" w:hAnsi="Special Elite" w:cs="Courier New"/>
         </w:rPr>
         <w:t>Perďoch</w:t>
       </w:r>
       <w:proofErr w:type="spellEnd"/>
       <w:r>
         <w:rPr>
-          <w:rFonts w:cs="Courier New"/>
-        </w:rPr>
-        <w:br/>
-      </w:r>
-      <w:r>
-        <w:rPr>
-          <w:rFonts w:cs="Courier New"/>
-        </w:rPr>
-        <w:t>-</w:t>
-      </w:r>
-      <w:r>
-        <w:rPr>
-          <w:rFonts w:cs="Courier New"/>
-        </w:rPr>
-        <w:t xml:space="preserve"> </w:t>
-      </w:r>
-      <w:r>
-        <w:rPr>
-          <w:rFonts w:cs="Courier New"/>
-          <w:u w:val="single"/>
-        </w:rPr>
-        <w:t>Drevovýroba a modelovanie:</w:t>
-      </w:r>
-      <w:r>
-        <w:rPr>
-          <w:rFonts w:cs="Courier New"/>
-        </w:rPr>
-        <w:t xml:space="preserve"> Bartolomej Mikula</w:t>
-      </w:r>
-      <w:r>
-        <w:rPr>
-          <w:rFonts w:cs="Courier New"/>
-        </w:rPr>
-        <w:br/>
-      </w:r>
-      <w:r>
-        <w:rPr>
-          <w:rFonts w:cs="Courier New"/>
-        </w:rPr>
-        <w:t>-</w:t>
-      </w:r>
-      <w:r>
-        <w:rPr>
-          <w:rFonts w:cs="Courier New"/>
-        </w:rPr>
-        <w:t xml:space="preserve"> </w:t>
-      </w:r>
-      <w:proofErr w:type="spellStart"/>
-      <w:r>
-        <w:rPr>
-          <w:rFonts w:cs="Courier New"/>
-          <w:u w:val="single"/>
-        </w:rPr>
-        <w:t>Biblistika</w:t>
-      </w:r>
-      <w:proofErr w:type="spellEnd"/>
-      <w:r>
-        <w:rPr>
-          <w:rFonts w:cs="Courier New"/>
-          <w:u w:val="single"/>
-        </w:rPr>
-        <w:t>:</w:t>
-      </w:r>
-      <w:r>
-        <w:rPr>
-          <w:rFonts w:cs="Courier New"/>
-        </w:rPr>
-        <w:t xml:space="preserve"> Jozef </w:t>
-      </w:r>
-      <w:proofErr w:type="spellStart"/>
-      <w:r>
-        <w:rPr>
-          <w:rFonts w:cs="Courier New"/>
-        </w:rPr>
-        <w:t>Hroš</w:t>
-      </w:r>
-      <w:proofErr w:type="spellEnd"/>
-      <w:r>
-        <w:rPr>
-          <w:rFonts w:cs="Courier New"/>
-        </w:rPr>
-        <w:br/>
-      </w:r>
-      <w:r>
-        <w:rPr>
-          <w:rFonts w:cs="Courier New"/>
-        </w:rPr>
-        <w:t xml:space="preserve">- </w:t>
-      </w:r>
-      <w:r>
-        <w:rPr>
-          <w:rFonts w:cs="Courier New"/>
-          <w:u w:val="single"/>
-        </w:rPr>
-        <w:t>Manažér marketingu:</w:t>
-      </w:r>
-      <w:r>
-        <w:rPr>
-          <w:rFonts w:cs="Courier New"/>
-        </w:rPr>
-        <w:t xml:space="preserve"> Šimon </w:t>
-      </w:r>
-      <w:proofErr w:type="spellStart"/>
-      <w:r>
-        <w:rPr>
-          <w:rFonts w:cs="Courier New"/>
-        </w:rPr>
-        <w:t>Šinal</w:t>
-      </w:r>
-      <w:proofErr w:type="spellEnd"/>
-      <w:r>
-        <w:rPr>
-          <w:rFonts w:cs="Courier New"/>
+          <w:rFonts w:ascii="Special Elite" w:hAnsi="Special Elite" w:cs="Courier New"/>
         </w:rPr>
         <w:br/>
         <w:t xml:space="preserve">- </w:t>
       </w:r>
       <w:r>
         <w:rPr>
-          <w:rFonts w:cs="Courier New"/>
+          <w:rFonts w:ascii="Special Elite" w:hAnsi="Special Elite" w:cs="Courier New"/>
           <w:u w:val="single"/>
         </w:rPr>
-        <w:t>Drevo materiál</w:t>
-      </w:r>
-      <w:r>
-        <w:rPr>
-          <w:rFonts w:cs="Courier New"/>
-        </w:rPr>
-        <w:t xml:space="preserve">: Bohuš </w:t>
+        <w:t>Drevovýroba a modelovanie:</w:t>
+      </w:r>
+      <w:r>
+        <w:rPr>
+          <w:rFonts w:ascii="Special Elite" w:hAnsi="Special Elite" w:cs="Courier New"/>
+        </w:rPr>
+        <w:t xml:space="preserve"> Bartolomej Mikula</w:t>
+      </w:r>
+      <w:r>
+        <w:rPr>
+          <w:rFonts w:ascii="Special Elite" w:hAnsi="Special Elite" w:cs="Courier New"/>
+        </w:rPr>
+        <w:br/>
+        <w:t>-</w:t>
+      </w:r>
+      <w:r>
+        <w:rPr>
+          <w:rFonts w:ascii="Special Elite" w:hAnsi="Special Elite" w:cs="Courier New"/>
+        </w:rPr>
+        <w:t xml:space="preserve"> </w:t>
       </w:r>
       <w:proofErr w:type="spellStart"/>
       <w:r>
         <w:rPr>
-          <w:rFonts w:cs="Courier New"/>
-        </w:rPr>
-        <w:t>Jaroš</w:t>
+          <w:rFonts w:ascii="Special Elite" w:hAnsi="Special Elite" w:cs="Courier New"/>
+          <w:u w:val="single"/>
+        </w:rPr>
+        <w:t>Biblistika</w:t>
       </w:r>
       <w:proofErr w:type="spellEnd"/>
       <w:r>
         <w:rPr>
-          <w:rFonts w:cs="Courier New"/>
+          <w:rFonts w:ascii="Special Elite" w:hAnsi="Special Elite" w:cs="Courier New"/>
+          <w:u w:val="single"/>
+        </w:rPr>
+        <w:t>:</w:t>
+      </w:r>
+      <w:r>
+        <w:rPr>
+          <w:rFonts w:ascii="Special Elite" w:hAnsi="Special Elite" w:cs="Courier New"/>
+        </w:rPr>
+        <w:t xml:space="preserve"> Jozef </w:t>
+      </w:r>
+      <w:proofErr w:type="spellStart"/>
+      <w:r>
+        <w:rPr>
+          <w:rFonts w:ascii="Special Elite" w:hAnsi="Special Elite" w:cs="Courier New"/>
+        </w:rPr>
+        <w:t>Hroš</w:t>
+      </w:r>
+      <w:proofErr w:type="spellEnd"/>
+      <w:r>
+        <w:rPr>
+          <w:rFonts w:ascii="Special Elite" w:hAnsi="Special Elite" w:cs="Courier New"/>
         </w:rPr>
         <w:br/>
       </w:r>
       <w:r>
         <w:rPr>
-          <w:rFonts w:cs="Courier New"/>
-        </w:rPr>
-        <w:t>-</w:t>
-      </w:r>
-      <w:r>
-        <w:rPr>
-          <w:rFonts w:cs="Courier New"/>
-        </w:rPr>
-        <w:t xml:space="preserve"> </w:t>
-      </w:r>
-      <w:r>
-        <w:rPr>
-          <w:rFonts w:cs="Courier New"/>
+          <w:rFonts w:ascii="Special Elite" w:hAnsi="Special Elite" w:cs="Courier New"/>
+        </w:rPr>
+        <w:t xml:space="preserve">- </w:t>
+      </w:r>
+      <w:r>
+        <w:rPr>
+          <w:rFonts w:ascii="Special Elite" w:hAnsi="Special Elite" w:cs="Courier New"/>
           <w:u w:val="single"/>
         </w:rPr>
-        <w:t>Kritika</w:t>
-      </w:r>
-      <w:r>
-        <w:rPr>
-          <w:rFonts w:cs="Courier New"/>
-          <w:u w:val="single"/>
-        </w:rPr>
-        <w:t xml:space="preserve"> hardvéru</w:t>
-      </w:r>
-      <w:r>
-        <w:rPr>
-          <w:rFonts w:cs="Courier New"/>
-          <w:u w:val="single"/>
-        </w:rPr>
-        <w:t>:</w:t>
-      </w:r>
-      <w:r>
-        <w:rPr>
-          <w:rFonts w:cs="Courier New"/>
-        </w:rPr>
-        <w:t xml:space="preserve"> Ing. Viliam </w:t>
+        <w:t>Manažér marketingu:</w:t>
+      </w:r>
+      <w:r>
+        <w:rPr>
+          <w:rFonts w:ascii="Special Elite" w:hAnsi="Special Elite" w:cs="Courier New"/>
+        </w:rPr>
+        <w:t xml:space="preserve"> Šimon </w:t>
       </w:r>
       <w:proofErr w:type="spellStart"/>
       <w:r>
         <w:rPr>
-          <w:rFonts w:cs="Courier New"/>
-        </w:rPr>
-        <w:t>Koprda</w:t>
+          <w:rFonts w:ascii="Special Elite" w:hAnsi="Special Elite" w:cs="Courier New"/>
+        </w:rPr>
+        <w:t>Šinal</w:t>
       </w:r>
       <w:proofErr w:type="spellEnd"/>
       <w:r>
         <w:rPr>
-          <w:rFonts w:cs="Courier New"/>
-        </w:rPr>
-        <w:t xml:space="preserve">, Ing. Dušan </w:t>
-      </w:r>
-      <w:proofErr w:type="spellStart"/>
-      <w:r>
-        <w:rPr>
-          <w:rFonts w:cs="Courier New"/>
-        </w:rPr>
-        <w:t>Dragúň</w:t>
-      </w:r>
-      <w:proofErr w:type="spellEnd"/>
-      <w:r>
-        <w:rPr>
-          <w:rFonts w:cs="Courier New"/>
+          <w:rFonts w:ascii="Special Elite" w:hAnsi="Special Elite" w:cs="Courier New"/>
         </w:rPr>
         <w:br/>
         <w:t xml:space="preserve">- </w:t>
       </w:r>
       <w:r>
         <w:rPr>
-          <w:rFonts w:cs="Courier New"/>
+          <w:rFonts w:ascii="Special Elite" w:hAnsi="Special Elite" w:cs="Courier New"/>
           <w:u w:val="single"/>
         </w:rPr>
-        <w:t>Súčiastky:</w:t>
-      </w:r>
-      <w:r>
-        <w:rPr>
-          <w:rFonts w:cs="Courier New"/>
-        </w:rPr>
-        <w:t xml:space="preserve"> MB </w:t>
+        <w:t>Drevo materiál</w:t>
+      </w:r>
+      <w:r>
+        <w:rPr>
+          <w:rFonts w:ascii="Special Elite" w:hAnsi="Special Elite" w:cs="Courier New"/>
+        </w:rPr>
+        <w:t xml:space="preserve">: </w:t>
       </w:r>
       <w:proofErr w:type="spellStart"/>
       <w:r>
         <w:rPr>
-          <w:rFonts w:cs="Courier New"/>
-        </w:rPr>
-        <w:t>Electronic</w:t>
+          <w:rFonts w:ascii="Special Elite" w:hAnsi="Special Elite" w:cs="Courier New"/>
+        </w:rPr>
+        <w:t>Jaroš</w:t>
       </w:r>
       <w:proofErr w:type="spellEnd"/>
       <w:r>
         <w:rPr>
-          <w:rFonts w:cs="Courier New"/>
-        </w:rPr>
-        <w:t xml:space="preserve"> Žilina, </w:t>
-      </w:r>
-      <w:r>
-        <w:rPr>
-          <w:rFonts w:cs="Courier New"/>
-        </w:rPr>
-        <w:t>VP Centrum</w:t>
-      </w:r>
-      <w:r>
-        <w:rPr>
-          <w:rFonts w:cs="Courier New"/>
-        </w:rPr>
-        <w:t xml:space="preserve"> Litoměřice</w:t>
-      </w:r>
-      <w:r>
-        <w:rPr>
-          <w:rFonts w:cs="Courier New"/>
-        </w:rPr>
-        <w:t>, Techfun.sk</w:t>
-      </w:r>
-      <w:r>
-        <w:rPr>
-          <w:rFonts w:cs="Courier New"/>
-        </w:rPr>
-        <w:t>, tomshardware.sk</w:t>
-      </w:r>
-      <w:r>
-        <w:rPr>
-          <w:rFonts w:cs="Courier New"/>
-        </w:rPr>
-        <w:t xml:space="preserve">, tme.eu, PS </w:t>
+          <w:rFonts w:ascii="Special Elite" w:hAnsi="Special Elite" w:cs="Courier New"/>
+        </w:rPr>
+        <w:t xml:space="preserve"> Bohuš</w:t>
+      </w:r>
+      <w:r>
+        <w:rPr>
+          <w:rFonts w:ascii="Special Elite" w:hAnsi="Special Elite" w:cs="Courier New"/>
+        </w:rPr>
+        <w:br/>
+      </w:r>
+      <w:r>
+        <w:rPr>
+          <w:rFonts w:ascii="Special Elite" w:hAnsi="Special Elite" w:cs="Courier New"/>
+        </w:rPr>
+        <w:t>-</w:t>
+      </w:r>
+      <w:r>
+        <w:rPr>
+          <w:rFonts w:ascii="Special Elite" w:hAnsi="Special Elite" w:cs="Courier New"/>
+        </w:rPr>
+        <w:t xml:space="preserve"> </w:t>
+      </w:r>
+      <w:r>
+        <w:rPr>
+          <w:rFonts w:ascii="Special Elite" w:hAnsi="Special Elite" w:cs="Courier New"/>
+          <w:u w:val="single"/>
+        </w:rPr>
+        <w:t>Kritika</w:t>
+      </w:r>
+      <w:r>
+        <w:rPr>
+          <w:rFonts w:ascii="Special Elite" w:hAnsi="Special Elite" w:cs="Courier New"/>
+          <w:u w:val="single"/>
+        </w:rPr>
+        <w:t xml:space="preserve"> hardvéru</w:t>
+      </w:r>
+      <w:r>
+        <w:rPr>
+          <w:rFonts w:ascii="Special Elite" w:hAnsi="Special Elite" w:cs="Courier New"/>
+          <w:u w:val="single"/>
+        </w:rPr>
+        <w:t>:</w:t>
+      </w:r>
+      <w:r>
+        <w:rPr>
+          <w:rFonts w:ascii="Special Elite" w:hAnsi="Special Elite" w:cs="Courier New"/>
+        </w:rPr>
+        <w:t xml:space="preserve"> Ing. Viliam </w:t>
       </w:r>
       <w:proofErr w:type="spellStart"/>
       <w:r>
         <w:rPr>
-          <w:rFonts w:cs="Courier New"/>
-        </w:rPr>
-        <w:t>Electronic</w:t>
+          <w:rFonts w:ascii="Special Elite" w:hAnsi="Special Elite" w:cs="Courier New"/>
+        </w:rPr>
+        <w:t>Koprda</w:t>
       </w:r>
       <w:proofErr w:type="spellEnd"/>
       <w:r>
         <w:rPr>
-          <w:rFonts w:cs="Courier New"/>
-        </w:rPr>
-        <w:t xml:space="preserve"> Praha</w:t>
-      </w:r>
-      <w:r>
-        <w:rPr>
-          <w:rFonts w:cs="Courier New"/>
+          <w:rFonts w:ascii="Special Elite" w:hAnsi="Special Elite" w:cs="Courier New"/>
+        </w:rPr>
+        <w:t xml:space="preserve">, Ing. Dušan </w:t>
+      </w:r>
+      <w:proofErr w:type="spellStart"/>
+      <w:r>
+        <w:rPr>
+          <w:rFonts w:ascii="Special Elite" w:hAnsi="Special Elite" w:cs="Courier New"/>
+        </w:rPr>
+        <w:t>Dragúň</w:t>
+      </w:r>
+      <w:proofErr w:type="spellEnd"/>
+      <w:r>
+        <w:rPr>
+          <w:rFonts w:ascii="Special Elite" w:hAnsi="Special Elite" w:cs="Courier New"/>
         </w:rPr>
         <w:br/>
         <w:t xml:space="preserve">- </w:t>
       </w:r>
       <w:r>
         <w:rPr>
-          <w:rFonts w:cs="Courier New"/>
+          <w:rFonts w:ascii="Special Elite" w:hAnsi="Special Elite" w:cs="Courier New"/>
           <w:u w:val="single"/>
         </w:rPr>
-        <w:t>Chémia na leptanie DPS:</w:t>
-      </w:r>
-      <w:r>
-        <w:rPr>
-          <w:rFonts w:cs="Courier New"/>
-        </w:rPr>
-        <w:t xml:space="preserve"> Ladislav </w:t>
+        <w:t>Súčiastky:</w:t>
+      </w:r>
+      <w:r>
+        <w:rPr>
+          <w:rFonts w:ascii="Special Elite" w:hAnsi="Special Elite" w:cs="Courier New"/>
+        </w:rPr>
+        <w:t xml:space="preserve"> MB </w:t>
       </w:r>
       <w:proofErr w:type="spellStart"/>
       <w:r>
         <w:rPr>
-          <w:rFonts w:cs="Courier New"/>
-        </w:rPr>
-        <w:t>Zimka</w:t>
+          <w:rFonts w:ascii="Special Elite" w:hAnsi="Special Elite" w:cs="Courier New"/>
+        </w:rPr>
+        <w:t>Electronic</w:t>
       </w:r>
       <w:proofErr w:type="spellEnd"/>
       <w:r>
         <w:rPr>
-          <w:rFonts w:cs="Courier New"/>
+          <w:rFonts w:ascii="Special Elite" w:hAnsi="Special Elite" w:cs="Courier New"/>
+        </w:rPr>
+        <w:t xml:space="preserve">, </w:t>
+      </w:r>
+      <w:r>
+        <w:rPr>
+          <w:rFonts w:ascii="Special Elite" w:hAnsi="Special Elite" w:cs="Courier New"/>
+        </w:rPr>
+        <w:t>VP Centrum</w:t>
+      </w:r>
+      <w:r>
+        <w:rPr>
+          <w:rFonts w:ascii="Special Elite" w:hAnsi="Special Elite" w:cs="Courier New"/>
+        </w:rPr>
+        <w:t xml:space="preserve"> Litoměřice</w:t>
+      </w:r>
+      <w:r>
+        <w:rPr>
+          <w:rFonts w:ascii="Special Elite" w:hAnsi="Special Elite" w:cs="Courier New"/>
+        </w:rPr>
+        <w:t xml:space="preserve">, </w:t>
+      </w:r>
+      <w:r>
+        <w:rPr>
+          <w:rFonts w:ascii="Special Elite" w:hAnsi="Special Elite" w:cs="Courier New"/>
+        </w:rPr>
+        <w:t>PS Electro</w:t>
+      </w:r>
+      <w:proofErr w:type="spellStart"/>
+      <w:r>
+        <w:rPr>
+          <w:rFonts w:ascii="Special Elite" w:hAnsi="Special Elite" w:cs="Courier New"/>
+        </w:rPr>
+        <w:t>nic</w:t>
+      </w:r>
+      <w:proofErr w:type="spellEnd"/>
+      <w:r>
+        <w:rPr>
+          <w:rFonts w:ascii="Special Elite" w:hAnsi="Special Elite" w:cs="Courier New"/>
+        </w:rPr>
+        <w:t xml:space="preserve"> Praha</w:t>
+      </w:r>
+      <w:r>
+        <w:rPr>
+          <w:rFonts w:ascii="Special Elite" w:hAnsi="Special Elite" w:cs="Courier New"/>
         </w:rPr>
         <w:br/>
         <w:t xml:space="preserve">- </w:t>
       </w:r>
       <w:r>
         <w:rPr>
-          <w:rFonts w:cs="Courier New"/>
+          <w:rFonts w:ascii="Special Elite" w:hAnsi="Special Elite" w:cs="Courier New"/>
           <w:u w:val="single"/>
         </w:rPr>
+        <w:t>Chémia na leptanie DPS:</w:t>
+      </w:r>
+      <w:r>
+        <w:rPr>
+          <w:rFonts w:ascii="Special Elite" w:hAnsi="Special Elite" w:cs="Courier New"/>
+        </w:rPr>
+        <w:t xml:space="preserve"> Ladislav </w:t>
+      </w:r>
+      <w:proofErr w:type="spellStart"/>
+      <w:r>
+        <w:rPr>
+          <w:rFonts w:ascii="Special Elite" w:hAnsi="Special Elite" w:cs="Courier New"/>
+        </w:rPr>
+        <w:t>Zimka</w:t>
+      </w:r>
+      <w:proofErr w:type="spellEnd"/>
+      <w:r>
+        <w:rPr>
+          <w:rFonts w:ascii="Special Elite" w:hAnsi="Special Elite" w:cs="Courier New"/>
+        </w:rPr>
+        <w:br/>
+        <w:t xml:space="preserve">- </w:t>
+      </w:r>
+      <w:r>
+        <w:rPr>
+          <w:rFonts w:ascii="Special Elite" w:hAnsi="Special Elite" w:cs="Courier New"/>
+          <w:u w:val="single"/>
+        </w:rPr>
         <w:t xml:space="preserve">Poskytovateľ </w:t>
       </w:r>
       <w:proofErr w:type="spellStart"/>
       <w:r>
         <w:rPr>
-          <w:rFonts w:cs="Courier New"/>
+          <w:rFonts w:ascii="Special Elite" w:hAnsi="Special Elite" w:cs="Courier New"/>
           <w:u w:val="single"/>
         </w:rPr>
         <w:t>numitrono</w:t>
       </w:r>
       <w:r>
         <w:rPr>
-          <w:rFonts w:cs="Courier New"/>
+          <w:rFonts w:ascii="Special Elite" w:hAnsi="Special Elite" w:cs="Courier New"/>
           <w:u w:val="single"/>
         </w:rPr>
         <w:t>v</w:t>
@@ -2570,28 +2906,28 @@
       <w:proofErr w:type="spellEnd"/>
       <w:r>
         <w:rPr>
-          <w:rFonts w:cs="Courier New"/>
+          <w:rFonts w:ascii="Special Elite" w:hAnsi="Special Elite" w:cs="Courier New"/>
           <w:u w:val="single"/>
         </w:rPr>
         <w:t>:</w:t>
       </w:r>
       <w:r>
         <w:rPr>
-          <w:rFonts w:cs="Courier New"/>
+          <w:rFonts w:ascii="Special Elite" w:hAnsi="Special Elite" w:cs="Courier New"/>
         </w:rPr>
         <w:t xml:space="preserve"> Robert </w:t>
       </w:r>
       <w:proofErr w:type="spellStart"/>
       <w:r>
         <w:rPr>
-          <w:rFonts w:cs="Courier New"/>
+          <w:rFonts w:ascii="Special Elite" w:hAnsi="Special Elite" w:cs="Courier New"/>
         </w:rPr>
         <w:t>Ziedins</w:t>
       </w:r>
       <w:proofErr w:type="spellEnd"/>
       <w:r>
         <w:rPr>
-          <w:rFonts w:cs="Courier New"/>
+          <w:rFonts w:ascii="Special Elite" w:hAnsi="Special Elite" w:cs="Courier New"/>
         </w:rPr>
         <w:t>, Litva</w:t>
       </w:r>
@@ -2599,33 +2935,13 @@
     <w:p>
       <w:pPr>
         <w:rPr>
-          <w:rFonts w:cs="Courier New"/>
-        </w:rPr>
-      </w:pPr>
-    </w:p>
-    <w:p>
-      <w:pPr>
-        <w:rPr>
-          <w:rFonts w:cs="Courier New"/>
-        </w:rPr>
-      </w:pPr>
-    </w:p>
-    <w:p>
-      <w:pPr>
-        <w:rPr>
-          <w:rFonts w:cs="Courier New"/>
-        </w:rPr>
-      </w:pPr>
-      <w:r>
-        <w:rPr>
-          <w:rFonts w:cs="Courier New"/>
-        </w:rPr>
-        <w:t>Napísané v Korni dňa 15.05.2025</w:t>
-      </w:r>
+          <w:rFonts w:ascii="Special Elite" w:hAnsi="Special Elite" w:cs="Courier New"/>
+        </w:rPr>
+      </w:pPr>
     </w:p>
     <w:sectPr>
-      <w:pgSz w:w="11906" w:h="16838" w:code="9"/>
-      <w:pgMar w:top="720" w:right="720" w:bottom="720" w:left="720" w:header="709" w:footer="709" w:gutter="0"/>
+      <w:pgSz w:w="10206" w:h="3969" w:orient="landscape" w:code="9"/>
+      <w:pgMar w:top="284" w:right="284" w:bottom="284" w:left="284" w:header="709" w:footer="709" w:gutter="0"/>
       <w:cols w:space="708"/>
       <w:docGrid w:linePitch="360"/>
     </w:sectPr>

</xml_diff>

<commit_message>
Opravy v schéme. Úpravy a optimalizácie firmvéru.
</commit_message>
<xml_diff>
--- a/docs/prirucka.docx
+++ b/docs/prirucka.docx
@@ -14,16 +14,6 @@
           <w:szCs w:val="72"/>
         </w:rPr>
       </w:pPr>
-      <w:r>
-        <w:rPr>
-          <w:rFonts w:ascii="Special Elite" w:hAnsi="Special Elite" w:cs="Courier New"/>
-          <w:b/>
-          <w:bCs/>
-          <w:sz w:val="72"/>
-          <w:szCs w:val="72"/>
-        </w:rPr>
-        <w:br/>
-      </w:r>
     </w:p>
     <w:p>
       <w:pPr>
@@ -1713,6 +1703,36 @@
     </w:p>
     <w:p>
       <w:pPr>
+        <w:pStyle w:val="Nadpis2"/>
+        <w:rPr>
+          <w:rFonts w:ascii="Special Elite" w:hAnsi="Special Elite"/>
+        </w:rPr>
+      </w:pPr>
+      <w:bookmarkStart w:id="4" w:name="_Toc211153208"/>
+      <w:r>
+        <w:rPr>
+          <w:rFonts w:ascii="Special Elite" w:hAnsi="Special Elite"/>
+        </w:rPr>
+        <w:lastRenderedPageBreak/>
+        <w:t>Manuálne nastavovanie</w:t>
+      </w:r>
+    </w:p>
+    <w:p>
+      <w:pPr>
+        <w:jc w:val="both"/>
+        <w:rPr>
+          <w:rFonts w:ascii="Special Elite" w:hAnsi="Special Elite" w:cs="Courier New"/>
+        </w:rPr>
+      </w:pPr>
+      <w:r>
+        <w:rPr>
+          <w:rFonts w:ascii="Special Elite" w:hAnsi="Special Elite" w:cs="Courier New"/>
+        </w:rPr>
+        <w:t>Na zadnej strane hodín sú osadené dve tlačidlá ktorými je možné hodiny nastavovať manuálne. Jedno tlačidlo posúva kurzor a druhé hodnotu na mieste kurzora. Stlačením oboch tlačidiel naraz sa prepína nastavovací režim. Podržaním jedného z tlačidiel sa nastavuje jas.</w:t>
+      </w:r>
+    </w:p>
+    <w:p>
+      <w:pPr>
         <w:rPr>
           <w:rStyle w:val="Nadpis2Char"/>
           <w:rFonts w:ascii="Special Elite" w:eastAsiaTheme="minorHAnsi" w:hAnsi="Special Elite" w:cstheme="minorBidi"/>
@@ -1722,13 +1742,11 @@
           <w:u w:val="none"/>
         </w:rPr>
       </w:pPr>
-      <w:bookmarkStart w:id="4" w:name="_Toc211153208"/>
       <w:r>
         <w:rPr>
           <w:rStyle w:val="Nadpis2Char"/>
           <w:rFonts w:ascii="Special Elite" w:hAnsi="Special Elite"/>
         </w:rPr>
-        <w:lastRenderedPageBreak/>
         <w:t>Firmvér</w:t>
       </w:r>
       <w:bookmarkEnd w:id="4"/>
@@ -1826,6 +1844,7 @@
     </w:p>
     <w:p>
       <w:pPr>
+        <w:jc w:val="both"/>
         <w:rPr>
           <w:rFonts w:ascii="Special Elite" w:hAnsi="Special Elite"/>
         </w:rPr>
@@ -1835,6 +1854,7 @@
           <w:rStyle w:val="Nadpis2Char"/>
           <w:rFonts w:ascii="Special Elite" w:hAnsi="Special Elite"/>
         </w:rPr>
+        <w:lastRenderedPageBreak/>
         <w:t>Pamäť</w:t>
       </w:r>
       <w:r>
@@ -1910,32 +1930,176 @@
     </w:p>
     <w:p>
       <w:pPr>
-        <w:pStyle w:val="Nadpis2"/>
-        <w:rPr>
-          <w:rFonts w:ascii="Special Elite" w:hAnsi="Special Elite"/>
-        </w:rPr>
-      </w:pPr>
-      <w:r>
-        <w:rPr>
-          <w:rFonts w:ascii="Special Elite" w:hAnsi="Special Elite"/>
-        </w:rPr>
-        <w:lastRenderedPageBreak/>
-        <w:t>Manuálne nastavovanie</w:t>
-      </w:r>
+        <w:jc w:val="both"/>
+        <w:rPr>
+          <w:rFonts w:ascii="Special Elite" w:hAnsi="Special Elite" w:cs="Courier New"/>
+        </w:rPr>
+      </w:pPr>
+      <w:bookmarkStart w:id="6" w:name="_Toc211153210"/>
       <w:bookmarkEnd w:id="5"/>
+      <w:r>
+        <w:rPr>
+          <w:rStyle w:val="Nadpis2Char"/>
+          <w:rFonts w:ascii="Special Elite" w:hAnsi="Special Elite"/>
+        </w:rPr>
+        <w:t>Napájanie</w:t>
+      </w:r>
+      <w:bookmarkEnd w:id="6"/>
+      <w:r>
+        <w:rPr>
+          <w:rFonts w:ascii="Special Elite" w:hAnsi="Special Elite" w:cs="Courier New"/>
+          <w:b/>
+          <w:bCs/>
+        </w:rPr>
+        <w:br/>
+      </w:r>
+      <w:r>
+        <w:rPr>
+          <w:rFonts w:ascii="Special Elite" w:hAnsi="Special Elite" w:cs="Courier New"/>
+        </w:rPr>
+        <w:t>Hodiny sa napájajú zo zdroja s výstupom 5</w:t>
+      </w:r>
+      <w:r>
+        <w:rPr>
+          <w:rFonts w:ascii="Special Elite" w:hAnsi="Special Elite" w:cs="Courier New"/>
+        </w:rPr>
+        <w:t xml:space="preserve"> </w:t>
+      </w:r>
+      <w:r>
+        <w:rPr>
+          <w:rFonts w:ascii="Special Elite" w:hAnsi="Special Elite" w:cs="Courier New"/>
+        </w:rPr>
+        <w:t xml:space="preserve">V schopným dodať aspoň </w:t>
+      </w:r>
+      <w:r>
+        <w:rPr>
+          <w:rFonts w:ascii="Special Elite" w:hAnsi="Special Elite" w:cs="Courier New"/>
+        </w:rPr>
+        <w:t>5</w:t>
+      </w:r>
+      <w:r>
+        <w:rPr>
+          <w:rFonts w:ascii="Special Elite" w:hAnsi="Special Elite" w:cs="Courier New"/>
+        </w:rPr>
+        <w:t xml:space="preserve"> </w:t>
+      </w:r>
+      <w:r>
+        <w:rPr>
+          <w:rFonts w:ascii="Special Elite" w:hAnsi="Special Elite" w:cs="Courier New"/>
+        </w:rPr>
+        <w:t>W. Zdroj by mal byť ideálne spínaný pre čo najnižšiu stratovosť s frekvenciou spínania</w:t>
+      </w:r>
+      <w:r>
+        <w:rPr>
+          <w:rFonts w:ascii="Special Elite" w:hAnsi="Special Elite" w:cs="Courier New"/>
+        </w:rPr>
+        <w:t xml:space="preserve"> rádovo</w:t>
+      </w:r>
+      <w:r>
+        <w:rPr>
+          <w:rFonts w:ascii="Special Elite" w:hAnsi="Special Elite" w:cs="Courier New"/>
+        </w:rPr>
+        <w:t xml:space="preserve"> vyššou ako 77.5 kHz aby sa predišlo rušeniu DCF77 prijímača</w:t>
+      </w:r>
+      <w:r>
+        <w:rPr>
+          <w:rFonts w:ascii="Special Elite" w:hAnsi="Special Elite" w:cs="Courier New"/>
+        </w:rPr>
+        <w:t>, rádio-amatéri odporúčajú Apple nabíjačky ako kvalitne odrušené zdroje.</w:t>
+      </w:r>
+      <w:r>
+        <w:rPr>
+          <w:rFonts w:ascii="Special Elite" w:hAnsi="Special Elite" w:cs="Courier New"/>
+        </w:rPr>
+        <w:br w:type="page"/>
+      </w:r>
     </w:p>
     <w:p>
       <w:pPr>
-        <w:jc w:val="both"/>
-        <w:rPr>
-          <w:rFonts w:ascii="Special Elite" w:hAnsi="Special Elite" w:cs="Courier New"/>
-        </w:rPr>
-      </w:pPr>
-      <w:r>
-        <w:rPr>
-          <w:rFonts w:ascii="Special Elite" w:hAnsi="Special Elite" w:cs="Courier New"/>
-        </w:rPr>
-        <w:t>Na zadnej strane hodín sú osadené dve tlačidlá ktorými je možné hodiny nastavovať manuálne. Jedno tlačidlo posúva kurzor a druhé hodnotu na mieste kurzora. Stlačením oboch tlačidiel naraz sa prepína nastavovací režim. Podržaním jedného z tlačidiel sa nastavuje jas.</w:t>
+        <w:rPr>
+          <w:rFonts w:ascii="Special Elite" w:eastAsiaTheme="majorEastAsia" w:hAnsi="Special Elite" w:cstheme="majorBidi"/>
+          <w:b/>
+          <w:color w:val="000000" w:themeColor="text1"/>
+          <w:szCs w:val="32"/>
+          <w:u w:val="single"/>
+        </w:rPr>
+      </w:pPr>
+      <w:bookmarkStart w:id="7" w:name="_Toc211153211"/>
+      <w:r>
+        <w:rPr>
+          <w:rStyle w:val="Nadpis2Char"/>
+          <w:rFonts w:ascii="Special Elite" w:hAnsi="Special Elite"/>
+        </w:rPr>
+        <w:lastRenderedPageBreak/>
+        <w:t>Pr</w:t>
+      </w:r>
+      <w:r>
+        <w:rPr>
+          <w:rStyle w:val="Nadpis2Char"/>
+          <w:rFonts w:ascii="Special Elite" w:hAnsi="Special Elite"/>
+        </w:rPr>
+        <w:t>i</w:t>
+      </w:r>
+      <w:r>
+        <w:rPr>
+          <w:rStyle w:val="Nadpis2Char"/>
+          <w:rFonts w:ascii="Special Elite" w:hAnsi="Special Elite"/>
+        </w:rPr>
+        <w:t>j</w:t>
+      </w:r>
+      <w:r>
+        <w:rPr>
+          <w:rStyle w:val="Nadpis2Char"/>
+          <w:rFonts w:ascii="Special Elite" w:hAnsi="Special Elite"/>
+        </w:rPr>
+        <w:t>í</w:t>
+      </w:r>
+      <w:r>
+        <w:rPr>
+          <w:rStyle w:val="Nadpis2Char"/>
+          <w:rFonts w:ascii="Special Elite" w:hAnsi="Special Elite"/>
+        </w:rPr>
+        <w:t>mač DCF77</w:t>
+      </w:r>
+      <w:bookmarkEnd w:id="7"/>
+      <w:r>
+        <w:rPr>
+          <w:rStyle w:val="Nadpis2Char"/>
+          <w:rFonts w:ascii="Special Elite" w:hAnsi="Special Elite"/>
+        </w:rPr>
+        <w:br/>
+      </w:r>
+      <w:r>
+        <w:rPr>
+          <w:rFonts w:ascii="Special Elite" w:hAnsi="Special Elite" w:cs="Courier New"/>
+        </w:rPr>
+        <w:t>V podstavci je umiestnená 140 milimetrová feritová anténa vlastnej výroby, odladená tak aby rezonovala pri frekvencii 77,5</w:t>
+      </w:r>
+      <w:r>
+        <w:rPr>
+          <w:rFonts w:ascii="Special Elite" w:hAnsi="Special Elite" w:cs="Courier New"/>
+        </w:rPr>
+        <w:t xml:space="preserve"> </w:t>
+      </w:r>
+      <w:r>
+        <w:rPr>
+          <w:rFonts w:ascii="Special Elite" w:hAnsi="Special Elite" w:cs="Courier New"/>
+        </w:rPr>
+        <w:t>kHz na ktorej vysielajú atómové hodiny z </w:t>
+      </w:r>
+      <w:proofErr w:type="spellStart"/>
+      <w:r>
+        <w:rPr>
+          <w:rFonts w:ascii="Special Elite" w:hAnsi="Special Elite" w:cs="Courier New"/>
+        </w:rPr>
+        <w:t>Mainflingenu</w:t>
+      </w:r>
+      <w:proofErr w:type="spellEnd"/>
+      <w:r>
+        <w:rPr>
+          <w:rFonts w:ascii="Special Elite" w:hAnsi="Special Elite" w:cs="Courier New"/>
+        </w:rPr>
+        <w:t xml:space="preserve"> (Nemecko) svoj časový signál. Tento signál používajú hodiny k automatickému nastaveniu času a prechodu zo zimného času na letný a naopak.</w:t>
       </w:r>
     </w:p>
     <w:p>
@@ -1945,216 +2109,50 @@
           <w:rFonts w:ascii="Special Elite" w:hAnsi="Special Elite" w:cs="Courier New"/>
         </w:rPr>
       </w:pPr>
-      <w:bookmarkStart w:id="6" w:name="_Toc211153210"/>
-      <w:r>
-        <w:rPr>
-          <w:rStyle w:val="Nadpis2Char"/>
-          <w:rFonts w:ascii="Special Elite" w:hAnsi="Special Elite"/>
-        </w:rPr>
-        <w:t>Napájanie</w:t>
-      </w:r>
-      <w:bookmarkEnd w:id="6"/>
-      <w:r>
-        <w:rPr>
-          <w:rFonts w:ascii="Special Elite" w:hAnsi="Special Elite" w:cs="Courier New"/>
-          <w:b/>
-          <w:bCs/>
-        </w:rPr>
-        <w:br/>
-      </w:r>
-      <w:r>
-        <w:rPr>
-          <w:rFonts w:ascii="Special Elite" w:hAnsi="Special Elite" w:cs="Courier New"/>
-        </w:rPr>
-        <w:t>Hodiny sa napájajú zo zdroja s výstupom 5</w:t>
-      </w:r>
-      <w:r>
-        <w:rPr>
-          <w:rFonts w:ascii="Special Elite" w:hAnsi="Special Elite" w:cs="Courier New"/>
-        </w:rPr>
-        <w:t xml:space="preserve"> </w:t>
-      </w:r>
-      <w:r>
-        <w:rPr>
-          <w:rFonts w:ascii="Special Elite" w:hAnsi="Special Elite" w:cs="Courier New"/>
-        </w:rPr>
-        <w:t xml:space="preserve">V schopným dodať aspoň </w:t>
-      </w:r>
-      <w:r>
-        <w:rPr>
-          <w:rFonts w:ascii="Special Elite" w:hAnsi="Special Elite" w:cs="Courier New"/>
-        </w:rPr>
-        <w:t>5</w:t>
-      </w:r>
-      <w:r>
-        <w:rPr>
-          <w:rFonts w:ascii="Special Elite" w:hAnsi="Special Elite" w:cs="Courier New"/>
-        </w:rPr>
-        <w:t xml:space="preserve"> </w:t>
-      </w:r>
-      <w:r>
-        <w:rPr>
-          <w:rFonts w:ascii="Special Elite" w:hAnsi="Special Elite" w:cs="Courier New"/>
-        </w:rPr>
-        <w:t>W. Zdroj by mal byť ideálne spínaný pre čo najnižšiu stratovosť s frekvenciou spínania</w:t>
-      </w:r>
-      <w:r>
-        <w:rPr>
-          <w:rFonts w:ascii="Special Elite" w:hAnsi="Special Elite" w:cs="Courier New"/>
-        </w:rPr>
-        <w:t xml:space="preserve"> rádovo</w:t>
-      </w:r>
-      <w:r>
-        <w:rPr>
-          <w:rFonts w:ascii="Special Elite" w:hAnsi="Special Elite" w:cs="Courier New"/>
-        </w:rPr>
-        <w:t xml:space="preserve"> vyššou ako 77.5 kHz aby sa predišlo rušeniu DCF77 prijímača.</w:t>
-      </w:r>
-      <w:r>
-        <w:rPr>
-          <w:rFonts w:ascii="Special Elite" w:hAnsi="Special Elite" w:cs="Courier New"/>
-        </w:rPr>
-        <w:br w:type="page"/>
+      <w:r>
+        <w:rPr>
+          <w:rFonts w:ascii="Special Elite" w:hAnsi="Special Elite" w:cs="Courier New"/>
+        </w:rPr>
+        <w:t xml:space="preserve">Keďže feritové antény sú </w:t>
+      </w:r>
+      <w:r>
+        <w:rPr>
+          <w:rFonts w:ascii="Special Elite" w:hAnsi="Special Elite" w:cs="Courier New"/>
+        </w:rPr>
+        <w:t xml:space="preserve">z povahy </w:t>
+      </w:r>
+      <w:r>
+        <w:rPr>
+          <w:rFonts w:ascii="Special Elite" w:hAnsi="Special Elite" w:cs="Courier New"/>
+        </w:rPr>
+        <w:t>závislé od orientácie, odporúčame mať hodiny otočené čelom na server alebo juh.</w:t>
       </w:r>
     </w:p>
     <w:p>
       <w:pPr>
         <w:jc w:val="both"/>
         <w:rPr>
-          <w:rStyle w:val="Nadpis2Char"/>
-          <w:rFonts w:ascii="Special Elite" w:hAnsi="Special Elite"/>
-        </w:rPr>
-      </w:pPr>
-      <w:bookmarkStart w:id="7" w:name="_Toc211153211"/>
-      <w:r>
-        <w:rPr>
-          <w:rStyle w:val="Nadpis2Char"/>
-          <w:rFonts w:ascii="Special Elite" w:hAnsi="Special Elite"/>
+          <w:rFonts w:ascii="Special Elite" w:hAnsi="Special Elite" w:cs="Courier New"/>
+        </w:rPr>
+      </w:pPr>
+      <w:r>
+        <w:rPr>
+          <w:rFonts w:ascii="Special Elite" w:hAnsi="Special Elite" w:cs="Courier New"/>
+        </w:rPr>
+        <w:t>P</w:t>
+      </w:r>
+      <w:r>
+        <w:rPr>
+          <w:rFonts w:ascii="Special Elite" w:hAnsi="Special Elite" w:cs="Courier New"/>
+        </w:rPr>
+        <w:t xml:space="preserve">očas synchronizácie, bliká indikačná LED-ka červenou farbou. Pri dobrej kvalite signálu a správnej orientácii hodín, by mala byť frekvencia blikanie 1 Hz. Po úspešnej synchronizácii času, svieti LED-ka stálou zelenou farbou. </w:t>
+      </w:r>
+      <w:r>
+        <w:rPr>
+          <w:rFonts w:ascii="Special Elite" w:hAnsi="Special Elite" w:cs="Courier New"/>
         </w:rPr>
         <w:lastRenderedPageBreak/>
-        <w:t>Pr</w:t>
-      </w:r>
-      <w:r>
-        <w:rPr>
-          <w:rStyle w:val="Nadpis2Char"/>
-          <w:rFonts w:ascii="Special Elite" w:hAnsi="Special Elite"/>
-        </w:rPr>
-        <w:t>i</w:t>
-      </w:r>
-      <w:r>
-        <w:rPr>
-          <w:rStyle w:val="Nadpis2Char"/>
-          <w:rFonts w:ascii="Special Elite" w:hAnsi="Special Elite"/>
-        </w:rPr>
-        <w:t>j</w:t>
-      </w:r>
-      <w:r>
-        <w:rPr>
-          <w:rStyle w:val="Nadpis2Char"/>
-          <w:rFonts w:ascii="Special Elite" w:hAnsi="Special Elite"/>
-        </w:rPr>
-        <w:t>í</w:t>
-      </w:r>
-      <w:r>
-        <w:rPr>
-          <w:rStyle w:val="Nadpis2Char"/>
-          <w:rFonts w:ascii="Special Elite" w:hAnsi="Special Elite"/>
-        </w:rPr>
-        <w:t>mač DCF77</w:t>
-      </w:r>
-      <w:bookmarkEnd w:id="7"/>
-    </w:p>
-    <w:p>
-      <w:pPr>
-        <w:jc w:val="both"/>
-        <w:rPr>
-          <w:rFonts w:ascii="Special Elite" w:hAnsi="Special Elite" w:cs="Courier New"/>
-        </w:rPr>
-      </w:pPr>
-      <w:r>
-        <w:rPr>
-          <w:rFonts w:ascii="Special Elite" w:hAnsi="Special Elite" w:cs="Courier New"/>
-        </w:rPr>
-        <w:t>V podstavci je umiestnená 140 milimetrová feritová anténa vlastnej výroby, odladená tak aby rezonovala pri frekvencii 77,5</w:t>
-      </w:r>
-      <w:r>
-        <w:rPr>
-          <w:rFonts w:ascii="Special Elite" w:hAnsi="Special Elite" w:cs="Courier New"/>
-        </w:rPr>
-        <w:t xml:space="preserve"> </w:t>
-      </w:r>
-      <w:r>
-        <w:rPr>
-          <w:rFonts w:ascii="Special Elite" w:hAnsi="Special Elite" w:cs="Courier New"/>
-        </w:rPr>
-        <w:t>kHz na ktorej vysielajú atómové hodiny z </w:t>
-      </w:r>
-      <w:proofErr w:type="spellStart"/>
-      <w:r>
-        <w:rPr>
-          <w:rFonts w:ascii="Special Elite" w:hAnsi="Special Elite" w:cs="Courier New"/>
-        </w:rPr>
-        <w:t>Mainflingenu</w:t>
-      </w:r>
-      <w:proofErr w:type="spellEnd"/>
-      <w:r>
-        <w:rPr>
-          <w:rFonts w:ascii="Special Elite" w:hAnsi="Special Elite" w:cs="Courier New"/>
-        </w:rPr>
-        <w:t xml:space="preserve"> (Nemecko) svoj časový signál. Tento signál používajú hodiny k automatickému nastaveniu času a prechodu zo zimného času na letný a naopak.</w:t>
-      </w:r>
-    </w:p>
-    <w:p>
-      <w:pPr>
-        <w:jc w:val="both"/>
-        <w:rPr>
-          <w:rFonts w:ascii="Special Elite" w:hAnsi="Special Elite" w:cs="Courier New"/>
-        </w:rPr>
-      </w:pPr>
-      <w:r>
-        <w:rPr>
-          <w:rFonts w:ascii="Special Elite" w:hAnsi="Special Elite" w:cs="Courier New"/>
-        </w:rPr>
-        <w:t xml:space="preserve">Keďže feritové antény sú </w:t>
-      </w:r>
-      <w:r>
-        <w:rPr>
-          <w:rFonts w:ascii="Special Elite" w:hAnsi="Special Elite" w:cs="Courier New"/>
-        </w:rPr>
-        <w:t xml:space="preserve">z povahy </w:t>
-      </w:r>
-      <w:r>
-        <w:rPr>
-          <w:rFonts w:ascii="Special Elite" w:hAnsi="Special Elite" w:cs="Courier New"/>
-        </w:rPr>
-        <w:t>závislé od orientácie, odporúčame mať hodiny otočené čelom na server alebo juh.</w:t>
-      </w:r>
-    </w:p>
-    <w:p>
-      <w:pPr>
-        <w:jc w:val="both"/>
-        <w:rPr>
-          <w:rFonts w:ascii="Special Elite" w:hAnsi="Special Elite" w:cs="Courier New"/>
-        </w:rPr>
-      </w:pPr>
-      <w:r>
-        <w:rPr>
-          <w:rFonts w:ascii="Special Elite" w:hAnsi="Special Elite" w:cs="Courier New"/>
-        </w:rPr>
-        <w:t>P</w:t>
-      </w:r>
-      <w:r>
-        <w:rPr>
-          <w:rFonts w:ascii="Special Elite" w:hAnsi="Special Elite" w:cs="Courier New"/>
-        </w:rPr>
-        <w:t xml:space="preserve">očas synchronizácie, bliká indikačná LED-ka červenou farbou. Pri dobrej kvalite signálu a správnej orientácii hodín, by mala byť frekvencia blikanie </w:t>
-      </w:r>
-      <w:r>
-        <w:rPr>
-          <w:rFonts w:ascii="Special Elite" w:hAnsi="Special Elite" w:cs="Courier New"/>
-        </w:rPr>
-        <w:lastRenderedPageBreak/>
-        <w:t>1 Hz. Po úspešnej synchronizácii času, svieti LED-ka stálou zelenou farbou. V prípade potreby sa tejto indikačnej LED-</w:t>
+        <w:t>V prípade potreby sa tejto indikačnej LED-</w:t>
       </w:r>
       <w:proofErr w:type="spellStart"/>
       <w:r>
@@ -2201,6 +2199,9 @@
       <w:r>
         <w:rPr>
           <w:rFonts w:ascii="Special Elite" w:hAnsi="Special Elite"/>
+          <w:b/>
+          <w:bCs/>
+          <w:u w:val="single"/>
         </w:rPr>
         <w:t>Záložná batéria</w:t>
       </w:r>
@@ -2281,7 +2282,13 @@
         <w:rPr>
           <w:rFonts w:ascii="Special Elite" w:hAnsi="Special Elite" w:cs="Courier New"/>
         </w:rPr>
-        <w:t>Od výroby obsahuje:</w:t>
+        <w:t>O</w:t>
+      </w:r>
+      <w:r>
+        <w:rPr>
+          <w:rFonts w:ascii="Special Elite" w:hAnsi="Special Elite" w:cs="Courier New"/>
+        </w:rPr>
+        <w:t>bsahuje:</w:t>
       </w:r>
     </w:p>
     <w:p>
@@ -2362,11 +2369,22 @@
     </w:p>
     <w:p>
       <w:pPr>
+        <w:pStyle w:val="Odstavecseseznamem"/>
+        <w:numPr>
+          <w:ilvl w:val="0"/>
+          <w:numId w:val="7"/>
+        </w:numPr>
         <w:jc w:val="both"/>
         <w:rPr>
           <w:rFonts w:ascii="Special Elite" w:hAnsi="Special Elite" w:cs="Courier New"/>
         </w:rPr>
       </w:pPr>
+      <w:r>
+        <w:rPr>
+          <w:rFonts w:ascii="Special Elite" w:hAnsi="Special Elite" w:cs="Courier New"/>
+        </w:rPr>
+        <w:t>1x schéma zapojenia plošného spoja hodín vo formáte A2</w:t>
+      </w:r>
     </w:p>
     <w:p>
       <w:pPr>
@@ -2519,6 +2537,8 @@
       <w:r>
         <w:rPr>
           <w:rFonts w:ascii="Special Elite" w:hAnsi="Special Elite" w:cs="Courier New"/>
+          <w:b/>
+          <w:bCs/>
           <w:u w:val="single"/>
         </w:rPr>
         <w:t>Vedúci projektu</w:t>
@@ -2526,6 +2546,8 @@
       <w:r>
         <w:rPr>
           <w:rFonts w:ascii="Special Elite" w:hAnsi="Special Elite" w:cs="Courier New"/>
+          <w:b/>
+          <w:bCs/>
           <w:u w:val="single"/>
         </w:rPr>
         <w:t>:</w:t>
@@ -2552,6 +2574,8 @@
       <w:r>
         <w:rPr>
           <w:rFonts w:ascii="Special Elite" w:hAnsi="Special Elite" w:cs="Courier New"/>
+          <w:b/>
+          <w:bCs/>
           <w:u w:val="single"/>
         </w:rPr>
         <w:t>Vedúci výroby</w:t>
@@ -2559,6 +2583,8 @@
       <w:r>
         <w:rPr>
           <w:rFonts w:ascii="Special Elite" w:hAnsi="Special Elite" w:cs="Courier New"/>
+          <w:b/>
+          <w:bCs/>
           <w:u w:val="single"/>
         </w:rPr>
         <w:t>:</w:t>
@@ -2575,6 +2601,124 @@
           <w:rFonts w:ascii="Special Elite" w:hAnsi="Special Elite" w:cs="Courier New"/>
         </w:rPr>
         <w:t>Perďoch</w:t>
+      </w:r>
+      <w:proofErr w:type="spellEnd"/>
+      <w:r>
+        <w:rPr>
+          <w:rFonts w:ascii="Special Elite" w:hAnsi="Special Elite" w:cs="Courier New"/>
+        </w:rPr>
+        <w:br/>
+        <w:t>-</w:t>
+      </w:r>
+      <w:r>
+        <w:rPr>
+          <w:rFonts w:ascii="Special Elite" w:hAnsi="Special Elite" w:cs="Courier New"/>
+          <w:b/>
+          <w:bCs/>
+          <w:u w:val="single"/>
+        </w:rPr>
+        <w:t xml:space="preserve"> Výroba podstavca a 3D modelovanie</w:t>
+      </w:r>
+      <w:r>
+        <w:rPr>
+          <w:rFonts w:ascii="Special Elite" w:hAnsi="Special Elite" w:cs="Courier New"/>
+          <w:b/>
+          <w:bCs/>
+          <w:u w:val="single"/>
+        </w:rPr>
+        <w:t>:</w:t>
+      </w:r>
+      <w:r>
+        <w:rPr>
+          <w:rFonts w:ascii="Special Elite" w:hAnsi="Special Elite" w:cs="Courier New"/>
+        </w:rPr>
+        <w:t xml:space="preserve"> Bartolomej Mikula</w:t>
+      </w:r>
+      <w:r>
+        <w:rPr>
+          <w:rFonts w:ascii="Special Elite" w:hAnsi="Special Elite" w:cs="Courier New"/>
+        </w:rPr>
+        <w:br/>
+        <w:t>-</w:t>
+      </w:r>
+      <w:r>
+        <w:rPr>
+          <w:rFonts w:ascii="Special Elite" w:hAnsi="Special Elite" w:cs="Courier New"/>
+        </w:rPr>
+        <w:t xml:space="preserve"> </w:t>
+      </w:r>
+      <w:proofErr w:type="spellStart"/>
+      <w:r>
+        <w:rPr>
+          <w:rFonts w:ascii="Special Elite" w:hAnsi="Special Elite" w:cs="Courier New"/>
+          <w:b/>
+          <w:bCs/>
+          <w:u w:val="single"/>
+        </w:rPr>
+        <w:t>Biblistika</w:t>
+      </w:r>
+      <w:proofErr w:type="spellEnd"/>
+      <w:r>
+        <w:rPr>
+          <w:rFonts w:ascii="Special Elite" w:hAnsi="Special Elite" w:cs="Courier New"/>
+          <w:u w:val="single"/>
+        </w:rPr>
+        <w:t>:</w:t>
+      </w:r>
+      <w:r>
+        <w:rPr>
+          <w:rFonts w:ascii="Special Elite" w:hAnsi="Special Elite" w:cs="Courier New"/>
+        </w:rPr>
+        <w:t xml:space="preserve"> Jozef </w:t>
+      </w:r>
+      <w:proofErr w:type="spellStart"/>
+      <w:r>
+        <w:rPr>
+          <w:rFonts w:ascii="Special Elite" w:hAnsi="Special Elite" w:cs="Courier New"/>
+        </w:rPr>
+        <w:t>Hroš</w:t>
+      </w:r>
+      <w:proofErr w:type="spellEnd"/>
+      <w:r>
+        <w:rPr>
+          <w:rFonts w:ascii="Special Elite" w:hAnsi="Special Elite" w:cs="Courier New"/>
+        </w:rPr>
+        <w:br/>
+      </w:r>
+      <w:r>
+        <w:rPr>
+          <w:rFonts w:ascii="Special Elite" w:hAnsi="Special Elite" w:cs="Courier New"/>
+        </w:rPr>
+        <w:t xml:space="preserve">- </w:t>
+      </w:r>
+      <w:r>
+        <w:rPr>
+          <w:rFonts w:ascii="Special Elite" w:hAnsi="Special Elite" w:cs="Courier New"/>
+          <w:b/>
+          <w:bCs/>
+          <w:u w:val="single"/>
+        </w:rPr>
+        <w:t>Manažér marketingu</w:t>
+      </w:r>
+      <w:r>
+        <w:rPr>
+          <w:rFonts w:ascii="Special Elite" w:hAnsi="Special Elite" w:cs="Courier New"/>
+          <w:u w:val="single"/>
+        </w:rPr>
+        <w:t>:</w:t>
+      </w:r>
+      <w:r>
+        <w:rPr>
+          <w:rFonts w:ascii="Special Elite" w:hAnsi="Special Elite" w:cs="Courier New"/>
+        </w:rPr>
+        <w:t xml:space="preserve"> Šimon </w:t>
+      </w:r>
+      <w:proofErr w:type="spellStart"/>
+      <w:r>
+        <w:rPr>
+          <w:rFonts w:ascii="Special Elite" w:hAnsi="Special Elite" w:cs="Courier New"/>
+        </w:rPr>
+        <w:t>Šinal</w:t>
       </w:r>
       <w:proofErr w:type="spellEnd"/>
       <w:r>
@@ -2587,21 +2731,42 @@
       <w:r>
         <w:rPr>
           <w:rFonts w:ascii="Special Elite" w:hAnsi="Special Elite" w:cs="Courier New"/>
+          <w:b/>
+          <w:bCs/>
           <w:u w:val="single"/>
         </w:rPr>
-        <w:t>Drevovýroba a modelovanie:</w:t>
-      </w:r>
-      <w:r>
-        <w:rPr>
-          <w:rFonts w:ascii="Special Elite" w:hAnsi="Special Elite" w:cs="Courier New"/>
-        </w:rPr>
-        <w:t xml:space="preserve"> Bartolomej Mikula</w:t>
-      </w:r>
+        <w:t>Drevo materiál</w:t>
+      </w:r>
+      <w:r>
+        <w:rPr>
+          <w:rFonts w:ascii="Special Elite" w:hAnsi="Special Elite" w:cs="Courier New"/>
+        </w:rPr>
+        <w:t xml:space="preserve">: </w:t>
+      </w:r>
+      <w:r>
+        <w:rPr>
+          <w:rFonts w:ascii="Special Elite" w:hAnsi="Special Elite" w:cs="Courier New"/>
+        </w:rPr>
+        <w:t xml:space="preserve">Bohumil </w:t>
+      </w:r>
+      <w:proofErr w:type="spellStart"/>
+      <w:r>
+        <w:rPr>
+          <w:rFonts w:ascii="Special Elite" w:hAnsi="Special Elite" w:cs="Courier New"/>
+        </w:rPr>
+        <w:t>Jaroš</w:t>
+      </w:r>
+      <w:proofErr w:type="spellEnd"/>
       <w:r>
         <w:rPr>
           <w:rFonts w:ascii="Special Elite" w:hAnsi="Special Elite" w:cs="Courier New"/>
         </w:rPr>
         <w:br/>
+      </w:r>
+      <w:r>
+        <w:rPr>
+          <w:rFonts w:ascii="Special Elite" w:hAnsi="Special Elite" w:cs="Courier New"/>
+        </w:rPr>
         <w:t>-</w:t>
       </w:r>
       <w:r>
@@ -2610,67 +2775,57 @@
         </w:rPr>
         <w:t xml:space="preserve"> </w:t>
       </w:r>
+      <w:r>
+        <w:rPr>
+          <w:rFonts w:ascii="Special Elite" w:hAnsi="Special Elite" w:cs="Courier New"/>
+          <w:b/>
+          <w:bCs/>
+          <w:u w:val="single"/>
+        </w:rPr>
+        <w:t>Kritika</w:t>
+      </w:r>
+      <w:r>
+        <w:rPr>
+          <w:rFonts w:ascii="Special Elite" w:hAnsi="Special Elite" w:cs="Courier New"/>
+          <w:b/>
+          <w:bCs/>
+          <w:u w:val="single"/>
+        </w:rPr>
+        <w:t xml:space="preserve"> hardvéru</w:t>
+      </w:r>
+      <w:r>
+        <w:rPr>
+          <w:rFonts w:ascii="Special Elite" w:hAnsi="Special Elite" w:cs="Courier New"/>
+          <w:u w:val="single"/>
+        </w:rPr>
+        <w:t>:</w:t>
+      </w:r>
+      <w:r>
+        <w:rPr>
+          <w:rFonts w:ascii="Special Elite" w:hAnsi="Special Elite" w:cs="Courier New"/>
+        </w:rPr>
+        <w:t xml:space="preserve"> Ing. Viliam </w:t>
+      </w:r>
       <w:proofErr w:type="spellStart"/>
       <w:r>
         <w:rPr>
           <w:rFonts w:ascii="Special Elite" w:hAnsi="Special Elite" w:cs="Courier New"/>
-          <w:u w:val="single"/>
-        </w:rPr>
-        <w:t>Biblistika</w:t>
+        </w:rPr>
+        <w:t>Koprda</w:t>
       </w:r>
       <w:proofErr w:type="spellEnd"/>
       <w:r>
         <w:rPr>
           <w:rFonts w:ascii="Special Elite" w:hAnsi="Special Elite" w:cs="Courier New"/>
-          <w:u w:val="single"/>
-        </w:rPr>
-        <w:t>:</w:t>
-      </w:r>
-      <w:r>
-        <w:rPr>
-          <w:rFonts w:ascii="Special Elite" w:hAnsi="Special Elite" w:cs="Courier New"/>
-        </w:rPr>
-        <w:t xml:space="preserve"> Jozef </w:t>
+        </w:rPr>
+        <w:t xml:space="preserve">, Ing. Dušan </w:t>
       </w:r>
       <w:proofErr w:type="spellStart"/>
       <w:r>
         <w:rPr>
           <w:rFonts w:ascii="Special Elite" w:hAnsi="Special Elite" w:cs="Courier New"/>
         </w:rPr>
-        <w:t>Hroš</w:t>
-      </w:r>
-      <w:proofErr w:type="spellEnd"/>
-      <w:r>
-        <w:rPr>
-          <w:rFonts w:ascii="Special Elite" w:hAnsi="Special Elite" w:cs="Courier New"/>
-        </w:rPr>
-        <w:br/>
-      </w:r>
-      <w:r>
-        <w:rPr>
-          <w:rFonts w:ascii="Special Elite" w:hAnsi="Special Elite" w:cs="Courier New"/>
-        </w:rPr>
-        <w:t xml:space="preserve">- </w:t>
-      </w:r>
-      <w:r>
-        <w:rPr>
-          <w:rFonts w:ascii="Special Elite" w:hAnsi="Special Elite" w:cs="Courier New"/>
-          <w:u w:val="single"/>
-        </w:rPr>
-        <w:t>Manažér marketingu:</w:t>
-      </w:r>
-      <w:r>
-        <w:rPr>
-          <w:rFonts w:ascii="Special Elite" w:hAnsi="Special Elite" w:cs="Courier New"/>
-        </w:rPr>
-        <w:t xml:space="preserve"> Šimon </w:t>
-      </w:r>
-      <w:proofErr w:type="spellStart"/>
-      <w:r>
-        <w:rPr>
-          <w:rFonts w:ascii="Special Elite" w:hAnsi="Special Elite" w:cs="Courier New"/>
-        </w:rPr>
-        <w:t>Šinal</w:t>
+        <w:t>Dragúň</w:t>
       </w:r>
       <w:proofErr w:type="spellEnd"/>
       <w:r>
@@ -2683,97 +2838,77 @@
       <w:r>
         <w:rPr>
           <w:rFonts w:ascii="Special Elite" w:hAnsi="Special Elite" w:cs="Courier New"/>
+          <w:b/>
+          <w:bCs/>
           <w:u w:val="single"/>
         </w:rPr>
-        <w:t>Drevo materiál</w:t>
-      </w:r>
-      <w:r>
-        <w:rPr>
-          <w:rFonts w:ascii="Special Elite" w:hAnsi="Special Elite" w:cs="Courier New"/>
-        </w:rPr>
-        <w:t xml:space="preserve">: </w:t>
+        <w:t>Súčiastky</w:t>
+      </w:r>
+      <w:r>
+        <w:rPr>
+          <w:rFonts w:ascii="Special Elite" w:hAnsi="Special Elite" w:cs="Courier New"/>
+          <w:u w:val="single"/>
+        </w:rPr>
+        <w:t>:</w:t>
+      </w:r>
+      <w:r>
+        <w:rPr>
+          <w:rFonts w:ascii="Special Elite" w:hAnsi="Special Elite" w:cs="Courier New"/>
+        </w:rPr>
+        <w:t xml:space="preserve"> MB </w:t>
       </w:r>
       <w:proofErr w:type="spellStart"/>
       <w:r>
         <w:rPr>
           <w:rFonts w:ascii="Special Elite" w:hAnsi="Special Elite" w:cs="Courier New"/>
         </w:rPr>
-        <w:t>Jaroš</w:t>
+        <w:t>Electronic</w:t>
       </w:r>
       <w:proofErr w:type="spellEnd"/>
       <w:r>
         <w:rPr>
           <w:rFonts w:ascii="Special Elite" w:hAnsi="Special Elite" w:cs="Courier New"/>
         </w:rPr>
-        <w:t xml:space="preserve"> Bohuš</w:t>
-      </w:r>
-      <w:r>
-        <w:rPr>
-          <w:rFonts w:ascii="Special Elite" w:hAnsi="Special Elite" w:cs="Courier New"/>
-        </w:rPr>
-        <w:br/>
-      </w:r>
-      <w:r>
-        <w:rPr>
-          <w:rFonts w:ascii="Special Elite" w:hAnsi="Special Elite" w:cs="Courier New"/>
-        </w:rPr>
-        <w:t>-</w:t>
-      </w:r>
-      <w:r>
-        <w:rPr>
-          <w:rFonts w:ascii="Special Elite" w:hAnsi="Special Elite" w:cs="Courier New"/>
-        </w:rPr>
-        <w:t xml:space="preserve"> </w:t>
-      </w:r>
-      <w:r>
-        <w:rPr>
-          <w:rFonts w:ascii="Special Elite" w:hAnsi="Special Elite" w:cs="Courier New"/>
-          <w:u w:val="single"/>
-        </w:rPr>
-        <w:t>Kritika</w:t>
-      </w:r>
-      <w:r>
-        <w:rPr>
-          <w:rFonts w:ascii="Special Elite" w:hAnsi="Special Elite" w:cs="Courier New"/>
-          <w:u w:val="single"/>
-        </w:rPr>
-        <w:t xml:space="preserve"> hardvéru</w:t>
-      </w:r>
-      <w:r>
-        <w:rPr>
-          <w:rFonts w:ascii="Special Elite" w:hAnsi="Special Elite" w:cs="Courier New"/>
-          <w:u w:val="single"/>
-        </w:rPr>
-        <w:t>:</w:t>
-      </w:r>
-      <w:r>
-        <w:rPr>
-          <w:rFonts w:ascii="Special Elite" w:hAnsi="Special Elite" w:cs="Courier New"/>
-        </w:rPr>
-        <w:t xml:space="preserve"> Ing. Viliam </w:t>
+        <w:t xml:space="preserve">, </w:t>
+      </w:r>
+      <w:r>
+        <w:rPr>
+          <w:rFonts w:ascii="Special Elite" w:hAnsi="Special Elite" w:cs="Courier New"/>
+        </w:rPr>
+        <w:t>VP Centrum</w:t>
+      </w:r>
+      <w:r>
+        <w:rPr>
+          <w:rFonts w:ascii="Special Elite" w:hAnsi="Special Elite" w:cs="Courier New"/>
+        </w:rPr>
+        <w:t xml:space="preserve"> Litoměřice</w:t>
+      </w:r>
+      <w:r>
+        <w:rPr>
+          <w:rFonts w:ascii="Special Elite" w:hAnsi="Special Elite" w:cs="Courier New"/>
+        </w:rPr>
+        <w:t xml:space="preserve">, </w:t>
+      </w:r>
+      <w:r>
+        <w:rPr>
+          <w:rFonts w:ascii="Special Elite" w:hAnsi="Special Elite" w:cs="Courier New"/>
+        </w:rPr>
+        <w:t xml:space="preserve">PS </w:t>
       </w:r>
       <w:proofErr w:type="spellStart"/>
       <w:r>
         <w:rPr>
           <w:rFonts w:ascii="Special Elite" w:hAnsi="Special Elite" w:cs="Courier New"/>
         </w:rPr>
-        <w:t>Koprda</w:t>
+        <w:t>Electronic</w:t>
       </w:r>
       <w:proofErr w:type="spellEnd"/>
       <w:r>
         <w:rPr>
           <w:rFonts w:ascii="Special Elite" w:hAnsi="Special Elite" w:cs="Courier New"/>
         </w:rPr>
-        <w:t xml:space="preserve">, Ing. Dušan </w:t>
-      </w:r>
-      <w:proofErr w:type="spellStart"/>
-      <w:r>
-        <w:rPr>
-          <w:rFonts w:ascii="Special Elite" w:hAnsi="Special Elite" w:cs="Courier New"/>
-        </w:rPr>
-        <w:t>Dragúň</w:t>
-      </w:r>
-      <w:proofErr w:type="spellEnd"/>
+        <w:t xml:space="preserve"> Praha</w:t>
+      </w:r>
       <w:r>
         <w:rPr>
           <w:rFonts w:ascii="Special Elite" w:hAnsi="Special Elite" w:cs="Courier New"/>
@@ -2784,68 +2919,33 @@
       <w:r>
         <w:rPr>
           <w:rFonts w:ascii="Special Elite" w:hAnsi="Special Elite" w:cs="Courier New"/>
+          <w:b/>
+          <w:bCs/>
           <w:u w:val="single"/>
         </w:rPr>
-        <w:t>Súčiastky:</w:t>
-      </w:r>
-      <w:r>
-        <w:rPr>
-          <w:rFonts w:ascii="Special Elite" w:hAnsi="Special Elite" w:cs="Courier New"/>
-        </w:rPr>
-        <w:t xml:space="preserve"> MB </w:t>
+        <w:t>Chémia na leptanie DPS</w:t>
+      </w:r>
+      <w:r>
+        <w:rPr>
+          <w:rFonts w:ascii="Special Elite" w:hAnsi="Special Elite" w:cs="Courier New"/>
+          <w:u w:val="single"/>
+        </w:rPr>
+        <w:t>:</w:t>
+      </w:r>
+      <w:r>
+        <w:rPr>
+          <w:rFonts w:ascii="Special Elite" w:hAnsi="Special Elite" w:cs="Courier New"/>
+        </w:rPr>
+        <w:t xml:space="preserve"> Ladislav </w:t>
       </w:r>
       <w:proofErr w:type="spellStart"/>
       <w:r>
         <w:rPr>
           <w:rFonts w:ascii="Special Elite" w:hAnsi="Special Elite" w:cs="Courier New"/>
         </w:rPr>
-        <w:t>Electronic</w:t>
+        <w:t>Zimka</w:t>
       </w:r>
       <w:proofErr w:type="spellEnd"/>
-      <w:r>
-        <w:rPr>
-          <w:rFonts w:ascii="Special Elite" w:hAnsi="Special Elite" w:cs="Courier New"/>
-        </w:rPr>
-        <w:t xml:space="preserve">, </w:t>
-      </w:r>
-      <w:r>
-        <w:rPr>
-          <w:rFonts w:ascii="Special Elite" w:hAnsi="Special Elite" w:cs="Courier New"/>
-        </w:rPr>
-        <w:t>VP Centrum</w:t>
-      </w:r>
-      <w:r>
-        <w:rPr>
-          <w:rFonts w:ascii="Special Elite" w:hAnsi="Special Elite" w:cs="Courier New"/>
-        </w:rPr>
-        <w:t xml:space="preserve"> Litoměřice</w:t>
-      </w:r>
-      <w:r>
-        <w:rPr>
-          <w:rFonts w:ascii="Special Elite" w:hAnsi="Special Elite" w:cs="Courier New"/>
-        </w:rPr>
-        <w:t xml:space="preserve">, </w:t>
-      </w:r>
-      <w:r>
-        <w:rPr>
-          <w:rFonts w:ascii="Special Elite" w:hAnsi="Special Elite" w:cs="Courier New"/>
-        </w:rPr>
-        <w:t>PS Electro</w:t>
-      </w:r>
-      <w:proofErr w:type="spellStart"/>
-      <w:r>
-        <w:rPr>
-          <w:rFonts w:ascii="Special Elite" w:hAnsi="Special Elite" w:cs="Courier New"/>
-        </w:rPr>
-        <w:t>nic</w:t>
-      </w:r>
-      <w:proofErr w:type="spellEnd"/>
-      <w:r>
-        <w:rPr>
-          <w:rFonts w:ascii="Special Elite" w:hAnsi="Special Elite" w:cs="Courier New"/>
-        </w:rPr>
-        <w:t xml:space="preserve"> Praha</w:t>
-      </w:r>
       <w:r>
         <w:rPr>
           <w:rFonts w:ascii="Special Elite" w:hAnsi="Special Elite" w:cs="Courier New"/>
@@ -2856,88 +2956,59 @@
       <w:r>
         <w:rPr>
           <w:rFonts w:ascii="Special Elite" w:hAnsi="Special Elite" w:cs="Courier New"/>
+          <w:b/>
+          <w:bCs/>
           <w:u w:val="single"/>
         </w:rPr>
-        <w:t>Chémia na leptanie DPS:</w:t>
-      </w:r>
-      <w:r>
-        <w:rPr>
-          <w:rFonts w:ascii="Special Elite" w:hAnsi="Special Elite" w:cs="Courier New"/>
-        </w:rPr>
-        <w:t xml:space="preserve"> Ladislav </w:t>
+        <w:t xml:space="preserve">Poskytovateľ </w:t>
       </w:r>
       <w:proofErr w:type="spellStart"/>
       <w:r>
         <w:rPr>
           <w:rFonts w:ascii="Special Elite" w:hAnsi="Special Elite" w:cs="Courier New"/>
-        </w:rPr>
-        <w:t>Zimka</w:t>
+          <w:b/>
+          <w:bCs/>
+          <w:u w:val="single"/>
+        </w:rPr>
+        <w:t>numitrono</w:t>
+      </w:r>
+      <w:r>
+        <w:rPr>
+          <w:rFonts w:ascii="Special Elite" w:hAnsi="Special Elite" w:cs="Courier New"/>
+          <w:b/>
+          <w:bCs/>
+          <w:u w:val="single"/>
+        </w:rPr>
+        <w:t>v</w:t>
       </w:r>
       <w:proofErr w:type="spellEnd"/>
       <w:r>
         <w:rPr>
           <w:rFonts w:ascii="Special Elite" w:hAnsi="Special Elite" w:cs="Courier New"/>
-        </w:rPr>
-        <w:br/>
-        <w:t xml:space="preserve">- </w:t>
-      </w:r>
-      <w:r>
-        <w:rPr>
-          <w:rFonts w:ascii="Special Elite" w:hAnsi="Special Elite" w:cs="Courier New"/>
           <w:u w:val="single"/>
         </w:rPr>
-        <w:t xml:space="preserve">Poskytovateľ </w:t>
+        <w:t>:</w:t>
+      </w:r>
+      <w:r>
+        <w:rPr>
+          <w:rFonts w:ascii="Special Elite" w:hAnsi="Special Elite" w:cs="Courier New"/>
+        </w:rPr>
+        <w:t xml:space="preserve"> Robert </w:t>
       </w:r>
       <w:proofErr w:type="spellStart"/>
       <w:r>
         <w:rPr>
           <w:rFonts w:ascii="Special Elite" w:hAnsi="Special Elite" w:cs="Courier New"/>
-          <w:u w:val="single"/>
-        </w:rPr>
-        <w:t>numitrono</w:t>
-      </w:r>
-      <w:r>
-        <w:rPr>
-          <w:rFonts w:ascii="Special Elite" w:hAnsi="Special Elite" w:cs="Courier New"/>
-          <w:u w:val="single"/>
-        </w:rPr>
-        <w:t>v</w:t>
+        </w:rPr>
+        <w:t>Ziedins</w:t>
       </w:r>
       <w:proofErr w:type="spellEnd"/>
       <w:r>
         <w:rPr>
           <w:rFonts w:ascii="Special Elite" w:hAnsi="Special Elite" w:cs="Courier New"/>
-          <w:u w:val="single"/>
-        </w:rPr>
-        <w:t>:</w:t>
-      </w:r>
-      <w:r>
-        <w:rPr>
-          <w:rFonts w:ascii="Special Elite" w:hAnsi="Special Elite" w:cs="Courier New"/>
-        </w:rPr>
-        <w:t xml:space="preserve"> Robert </w:t>
-      </w:r>
-      <w:proofErr w:type="spellStart"/>
-      <w:r>
-        <w:rPr>
-          <w:rFonts w:ascii="Special Elite" w:hAnsi="Special Elite" w:cs="Courier New"/>
-        </w:rPr>
-        <w:t>Ziedins</w:t>
-      </w:r>
-      <w:proofErr w:type="spellEnd"/>
-      <w:r>
-        <w:rPr>
-          <w:rFonts w:ascii="Special Elite" w:hAnsi="Special Elite" w:cs="Courier New"/>
         </w:rPr>
         <w:t>, Litva</w:t>
       </w:r>
-    </w:p>
-    <w:p>
-      <w:pPr>
-        <w:rPr>
-          <w:rFonts w:ascii="Special Elite" w:hAnsi="Special Elite" w:cs="Courier New"/>
-        </w:rPr>
-      </w:pPr>
     </w:p>
     <w:sectPr>
       <w:pgSz w:w="10206" w:h="3969" w:orient="landscape" w:code="9"/>

</xml_diff>

<commit_message>
Vytlacena verzia prirucky + novy model, zatial v stadiu testovania.
</commit_message>
<xml_diff>
--- a/docs/prirucka.docx
+++ b/docs/prirucka.docx
@@ -14,18 +14,260 @@
       </w:pPr>
       <w:r>
         <w:rPr>
+          <w:rFonts w:cs="Courier New"/>
+          <w:b/>
+          <w:bCs/>
           <w:noProof/>
+          <w:color w:val="FFFFFF" w:themeColor="background1"/>
+          <w:sz w:val="48"/>
+          <w:szCs w:val="48"/>
         </w:rPr>
         <mc:AlternateContent>
           <mc:Choice Requires="wps">
             <w:drawing>
-              <wp:anchor distT="0" distB="0" distL="114300" distR="114300" simplePos="0" relativeHeight="251799552" behindDoc="0" locked="0" layoutInCell="1" allowOverlap="1" wp14:anchorId="11919415" wp14:editId="5DB9502D">
+              <wp:anchor distT="0" distB="0" distL="114300" distR="114300" simplePos="0" relativeHeight="251791360" behindDoc="1" locked="0" layoutInCell="1" allowOverlap="1" wp14:anchorId="7A8947BC" wp14:editId="2263757C">
+                <wp:simplePos x="0" y="0"/>
+                <wp:positionH relativeFrom="column">
+                  <wp:posOffset>-603885</wp:posOffset>
+                </wp:positionH>
+                <wp:positionV relativeFrom="paragraph">
+                  <wp:posOffset>862965</wp:posOffset>
+                </wp:positionV>
+                <wp:extent cx="5574030" cy="918845"/>
+                <wp:effectExtent l="0" t="0" r="7620" b="0"/>
+                <wp:wrapNone/>
+                <wp:docPr id="1734245166" name="Ovál 48"/>
+                <wp:cNvGraphicFramePr/>
+                <a:graphic xmlns:a="http://schemas.openxmlformats.org/drawingml/2006/main">
+                  <a:graphicData uri="http://schemas.microsoft.com/office/word/2010/wordprocessingShape">
+                    <wps:wsp>
+                      <wps:cNvSpPr/>
+                      <wps:spPr>
+                        <a:xfrm>
+                          <a:off x="0" y="0"/>
+                          <a:ext cx="5574030" cy="918845"/>
+                        </a:xfrm>
+                        <a:prstGeom prst="ellipse">
+                          <a:avLst/>
+                        </a:prstGeom>
+                        <a:ln>
+                          <a:noFill/>
+                        </a:ln>
+                      </wps:spPr>
+                      <wps:style>
+                        <a:lnRef idx="2">
+                          <a:schemeClr val="accent1">
+                            <a:shade val="15000"/>
+                          </a:schemeClr>
+                        </a:lnRef>
+                        <a:fillRef idx="1">
+                          <a:schemeClr val="accent1"/>
+                        </a:fillRef>
+                        <a:effectRef idx="0">
+                          <a:schemeClr val="accent1"/>
+                        </a:effectRef>
+                        <a:fontRef idx="minor">
+                          <a:schemeClr val="lt1"/>
+                        </a:fontRef>
+                      </wps:style>
+                      <wps:bodyPr rot="0" spcFirstLastPara="0" vertOverflow="overflow" horzOverflow="overflow" vert="horz" wrap="square" lIns="91440" tIns="45720" rIns="91440" bIns="45720" numCol="1" spcCol="0" rtlCol="0" fromWordArt="0" anchor="ctr" anchorCtr="0" forceAA="0" compatLnSpc="1">
+                        <a:prstTxWarp prst="textNoShape">
+                          <a:avLst/>
+                        </a:prstTxWarp>
+                        <a:noAutofit/>
+                      </wps:bodyPr>
+                    </wps:wsp>
+                  </a:graphicData>
+                </a:graphic>
+                <wp14:sizeRelH relativeFrom="margin">
+                  <wp14:pctWidth>0</wp14:pctWidth>
+                </wp14:sizeRelH>
+                <wp14:sizeRelV relativeFrom="margin">
+                  <wp14:pctHeight>0</wp14:pctHeight>
+                </wp14:sizeRelV>
+              </wp:anchor>
+            </w:drawing>
+          </mc:Choice>
+          <mc:Fallback>
+            <w:pict>
+              <v:oval w14:anchorId="73FC6AA3" id="Ovál 48" o:spid="_x0000_s1026" style="position:absolute;margin-left:-47.55pt;margin-top:67.95pt;width:438.9pt;height:72.35pt;z-index:-251525120;visibility:visible;mso-wrap-style:square;mso-width-percent:0;mso-height-percent:0;mso-wrap-distance-left:9pt;mso-wrap-distance-top:0;mso-wrap-distance-right:9pt;mso-wrap-distance-bottom:0;mso-position-horizontal:absolute;mso-position-horizontal-relative:text;mso-position-vertical:absolute;mso-position-vertical-relative:text;mso-width-percent:0;mso-height-percent:0;mso-width-relative:margin;mso-height-relative:margin;v-text-anchor:middle" o:gfxdata="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" fillcolor="#a5b592 [3204]" stroked="f" strokeweight="1pt">
+                <v:stroke joinstyle="miter"/>
+              </v:oval>
+            </w:pict>
+          </mc:Fallback>
+        </mc:AlternateContent>
+      </w:r>
+      <w:r>
+        <w:rPr>
+          <w:rFonts w:cs="Courier New"/>
+          <w:b/>
+          <w:bCs/>
+          <w:noProof/>
+          <w:color w:val="FFFFFF" w:themeColor="background1"/>
+          <w:sz w:val="48"/>
+          <w:szCs w:val="48"/>
+        </w:rPr>
+        <mc:AlternateContent>
+          <mc:Choice Requires="wps">
+            <w:drawing>
+              <wp:anchor distT="0" distB="0" distL="114300" distR="114300" simplePos="0" relativeHeight="251790336" behindDoc="1" locked="0" layoutInCell="1" allowOverlap="1" wp14:anchorId="1B561F4B" wp14:editId="041D621E">
+                <wp:simplePos x="0" y="0"/>
+                <wp:positionH relativeFrom="column">
+                  <wp:posOffset>-554990</wp:posOffset>
+                </wp:positionH>
+                <wp:positionV relativeFrom="paragraph">
+                  <wp:posOffset>-1092835</wp:posOffset>
+                </wp:positionV>
+                <wp:extent cx="5474970" cy="2307590"/>
+                <wp:effectExtent l="0" t="0" r="0" b="0"/>
+                <wp:wrapNone/>
+                <wp:docPr id="698458253" name="Obdélník 47"/>
+                <wp:cNvGraphicFramePr/>
+                <a:graphic xmlns:a="http://schemas.openxmlformats.org/drawingml/2006/main">
+                  <a:graphicData uri="http://schemas.microsoft.com/office/word/2010/wordprocessingShape">
+                    <wps:wsp>
+                      <wps:cNvSpPr/>
+                      <wps:spPr>
+                        <a:xfrm>
+                          <a:off x="0" y="0"/>
+                          <a:ext cx="5474970" cy="2307590"/>
+                        </a:xfrm>
+                        <a:prstGeom prst="rect">
+                          <a:avLst/>
+                        </a:prstGeom>
+                        <a:ln>
+                          <a:noFill/>
+                        </a:ln>
+                      </wps:spPr>
+                      <wps:style>
+                        <a:lnRef idx="2">
+                          <a:schemeClr val="accent1">
+                            <a:shade val="15000"/>
+                          </a:schemeClr>
+                        </a:lnRef>
+                        <a:fillRef idx="1">
+                          <a:schemeClr val="accent1"/>
+                        </a:fillRef>
+                        <a:effectRef idx="0">
+                          <a:schemeClr val="accent1"/>
+                        </a:effectRef>
+                        <a:fontRef idx="minor">
+                          <a:schemeClr val="lt1"/>
+                        </a:fontRef>
+                      </wps:style>
+                      <wps:bodyPr rot="0" spcFirstLastPara="0" vertOverflow="overflow" horzOverflow="overflow" vert="horz" wrap="square" lIns="91440" tIns="45720" rIns="91440" bIns="45720" numCol="1" spcCol="0" rtlCol="0" fromWordArt="0" anchor="ctr" anchorCtr="0" forceAA="0" compatLnSpc="1">
+                        <a:prstTxWarp prst="textNoShape">
+                          <a:avLst/>
+                        </a:prstTxWarp>
+                        <a:noAutofit/>
+                      </wps:bodyPr>
+                    </wps:wsp>
+                  </a:graphicData>
+                </a:graphic>
+                <wp14:sizeRelH relativeFrom="margin">
+                  <wp14:pctWidth>0</wp14:pctWidth>
+                </wp14:sizeRelH>
+                <wp14:sizeRelV relativeFrom="margin">
+                  <wp14:pctHeight>0</wp14:pctHeight>
+                </wp14:sizeRelV>
+              </wp:anchor>
+            </w:drawing>
+          </mc:Choice>
+          <mc:Fallback>
+            <w:pict>
+              <v:rect w14:anchorId="2D6B8673" id="Obdélník 47" o:spid="_x0000_s1026" style="position:absolute;margin-left:-43.7pt;margin-top:-86.05pt;width:431.1pt;height:181.7pt;z-index:-251526144;visibility:visible;mso-wrap-style:square;mso-width-percent:0;mso-height-percent:0;mso-wrap-distance-left:9pt;mso-wrap-distance-top:0;mso-wrap-distance-right:9pt;mso-wrap-distance-bottom:0;mso-position-horizontal:absolute;mso-position-horizontal-relative:text;mso-position-vertical:absolute;mso-position-vertical-relative:text;mso-width-percent:0;mso-height-percent:0;mso-width-relative:margin;mso-height-relative:margin;v-text-anchor:middle" o:gfxdata="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" fillcolor="#a5b592 [3204]" stroked="f" strokeweight="1pt"/>
+            </w:pict>
+          </mc:Fallback>
+        </mc:AlternateContent>
+      </w:r>
+      <w:r>
+        <w:rPr>
+          <w:noProof/>
+        </w:rPr>
+        <mc:AlternateContent>
+          <mc:Choice Requires="wps">
+            <w:drawing>
+              <wp:anchor distT="0" distB="0" distL="114300" distR="114300" simplePos="0" relativeHeight="251797504" behindDoc="0" locked="0" layoutInCell="1" allowOverlap="1" wp14:anchorId="214B0A7B" wp14:editId="08BD3B0B">
+                <wp:simplePos x="0" y="0"/>
+                <wp:positionH relativeFrom="column">
+                  <wp:posOffset>-450215</wp:posOffset>
+                </wp:positionH>
+                <wp:positionV relativeFrom="paragraph">
+                  <wp:posOffset>-589280</wp:posOffset>
+                </wp:positionV>
+                <wp:extent cx="2049780" cy="0"/>
+                <wp:effectExtent l="0" t="57150" r="64770" b="76200"/>
+                <wp:wrapNone/>
+                <wp:docPr id="1006947127" name="Přímá spojnice 56"/>
+                <wp:cNvGraphicFramePr/>
+                <a:graphic xmlns:a="http://schemas.openxmlformats.org/drawingml/2006/main">
+                  <a:graphicData uri="http://schemas.microsoft.com/office/word/2010/wordprocessingShape">
+                    <wps:wsp>
+                      <wps:cNvCnPr/>
+                      <wps:spPr>
+                        <a:xfrm>
+                          <a:off x="0" y="0"/>
+                          <a:ext cx="2049780" cy="0"/>
+                        </a:xfrm>
+                        <a:prstGeom prst="line">
+                          <a:avLst/>
+                        </a:prstGeom>
+                        <a:ln w="136525">
+                          <a:solidFill>
+                            <a:schemeClr val="bg1"/>
+                          </a:solidFill>
+                        </a:ln>
+                      </wps:spPr>
+                      <wps:style>
+                        <a:lnRef idx="3">
+                          <a:schemeClr val="dk1"/>
+                        </a:lnRef>
+                        <a:fillRef idx="0">
+                          <a:schemeClr val="dk1"/>
+                        </a:fillRef>
+                        <a:effectRef idx="2">
+                          <a:schemeClr val="dk1"/>
+                        </a:effectRef>
+                        <a:fontRef idx="minor">
+                          <a:schemeClr val="tx1"/>
+                        </a:fontRef>
+                      </wps:style>
+                      <wps:bodyPr/>
+                    </wps:wsp>
+                  </a:graphicData>
+                </a:graphic>
+                <wp14:sizeRelH relativeFrom="margin">
+                  <wp14:pctWidth>0</wp14:pctWidth>
+                </wp14:sizeRelH>
+                <wp14:sizeRelV relativeFrom="margin">
+                  <wp14:pctHeight>0</wp14:pctHeight>
+                </wp14:sizeRelV>
+              </wp:anchor>
+            </w:drawing>
+          </mc:Choice>
+          <mc:Fallback>
+            <w:pict>
+              <v:line w14:anchorId="04FA699E" id="Přímá spojnice 56" o:spid="_x0000_s1026" style="position:absolute;z-index:251797504;visibility:visible;mso-wrap-style:square;mso-width-percent:0;mso-height-percent:0;mso-wrap-distance-left:9pt;mso-wrap-distance-top:0;mso-wrap-distance-right:9pt;mso-wrap-distance-bottom:0;mso-position-horizontal:absolute;mso-position-horizontal-relative:text;mso-position-vertical:absolute;mso-position-vertical-relative:text;mso-width-percent:0;mso-height-percent:0;mso-width-relative:margin;mso-height-relative:margin" from="-35.45pt,-46.4pt" to="125.95pt,-46.4pt" o:gfxdata="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" strokecolor="white [3212]" strokeweight="10.75pt">
+                <v:stroke joinstyle="miter"/>
+              </v:line>
+            </w:pict>
+          </mc:Fallback>
+        </mc:AlternateContent>
+      </w:r>
+      <w:r>
+        <w:rPr>
+          <w:noProof/>
+        </w:rPr>
+        <mc:AlternateContent>
+          <mc:Choice Requires="wps">
+            <w:drawing>
+              <wp:anchor distT="0" distB="0" distL="114300" distR="114300" simplePos="0" relativeHeight="251799552" behindDoc="0" locked="0" layoutInCell="1" allowOverlap="1" wp14:anchorId="11919415" wp14:editId="74A50E70">
                 <wp:simplePos x="0" y="0"/>
                 <wp:positionH relativeFrom="column">
                   <wp:posOffset>2717800</wp:posOffset>
                 </wp:positionH>
                 <wp:positionV relativeFrom="paragraph">
-                  <wp:posOffset>-669290</wp:posOffset>
+                  <wp:posOffset>-598805</wp:posOffset>
                 </wp:positionV>
                 <wp:extent cx="2343785" cy="11430"/>
                 <wp:effectExtent l="0" t="57150" r="56515" b="83820"/>
@@ -79,7 +321,7 @@
           </mc:Choice>
           <mc:Fallback>
             <w:pict>
-              <v:line w14:anchorId="3436B209" id="Přímá spojnice 56" o:spid="_x0000_s1026" style="position:absolute;flip:y;z-index:251799552;visibility:visible;mso-wrap-style:square;mso-width-percent:0;mso-height-percent:0;mso-wrap-distance-left:9pt;mso-wrap-distance-top:0;mso-wrap-distance-right:9pt;mso-wrap-distance-bottom:0;mso-position-horizontal:absolute;mso-position-horizontal-relative:text;mso-position-vertical:absolute;mso-position-vertical-relative:text;mso-width-percent:0;mso-height-percent:0;mso-width-relative:margin;mso-height-relative:margin" from="214pt,-52.7pt" to="398.55pt,-51.8pt" o:gfxdata="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" strokecolor="white [3212]" strokeweight="10.75pt">
+              <v:line w14:anchorId="65243B8C" id="Přímá spojnice 56" o:spid="_x0000_s1026" style="position:absolute;flip:y;z-index:251799552;visibility:visible;mso-wrap-style:square;mso-width-percent:0;mso-height-percent:0;mso-wrap-distance-left:9pt;mso-wrap-distance-top:0;mso-wrap-distance-right:9pt;mso-wrap-distance-bottom:0;mso-position-horizontal:absolute;mso-position-horizontal-relative:text;mso-position-vertical:absolute;mso-position-vertical-relative:text;mso-width-percent:0;mso-height-percent:0;mso-width-relative:margin;mso-height-relative:margin" from="214pt,-47.15pt" to="398.55pt,-46.25pt" o:gfxdata="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" strokecolor="white [3212]" strokeweight="10.75pt">
                 <v:stroke joinstyle="miter"/>
               </v:line>
             </w:pict>
@@ -90,88 +332,14 @@
         <w:rPr>
           <w:noProof/>
         </w:rPr>
-        <mc:AlternateContent>
-          <mc:Choice Requires="wps">
-            <w:drawing>
-              <wp:anchor distT="0" distB="0" distL="114300" distR="114300" simplePos="0" relativeHeight="251797504" behindDoc="0" locked="0" layoutInCell="1" allowOverlap="1" wp14:anchorId="214B0A7B" wp14:editId="7C63970A">
-                <wp:simplePos x="0" y="0"/>
-                <wp:positionH relativeFrom="column">
-                  <wp:posOffset>-450215</wp:posOffset>
-                </wp:positionH>
-                <wp:positionV relativeFrom="paragraph">
-                  <wp:posOffset>-660400</wp:posOffset>
-                </wp:positionV>
-                <wp:extent cx="2049780" cy="0"/>
-                <wp:effectExtent l="0" t="57150" r="64770" b="76200"/>
-                <wp:wrapNone/>
-                <wp:docPr id="1006947127" name="Přímá spojnice 56"/>
-                <wp:cNvGraphicFramePr/>
-                <a:graphic xmlns:a="http://schemas.openxmlformats.org/drawingml/2006/main">
-                  <a:graphicData uri="http://schemas.microsoft.com/office/word/2010/wordprocessingShape">
-                    <wps:wsp>
-                      <wps:cNvCnPr/>
-                      <wps:spPr>
-                        <a:xfrm>
-                          <a:off x="0" y="0"/>
-                          <a:ext cx="2049780" cy="0"/>
-                        </a:xfrm>
-                        <a:prstGeom prst="line">
-                          <a:avLst/>
-                        </a:prstGeom>
-                        <a:ln w="136525">
-                          <a:solidFill>
-                            <a:schemeClr val="bg1"/>
-                          </a:solidFill>
-                        </a:ln>
-                      </wps:spPr>
-                      <wps:style>
-                        <a:lnRef idx="3">
-                          <a:schemeClr val="dk1"/>
-                        </a:lnRef>
-                        <a:fillRef idx="0">
-                          <a:schemeClr val="dk1"/>
-                        </a:fillRef>
-                        <a:effectRef idx="2">
-                          <a:schemeClr val="dk1"/>
-                        </a:effectRef>
-                        <a:fontRef idx="minor">
-                          <a:schemeClr val="tx1"/>
-                        </a:fontRef>
-                      </wps:style>
-                      <wps:bodyPr/>
-                    </wps:wsp>
-                  </a:graphicData>
-                </a:graphic>
-                <wp14:sizeRelH relativeFrom="margin">
-                  <wp14:pctWidth>0</wp14:pctWidth>
-                </wp14:sizeRelH>
-                <wp14:sizeRelV relativeFrom="margin">
-                  <wp14:pctHeight>0</wp14:pctHeight>
-                </wp14:sizeRelV>
-              </wp:anchor>
-            </w:drawing>
-          </mc:Choice>
-          <mc:Fallback>
-            <w:pict>
-              <v:line w14:anchorId="438D39D9" id="Přímá spojnice 56" o:spid="_x0000_s1026" style="position:absolute;z-index:251797504;visibility:visible;mso-wrap-style:square;mso-width-percent:0;mso-height-percent:0;mso-wrap-distance-left:9pt;mso-wrap-distance-top:0;mso-wrap-distance-right:9pt;mso-wrap-distance-bottom:0;mso-position-horizontal:absolute;mso-position-horizontal-relative:text;mso-position-vertical:absolute;mso-position-vertical-relative:text;mso-width-percent:0;mso-height-percent:0;mso-width-relative:margin;mso-height-relative:margin" from="-35.45pt,-52pt" to="125.95pt,-52pt" o:gfxdata="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" strokecolor="white [3212]" strokeweight="10.75pt">
-                <v:stroke joinstyle="miter"/>
-              </v:line>
-            </w:pict>
-          </mc:Fallback>
-        </mc:AlternateContent>
-      </w:r>
-      <w:r>
-        <w:rPr>
-          <w:noProof/>
-        </w:rPr>
         <w:drawing>
-          <wp:anchor distT="0" distB="0" distL="114300" distR="114300" simplePos="0" relativeHeight="251796480" behindDoc="0" locked="0" layoutInCell="1" allowOverlap="1" wp14:anchorId="357E4583" wp14:editId="0191CE8A">
+          <wp:anchor distT="0" distB="0" distL="114300" distR="114300" simplePos="0" relativeHeight="251796480" behindDoc="0" locked="0" layoutInCell="1" allowOverlap="1" wp14:anchorId="357E4583" wp14:editId="2AA1D0CF">
             <wp:simplePos x="0" y="0"/>
             <wp:positionH relativeFrom="column">
               <wp:posOffset>1710690</wp:posOffset>
             </wp:positionH>
             <wp:positionV relativeFrom="paragraph">
-              <wp:posOffset>-966470</wp:posOffset>
+              <wp:posOffset>-863600</wp:posOffset>
             </wp:positionV>
             <wp:extent cx="916940" cy="603250"/>
             <wp:effectExtent l="0" t="0" r="0" b="6350"/>
@@ -247,7 +415,7 @@
         <mc:AlternateContent>
           <mc:Choice Requires="wps">
             <w:drawing>
-              <wp:anchor distT="0" distB="0" distL="114300" distR="114300" simplePos="0" relativeHeight="251788288" behindDoc="0" locked="0" layoutInCell="1" allowOverlap="1" wp14:anchorId="4E3027CD" wp14:editId="1DEE8CEA">
+              <wp:anchor distT="0" distB="0" distL="114300" distR="114300" simplePos="0" relativeHeight="251788288" behindDoc="0" locked="0" layoutInCell="1" allowOverlap="1" wp14:anchorId="4E3027CD" wp14:editId="132C3D47">
                 <wp:simplePos x="0" y="0"/>
                 <wp:positionH relativeFrom="column">
                   <wp:posOffset>-63500</wp:posOffset>
@@ -351,174 +519,6 @@
       </w:r>
       <w:r>
         <w:rPr>
-          <w:rFonts w:cs="Courier New"/>
-          <w:b/>
-          <w:bCs/>
-          <w:noProof/>
-          <w:color w:val="FFFFFF" w:themeColor="background1"/>
-          <w:sz w:val="48"/>
-          <w:szCs w:val="48"/>
-        </w:rPr>
-        <mc:AlternateContent>
-          <mc:Choice Requires="wps">
-            <w:drawing>
-              <wp:anchor distT="0" distB="0" distL="114300" distR="114300" simplePos="0" relativeHeight="251791360" behindDoc="1" locked="0" layoutInCell="1" allowOverlap="1" wp14:anchorId="7A8947BC" wp14:editId="54D83A7E">
-                <wp:simplePos x="0" y="0"/>
-                <wp:positionH relativeFrom="column">
-                  <wp:posOffset>-557530</wp:posOffset>
-                </wp:positionH>
-                <wp:positionV relativeFrom="paragraph">
-                  <wp:posOffset>471805</wp:posOffset>
-                </wp:positionV>
-                <wp:extent cx="5574030" cy="880745"/>
-                <wp:effectExtent l="0" t="0" r="7620" b="0"/>
-                <wp:wrapNone/>
-                <wp:docPr id="1734245166" name="Ovál 48"/>
-                <wp:cNvGraphicFramePr/>
-                <a:graphic xmlns:a="http://schemas.openxmlformats.org/drawingml/2006/main">
-                  <a:graphicData uri="http://schemas.microsoft.com/office/word/2010/wordprocessingShape">
-                    <wps:wsp>
-                      <wps:cNvSpPr/>
-                      <wps:spPr>
-                        <a:xfrm>
-                          <a:off x="0" y="0"/>
-                          <a:ext cx="5574030" cy="880745"/>
-                        </a:xfrm>
-                        <a:prstGeom prst="ellipse">
-                          <a:avLst/>
-                        </a:prstGeom>
-                        <a:ln>
-                          <a:noFill/>
-                        </a:ln>
-                      </wps:spPr>
-                      <wps:style>
-                        <a:lnRef idx="2">
-                          <a:schemeClr val="accent1">
-                            <a:shade val="15000"/>
-                          </a:schemeClr>
-                        </a:lnRef>
-                        <a:fillRef idx="1">
-                          <a:schemeClr val="accent1"/>
-                        </a:fillRef>
-                        <a:effectRef idx="0">
-                          <a:schemeClr val="accent1"/>
-                        </a:effectRef>
-                        <a:fontRef idx="minor">
-                          <a:schemeClr val="lt1"/>
-                        </a:fontRef>
-                      </wps:style>
-                      <wps:bodyPr rot="0" spcFirstLastPara="0" vertOverflow="overflow" horzOverflow="overflow" vert="horz" wrap="square" lIns="91440" tIns="45720" rIns="91440" bIns="45720" numCol="1" spcCol="0" rtlCol="0" fromWordArt="0" anchor="ctr" anchorCtr="0" forceAA="0" compatLnSpc="1">
-                        <a:prstTxWarp prst="textNoShape">
-                          <a:avLst/>
-                        </a:prstTxWarp>
-                        <a:noAutofit/>
-                      </wps:bodyPr>
-                    </wps:wsp>
-                  </a:graphicData>
-                </a:graphic>
-                <wp14:sizeRelH relativeFrom="margin">
-                  <wp14:pctWidth>0</wp14:pctWidth>
-                </wp14:sizeRelH>
-                <wp14:sizeRelV relativeFrom="margin">
-                  <wp14:pctHeight>0</wp14:pctHeight>
-                </wp14:sizeRelV>
-              </wp:anchor>
-            </w:drawing>
-          </mc:Choice>
-          <mc:Fallback>
-            <w:pict>
-              <v:oval w14:anchorId="77D416CD" id="Ovál 48" o:spid="_x0000_s1026" style="position:absolute;margin-left:-43.9pt;margin-top:37.15pt;width:438.9pt;height:69.35pt;z-index:-251525120;visibility:visible;mso-wrap-style:square;mso-width-percent:0;mso-height-percent:0;mso-wrap-distance-left:9pt;mso-wrap-distance-top:0;mso-wrap-distance-right:9pt;mso-wrap-distance-bottom:0;mso-position-horizontal:absolute;mso-position-horizontal-relative:text;mso-position-vertical:absolute;mso-position-vertical-relative:text;mso-width-percent:0;mso-height-percent:0;mso-width-relative:margin;mso-height-relative:margin;v-text-anchor:middle" o:gfxdata="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" fillcolor="#a5b592 [3204]" stroked="f" strokeweight="1pt">
-                <v:stroke joinstyle="miter"/>
-              </v:oval>
-            </w:pict>
-          </mc:Fallback>
-        </mc:AlternateContent>
-      </w:r>
-      <w:r>
-        <w:rPr>
-          <w:rFonts w:cs="Courier New"/>
-          <w:b/>
-          <w:bCs/>
-          <w:noProof/>
-          <w:color w:val="FFFFFF" w:themeColor="background1"/>
-          <w:sz w:val="48"/>
-          <w:szCs w:val="48"/>
-        </w:rPr>
-        <mc:AlternateContent>
-          <mc:Choice Requires="wps">
-            <w:drawing>
-              <wp:anchor distT="0" distB="0" distL="114300" distR="114300" simplePos="0" relativeHeight="251790336" behindDoc="1" locked="0" layoutInCell="1" allowOverlap="1" wp14:anchorId="1B561F4B" wp14:editId="5F9B3392">
-                <wp:simplePos x="0" y="0"/>
-                <wp:positionH relativeFrom="column">
-                  <wp:posOffset>-560705</wp:posOffset>
-                </wp:positionH>
-                <wp:positionV relativeFrom="paragraph">
-                  <wp:posOffset>-1525905</wp:posOffset>
-                </wp:positionV>
-                <wp:extent cx="5474970" cy="2307590"/>
-                <wp:effectExtent l="0" t="0" r="0" b="0"/>
-                <wp:wrapNone/>
-                <wp:docPr id="698458253" name="Obdélník 47"/>
-                <wp:cNvGraphicFramePr/>
-                <a:graphic xmlns:a="http://schemas.openxmlformats.org/drawingml/2006/main">
-                  <a:graphicData uri="http://schemas.microsoft.com/office/word/2010/wordprocessingShape">
-                    <wps:wsp>
-                      <wps:cNvSpPr/>
-                      <wps:spPr>
-                        <a:xfrm>
-                          <a:off x="0" y="0"/>
-                          <a:ext cx="5474970" cy="2307590"/>
-                        </a:xfrm>
-                        <a:prstGeom prst="rect">
-                          <a:avLst/>
-                        </a:prstGeom>
-                        <a:ln>
-                          <a:noFill/>
-                        </a:ln>
-                      </wps:spPr>
-                      <wps:style>
-                        <a:lnRef idx="2">
-                          <a:schemeClr val="accent1">
-                            <a:shade val="15000"/>
-                          </a:schemeClr>
-                        </a:lnRef>
-                        <a:fillRef idx="1">
-                          <a:schemeClr val="accent1"/>
-                        </a:fillRef>
-                        <a:effectRef idx="0">
-                          <a:schemeClr val="accent1"/>
-                        </a:effectRef>
-                        <a:fontRef idx="minor">
-                          <a:schemeClr val="lt1"/>
-                        </a:fontRef>
-                      </wps:style>
-                      <wps:bodyPr rot="0" spcFirstLastPara="0" vertOverflow="overflow" horzOverflow="overflow" vert="horz" wrap="square" lIns="91440" tIns="45720" rIns="91440" bIns="45720" numCol="1" spcCol="0" rtlCol="0" fromWordArt="0" anchor="ctr" anchorCtr="0" forceAA="0" compatLnSpc="1">
-                        <a:prstTxWarp prst="textNoShape">
-                          <a:avLst/>
-                        </a:prstTxWarp>
-                        <a:noAutofit/>
-                      </wps:bodyPr>
-                    </wps:wsp>
-                  </a:graphicData>
-                </a:graphic>
-                <wp14:sizeRelH relativeFrom="margin">
-                  <wp14:pctWidth>0</wp14:pctWidth>
-                </wp14:sizeRelH>
-                <wp14:sizeRelV relativeFrom="margin">
-                  <wp14:pctHeight>0</wp14:pctHeight>
-                </wp14:sizeRelV>
-              </wp:anchor>
-            </w:drawing>
-          </mc:Choice>
-          <mc:Fallback>
-            <w:pict>
-              <v:rect w14:anchorId="7C1E7BD2" id="Obdélník 47" o:spid="_x0000_s1026" style="position:absolute;margin-left:-44.15pt;margin-top:-120.15pt;width:431.1pt;height:181.7pt;z-index:-251526144;visibility:visible;mso-wrap-style:square;mso-width-percent:0;mso-height-percent:0;mso-wrap-distance-left:9pt;mso-wrap-distance-top:0;mso-wrap-distance-right:9pt;mso-wrap-distance-bottom:0;mso-position-horizontal:absolute;mso-position-horizontal-relative:text;mso-position-vertical:absolute;mso-position-vertical-relative:text;mso-width-percent:0;mso-height-percent:0;mso-width-relative:margin;mso-height-relative:margin;v-text-anchor:middle" o:gfxdata="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" fillcolor="#a5b592 [3204]" stroked="f" strokeweight="1pt"/>
-            </w:pict>
-          </mc:Fallback>
-        </mc:AlternateContent>
-      </w:r>
-      <w:r>
-        <w:rPr>
           <w:rFonts w:ascii="Britannic Bold" w:hAnsi="Britannic Bold" w:cs="Courier New"/>
           <w:b/>
           <w:bCs/>
@@ -556,6 +556,19 @@
         </w:rPr>
         <w:t>50</w:t>
       </w:r>
+    </w:p>
+    <w:p>
+      <w:pPr>
+        <w:jc w:val="center"/>
+        <w:rPr>
+          <w:rFonts w:ascii="Britannic Bold" w:hAnsi="Britannic Bold" w:cs="Courier New"/>
+          <w:i/>
+          <w:iCs/>
+          <w:noProof/>
+          <w:sz w:val="72"/>
+          <w:szCs w:val="72"/>
+        </w:rPr>
+      </w:pPr>
     </w:p>
     <w:p>
       <w:pPr>
@@ -594,8 +607,8 @@
           <w:szCs w:val="72"/>
         </w:rPr>
         <w:drawing>
-          <wp:inline distT="0" distB="0" distL="0" distR="0" wp14:anchorId="0EB02733" wp14:editId="242A301A">
-            <wp:extent cx="4443670" cy="2522083"/>
+          <wp:inline distT="0" distB="0" distL="0" distR="0" wp14:anchorId="0EB02733" wp14:editId="3A02882E">
+            <wp:extent cx="4442793" cy="2401842"/>
             <wp:effectExtent l="0" t="0" r="0" b="0"/>
             <wp:docPr id="1425507803" name="Obrázek 51"/>
             <wp:cNvGraphicFramePr>
@@ -610,7 +623,7 @@
                       <a:picLocks noChangeAspect="1" noChangeArrowheads="1"/>
                     </pic:cNvPicPr>
                   </pic:nvPicPr>
-                  <pic:blipFill>
+                  <pic:blipFill rotWithShape="1">
                     <a:blip r:embed="rId11" cstate="print">
                       <a:extLst>
                         <a:ext uri="{28A0092B-C50C-407E-A947-70E740481C1C}">
@@ -618,7 +631,7 @@
                         </a:ext>
                       </a:extLst>
                     </a:blip>
-                    <a:srcRect/>
+                    <a:srcRect t="4749"/>
                     <a:stretch>
                       <a:fillRect/>
                     </a:stretch>
@@ -626,12 +639,20 @@
                   <pic:spPr bwMode="auto">
                     <a:xfrm>
                       <a:off x="0" y="0"/>
-                      <a:ext cx="4686022" cy="2659634"/>
+                      <a:ext cx="4686022" cy="2533335"/>
                     </a:xfrm>
                     <a:prstGeom prst="rect">
                       <a:avLst/>
                     </a:prstGeom>
                     <a:noFill/>
+                    <a:ln>
+                      <a:noFill/>
+                    </a:ln>
+                    <a:extLst>
+                      <a:ext uri="{53640926-AAD7-44D8-BBD7-CCE9431645EC}">
+                        <a14:shadowObscured xmlns:a14="http://schemas.microsoft.com/office/drawing/2010/main"/>
+                      </a:ext>
+                    </a:extLst>
                   </pic:spPr>
                 </pic:pic>
               </a:graphicData>
@@ -767,7 +788,7 @@
             </w:rPr>
             <w:fldChar w:fldCharType="separate"/>
           </w:r>
-          <w:hyperlink w:anchor="_Toc230111762" w:history="1">
+          <w:hyperlink w:anchor="_Toc230184616" w:history="1">
             <w:r>
               <w:rPr>
                 <w:rStyle w:val="Hypertextovodkaz"/>
@@ -794,7 +815,7 @@
                 <w:noProof/>
                 <w:webHidden/>
               </w:rPr>
-              <w:instrText xml:space="preserve"> PAGEREF _Toc230111762 \h </w:instrText>
+              <w:instrText xml:space="preserve"> PAGEREF _Toc230184616 \h </w:instrText>
             </w:r>
             <w:r>
               <w:rPr>
@@ -837,7 +858,7 @@
               <w:lang w:eastAsia="sk-SK"/>
             </w:rPr>
           </w:pPr>
-          <w:hyperlink w:anchor="_Toc230111763" w:history="1">
+          <w:hyperlink w:anchor="_Toc230184617" w:history="1">
             <w:r>
               <w:rPr>
                 <w:rStyle w:val="Hypertextovodkaz"/>
@@ -874,7 +895,7 @@
                 <w:noProof/>
                 <w:webHidden/>
               </w:rPr>
-              <w:instrText xml:space="preserve"> PAGEREF _Toc230111763 \h </w:instrText>
+              <w:instrText xml:space="preserve"> PAGEREF _Toc230184617 \h </w:instrText>
             </w:r>
             <w:r>
               <w:rPr>
@@ -917,7 +938,7 @@
               <w:lang w:eastAsia="sk-SK"/>
             </w:rPr>
           </w:pPr>
-          <w:hyperlink w:anchor="_Toc230111764" w:history="1">
+          <w:hyperlink w:anchor="_Toc230184618" w:history="1">
             <w:r>
               <w:rPr>
                 <w:rStyle w:val="Hypertextovodkaz"/>
@@ -962,7 +983,7 @@
                 <w:noProof/>
                 <w:webHidden/>
               </w:rPr>
-              <w:instrText xml:space="preserve"> PAGEREF _Toc230111764 \h </w:instrText>
+              <w:instrText xml:space="preserve"> PAGEREF _Toc230184618 \h </w:instrText>
             </w:r>
             <w:r>
               <w:rPr>
@@ -1005,7 +1026,7 @@
               <w:lang w:eastAsia="sk-SK"/>
             </w:rPr>
           </w:pPr>
-          <w:hyperlink w:anchor="_Toc230111765" w:history="1">
+          <w:hyperlink w:anchor="_Toc230184619" w:history="1">
             <w:r>
               <w:rPr>
                 <w:rStyle w:val="Hypertextovodkaz"/>
@@ -1035,7 +1056,7 @@
                 <w:noProof/>
                 <w:webHidden/>
               </w:rPr>
-              <w:instrText xml:space="preserve"> PAGEREF _Toc230111765 \h </w:instrText>
+              <w:instrText xml:space="preserve"> PAGEREF _Toc230184619 \h </w:instrText>
             </w:r>
             <w:r>
               <w:rPr>
@@ -1078,7 +1099,7 @@
               <w:lang w:eastAsia="sk-SK"/>
             </w:rPr>
           </w:pPr>
-          <w:hyperlink w:anchor="_Toc230111766" w:history="1">
+          <w:hyperlink w:anchor="_Toc230184620" w:history="1">
             <w:r>
               <w:rPr>
                 <w:rStyle w:val="Hypertextovodkaz"/>
@@ -1105,7 +1126,7 @@
                 <w:noProof/>
                 <w:webHidden/>
               </w:rPr>
-              <w:instrText xml:space="preserve"> PAGEREF _Toc230111766 \h </w:instrText>
+              <w:instrText xml:space="preserve"> PAGEREF _Toc230184620 \h </w:instrText>
             </w:r>
             <w:r>
               <w:rPr>
@@ -1148,7 +1169,7 @@
               <w:lang w:eastAsia="sk-SK"/>
             </w:rPr>
           </w:pPr>
-          <w:hyperlink w:anchor="_Toc230111767" w:history="1">
+          <w:hyperlink w:anchor="_Toc230184621" w:history="1">
             <w:r>
               <w:rPr>
                 <w:rStyle w:val="Hypertextovodkaz"/>
@@ -1175,7 +1196,7 @@
                 <w:noProof/>
                 <w:webHidden/>
               </w:rPr>
-              <w:instrText xml:space="preserve"> PAGEREF _Toc230111767 \h </w:instrText>
+              <w:instrText xml:space="preserve"> PAGEREF _Toc230184621 \h </w:instrText>
             </w:r>
             <w:r>
               <w:rPr>
@@ -1218,7 +1239,7 @@
               <w:lang w:eastAsia="sk-SK"/>
             </w:rPr>
           </w:pPr>
-          <w:hyperlink w:anchor="_Toc230111768" w:history="1">
+          <w:hyperlink w:anchor="_Toc230184622" w:history="1">
             <w:r>
               <w:rPr>
                 <w:rStyle w:val="Hypertextovodkaz"/>
@@ -1245,7 +1266,7 @@
                 <w:noProof/>
                 <w:webHidden/>
               </w:rPr>
-              <w:instrText xml:space="preserve"> PAGEREF _Toc230111768 \h </w:instrText>
+              <w:instrText xml:space="preserve"> PAGEREF _Toc230184622 \h </w:instrText>
             </w:r>
             <w:r>
               <w:rPr>
@@ -1288,13 +1309,21 @@
               <w:lang w:eastAsia="sk-SK"/>
             </w:rPr>
           </w:pPr>
-          <w:hyperlink w:anchor="_Toc230111769" w:history="1">
+          <w:hyperlink w:anchor="_Toc230184623" w:history="1">
             <w:r>
               <w:rPr>
                 <w:rStyle w:val="Hypertextovodkaz"/>
-                <w:noProof/>
-              </w:rPr>
-              <w:t>Nastavovanie jasu displeja</w:t>
+                <w:bCs/>
+                <w:noProof/>
+              </w:rPr>
+              <w:t>Poznámka:</w:t>
+            </w:r>
+            <w:r>
+              <w:rPr>
+                <w:rStyle w:val="Hypertextovodkaz"/>
+                <w:noProof/>
+              </w:rPr>
+              <w:t xml:space="preserve"> Hodnota v zátvorke je predvolená (výrobné nastavenie).</w:t>
             </w:r>
             <w:r>
               <w:rPr>
@@ -1315,7 +1344,7 @@
                 <w:noProof/>
                 <w:webHidden/>
               </w:rPr>
-              <w:instrText xml:space="preserve"> PAGEREF _Toc230111769 \h </w:instrText>
+              <w:instrText xml:space="preserve"> PAGEREF _Toc230184623 \h </w:instrText>
             </w:r>
             <w:r>
               <w:rPr>
@@ -1358,13 +1387,13 @@
               <w:lang w:eastAsia="sk-SK"/>
             </w:rPr>
           </w:pPr>
-          <w:hyperlink w:anchor="_Toc230111770" w:history="1">
+          <w:hyperlink w:anchor="_Toc230184624" w:history="1">
             <w:r>
               <w:rPr>
                 <w:rStyle w:val="Hypertextovodkaz"/>
                 <w:noProof/>
               </w:rPr>
-              <w:t>Zobrazovanie dátumu a teploty</w:t>
+              <w:t>Nastavovanie jasu displeja</w:t>
             </w:r>
             <w:r>
               <w:rPr>
@@ -1385,7 +1414,7 @@
                 <w:noProof/>
                 <w:webHidden/>
               </w:rPr>
-              <w:instrText xml:space="preserve"> PAGEREF _Toc230111770 \h </w:instrText>
+              <w:instrText xml:space="preserve"> PAGEREF _Toc230184624 \h </w:instrText>
             </w:r>
             <w:r>
               <w:rPr>
@@ -1428,13 +1457,13 @@
               <w:lang w:eastAsia="sk-SK"/>
             </w:rPr>
           </w:pPr>
-          <w:hyperlink w:anchor="_Toc230111771" w:history="1">
+          <w:hyperlink w:anchor="_Toc230184625" w:history="1">
             <w:r>
               <w:rPr>
                 <w:rStyle w:val="Hypertextovodkaz"/>
                 <w:noProof/>
               </w:rPr>
-              <w:t>Základné komponenty hodín</w:t>
+              <w:t>Zobrazovanie dátumu a teploty</w:t>
             </w:r>
             <w:r>
               <w:rPr>
@@ -1455,7 +1484,7 @@
                 <w:noProof/>
                 <w:webHidden/>
               </w:rPr>
-              <w:instrText xml:space="preserve"> PAGEREF _Toc230111771 \h </w:instrText>
+              <w:instrText xml:space="preserve"> PAGEREF _Toc230184625 \h </w:instrText>
             </w:r>
             <w:r>
               <w:rPr>
@@ -1475,7 +1504,7 @@
                 <w:noProof/>
                 <w:webHidden/>
               </w:rPr>
-              <w:t>10</w:t>
+              <w:t>9</w:t>
             </w:r>
             <w:r>
               <w:rPr>
@@ -1498,13 +1527,13 @@
               <w:lang w:eastAsia="sk-SK"/>
             </w:rPr>
           </w:pPr>
-          <w:hyperlink w:anchor="_Toc230111772" w:history="1">
+          <w:hyperlink w:anchor="_Toc230184626" w:history="1">
             <w:r>
               <w:rPr>
                 <w:rStyle w:val="Hypertextovodkaz"/>
                 <w:noProof/>
               </w:rPr>
-              <w:t>1. Poistka</w:t>
+              <w:t>Základné komponenty hodín</w:t>
             </w:r>
             <w:r>
               <w:rPr>
@@ -1525,7 +1554,7 @@
                 <w:noProof/>
                 <w:webHidden/>
               </w:rPr>
-              <w:instrText xml:space="preserve"> PAGEREF _Toc230111772 \h </w:instrText>
+              <w:instrText xml:space="preserve"> PAGEREF _Toc230184626 \h </w:instrText>
             </w:r>
             <w:r>
               <w:rPr>
@@ -1568,13 +1597,13 @@
               <w:lang w:eastAsia="sk-SK"/>
             </w:rPr>
           </w:pPr>
-          <w:hyperlink w:anchor="_Toc230111773" w:history="1">
+          <w:hyperlink w:anchor="_Toc230184627" w:history="1">
             <w:r>
               <w:rPr>
                 <w:rStyle w:val="Hypertextovodkaz"/>
                 <w:noProof/>
               </w:rPr>
-              <w:t>2. Napájanie</w:t>
+              <w:t>1. Poistka</w:t>
             </w:r>
             <w:r>
               <w:rPr>
@@ -1595,7 +1624,7 @@
                 <w:noProof/>
                 <w:webHidden/>
               </w:rPr>
-              <w:instrText xml:space="preserve"> PAGEREF _Toc230111773 \h </w:instrText>
+              <w:instrText xml:space="preserve"> PAGEREF _Toc230184627 \h </w:instrText>
             </w:r>
             <w:r>
               <w:rPr>
@@ -1638,13 +1667,13 @@
               <w:lang w:eastAsia="sk-SK"/>
             </w:rPr>
           </w:pPr>
-          <w:hyperlink w:anchor="_Toc230111774" w:history="1">
+          <w:hyperlink w:anchor="_Toc230184628" w:history="1">
             <w:r>
               <w:rPr>
                 <w:rStyle w:val="Hypertextovodkaz"/>
                 <w:noProof/>
               </w:rPr>
-              <w:t>3. QR-kód s odkazom na web</w:t>
+              <w:t>2. Napájanie</w:t>
             </w:r>
             <w:r>
               <w:rPr>
@@ -1665,7 +1694,7 @@
                 <w:noProof/>
                 <w:webHidden/>
               </w:rPr>
-              <w:instrText xml:space="preserve"> PAGEREF _Toc230111774 \h </w:instrText>
+              <w:instrText xml:space="preserve"> PAGEREF _Toc230184628 \h </w:instrText>
             </w:r>
             <w:r>
               <w:rPr>
@@ -1708,13 +1737,13 @@
               <w:lang w:eastAsia="sk-SK"/>
             </w:rPr>
           </w:pPr>
-          <w:hyperlink w:anchor="_Toc230111775" w:history="1">
+          <w:hyperlink w:anchor="_Toc230184629" w:history="1">
             <w:r>
               <w:rPr>
                 <w:rStyle w:val="Hypertextovodkaz"/>
                 <w:noProof/>
               </w:rPr>
-              <w:t>4. Trimmer nastavujúci úroveň napätia DCF77 prijímača</w:t>
+              <w:t>3. QR-kód s odkazom na web</w:t>
             </w:r>
             <w:r>
               <w:rPr>
@@ -1735,7 +1764,7 @@
                 <w:noProof/>
                 <w:webHidden/>
               </w:rPr>
-              <w:instrText xml:space="preserve"> PAGEREF _Toc230111775 \h </w:instrText>
+              <w:instrText xml:space="preserve"> PAGEREF _Toc230184629 \h </w:instrText>
             </w:r>
             <w:r>
               <w:rPr>
@@ -1755,7 +1784,7 @@
                 <w:noProof/>
                 <w:webHidden/>
               </w:rPr>
-              <w:t>11</w:t>
+              <w:t>10</w:t>
             </w:r>
             <w:r>
               <w:rPr>
@@ -1778,13 +1807,13 @@
               <w:lang w:eastAsia="sk-SK"/>
             </w:rPr>
           </w:pPr>
-          <w:hyperlink w:anchor="_Toc230111776" w:history="1">
+          <w:hyperlink w:anchor="_Toc230184630" w:history="1">
             <w:r>
               <w:rPr>
                 <w:rStyle w:val="Hypertextovodkaz"/>
                 <w:noProof/>
               </w:rPr>
-              <w:t>5. Prepojka nastavujúca napäťový zdroj DCF77 prijímača</w:t>
+              <w:t>4. Trimmer nastavujúci úroveň napätia DCF77 prijímača</w:t>
             </w:r>
             <w:r>
               <w:rPr>
@@ -1805,7 +1834,7 @@
                 <w:noProof/>
                 <w:webHidden/>
               </w:rPr>
-              <w:instrText xml:space="preserve"> PAGEREF _Toc230111776 \h </w:instrText>
+              <w:instrText xml:space="preserve"> PAGEREF _Toc230184630 \h </w:instrText>
             </w:r>
             <w:r>
               <w:rPr>
@@ -1848,13 +1877,13 @@
               <w:lang w:eastAsia="sk-SK"/>
             </w:rPr>
           </w:pPr>
-          <w:hyperlink w:anchor="_Toc230111777" w:history="1">
+          <w:hyperlink w:anchor="_Toc230184631" w:history="1">
             <w:r>
               <w:rPr>
                 <w:rStyle w:val="Hypertextovodkaz"/>
                 <w:noProof/>
               </w:rPr>
-              <w:t>6. Svetelný senzor pre automatické prispôsobenie jasu</w:t>
+              <w:t>5. Prepojka nastavujúca napäťový zdroj DCF77 prijímača</w:t>
             </w:r>
             <w:r>
               <w:rPr>
@@ -1875,7 +1904,7 @@
                 <w:noProof/>
                 <w:webHidden/>
               </w:rPr>
-              <w:instrText xml:space="preserve"> PAGEREF _Toc230111777 \h </w:instrText>
+              <w:instrText xml:space="preserve"> PAGEREF _Toc230184631 \h </w:instrText>
             </w:r>
             <w:r>
               <w:rPr>
@@ -1918,13 +1947,13 @@
               <w:lang w:eastAsia="sk-SK"/>
             </w:rPr>
           </w:pPr>
-          <w:hyperlink w:anchor="_Toc230111778" w:history="1">
+          <w:hyperlink w:anchor="_Toc230184632" w:history="1">
             <w:r>
               <w:rPr>
                 <w:rStyle w:val="Hypertextovodkaz"/>
                 <w:noProof/>
               </w:rPr>
-              <w:t>7. Senzor prúdového odberu hodín</w:t>
+              <w:t>6. Svetelný senzor pre automatické prispôsobenie jasu</w:t>
             </w:r>
             <w:r>
               <w:rPr>
@@ -1945,7 +1974,7 @@
                 <w:noProof/>
                 <w:webHidden/>
               </w:rPr>
-              <w:instrText xml:space="preserve"> PAGEREF _Toc230111778 \h </w:instrText>
+              <w:instrText xml:space="preserve"> PAGEREF _Toc230184632 \h </w:instrText>
             </w:r>
             <w:r>
               <w:rPr>
@@ -1988,13 +2017,13 @@
               <w:lang w:eastAsia="sk-SK"/>
             </w:rPr>
           </w:pPr>
-          <w:hyperlink w:anchor="_Toc230111779" w:history="1">
+          <w:hyperlink w:anchor="_Toc230184633" w:history="1">
             <w:r>
               <w:rPr>
                 <w:rStyle w:val="Hypertextovodkaz"/>
                 <w:noProof/>
               </w:rPr>
-              <w:t>8. Tlačidlo RESET</w:t>
+              <w:t>7. Senzor prúdového odberu displeja</w:t>
             </w:r>
             <w:r>
               <w:rPr>
@@ -2015,7 +2044,7 @@
                 <w:noProof/>
                 <w:webHidden/>
               </w:rPr>
-              <w:instrText xml:space="preserve"> PAGEREF _Toc230111779 \h </w:instrText>
+              <w:instrText xml:space="preserve"> PAGEREF _Toc230184633 \h </w:instrText>
             </w:r>
             <w:r>
               <w:rPr>
@@ -2035,7 +2064,7 @@
                 <w:noProof/>
                 <w:webHidden/>
               </w:rPr>
-              <w:t>12</w:t>
+              <w:t>11</w:t>
             </w:r>
             <w:r>
               <w:rPr>
@@ -2058,13 +2087,13 @@
               <w:lang w:eastAsia="sk-SK"/>
             </w:rPr>
           </w:pPr>
-          <w:hyperlink w:anchor="_Toc230111780" w:history="1">
+          <w:hyperlink w:anchor="_Toc230184634" w:history="1">
             <w:r>
               <w:rPr>
                 <w:rStyle w:val="Hypertextovodkaz"/>
                 <w:noProof/>
               </w:rPr>
-              <w:t>9. Mikrokontrolér</w:t>
+              <w:t>8. Tlačidlo RESET</w:t>
             </w:r>
             <w:r>
               <w:rPr>
@@ -2085,7 +2114,7 @@
                 <w:noProof/>
                 <w:webHidden/>
               </w:rPr>
-              <w:instrText xml:space="preserve"> PAGEREF _Toc230111780 \h </w:instrText>
+              <w:instrText xml:space="preserve"> PAGEREF _Toc230184634 \h </w:instrText>
             </w:r>
             <w:r>
               <w:rPr>
@@ -2128,13 +2157,13 @@
               <w:lang w:eastAsia="sk-SK"/>
             </w:rPr>
           </w:pPr>
-          <w:hyperlink w:anchor="_Toc230111781" w:history="1">
+          <w:hyperlink w:anchor="_Toc230184635" w:history="1">
             <w:r>
               <w:rPr>
                 <w:rStyle w:val="Hypertextovodkaz"/>
                 <w:noProof/>
               </w:rPr>
-              <w:t>10. Záložná batéria</w:t>
+              <w:t>9. Mikrokontrolér</w:t>
             </w:r>
             <w:r>
               <w:rPr>
@@ -2155,7 +2184,7 @@
                 <w:noProof/>
                 <w:webHidden/>
               </w:rPr>
-              <w:instrText xml:space="preserve"> PAGEREF _Toc230111781 \h </w:instrText>
+              <w:instrText xml:space="preserve"> PAGEREF _Toc230184635 \h </w:instrText>
             </w:r>
             <w:r>
               <w:rPr>
@@ -2198,12 +2227,292 @@
               <w:lang w:eastAsia="sk-SK"/>
             </w:rPr>
           </w:pPr>
-          <w:hyperlink w:anchor="_Toc230111782" w:history="1">
+          <w:hyperlink w:anchor="_Toc230184636" w:history="1">
             <w:r>
               <w:rPr>
                 <w:rStyle w:val="Hypertextovodkaz"/>
                 <w:noProof/>
               </w:rPr>
+              <w:t>10. Záložná batéria</w:t>
+            </w:r>
+            <w:r>
+              <w:rPr>
+                <w:noProof/>
+                <w:webHidden/>
+              </w:rPr>
+              <w:tab/>
+            </w:r>
+            <w:r>
+              <w:rPr>
+                <w:noProof/>
+                <w:webHidden/>
+              </w:rPr>
+              <w:fldChar w:fldCharType="begin"/>
+            </w:r>
+            <w:r>
+              <w:rPr>
+                <w:noProof/>
+                <w:webHidden/>
+              </w:rPr>
+              <w:instrText xml:space="preserve"> PAGEREF _Toc230184636 \h </w:instrText>
+            </w:r>
+            <w:r>
+              <w:rPr>
+                <w:noProof/>
+                <w:webHidden/>
+              </w:rPr>
+            </w:r>
+            <w:r>
+              <w:rPr>
+                <w:noProof/>
+                <w:webHidden/>
+              </w:rPr>
+              <w:fldChar w:fldCharType="separate"/>
+            </w:r>
+            <w:r>
+              <w:rPr>
+                <w:noProof/>
+                <w:webHidden/>
+              </w:rPr>
+              <w:t>12</w:t>
+            </w:r>
+            <w:r>
+              <w:rPr>
+                <w:noProof/>
+                <w:webHidden/>
+              </w:rPr>
+              <w:fldChar w:fldCharType="end"/>
+            </w:r>
+          </w:hyperlink>
+        </w:p>
+        <w:p>
+          <w:pPr>
+            <w:pStyle w:val="Obsah2"/>
+            <w:tabs>
+              <w:tab w:val="right" w:leader="dot" w:pos="6969"/>
+            </w:tabs>
+            <w:rPr>
+              <w:rFonts w:asciiTheme="minorHAnsi" w:eastAsiaTheme="minorEastAsia" w:hAnsiTheme="minorHAnsi"/>
+              <w:noProof/>
+              <w:lang w:eastAsia="sk-SK"/>
+            </w:rPr>
+          </w:pPr>
+          <w:hyperlink w:anchor="_Toc230184637" w:history="1">
+            <w:r>
+              <w:rPr>
+                <w:rStyle w:val="Hypertextovodkaz"/>
+                <w:noProof/>
+              </w:rPr>
+              <w:t>11. UART zbernica</w:t>
+            </w:r>
+            <w:r>
+              <w:rPr>
+                <w:noProof/>
+                <w:webHidden/>
+              </w:rPr>
+              <w:tab/>
+            </w:r>
+            <w:r>
+              <w:rPr>
+                <w:noProof/>
+                <w:webHidden/>
+              </w:rPr>
+              <w:fldChar w:fldCharType="begin"/>
+            </w:r>
+            <w:r>
+              <w:rPr>
+                <w:noProof/>
+                <w:webHidden/>
+              </w:rPr>
+              <w:instrText xml:space="preserve"> PAGEREF _Toc230184637 \h </w:instrText>
+            </w:r>
+            <w:r>
+              <w:rPr>
+                <w:noProof/>
+                <w:webHidden/>
+              </w:rPr>
+            </w:r>
+            <w:r>
+              <w:rPr>
+                <w:noProof/>
+                <w:webHidden/>
+              </w:rPr>
+              <w:fldChar w:fldCharType="separate"/>
+            </w:r>
+            <w:r>
+              <w:rPr>
+                <w:noProof/>
+                <w:webHidden/>
+              </w:rPr>
+              <w:t>12</w:t>
+            </w:r>
+            <w:r>
+              <w:rPr>
+                <w:noProof/>
+                <w:webHidden/>
+              </w:rPr>
+              <w:fldChar w:fldCharType="end"/>
+            </w:r>
+          </w:hyperlink>
+        </w:p>
+        <w:p>
+          <w:pPr>
+            <w:pStyle w:val="Obsah2"/>
+            <w:tabs>
+              <w:tab w:val="right" w:leader="dot" w:pos="6969"/>
+            </w:tabs>
+            <w:rPr>
+              <w:rFonts w:asciiTheme="minorHAnsi" w:eastAsiaTheme="minorEastAsia" w:hAnsiTheme="minorHAnsi"/>
+              <w:noProof/>
+              <w:lang w:eastAsia="sk-SK"/>
+            </w:rPr>
+          </w:pPr>
+          <w:hyperlink w:anchor="_Toc230184638" w:history="1">
+            <w:r>
+              <w:rPr>
+                <w:rStyle w:val="Hypertextovodkaz"/>
+                <w:noProof/>
+              </w:rPr>
+              <w:t>12. ICSP zbernica</w:t>
+            </w:r>
+            <w:r>
+              <w:rPr>
+                <w:noProof/>
+                <w:webHidden/>
+              </w:rPr>
+              <w:tab/>
+            </w:r>
+            <w:r>
+              <w:rPr>
+                <w:noProof/>
+                <w:webHidden/>
+              </w:rPr>
+              <w:fldChar w:fldCharType="begin"/>
+            </w:r>
+            <w:r>
+              <w:rPr>
+                <w:noProof/>
+                <w:webHidden/>
+              </w:rPr>
+              <w:instrText xml:space="preserve"> PAGEREF _Toc230184638 \h </w:instrText>
+            </w:r>
+            <w:r>
+              <w:rPr>
+                <w:noProof/>
+                <w:webHidden/>
+              </w:rPr>
+            </w:r>
+            <w:r>
+              <w:rPr>
+                <w:noProof/>
+                <w:webHidden/>
+              </w:rPr>
+              <w:fldChar w:fldCharType="separate"/>
+            </w:r>
+            <w:r>
+              <w:rPr>
+                <w:noProof/>
+                <w:webHidden/>
+              </w:rPr>
+              <w:t>13</w:t>
+            </w:r>
+            <w:r>
+              <w:rPr>
+                <w:noProof/>
+                <w:webHidden/>
+              </w:rPr>
+              <w:fldChar w:fldCharType="end"/>
+            </w:r>
+          </w:hyperlink>
+        </w:p>
+        <w:p>
+          <w:pPr>
+            <w:pStyle w:val="Obsah2"/>
+            <w:tabs>
+              <w:tab w:val="right" w:leader="dot" w:pos="6969"/>
+            </w:tabs>
+            <w:rPr>
+              <w:rFonts w:asciiTheme="minorHAnsi" w:eastAsiaTheme="minorEastAsia" w:hAnsiTheme="minorHAnsi"/>
+              <w:noProof/>
+              <w:lang w:eastAsia="sk-SK"/>
+            </w:rPr>
+          </w:pPr>
+          <w:hyperlink w:anchor="_Toc230184639" w:history="1">
+            <w:r>
+              <w:rPr>
+                <w:rStyle w:val="Hypertextovodkaz"/>
+                <w:noProof/>
+              </w:rPr>
+              <w:t>Nočný režim</w:t>
+            </w:r>
+            <w:r>
+              <w:rPr>
+                <w:noProof/>
+                <w:webHidden/>
+              </w:rPr>
+              <w:tab/>
+            </w:r>
+            <w:r>
+              <w:rPr>
+                <w:noProof/>
+                <w:webHidden/>
+              </w:rPr>
+              <w:fldChar w:fldCharType="begin"/>
+            </w:r>
+            <w:r>
+              <w:rPr>
+                <w:noProof/>
+                <w:webHidden/>
+              </w:rPr>
+              <w:instrText xml:space="preserve"> PAGEREF _Toc230184639 \h </w:instrText>
+            </w:r>
+            <w:r>
+              <w:rPr>
+                <w:noProof/>
+                <w:webHidden/>
+              </w:rPr>
+            </w:r>
+            <w:r>
+              <w:rPr>
+                <w:noProof/>
+                <w:webHidden/>
+              </w:rPr>
+              <w:fldChar w:fldCharType="separate"/>
+            </w:r>
+            <w:r>
+              <w:rPr>
+                <w:noProof/>
+                <w:webHidden/>
+              </w:rPr>
+              <w:t>13</w:t>
+            </w:r>
+            <w:r>
+              <w:rPr>
+                <w:noProof/>
+                <w:webHidden/>
+              </w:rPr>
+              <w:fldChar w:fldCharType="end"/>
+            </w:r>
+          </w:hyperlink>
+        </w:p>
+        <w:p>
+          <w:pPr>
+            <w:pStyle w:val="Obsah2"/>
+            <w:tabs>
+              <w:tab w:val="right" w:leader="dot" w:pos="6969"/>
+            </w:tabs>
+            <w:rPr>
+              <w:rFonts w:asciiTheme="minorHAnsi" w:eastAsiaTheme="minorEastAsia" w:hAnsiTheme="minorHAnsi"/>
+              <w:noProof/>
+              <w:lang w:eastAsia="sk-SK"/>
+            </w:rPr>
+          </w:pPr>
+          <w:hyperlink w:anchor="_Toc230184640" w:history="1">
+            <w:r>
+              <w:rPr>
+                <w:rStyle w:val="Hypertextovodkaz"/>
+                <w:noProof/>
+              </w:rPr>
               <w:t>Úložný priestor</w:t>
             </w:r>
             <w:r>
@@ -2225,7 +2534,7 @@
                 <w:noProof/>
                 <w:webHidden/>
               </w:rPr>
-              <w:instrText xml:space="preserve"> PAGEREF _Toc230111782 \h </w:instrText>
+              <w:instrText xml:space="preserve"> PAGEREF _Toc230184640 \h </w:instrText>
             </w:r>
             <w:r>
               <w:rPr>
@@ -2268,7 +2577,7 @@
               <w:lang w:eastAsia="sk-SK"/>
             </w:rPr>
           </w:pPr>
-          <w:hyperlink w:anchor="_Toc230111783" w:history="1">
+          <w:hyperlink w:anchor="_Toc230184641" w:history="1">
             <w:r>
               <w:rPr>
                 <w:rStyle w:val="Hypertextovodkaz"/>
@@ -2295,7 +2604,7 @@
                 <w:noProof/>
                 <w:webHidden/>
               </w:rPr>
-              <w:instrText xml:space="preserve"> PAGEREF _Toc230111783 \h </w:instrText>
+              <w:instrText xml:space="preserve"> PAGEREF _Toc230184641 \h </w:instrText>
             </w:r>
             <w:r>
               <w:rPr>
@@ -2338,13 +2647,13 @@
               <w:lang w:eastAsia="sk-SK"/>
             </w:rPr>
           </w:pPr>
-          <w:hyperlink w:anchor="_Toc230111784" w:history="1">
+          <w:hyperlink w:anchor="_Toc230184642" w:history="1">
             <w:r>
               <w:rPr>
                 <w:rStyle w:val="Hypertextovodkaz"/>
                 <w:noProof/>
               </w:rPr>
-              <w:t>Správna orientácia prijímača</w:t>
+              <w:t>Orientácia prijímača</w:t>
             </w:r>
             <w:r>
               <w:rPr>
@@ -2365,7 +2674,7 @@
                 <w:noProof/>
                 <w:webHidden/>
               </w:rPr>
-              <w:instrText xml:space="preserve"> PAGEREF _Toc230111784 \h </w:instrText>
+              <w:instrText xml:space="preserve"> PAGEREF _Toc230184642 \h </w:instrText>
             </w:r>
             <w:r>
               <w:rPr>
@@ -2408,7 +2717,7 @@
               <w:lang w:eastAsia="sk-SK"/>
             </w:rPr>
           </w:pPr>
-          <w:hyperlink w:anchor="_Toc230111785" w:history="1">
+          <w:hyperlink w:anchor="_Toc230184643" w:history="1">
             <w:r>
               <w:rPr>
                 <w:rStyle w:val="Hypertextovodkaz"/>
@@ -2435,7 +2744,7 @@
                 <w:noProof/>
                 <w:webHidden/>
               </w:rPr>
-              <w:instrText xml:space="preserve"> PAGEREF _Toc230111785 \h </w:instrText>
+              <w:instrText xml:space="preserve"> PAGEREF _Toc230184643 \h </w:instrText>
             </w:r>
             <w:r>
               <w:rPr>
@@ -2478,7 +2787,7 @@
               <w:lang w:eastAsia="sk-SK"/>
             </w:rPr>
           </w:pPr>
-          <w:hyperlink w:anchor="_Toc230111786" w:history="1">
+          <w:hyperlink w:anchor="_Toc230184644" w:history="1">
             <w:r>
               <w:rPr>
                 <w:rStyle w:val="Hypertextovodkaz"/>
@@ -2505,7 +2814,7 @@
                 <w:noProof/>
                 <w:webHidden/>
               </w:rPr>
-              <w:instrText xml:space="preserve"> PAGEREF _Toc230111786 \h </w:instrText>
+              <w:instrText xml:space="preserve"> PAGEREF _Toc230184644 \h </w:instrText>
             </w:r>
             <w:r>
               <w:rPr>
@@ -2548,7 +2857,7 @@
               <w:lang w:eastAsia="sk-SK"/>
             </w:rPr>
           </w:pPr>
-          <w:hyperlink w:anchor="_Toc230111787" w:history="1">
+          <w:hyperlink w:anchor="_Toc230184645" w:history="1">
             <w:r>
               <w:rPr>
                 <w:rStyle w:val="Hypertextovodkaz"/>
@@ -2575,7 +2884,7 @@
                 <w:noProof/>
                 <w:webHidden/>
               </w:rPr>
-              <w:instrText xml:space="preserve"> PAGEREF _Toc230111787 \h </w:instrText>
+              <w:instrText xml:space="preserve"> PAGEREF _Toc230184645 \h </w:instrText>
             </w:r>
             <w:r>
               <w:rPr>
@@ -2618,7 +2927,7 @@
               <w:lang w:eastAsia="sk-SK"/>
             </w:rPr>
           </w:pPr>
-          <w:hyperlink w:anchor="_Toc230111788" w:history="1">
+          <w:hyperlink w:anchor="_Toc230184646" w:history="1">
             <w:r>
               <w:rPr>
                 <w:rStyle w:val="Hypertextovodkaz"/>
@@ -2645,7 +2954,7 @@
                 <w:noProof/>
                 <w:webHidden/>
               </w:rPr>
-              <w:instrText xml:space="preserve"> PAGEREF _Toc230111788 \h </w:instrText>
+              <w:instrText xml:space="preserve"> PAGEREF _Toc230184646 \h </w:instrText>
             </w:r>
             <w:r>
               <w:rPr>
@@ -2688,7 +2997,7 @@
               <w:lang w:eastAsia="sk-SK"/>
             </w:rPr>
           </w:pPr>
-          <w:hyperlink w:anchor="_Toc230111789" w:history="1">
+          <w:hyperlink w:anchor="_Toc230184647" w:history="1">
             <w:r>
               <w:rPr>
                 <w:rStyle w:val="Hypertextovodkaz"/>
@@ -2715,7 +3024,7 @@
                 <w:noProof/>
                 <w:webHidden/>
               </w:rPr>
-              <w:instrText xml:space="preserve"> PAGEREF _Toc230111789 \h </w:instrText>
+              <w:instrText xml:space="preserve"> PAGEREF _Toc230184647 \h </w:instrText>
             </w:r>
             <w:r>
               <w:rPr>
@@ -2758,7 +3067,7 @@
               <w:lang w:eastAsia="sk-SK"/>
             </w:rPr>
           </w:pPr>
-          <w:hyperlink w:anchor="_Toc230111790" w:history="1">
+          <w:hyperlink w:anchor="_Toc230184648" w:history="1">
             <w:r>
               <w:rPr>
                 <w:rStyle w:val="Hypertextovodkaz"/>
@@ -2785,7 +3094,7 @@
                 <w:noProof/>
                 <w:webHidden/>
               </w:rPr>
-              <w:instrText xml:space="preserve"> PAGEREF _Toc230111790 \h </w:instrText>
+              <w:instrText xml:space="preserve"> PAGEREF _Toc230184648 \h </w:instrText>
             </w:r>
             <w:r>
               <w:rPr>
@@ -2883,7 +3192,7 @@
       <w:pPr>
         <w:pStyle w:val="Nadpis1"/>
       </w:pPr>
-      <w:bookmarkStart w:id="0" w:name="_Toc230111762"/>
+      <w:bookmarkStart w:id="0" w:name="_Toc230184616"/>
       <w:r>
         <w:t>Digitálne hodiny Numeri</w:t>
       </w:r>
@@ -2904,7 +3213,7 @@
           <w:bCs/>
         </w:rPr>
       </w:pPr>
-      <w:bookmarkStart w:id="1" w:name="_Toc230111763"/>
+      <w:bookmarkStart w:id="1" w:name="_Toc230184617"/>
       <w:r>
         <w:rPr>
           <w:rStyle w:val="Nadpis2Char"/>
@@ -2973,7 +3282,7 @@
         </w:rPr>
         <w:br/>
       </w:r>
-      <w:bookmarkStart w:id="2" w:name="_Toc230111764"/>
+      <w:bookmarkStart w:id="2" w:name="_Toc230184618"/>
       <w:r>
         <w:rPr>
           <w:rFonts w:cs="Courier New"/>
@@ -3522,7 +3831,7 @@
           </mc:Fallback>
         </mc:AlternateContent>
       </w:r>
-      <w:bookmarkStart w:id="3" w:name="_Toc230111765"/>
+      <w:bookmarkStart w:id="3" w:name="_Toc230184619"/>
       <w:r>
         <w:rPr>
           <w:rStyle w:val="Nadpis2Char"/>
@@ -3903,7 +4212,7 @@
       <w:pPr>
         <w:pStyle w:val="Nadpis2"/>
       </w:pPr>
-      <w:bookmarkStart w:id="4" w:name="_Toc230111766"/>
+      <w:bookmarkStart w:id="4" w:name="_Toc230184620"/>
       <w:r>
         <w:lastRenderedPageBreak/>
         <w:t>Ovládací panel</w:t>
@@ -4032,7 +4341,13 @@
           </w:tcPr>
           <w:p>
             <w:r>
-              <w:t>Vypínač hodín.</w:t>
+              <w:t>Vypínač hodín</w:t>
+            </w:r>
+            <w:r>
+              <w:t xml:space="preserve"> (hore zapnuté, dole vypnuté)</w:t>
+            </w:r>
+            <w:r>
+              <w:t>.</w:t>
             </w:r>
           </w:p>
         </w:tc>
@@ -4061,7 +4376,22 @@
           </w:tcPr>
           <w:p>
             <w:r>
-              <w:t>Napájací USB-C konektor.</w:t>
+              <w:t>Napájací USB-C konektor</w:t>
+            </w:r>
+            <w:r>
+              <w:t xml:space="preserve"> (vstup 5 V</w:t>
+            </w:r>
+            <w:r>
+              <w:t> </w:t>
+            </w:r>
+            <w:r>
+              <w:t>a</w:t>
+            </w:r>
+            <w:r>
+              <w:t xml:space="preserve"> aspoň</w:t>
+            </w:r>
+            <w:r>
+              <w:t> 1 A).</w:t>
             </w:r>
           </w:p>
         </w:tc>
@@ -4296,7 +4626,7 @@
       <w:pPr>
         <w:pStyle w:val="Nadpis2"/>
       </w:pPr>
-      <w:bookmarkStart w:id="5" w:name="_Toc230111767"/>
+      <w:bookmarkStart w:id="5" w:name="_Toc230184621"/>
       <w:r>
         <w:t>N</w:t>
       </w:r>
@@ -4516,13 +4846,7 @@
         <w:t>nastavovacieho režimu</w:t>
       </w:r>
       <w:r>
-        <w:t xml:space="preserve"> držte obe tlačidlá stlačené</w:t>
-      </w:r>
-      <w:r>
-        <w:t>,</w:t>
-      </w:r>
-      <w:r>
-        <w:t xml:space="preserve"> </w:t>
+        <w:t xml:space="preserve"> držte obe tlačidlá stlačené </w:t>
       </w:r>
       <w:r>
         <w:t xml:space="preserve">dovtedy, </w:t>
@@ -4599,6 +4923,51 @@
           <w:rFonts w:cs="Courier New"/>
         </w:rPr>
         <w:t>.</w:t>
+      </w:r>
+      <w:r>
+        <w:rPr>
+          <w:rFonts w:cs="Courier New"/>
+        </w:rPr>
+        <w:t xml:space="preserve"> </w:t>
+      </w:r>
+      <w:r>
+        <w:rPr>
+          <w:rFonts w:cs="Courier New"/>
+        </w:rPr>
+        <w:t>Ukončenie</w:t>
+      </w:r>
+      <w:r>
+        <w:rPr>
+          <w:rFonts w:cs="Courier New"/>
+        </w:rPr>
+        <w:t xml:space="preserve"> nastavovacieho režimu funguje </w:t>
+      </w:r>
+      <w:r>
+        <w:rPr>
+          <w:rFonts w:cs="Courier New"/>
+        </w:rPr>
+        <w:t xml:space="preserve">rovnako </w:t>
+      </w:r>
+      <w:r>
+        <w:t>—</w:t>
+      </w:r>
+      <w:r>
+        <w:t xml:space="preserve"> </w:t>
+      </w:r>
+      <w:r>
+        <w:t>dlhým stlačením oboch tlačidiel</w:t>
+      </w:r>
+      <w:r>
+        <w:t>,</w:t>
+      </w:r>
+      <w:r>
+        <w:t xml:space="preserve"> kým kurzor </w:t>
+      </w:r>
+      <w:r>
+        <w:t xml:space="preserve">úplne </w:t>
+      </w:r>
+      <w:r>
+        <w:t>nezmizne.</w:t>
       </w:r>
     </w:p>
     <w:p>
@@ -4714,24 +5083,247 @@
     </w:p>
     <w:p>
       <w:pPr>
-        <w:rPr>
-          <w:rFonts w:eastAsiaTheme="majorEastAsia" w:cstheme="majorBidi"/>
-          <w:b/>
-          <w:color w:val="000000" w:themeColor="text1"/>
-          <w:szCs w:val="32"/>
-        </w:rPr>
-      </w:pPr>
-      <w:r>
-        <w:br w:type="page"/>
+        <w:jc w:val="center"/>
+      </w:pPr>
+      <w:r>
+        <w:rPr>
+          <w:noProof/>
+        </w:rPr>
+        <w:lastRenderedPageBreak/>
+        <mc:AlternateContent>
+          <mc:Choice Requires="wps">
+            <w:drawing>
+              <wp:anchor distT="0" distB="0" distL="114300" distR="114300" simplePos="0" relativeHeight="251816960" behindDoc="0" locked="0" layoutInCell="1" allowOverlap="1" wp14:anchorId="7B7B57AD" wp14:editId="6849D8A5">
+                <wp:simplePos x="0" y="0"/>
+                <wp:positionH relativeFrom="column">
+                  <wp:posOffset>243840</wp:posOffset>
+                </wp:positionH>
+                <wp:positionV relativeFrom="paragraph">
+                  <wp:posOffset>640080</wp:posOffset>
+                </wp:positionV>
+                <wp:extent cx="1397000" cy="228600"/>
+                <wp:effectExtent l="0" t="0" r="0" b="0"/>
+                <wp:wrapNone/>
+                <wp:docPr id="506601828" name="Textové pole 60"/>
+                <wp:cNvGraphicFramePr/>
+                <a:graphic xmlns:a="http://schemas.openxmlformats.org/drawingml/2006/main">
+                  <a:graphicData uri="http://schemas.microsoft.com/office/word/2010/wordprocessingShape">
+                    <wps:wsp>
+                      <wps:cNvSpPr txBox="1"/>
+                      <wps:spPr>
+                        <a:xfrm>
+                          <a:off x="0" y="0"/>
+                          <a:ext cx="1397000" cy="228600"/>
+                        </a:xfrm>
+                        <a:prstGeom prst="rect">
+                          <a:avLst/>
+                        </a:prstGeom>
+                        <a:noFill/>
+                        <a:ln w="6350">
+                          <a:noFill/>
+                        </a:ln>
+                      </wps:spPr>
+                      <wps:txbx>
+                        <w:txbxContent>
+                          <w:p>
+                            <w:pPr>
+                              <w:rPr>
+                                <w:sz w:val="20"/>
+                                <w:szCs w:val="20"/>
+                                <w:lang w:val="cs-CZ"/>
+                              </w:rPr>
+                            </w:pPr>
+                            <w:r>
+                              <w:rPr>
+                                <w:sz w:val="20"/>
+                                <w:szCs w:val="20"/>
+                                <w:lang w:val="cs-CZ"/>
+                              </w:rPr>
+                              <w:t>Kurzor</w:t>
+                            </w:r>
+                          </w:p>
+                        </w:txbxContent>
+                      </wps:txbx>
+                      <wps:bodyPr rot="0" spcFirstLastPara="0" vertOverflow="overflow" horzOverflow="overflow" vert="horz" wrap="square" lIns="91440" tIns="45720" rIns="91440" bIns="45720" numCol="1" spcCol="0" rtlCol="0" fromWordArt="0" anchor="t" anchorCtr="0" forceAA="0" compatLnSpc="1">
+                        <a:prstTxWarp prst="textNoShape">
+                          <a:avLst/>
+                        </a:prstTxWarp>
+                        <a:noAutofit/>
+                      </wps:bodyPr>
+                    </wps:wsp>
+                  </a:graphicData>
+                </a:graphic>
+                <wp14:sizeRelH relativeFrom="margin">
+                  <wp14:pctWidth>0</wp14:pctWidth>
+                </wp14:sizeRelH>
+                <wp14:sizeRelV relativeFrom="margin">
+                  <wp14:pctHeight>0</wp14:pctHeight>
+                </wp14:sizeRelV>
+              </wp:anchor>
+            </w:drawing>
+          </mc:Choice>
+          <mc:Fallback>
+            <w:pict>
+              <v:shape w14:anchorId="7B7B57AD" id="Textové pole 60" o:spid="_x0000_s1031" type="#_x0000_t202" style="position:absolute;left:0;text-align:left;margin-left:19.2pt;margin-top:50.4pt;width:110pt;height:18pt;z-index:251816960;visibility:visible;mso-wrap-style:square;mso-width-percent:0;mso-height-percent:0;mso-wrap-distance-left:9pt;mso-wrap-distance-top:0;mso-wrap-distance-right:9pt;mso-wrap-distance-bottom:0;mso-position-horizontal:absolute;mso-position-horizontal-relative:text;mso-position-vertical:absolute;mso-position-vertical-relative:text;mso-width-percent:0;mso-height-percent:0;mso-width-relative:margin;mso-height-relative:margin;v-text-anchor:top" o:gfxdata="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" filled="f" stroked="f" strokeweight=".5pt">
+                <v:textbox>
+                  <w:txbxContent>
+                    <w:p>
+                      <w:pPr>
+                        <w:rPr>
+                          <w:sz w:val="20"/>
+                          <w:szCs w:val="20"/>
+                          <w:lang w:val="cs-CZ"/>
+                        </w:rPr>
+                      </w:pPr>
+                      <w:r>
+                        <w:rPr>
+                          <w:sz w:val="20"/>
+                          <w:szCs w:val="20"/>
+                          <w:lang w:val="cs-CZ"/>
+                        </w:rPr>
+                        <w:t>Kurzor</w:t>
+                      </w:r>
+                    </w:p>
+                  </w:txbxContent>
+                </v:textbox>
+              </v:shape>
+            </w:pict>
+          </mc:Fallback>
+        </mc:AlternateContent>
+      </w:r>
+      <w:r>
+        <w:rPr>
+          <w:noProof/>
+        </w:rPr>
+        <mc:AlternateContent>
+          <mc:Choice Requires="wps">
+            <w:drawing>
+              <wp:anchor distT="0" distB="0" distL="114300" distR="114300" simplePos="0" relativeHeight="251815936" behindDoc="0" locked="0" layoutInCell="1" allowOverlap="1" wp14:anchorId="251D68E4" wp14:editId="66DE63D0">
+                <wp:simplePos x="0" y="0"/>
+                <wp:positionH relativeFrom="column">
+                  <wp:posOffset>685800</wp:posOffset>
+                </wp:positionH>
+                <wp:positionV relativeFrom="paragraph">
+                  <wp:posOffset>828040</wp:posOffset>
+                </wp:positionV>
+                <wp:extent cx="416560" cy="223520"/>
+                <wp:effectExtent l="0" t="0" r="21590" b="24130"/>
+                <wp:wrapNone/>
+                <wp:docPr id="519608011" name="Přímá spojnice 59"/>
+                <wp:cNvGraphicFramePr/>
+                <a:graphic xmlns:a="http://schemas.openxmlformats.org/drawingml/2006/main">
+                  <a:graphicData uri="http://schemas.microsoft.com/office/word/2010/wordprocessingShape">
+                    <wps:wsp>
+                      <wps:cNvCnPr/>
+                      <wps:spPr>
+                        <a:xfrm flipH="1" flipV="1">
+                          <a:off x="0" y="0"/>
+                          <a:ext cx="416560" cy="223520"/>
+                        </a:xfrm>
+                        <a:prstGeom prst="line">
+                          <a:avLst/>
+                        </a:prstGeom>
+                      </wps:spPr>
+                      <wps:style>
+                        <a:lnRef idx="3">
+                          <a:schemeClr val="dk1"/>
+                        </a:lnRef>
+                        <a:fillRef idx="0">
+                          <a:schemeClr val="dk1"/>
+                        </a:fillRef>
+                        <a:effectRef idx="2">
+                          <a:schemeClr val="dk1"/>
+                        </a:effectRef>
+                        <a:fontRef idx="minor">
+                          <a:schemeClr val="tx1"/>
+                        </a:fontRef>
+                      </wps:style>
+                      <wps:bodyPr/>
+                    </wps:wsp>
+                  </a:graphicData>
+                </a:graphic>
+                <wp14:sizeRelH relativeFrom="margin">
+                  <wp14:pctWidth>0</wp14:pctWidth>
+                </wp14:sizeRelH>
+                <wp14:sizeRelV relativeFrom="margin">
+                  <wp14:pctHeight>0</wp14:pctHeight>
+                </wp14:sizeRelV>
+              </wp:anchor>
+            </w:drawing>
+          </mc:Choice>
+          <mc:Fallback>
+            <w:pict>
+              <v:line w14:anchorId="26A0439C" id="Přímá spojnice 59" o:spid="_x0000_s1026" style="position:absolute;flip:x y;z-index:251815936;visibility:visible;mso-wrap-style:square;mso-width-percent:0;mso-height-percent:0;mso-wrap-distance-left:9pt;mso-wrap-distance-top:0;mso-wrap-distance-right:9pt;mso-wrap-distance-bottom:0;mso-position-horizontal:absolute;mso-position-horizontal-relative:text;mso-position-vertical:absolute;mso-position-vertical-relative:text;mso-width-percent:0;mso-height-percent:0;mso-width-relative:margin;mso-height-relative:margin" from="54pt,65.2pt" to="86.8pt,82.8pt" o:gfxdata="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" strokecolor="black [3200]" strokeweight="1.5pt">
+                <v:stroke joinstyle="miter"/>
+              </v:line>
+            </w:pict>
+          </mc:Fallback>
+        </mc:AlternateContent>
+      </w:r>
+      <w:r>
+        <w:rPr>
+          <w:noProof/>
+        </w:rPr>
+        <w:drawing>
+          <wp:inline distT="0" distB="0" distL="0" distR="0" wp14:anchorId="1CB559F7" wp14:editId="22937F9F">
+            <wp:extent cx="3936039" cy="2244090"/>
+            <wp:effectExtent l="0" t="0" r="7620" b="3810"/>
+            <wp:docPr id="734623036" name="Obrázek 1"/>
+            <wp:cNvGraphicFramePr>
+              <a:graphicFrameLocks xmlns:a="http://schemas.openxmlformats.org/drawingml/2006/main" noChangeAspect="1"/>
+            </wp:cNvGraphicFramePr>
+            <a:graphic xmlns:a="http://schemas.openxmlformats.org/drawingml/2006/main">
+              <a:graphicData uri="http://schemas.openxmlformats.org/drawingml/2006/picture">
+                <pic:pic xmlns:pic="http://schemas.openxmlformats.org/drawingml/2006/picture">
+                  <pic:nvPicPr>
+                    <pic:cNvPr id="734623036" name=""/>
+                    <pic:cNvPicPr/>
+                  </pic:nvPicPr>
+                  <pic:blipFill>
+                    <a:blip r:embed="rId16"/>
+                    <a:stretch>
+                      <a:fillRect/>
+                    </a:stretch>
+                  </pic:blipFill>
+                  <pic:spPr>
+                    <a:xfrm>
+                      <a:off x="0" y="0"/>
+                      <a:ext cx="4092883" cy="2333513"/>
+                    </a:xfrm>
+                    <a:prstGeom prst="rect">
+                      <a:avLst/>
+                    </a:prstGeom>
+                  </pic:spPr>
+                </pic:pic>
+              </a:graphicData>
+            </a:graphic>
+          </wp:inline>
+        </w:drawing>
+      </w:r>
+      <w:r>
+        <w:br/>
+      </w:r>
+      <w:r>
+        <w:rPr>
+          <w:sz w:val="20"/>
+          <w:szCs w:val="20"/>
+        </w:rPr>
+        <w:t>Obr. 3 Detailný pohľad na numitronový displej v nastavovacom režime (viditeľný kurzor na prvom numitrone). Každý z numitronov displeja zobrazuje svoje poradové číslo</w:t>
+      </w:r>
+      <w:r>
+        <w:rPr>
+          <w:sz w:val="20"/>
+          <w:szCs w:val="20"/>
+        </w:rPr>
+        <w:t xml:space="preserve"> pre demonštračné účely.</w:t>
       </w:r>
     </w:p>
     <w:p>
       <w:pPr>
         <w:pStyle w:val="Nadpis2"/>
       </w:pPr>
-      <w:bookmarkStart w:id="6" w:name="_Toc230111768"/>
-      <w:r>
-        <w:lastRenderedPageBreak/>
+      <w:bookmarkStart w:id="6" w:name="_Toc230184622"/>
+      <w:r>
         <w:t>Stránky nastavení</w:t>
       </w:r>
       <w:bookmarkEnd w:id="6"/>
@@ -4805,7 +5397,7 @@
           </mc:Choice>
           <mc:Fallback>
             <w:pict>
-              <v:shape w14:anchorId="3882D008" id="_x0000_s1031" type="#_x0000_t202" style="position:absolute;left:0;text-align:left;margin-left:458.25pt;margin-top:143.25pt;width:1in;height:23pt;z-index:251699200;visibility:visible;mso-wrap-style:none;mso-height-percent:0;mso-wrap-distance-left:9pt;mso-wrap-distance-top:0;mso-wrap-distance-right:9pt;mso-wrap-distance-bottom:0;mso-position-horizontal:absolute;mso-position-horizontal-relative:text;mso-position-vertical:absolute;mso-position-vertical-relative:text;mso-height-percent:0;mso-height-relative:margin;v-text-anchor:top" o:gfxdata="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" filled="f" stroked="f" strokeweight=".5pt">
+              <v:shape w14:anchorId="3882D008" id="_x0000_s1032" type="#_x0000_t202" style="position:absolute;left:0;text-align:left;margin-left:458.25pt;margin-top:143.25pt;width:1in;height:23pt;z-index:251699200;visibility:visible;mso-wrap-style:none;mso-height-percent:0;mso-wrap-distance-left:9pt;mso-wrap-distance-top:0;mso-wrap-distance-right:9pt;mso-wrap-distance-bottom:0;mso-position-horizontal:absolute;mso-position-horizontal-relative:text;mso-position-vertical:absolute;mso-position-vertical-relative:text;mso-height-percent:0;mso-height-relative:margin;v-text-anchor:top" o:gfxdata="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" filled="f" stroked="f" strokeweight=".5pt">
                 <v:textbox>
                   <w:txbxContent>
                     <w:p>
@@ -4823,300 +5415,231 @@
         </mc:AlternateContent>
       </w:r>
       <w:r>
-        <w:t xml:space="preserve">Nastavenia sú popísané tabuľkou pre každú stranu. Tabuľka je rozdelená na tri stĺpce. </w:t>
-      </w:r>
-      <w:r>
-        <w:t>Prvý stĺpec obsahuje poradové čísla numitronov, druhý uvádza rozsah možných hodnôt a tretí poskytuje stručný popis príslušného nastavenia.</w:t>
-      </w:r>
-      <w:r>
-        <w:t xml:space="preserve"> Numitrony sú číslované z prednej strany </w:t>
-      </w:r>
-      <w:r>
-        <w:t>zľava</w:t>
-      </w:r>
-      <w:r>
-        <w:t xml:space="preserve"> (vi</w:t>
-      </w:r>
-      <w:r>
-        <w:t>ď</w:t>
-      </w:r>
-      <w:r>
-        <w:t xml:space="preserve"> Obr. 3)</w:t>
+        <w:t>Keďže počet nastavení je pomerne veľký, numitronový displej ich nedokáže zobraziť všetky naraz, preto sú rozdelené do tzv. stránok</w:t>
+      </w:r>
+      <w:r>
+        <w:t xml:space="preserve"> nastavení</w:t>
       </w:r>
       <w:r>
         <w:t>.</w:t>
       </w:r>
-      <w:r>
-        <w:t xml:space="preserve"> Hodnota v zátvorkách predstavuje predvolenú hodnotu pre dané nastavenie.</w:t>
-      </w:r>
     </w:p>
-    <w:p/>
     <w:p>
-      <w:pPr>
-        <w:jc w:val="center"/>
-      </w:pPr>
-      <w:r>
-        <w:rPr>
-          <w:noProof/>
-        </w:rPr>
-        <mc:AlternateContent>
-          <mc:Choice Requires="wps">
-            <w:drawing>
-              <wp:anchor distT="0" distB="0" distL="114300" distR="114300" simplePos="0" relativeHeight="251804672" behindDoc="0" locked="0" layoutInCell="1" allowOverlap="1" wp14:anchorId="0DE13D57" wp14:editId="4C5066A1">
-                <wp:simplePos x="0" y="0"/>
-                <wp:positionH relativeFrom="column">
-                  <wp:posOffset>57150</wp:posOffset>
-                </wp:positionH>
-                <wp:positionV relativeFrom="paragraph">
-                  <wp:posOffset>671195</wp:posOffset>
-                </wp:positionV>
-                <wp:extent cx="1306830" cy="1010285"/>
-                <wp:effectExtent l="0" t="0" r="0" b="0"/>
-                <wp:wrapNone/>
-                <wp:docPr id="1240849215" name="Textové pole 51"/>
-                <wp:cNvGraphicFramePr/>
-                <a:graphic xmlns:a="http://schemas.openxmlformats.org/drawingml/2006/main">
-                  <a:graphicData uri="http://schemas.microsoft.com/office/word/2010/wordprocessingShape">
-                    <wps:wsp>
-                      <wps:cNvSpPr txBox="1"/>
-                      <wps:spPr>
-                        <a:xfrm>
-                          <a:off x="0" y="0"/>
-                          <a:ext cx="1306830" cy="1010285"/>
-                        </a:xfrm>
-                        <a:prstGeom prst="rect">
-                          <a:avLst/>
-                        </a:prstGeom>
-                        <a:noFill/>
-                        <a:ln w="6350">
-                          <a:noFill/>
-                        </a:ln>
-                      </wps:spPr>
-                      <wps:txbx>
-                        <w:txbxContent>
-                          <w:p>
-                            <w:pPr>
-                              <w:rPr>
-                                <w:sz w:val="16"/>
-                                <w:szCs w:val="16"/>
-                                <w:lang w:val="cs-CZ"/>
-                              </w:rPr>
-                            </w:pPr>
-                            <w:r>
-                              <w:rPr>
-                                <w:sz w:val="16"/>
-                                <w:szCs w:val="16"/>
-                                <w:lang w:val="cs-CZ"/>
-                              </w:rPr>
-                              <w:t>Kurzor</w:t>
-                            </w:r>
-                          </w:p>
-                        </w:txbxContent>
-                      </wps:txbx>
-                      <wps:bodyPr rot="0" spcFirstLastPara="0" vertOverflow="overflow" horzOverflow="overflow" vert="horz" wrap="square" lIns="91440" tIns="45720" rIns="91440" bIns="45720" numCol="1" spcCol="0" rtlCol="0" fromWordArt="0" anchor="t" anchorCtr="0" forceAA="0" compatLnSpc="1">
-                        <a:prstTxWarp prst="textNoShape">
-                          <a:avLst/>
-                        </a:prstTxWarp>
-                        <a:noAutofit/>
-                      </wps:bodyPr>
-                    </wps:wsp>
-                  </a:graphicData>
-                </a:graphic>
-                <wp14:sizeRelH relativeFrom="margin">
-                  <wp14:pctWidth>0</wp14:pctWidth>
-                </wp14:sizeRelH>
-                <wp14:sizeRelV relativeFrom="margin">
-                  <wp14:pctHeight>0</wp14:pctHeight>
-                </wp14:sizeRelV>
-              </wp:anchor>
-            </w:drawing>
-          </mc:Choice>
-          <mc:Fallback>
-            <w:pict>
-              <v:shape w14:anchorId="0DE13D57" id="Textové pole 51" o:spid="_x0000_s1032" type="#_x0000_t202" style="position:absolute;left:0;text-align:left;margin-left:4.5pt;margin-top:52.85pt;width:102.9pt;height:79.55pt;z-index:251804672;visibility:visible;mso-wrap-style:square;mso-width-percent:0;mso-height-percent:0;mso-wrap-distance-left:9pt;mso-wrap-distance-top:0;mso-wrap-distance-right:9pt;mso-wrap-distance-bottom:0;mso-position-horizontal:absolute;mso-position-horizontal-relative:text;mso-position-vertical:absolute;mso-position-vertical-relative:text;mso-width-percent:0;mso-height-percent:0;mso-width-relative:margin;mso-height-relative:margin;v-text-anchor:top" o:gfxdata="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" filled="f" stroked="f" strokeweight=".5pt">
-                <v:textbox>
-                  <w:txbxContent>
-                    <w:p>
-                      <w:pPr>
-                        <w:rPr>
-                          <w:sz w:val="16"/>
-                          <w:szCs w:val="16"/>
-                          <w:lang w:val="cs-CZ"/>
-                        </w:rPr>
-                      </w:pPr>
-                      <w:r>
-                        <w:rPr>
-                          <w:sz w:val="16"/>
-                          <w:szCs w:val="16"/>
-                          <w:lang w:val="cs-CZ"/>
-                        </w:rPr>
-                        <w:t>Kurzor</w:t>
-                      </w:r>
-                    </w:p>
-                  </w:txbxContent>
-                </v:textbox>
-              </v:shape>
-            </w:pict>
-          </mc:Fallback>
-        </mc:AlternateContent>
-      </w:r>
-      <w:r>
-        <w:rPr>
-          <w:noProof/>
-        </w:rPr>
-        <mc:AlternateContent>
-          <mc:Choice Requires="wps">
-            <w:drawing>
-              <wp:anchor distT="0" distB="0" distL="114300" distR="114300" simplePos="0" relativeHeight="251803648" behindDoc="0" locked="0" layoutInCell="1" allowOverlap="1" wp14:anchorId="4C948130" wp14:editId="7AA4FBE8">
-                <wp:simplePos x="0" y="0"/>
-                <wp:positionH relativeFrom="column">
-                  <wp:posOffset>434975</wp:posOffset>
-                </wp:positionH>
-                <wp:positionV relativeFrom="paragraph">
-                  <wp:posOffset>859790</wp:posOffset>
-                </wp:positionV>
-                <wp:extent cx="508000" cy="349250"/>
-                <wp:effectExtent l="0" t="0" r="25400" b="31750"/>
-                <wp:wrapNone/>
-                <wp:docPr id="427841221" name="Přímá spojnice 50"/>
-                <wp:cNvGraphicFramePr/>
-                <a:graphic xmlns:a="http://schemas.openxmlformats.org/drawingml/2006/main">
-                  <a:graphicData uri="http://schemas.microsoft.com/office/word/2010/wordprocessingShape">
-                    <wps:wsp>
-                      <wps:cNvCnPr/>
-                      <wps:spPr>
-                        <a:xfrm flipH="1" flipV="1">
-                          <a:off x="0" y="0"/>
-                          <a:ext cx="508000" cy="349250"/>
-                        </a:xfrm>
-                        <a:prstGeom prst="line">
-                          <a:avLst/>
-                        </a:prstGeom>
-                      </wps:spPr>
-                      <wps:style>
-                        <a:lnRef idx="3">
-                          <a:schemeClr val="dk1"/>
-                        </a:lnRef>
-                        <a:fillRef idx="0">
-                          <a:schemeClr val="dk1"/>
-                        </a:fillRef>
-                        <a:effectRef idx="2">
-                          <a:schemeClr val="dk1"/>
-                        </a:effectRef>
-                        <a:fontRef idx="minor">
-                          <a:schemeClr val="tx1"/>
-                        </a:fontRef>
-                      </wps:style>
-                      <wps:bodyPr/>
-                    </wps:wsp>
-                  </a:graphicData>
-                </a:graphic>
-                <wp14:sizeRelH relativeFrom="margin">
-                  <wp14:pctWidth>0</wp14:pctWidth>
-                </wp14:sizeRelH>
-                <wp14:sizeRelV relativeFrom="margin">
-                  <wp14:pctHeight>0</wp14:pctHeight>
-                </wp14:sizeRelV>
-              </wp:anchor>
-            </w:drawing>
-          </mc:Choice>
-          <mc:Fallback>
-            <w:pict>
-              <v:line w14:anchorId="5FF2CFCA" id="Přímá spojnice 50" o:spid="_x0000_s1026" style="position:absolute;flip:x y;z-index:251803648;visibility:visible;mso-wrap-style:square;mso-width-percent:0;mso-height-percent:0;mso-wrap-distance-left:9pt;mso-wrap-distance-top:0;mso-wrap-distance-right:9pt;mso-wrap-distance-bottom:0;mso-position-horizontal:absolute;mso-position-horizontal-relative:text;mso-position-vertical:absolute;mso-position-vertical-relative:text;mso-width-percent:0;mso-height-percent:0;mso-width-relative:margin;mso-height-relative:margin" from="34.25pt,67.7pt" to="74.25pt,95.2pt" o:gfxdata="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" strokecolor="black [3200]" strokeweight="1.5pt">
-                <v:stroke joinstyle="miter"/>
-              </v:line>
-            </w:pict>
-          </mc:Fallback>
-        </mc:AlternateContent>
-      </w:r>
-      <w:r>
-        <w:rPr>
-          <w:noProof/>
-        </w:rPr>
-        <w:drawing>
-          <wp:inline distT="0" distB="0" distL="0" distR="0" wp14:anchorId="2A91F261" wp14:editId="275D8B98">
-            <wp:extent cx="4431665" cy="2526665"/>
-            <wp:effectExtent l="0" t="0" r="6985" b="6985"/>
-            <wp:docPr id="734623036" name="Obrázek 1"/>
-            <wp:cNvGraphicFramePr>
-              <a:graphicFrameLocks xmlns:a="http://schemas.openxmlformats.org/drawingml/2006/main" noChangeAspect="1"/>
-            </wp:cNvGraphicFramePr>
-            <a:graphic xmlns:a="http://schemas.openxmlformats.org/drawingml/2006/main">
-              <a:graphicData uri="http://schemas.openxmlformats.org/drawingml/2006/picture">
-                <pic:pic xmlns:pic="http://schemas.openxmlformats.org/drawingml/2006/picture">
-                  <pic:nvPicPr>
-                    <pic:cNvPr id="734623036" name=""/>
-                    <pic:cNvPicPr/>
-                  </pic:nvPicPr>
-                  <pic:blipFill>
-                    <a:blip r:embed="rId16"/>
-                    <a:stretch>
-                      <a:fillRect/>
-                    </a:stretch>
-                  </pic:blipFill>
-                  <pic:spPr>
-                    <a:xfrm>
-                      <a:off x="0" y="0"/>
-                      <a:ext cx="4431665" cy="2526665"/>
-                    </a:xfrm>
-                    <a:prstGeom prst="rect">
-                      <a:avLst/>
-                    </a:prstGeom>
-                  </pic:spPr>
-                </pic:pic>
-              </a:graphicData>
-            </a:graphic>
-          </wp:inline>
-        </w:drawing>
-      </w:r>
-      <w:r>
-        <w:rPr>
-          <w:sz w:val="20"/>
-          <w:szCs w:val="20"/>
-        </w:rPr>
-        <w:t>Obr. 3</w:t>
-      </w:r>
-      <w:r>
-        <w:rPr>
-          <w:sz w:val="20"/>
-          <w:szCs w:val="20"/>
-        </w:rPr>
-        <w:t xml:space="preserve"> Detailný pohľad na numitronový displej hodín</w:t>
-      </w:r>
-      <w:r>
-        <w:rPr>
-          <w:sz w:val="20"/>
-          <w:szCs w:val="20"/>
-        </w:rPr>
-        <w:t xml:space="preserve"> s aktívnym kurzorom</w:t>
-      </w:r>
-      <w:r>
-        <w:rPr>
-          <w:sz w:val="20"/>
-          <w:szCs w:val="20"/>
-        </w:rPr>
-        <w:t xml:space="preserve"> (teda</w:t>
-      </w:r>
-      <w:r>
-        <w:rPr>
-          <w:sz w:val="20"/>
-          <w:szCs w:val="20"/>
-        </w:rPr>
-        <w:t xml:space="preserve"> aktivovaným nastavovacím režimom</w:t>
-      </w:r>
-      <w:r>
-        <w:rPr>
-          <w:sz w:val="20"/>
-          <w:szCs w:val="20"/>
-        </w:rPr>
+      <w:r>
+        <w:rPr>
+          <w:b/>
+          <w:bCs/>
+        </w:rPr>
+        <w:t xml:space="preserve">Stránka </w:t>
+      </w:r>
+      <w:r>
+        <w:t>je</w:t>
+      </w:r>
+      <w:r>
+        <w:t xml:space="preserve"> jednoducho</w:t>
+      </w:r>
+      <w:r>
+        <w:t xml:space="preserve"> štvorica nastavení</w:t>
+      </w:r>
+      <w:r>
+        <w:t xml:space="preserve"> </w:t>
+      </w:r>
+      <w:r>
+        <w:t>zobrazená</w:t>
+      </w:r>
+      <w:r>
+        <w:t xml:space="preserve"> naraz</w:t>
+      </w:r>
+      <w:r>
+        <w:t xml:space="preserve"> </w:t>
+      </w:r>
+      <w:r>
+        <w:t>(každé nastavenie zobrazuje jeden numitron)</w:t>
+      </w:r>
+      <w:r>
+        <w:t xml:space="preserve">. </w:t>
+      </w:r>
+      <w:r>
+        <w:t>Pre každú z</w:t>
+      </w:r>
+      <w:r>
+        <w:t xml:space="preserve">o </w:t>
+      </w:r>
+      <w:r>
+        <w:t>stránok sa</w:t>
+      </w:r>
+      <w:r>
+        <w:t xml:space="preserve"> </w:t>
+      </w:r>
+      <w:r>
+        <w:t xml:space="preserve">nižšie </w:t>
+      </w:r>
+      <w:r>
+        <w:t xml:space="preserve">nachádza tabuľka </w:t>
+      </w:r>
+      <w:r>
+        <w:t>ktor</w:t>
+      </w:r>
+      <w:r>
+        <w:t>á</w:t>
+      </w:r>
+      <w:r>
+        <w:t xml:space="preserve"> danú stránku a jej nastavenia popisuj</w:t>
+      </w:r>
+      <w:r>
+        <w:t xml:space="preserve">e </w:t>
+      </w:r>
+      <w:r>
+        <w:t xml:space="preserve">týmito tromi </w:t>
+      </w:r>
+      <w:r>
+        <w:t>stĺpcami</w:t>
+      </w:r>
+      <w:r>
+        <w:t>:</w:t>
+      </w:r>
+    </w:p>
+    <w:p>
+      <w:pPr>
+        <w:pStyle w:val="Odstavecseseznamem"/>
+        <w:numPr>
+          <w:ilvl w:val="0"/>
+          <w:numId w:val="23"/>
+        </w:numPr>
+      </w:pPr>
+      <w:r>
+        <w:rPr>
+          <w:b/>
+          <w:bCs/>
+        </w:rPr>
+        <w:t>p</w:t>
+      </w:r>
+      <w:r>
+        <w:rPr>
+          <w:b/>
+          <w:bCs/>
+        </w:rPr>
+        <w:t>rvý</w:t>
+      </w:r>
+      <w:r>
+        <w:t xml:space="preserve"> st</w:t>
+      </w:r>
+      <w:r>
+        <w:t>ĺ</w:t>
+      </w:r>
+      <w:r>
+        <w:t>pec obsahuje poradové čísla numitronov</w:t>
+      </w:r>
+      <w:r>
+        <w:t xml:space="preserve"> (číslované </w:t>
+      </w:r>
+      <w:r>
+        <w:t xml:space="preserve">spredu </w:t>
+      </w:r>
+      <w:r>
+        <w:t>zľava, viď Obr. 3</w:t>
+      </w:r>
+      <w:r>
         <w:t>)</w:t>
       </w:r>
       <w:r>
-        <w:rPr>
-          <w:sz w:val="20"/>
-          <w:szCs w:val="20"/>
-        </w:rPr>
-        <w:t>.</w:t>
+        <w:t>,</w:t>
+      </w:r>
+    </w:p>
+    <w:p>
+      <w:pPr>
+        <w:pStyle w:val="Odstavecseseznamem"/>
+        <w:numPr>
+          <w:ilvl w:val="0"/>
+          <w:numId w:val="23"/>
+        </w:numPr>
+      </w:pPr>
+      <w:r>
+        <w:rPr>
+          <w:b/>
+          <w:bCs/>
+        </w:rPr>
+        <w:t>druhý</w:t>
+      </w:r>
+      <w:r>
+        <w:t xml:space="preserve"> </w:t>
+      </w:r>
+      <w:r>
+        <w:t xml:space="preserve">stĺpec </w:t>
+      </w:r>
+      <w:r>
+        <w:t xml:space="preserve">uvádza rozsah </w:t>
+      </w:r>
+      <w:r>
+        <w:t>hodnôt, ktoré dané nastavenie môže nadobudnúť</w:t>
+      </w:r>
+      <w:r>
+        <w:t xml:space="preserve">, pričom hodnota v zátvorke </w:t>
+      </w:r>
+      <w:r>
+        <w:t>predstavuje predvolenú hodnotu</w:t>
+      </w:r>
+      <w:r>
+        <w:t>,</w:t>
+      </w:r>
+    </w:p>
+    <w:p>
+      <w:pPr>
+        <w:pStyle w:val="Odstavecseseznamem"/>
+        <w:numPr>
+          <w:ilvl w:val="0"/>
+          <w:numId w:val="23"/>
+        </w:numPr>
+        <w:jc w:val="left"/>
+      </w:pPr>
+      <w:r>
+        <w:rPr>
+          <w:b/>
+          <w:bCs/>
+        </w:rPr>
+        <w:t>tretí</w:t>
+      </w:r>
+      <w:r>
+        <w:t xml:space="preserve"> st</w:t>
+      </w:r>
+      <w:r>
+        <w:t>ĺ</w:t>
+      </w:r>
+      <w:r>
+        <w:t xml:space="preserve">pec </w:t>
+      </w:r>
+      <w:r>
+        <w:t>poskytuje stručný popis príslušného nastavenia</w:t>
+      </w:r>
+      <w:r>
+        <w:t xml:space="preserve"> a jeho </w:t>
+      </w:r>
+      <w:r>
+        <w:t xml:space="preserve">možných </w:t>
+      </w:r>
+      <w:r>
+        <w:t>hodnôt.</w:t>
+      </w:r>
+    </w:p>
+    <w:p>
+      <w:r>
+        <w:rPr>
+          <w:b/>
+          <w:bCs/>
+        </w:rPr>
+        <w:t>Medzi stránkami je možné prechádzať krátkym stlačením oboch krajných tlačidiel</w:t>
+      </w:r>
+      <w:r>
+        <w:t xml:space="preserve">. Pri prechode </w:t>
+      </w:r>
+      <w:r>
+        <w:t xml:space="preserve">na novú stránku </w:t>
+      </w:r>
+      <w:r>
+        <w:t xml:space="preserve">sa </w:t>
+      </w:r>
+      <w:r>
+        <w:t>zmeny vykonané na predchádzajúcej stránke uložia.</w:t>
       </w:r>
       <w:r>
         <w:br w:type="page"/>
@@ -5163,7 +5686,7 @@
                 <w:szCs w:val="18"/>
               </w:rPr>
               <w:lastRenderedPageBreak/>
-              <w:t>Č</w:t>
+              <w:t>Poradové č</w:t>
             </w:r>
             <w:r>
               <w:rPr>
@@ -5226,6 +5749,34 @@
                 <w:szCs w:val="18"/>
               </w:rPr>
               <w:t>Stručný popis nastavenia</w:t>
+            </w:r>
+            <w:r>
+              <w:rPr>
+                <w:sz w:val="18"/>
+                <w:szCs w:val="18"/>
+              </w:rPr>
+              <w:t xml:space="preserve"> prípadne </w:t>
+            </w:r>
+            <w:r>
+              <w:rPr>
+                <w:sz w:val="18"/>
+                <w:szCs w:val="18"/>
+              </w:rPr>
+              <w:t xml:space="preserve">jeho </w:t>
+            </w:r>
+            <w:r>
+              <w:rPr>
+                <w:sz w:val="18"/>
+                <w:szCs w:val="18"/>
+              </w:rPr>
+              <w:t>možných hodnôt</w:t>
+            </w:r>
+            <w:r>
+              <w:rPr>
+                <w:sz w:val="18"/>
+                <w:szCs w:val="18"/>
+              </w:rPr>
+              <w:t>.</w:t>
             </w:r>
           </w:p>
         </w:tc>
@@ -5720,10 +6271,22 @@
               <w:t>1</w:t>
             </w:r>
             <w:r>
-              <w:t xml:space="preserve"> - </w:t>
-            </w:r>
-            <w:r>
-              <w:t>zapnutý (ochrana pred nadprúdom a podprúdom)</w:t>
+              <w:t xml:space="preserve"> </w:t>
+            </w:r>
+            <w:r>
+              <w:t>–</w:t>
+            </w:r>
+            <w:r>
+              <w:t xml:space="preserve"> </w:t>
+            </w:r>
+            <w:r>
+              <w:t>zapnutý (ochrana pred nadprúdom a</w:t>
+            </w:r>
+            <w:r>
+              <w:t> </w:t>
+            </w:r>
+            <w:r>
+              <w:t>podprúdom)</w:t>
             </w:r>
           </w:p>
           <w:p>
@@ -5754,14 +6317,28 @@
                 <w:sz w:val="20"/>
                 <w:szCs w:val="20"/>
               </w:rPr>
-              <w:t xml:space="preserve">Predvolene vypnutý </w:t>
+              <w:t xml:space="preserve">Predvolene vypnutý pre prípad vážnej chyby senzora. Výrobné nastavenia je vždy možné obnoviť dlhým </w:t>
             </w:r>
             <w:r>
               <w:rPr>
                 <w:sz w:val="20"/>
                 <w:szCs w:val="20"/>
               </w:rPr>
-              <w:t>pre prípad vážnej chyby senzora. Cez dlhé podržanie RESET ide vždy vypnúť.</w:t>
+              <w:t xml:space="preserve">stlačením </w:t>
+            </w:r>
+            <w:r>
+              <w:rPr>
+                <w:sz w:val="20"/>
+                <w:szCs w:val="20"/>
+              </w:rPr>
+              <w:t>tlačidla RESET</w:t>
+            </w:r>
+            <w:r>
+              <w:rPr>
+                <w:sz w:val="20"/>
+                <w:szCs w:val="20"/>
+              </w:rPr>
+              <w:t xml:space="preserve"> (viď strana 12).</w:t>
             </w:r>
           </w:p>
         </w:tc>
@@ -5812,8 +6389,11 @@
             </w:tcBorders>
           </w:tcPr>
           <w:p>
-            <w:r>
-              <w:t>Nastavovanie času cez DCF77</w:t>
+            <w:pPr>
+              <w:jc w:val="left"/>
+            </w:pPr>
+            <w:r>
+              <w:t>Vypínanie prijímača DCF77</w:t>
             </w:r>
             <w:r>
               <w:t>:</w:t>
@@ -5835,8 +6415,17 @@
             </w:r>
           </w:p>
           <w:p>
-            <w:r>
-              <w:t xml:space="preserve">1 - </w:t>
+            <w:pPr>
+              <w:jc w:val="left"/>
+            </w:pPr>
+            <w:r>
+              <w:t xml:space="preserve">1 </w:t>
+            </w:r>
+            <w:r>
+              <w:t>–</w:t>
+            </w:r>
+            <w:r>
+              <w:t xml:space="preserve"> </w:t>
             </w:r>
             <w:r>
               <w:t>DCF77 prijímač</w:t>
@@ -5990,6 +6579,9 @@
             <w:tcW w:w="4806" w:type="dxa"/>
           </w:tcPr>
           <w:p>
+            <w:pPr>
+              <w:jc w:val="left"/>
+            </w:pPr>
             <w:r>
               <w:t>Akcia časovača.</w:t>
             </w:r>
@@ -5999,6 +6591,9 @@
             </w:r>
           </w:p>
           <w:p>
+            <w:pPr>
+              <w:jc w:val="left"/>
+            </w:pPr>
             <w:r>
               <w:t xml:space="preserve">1 </w:t>
             </w:r>
@@ -6019,6 +6614,9 @@
             </w:r>
           </w:p>
           <w:p>
+            <w:pPr>
+              <w:jc w:val="left"/>
+            </w:pPr>
             <w:r>
               <w:t xml:space="preserve">2 </w:t>
             </w:r>
@@ -6211,56 +6809,112 @@
           <w:sz w:val="20"/>
           <w:szCs w:val="20"/>
         </w:rPr>
-        <w:t>zoznam vyššie) v nastavenom čase.</w:t>
+        <w:t>zoznam vyššie)</w:t>
       </w:r>
       <w:r>
         <w:rPr>
           <w:sz w:val="20"/>
           <w:szCs w:val="20"/>
         </w:rPr>
-        <w:t xml:space="preserve"> Ak je viac časovačov nastavených na rovnakú hodinu, spustia sa podľa poradia ich </w:t>
+        <w:t xml:space="preserve"> </w:t>
       </w:r>
       <w:r>
         <w:rPr>
           <w:sz w:val="20"/>
           <w:szCs w:val="20"/>
         </w:rPr>
-        <w:t>identifikačných</w:t>
+        <w:t>v</w:t>
       </w:r>
       <w:r>
         <w:rPr>
           <w:sz w:val="20"/>
           <w:szCs w:val="20"/>
         </w:rPr>
-        <w:t xml:space="preserve"> čísel (ID) </w:t>
+        <w:t> </w:t>
       </w:r>
       <w:r>
         <w:rPr>
           <w:sz w:val="20"/>
           <w:szCs w:val="20"/>
         </w:rPr>
-        <w:t>(</w:t>
+        <w:t>nastavenom čase.</w:t>
       </w:r>
       <w:r>
         <w:rPr>
           <w:sz w:val="20"/>
           <w:szCs w:val="20"/>
         </w:rPr>
-        <w:t xml:space="preserve">t. j. </w:t>
+        <w:t xml:space="preserve"> Ak je viac časovačov nastavených na rovnakú hodinu, spustia sa podľa poradia ich </w:t>
       </w:r>
       <w:r>
         <w:rPr>
           <w:sz w:val="20"/>
           <w:szCs w:val="20"/>
         </w:rPr>
-        <w:t xml:space="preserve">časovač s najmenším číslom </w:t>
+        <w:t>identifikačných</w:t>
       </w:r>
       <w:r>
         <w:rPr>
           <w:sz w:val="20"/>
           <w:szCs w:val="20"/>
         </w:rPr>
-        <w:t>prvý, po ňom časovač s druhým najmenším číslom atď...</w:t>
+        <w:t xml:space="preserve"> čísel (ID) </w:t>
+      </w:r>
+      <w:r>
+        <w:rPr>
+          <w:sz w:val="20"/>
+          <w:szCs w:val="20"/>
+        </w:rPr>
+        <w:t>(</w:t>
+      </w:r>
+      <w:r>
+        <w:rPr>
+          <w:sz w:val="20"/>
+          <w:szCs w:val="20"/>
+        </w:rPr>
+        <w:t xml:space="preserve">t. j. </w:t>
+      </w:r>
+      <w:r>
+        <w:rPr>
+          <w:sz w:val="20"/>
+          <w:szCs w:val="20"/>
+        </w:rPr>
+        <w:t>časovač s</w:t>
+      </w:r>
+      <w:r>
+        <w:rPr>
+          <w:sz w:val="20"/>
+          <w:szCs w:val="20"/>
+        </w:rPr>
+        <w:t> </w:t>
+      </w:r>
+      <w:r>
+        <w:rPr>
+          <w:sz w:val="20"/>
+          <w:szCs w:val="20"/>
+        </w:rPr>
+        <w:t xml:space="preserve">najmenším číslom </w:t>
+      </w:r>
+      <w:r>
+        <w:rPr>
+          <w:sz w:val="20"/>
+          <w:szCs w:val="20"/>
+        </w:rPr>
+        <w:t>prvý, po ňom časovač s</w:t>
+      </w:r>
+      <w:r>
+        <w:rPr>
+          <w:sz w:val="20"/>
+          <w:szCs w:val="20"/>
+        </w:rPr>
+        <w:t> </w:t>
+      </w:r>
+      <w:r>
+        <w:rPr>
+          <w:sz w:val="20"/>
+          <w:szCs w:val="20"/>
+        </w:rPr>
+        <w:t>druhým najmenším číslom atď...</w:t>
       </w:r>
       <w:r>
         <w:rPr>
@@ -6390,7 +7044,13 @@
               <w:t>4</w:t>
             </w:r>
             <w:r>
-              <w:t xml:space="preserve"> - </w:t>
+              <w:t xml:space="preserve"> </w:t>
+            </w:r>
+            <w:r>
+              <w:t>–</w:t>
+            </w:r>
+            <w:r>
+              <w:t xml:space="preserve"> </w:t>
             </w:r>
             <w:r>
               <w:t>Dátum</w:t>
@@ -6657,7 +7317,13 @@
               <w:t>5</w:t>
             </w:r>
             <w:r>
-              <w:t xml:space="preserve"> - Rok</w:t>
+              <w:t xml:space="preserve"> </w:t>
+            </w:r>
+            <w:r>
+              <w:t>–</w:t>
+            </w:r>
+            <w:r>
+              <w:t xml:space="preserve"> Rok</w:t>
             </w:r>
           </w:p>
         </w:tc>
@@ -6843,71 +7509,160 @@
       </w:tr>
     </w:tbl>
     <w:p>
-      <w:r>
+      <w:pPr>
+        <w:jc w:val="left"/>
         <w:rPr>
           <w:rStyle w:val="Nadpis2Char"/>
           <w:rFonts w:eastAsiaTheme="minorHAnsi" w:cstheme="minorBidi"/>
           <w:b w:val="0"/>
           <w:color w:val="auto"/>
-          <w:szCs w:val="24"/>
-        </w:rPr>
-        <w:br/>
-      </w:r>
-      <w:r>
-        <w:t xml:space="preserve">Pre ukončenie nastavovacieho režimu </w:t>
-      </w:r>
-      <w:r>
-        <w:t>držte stlačené obe krajné tlačidl</w:t>
-      </w:r>
-      <w:r>
-        <w:t>á</w:t>
-      </w:r>
-      <w:r>
-        <w:t xml:space="preserve"> až kým nezmizne kurzor.</w:t>
-      </w:r>
-      <w:bookmarkStart w:id="7" w:name="_Toc230111769"/>
-    </w:p>
-    <w:p>
-      <w:pPr>
-        <w:pStyle w:val="Nadpis2"/>
-      </w:pPr>
-      <w:r>
-        <w:br/>
-      </w:r>
-      <w:r>
-        <w:t xml:space="preserve">Nastavovanie </w:t>
-      </w:r>
-      <w:r>
-        <w:t>jasu</w:t>
-      </w:r>
-      <w:r>
-        <w:t xml:space="preserve"> displeja</w:t>
+          <w:sz w:val="20"/>
+          <w:szCs w:val="20"/>
+        </w:rPr>
+      </w:pPr>
+      <w:bookmarkStart w:id="7" w:name="_Toc230184623"/>
+      <w:r>
+        <w:rPr>
+          <w:rStyle w:val="Nadpis2Char"/>
+          <w:rFonts w:eastAsiaTheme="minorHAnsi" w:cstheme="minorBidi"/>
+          <w:bCs/>
+          <w:color w:val="auto"/>
+          <w:sz w:val="20"/>
+          <w:szCs w:val="20"/>
+        </w:rPr>
+        <w:t>Poznámka:</w:t>
+      </w:r>
+      <w:r>
+        <w:rPr>
+          <w:rStyle w:val="Nadpis2Char"/>
+          <w:rFonts w:eastAsiaTheme="minorHAnsi" w:cstheme="minorBidi"/>
+          <w:b w:val="0"/>
+          <w:color w:val="auto"/>
+          <w:sz w:val="20"/>
+          <w:szCs w:val="20"/>
+        </w:rPr>
+        <w:t xml:space="preserve"> Hodnota v zátvorke je predvolená</w:t>
+      </w:r>
+      <w:r>
+        <w:rPr>
+          <w:rStyle w:val="Nadpis2Char"/>
+          <w:rFonts w:eastAsiaTheme="minorHAnsi" w:cstheme="minorBidi"/>
+          <w:b w:val="0"/>
+          <w:color w:val="auto"/>
+          <w:sz w:val="20"/>
+          <w:szCs w:val="20"/>
+        </w:rPr>
+        <w:t xml:space="preserve"> (výrobné nastavenie)</w:t>
+      </w:r>
+      <w:r>
+        <w:rPr>
+          <w:rStyle w:val="Nadpis2Char"/>
+          <w:rFonts w:eastAsiaTheme="minorHAnsi" w:cstheme="minorBidi"/>
+          <w:b w:val="0"/>
+          <w:color w:val="auto"/>
+          <w:sz w:val="20"/>
+          <w:szCs w:val="20"/>
+        </w:rPr>
+        <w:t>.</w:t>
       </w:r>
       <w:bookmarkEnd w:id="7"/>
     </w:p>
     <w:p>
       <w:r>
-        <w:t xml:space="preserve">Mimo nastavovacieho režimu slúžia krajné tlačidlá </w:t>
-      </w:r>
-      <w:r>
-        <w:t xml:space="preserve">aj </w:t>
-      </w:r>
-      <w:r>
-        <w:t>na nastavovanie jasu</w:t>
-      </w:r>
-      <w:r>
-        <w:t xml:space="preserve"> samotného</w:t>
-      </w:r>
-      <w:r>
-        <w:t xml:space="preserve"> numitronového displeja.</w:t>
+        <w:t xml:space="preserve">Pre </w:t>
+      </w:r>
+      <w:r>
+        <w:rPr>
+          <w:b/>
+          <w:bCs/>
+        </w:rPr>
+        <w:t>ukončenie nastavovacieho režimu</w:t>
+      </w:r>
+      <w:r>
+        <w:t xml:space="preserve"> </w:t>
+      </w:r>
+      <w:r>
+        <w:t>držte stlačené obe krajné tlačidl</w:t>
+      </w:r>
+      <w:r>
+        <w:t>á</w:t>
+      </w:r>
+      <w:r>
+        <w:t xml:space="preserve"> až kým nezmizne kurzor.</w:t>
+      </w:r>
+      <w:r>
+        <w:t xml:space="preserve"> Prípadne sa nastavovací režim vypne automaticky </w:t>
+      </w:r>
+      <w:r>
+        <w:t>po piatich minútach neaktivity</w:t>
+      </w:r>
+      <w:r>
+        <w:t xml:space="preserve"> a to </w:t>
+      </w:r>
+      <w:r>
+        <w:rPr>
+          <w:b/>
+          <w:bCs/>
+        </w:rPr>
+        <w:t>bez uloženia</w:t>
+      </w:r>
+      <w:r>
+        <w:t xml:space="preserve"> </w:t>
+      </w:r>
+      <w:r>
+        <w:t>zmien na poslednej upravovanej stránke</w:t>
+      </w:r>
+      <w:r>
+        <w:t xml:space="preserve"> nastavení.</w:t>
       </w:r>
     </w:p>
     <w:p>
       <w:pPr>
+        <w:pStyle w:val="Nadpis2"/>
+      </w:pPr>
+      <w:r>
+        <w:br/>
+      </w:r>
+      <w:bookmarkStart w:id="8" w:name="_Toc230184624"/>
+      <w:r>
+        <w:t xml:space="preserve">Nastavovanie </w:t>
+      </w:r>
+      <w:r>
+        <w:t>jasu</w:t>
+      </w:r>
+      <w:r>
+        <w:t xml:space="preserve"> displeja</w:t>
+      </w:r>
+      <w:bookmarkEnd w:id="8"/>
+    </w:p>
+    <w:p>
+      <w:r>
+        <w:t xml:space="preserve">Mimo nastavovacieho režimu slúžia krajné tlačidlá aj na nastavovanie jasu numitronového displeja. </w:t>
+      </w:r>
+      <w:r>
+        <w:rPr>
+          <w:b/>
+          <w:bCs/>
+        </w:rPr>
+        <w:t>Táto funkcia je dostupná len vtedy, keď je v nastaveniach hodín vypnuté automatické riadenie jas</w:t>
+      </w:r>
+      <w:r>
+        <w:rPr>
+          <w:b/>
+          <w:bCs/>
+        </w:rPr>
+        <w:t>u</w:t>
+      </w:r>
+      <w:r>
+        <w:t>.</w:t>
+      </w:r>
+    </w:p>
+    <w:p>
+      <w:pPr>
         <w:jc w:val="left"/>
       </w:pPr>
       <w:r>
-        <w:t xml:space="preserve">  </w:t>
+        <w:t xml:space="preserve"> </w:t>
       </w:r>
       <w:r>
         <w:rPr>
@@ -6950,6 +7705,9 @@
         </w:drawing>
       </w:r>
       <w:r>
+        <w:t xml:space="preserve"> </w:t>
+      </w:r>
+      <w:r>
         <w:t xml:space="preserve">— </w:t>
       </w:r>
       <w:r>
@@ -7048,7 +7806,7 @@
       <w:pPr>
         <w:pStyle w:val="Nadpis2"/>
       </w:pPr>
-      <w:bookmarkStart w:id="8" w:name="_Toc230111770"/>
+      <w:bookmarkStart w:id="9" w:name="_Toc230184625"/>
       <w:r>
         <w:t>Zobrazovanie dátumu a</w:t>
       </w:r>
@@ -7058,96 +7816,22 @@
       <w:r>
         <w:t>teploty</w:t>
       </w:r>
-      <w:bookmarkEnd w:id="8"/>
+      <w:bookmarkEnd w:id="9"/>
     </w:p>
     <w:p>
       <w:r>
-        <w:t>Krátk</w:t>
-      </w:r>
-      <w:r>
-        <w:t>e</w:t>
-      </w:r>
-      <w:r>
-        <w:t xml:space="preserve"> stlače</w:t>
-      </w:r>
-      <w:r>
-        <w:t xml:space="preserve">nie </w:t>
-      </w:r>
-      <w:r>
-        <w:t xml:space="preserve">oboch krajných tlačidiel panela mimo nastavovacieho režimu </w:t>
-      </w:r>
-      <w:r>
-        <w:t>zobraz</w:t>
-      </w:r>
-      <w:r>
-        <w:t>í</w:t>
-      </w:r>
-      <w:r>
-        <w:t xml:space="preserve"> teplotu okolia</w:t>
-      </w:r>
-      <w:r>
-        <w:t xml:space="preserve"> (teplotný senzor sa nachádza v blízkosti </w:t>
-      </w:r>
-      <w:r>
-        <w:t xml:space="preserve">mincovej </w:t>
-      </w:r>
-      <w:r>
-        <w:t>batérie)</w:t>
-      </w:r>
-      <w:r>
-        <w:t>. Opätovn</w:t>
-      </w:r>
-      <w:r>
-        <w:t>ým krátkym</w:t>
-      </w:r>
-      <w:r>
-        <w:t xml:space="preserve"> stlačením oboch tlačidiel pri zobrazenej teplot</w:t>
-      </w:r>
-      <w:r>
-        <w:t>e</w:t>
-      </w:r>
-      <w:r>
-        <w:t xml:space="preserve"> sa zobrazí aktuálny dátum.</w:t>
-      </w:r>
-    </w:p>
-    <w:p>
-      <w:pPr>
-        <w:rPr>
-          <w:rStyle w:val="Nadpis2Char"/>
-          <w:rFonts w:eastAsiaTheme="minorHAnsi" w:cstheme="minorBidi"/>
-          <w:color w:val="auto"/>
-          <w:szCs w:val="24"/>
-        </w:rPr>
-      </w:pPr>
-      <w:r>
-        <w:t xml:space="preserve">Tieto údaje sa zobrazia </w:t>
-      </w:r>
-      <w:r>
-        <w:t>len na</w:t>
-      </w:r>
-      <w:r>
-        <w:t xml:space="preserve"> pár sekúnd</w:t>
-      </w:r>
-      <w:r>
-        <w:t>, po ktorých</w:t>
-      </w:r>
-      <w:r>
-        <w:t xml:space="preserve"> sa hodiny vrátia</w:t>
-      </w:r>
-      <w:r>
-        <w:t xml:space="preserve"> späť</w:t>
-      </w:r>
-      <w:r>
-        <w:t xml:space="preserve"> k zobrazovaniu času.</w:t>
-      </w:r>
-      <w:r>
-        <w:rPr>
-          <w:rStyle w:val="Nadpis2Char"/>
-          <w:rFonts w:eastAsiaTheme="minorHAnsi" w:cstheme="minorBidi"/>
-          <w:b w:val="0"/>
-          <w:color w:val="auto"/>
-          <w:szCs w:val="24"/>
-        </w:rPr>
+        <w:t>Krátkym stlačením oboch tlačidiel sa zobrazí teplota okolia, ďalším stlačením dátum — oba údaje len na pár sekúnd</w:t>
+      </w:r>
+      <w:r>
+        <w:t>, po ktorých sa hodiny vrátia k zobraz</w:t>
+      </w:r>
+      <w:r>
+        <w:t>eniu</w:t>
+      </w:r>
+      <w:r>
+        <w:t xml:space="preserve"> času.</w:t>
+      </w:r>
+      <w:r>
         <w:br w:type="page"/>
       </w:r>
     </w:p>
@@ -7162,7 +7846,7 @@
           <w:szCs w:val="24"/>
         </w:rPr>
       </w:pPr>
-      <w:bookmarkStart w:id="9" w:name="_Toc230111771"/>
+      <w:bookmarkStart w:id="10" w:name="_Toc230184626"/>
       <w:r>
         <w:rPr>
           <w:rStyle w:val="Nadpis2Char"/>
@@ -7174,7 +7858,7 @@
         <w:lastRenderedPageBreak/>
         <w:t>Základné komponenty hodín</w:t>
       </w:r>
-      <w:bookmarkEnd w:id="9"/>
+      <w:bookmarkEnd w:id="10"/>
     </w:p>
     <w:p>
       <w:pPr>
@@ -9462,14 +10146,14 @@
       <w:r>
         <w:br/>
       </w:r>
-      <w:bookmarkStart w:id="10" w:name="_Toc230111772"/>
+      <w:bookmarkStart w:id="11" w:name="_Toc230184627"/>
       <w:r>
         <w:t xml:space="preserve">1. </w:t>
       </w:r>
       <w:r>
         <w:t>Poistka</w:t>
       </w:r>
-      <w:bookmarkEnd w:id="10"/>
+      <w:bookmarkEnd w:id="11"/>
     </w:p>
     <w:p>
       <w:pPr>
@@ -9485,7 +10169,13 @@
         <w:rPr>
           <w:rFonts w:cs="Courier New"/>
         </w:rPr>
-        <w:t>Jedná sa o hardvérovú ochranu pred nadprúdom</w:t>
+        <w:t xml:space="preserve">Ide </w:t>
+      </w:r>
+      <w:r>
+        <w:rPr>
+          <w:rFonts w:cs="Courier New"/>
+        </w:rPr>
+        <w:t>o hardvérovú ochranu pred nadprúdom</w:t>
       </w:r>
       <w:r>
         <w:rPr>
@@ -9546,7 +10236,7 @@
         </w:rPr>
         <w:br/>
       </w:r>
-      <w:bookmarkStart w:id="11" w:name="_Toc230111773"/>
+      <w:bookmarkStart w:id="12" w:name="_Toc230184628"/>
       <w:r>
         <w:rPr>
           <w:rStyle w:val="Nadpis2Char"/>
@@ -9554,7 +10244,7 @@
         </w:rPr>
         <w:t>2. Napájanie</w:t>
       </w:r>
-      <w:bookmarkEnd w:id="11"/>
+      <w:bookmarkEnd w:id="12"/>
     </w:p>
     <w:p>
       <w:pPr>
@@ -9600,7 +10290,7 @@
       <w:r>
         <w:br/>
       </w:r>
-      <w:bookmarkStart w:id="12" w:name="_Toc230111774"/>
+      <w:bookmarkStart w:id="13" w:name="_Toc230184629"/>
       <w:r>
         <w:t xml:space="preserve">3. </w:t>
       </w:r>
@@ -9610,7 +10300,7 @@
       <w:r>
         <w:t>eb</w:t>
       </w:r>
-      <w:bookmarkEnd w:id="12"/>
+      <w:bookmarkEnd w:id="13"/>
     </w:p>
     <w:p>
       <w:pPr>
@@ -9670,7 +10360,7 @@
       <w:pPr>
         <w:pStyle w:val="Nadpis2"/>
       </w:pPr>
-      <w:bookmarkStart w:id="13" w:name="_Toc230111775"/>
+      <w:bookmarkStart w:id="14" w:name="_Toc230184630"/>
       <w:r>
         <w:lastRenderedPageBreak/>
         <w:t>4</w:t>
@@ -9696,88 +10386,44 @@
       <w:r>
         <w:t>DCF77 prijímača</w:t>
       </w:r>
-      <w:bookmarkEnd w:id="13"/>
+      <w:bookmarkEnd w:id="14"/>
     </w:p>
     <w:p>
       <w:r>
-        <w:t>Doska hodín disponuje vlastným napäťovým regulátorom založeným na Zenerovej dióde. Jeho úlohou je vytvárať relatívne stabilné nastaviteľné napätie</w:t>
-      </w:r>
-      <w:r>
-        <w:t xml:space="preserve"> (v rozsahu od 1,1 V po 3,6 V)</w:t>
-      </w:r>
-      <w:r>
-        <w:t xml:space="preserve"> pre DCF77 prijímač</w:t>
-      </w:r>
-      <w:r>
-        <w:t xml:space="preserve">, nakoľko existujú rôzne typy s rôznymi požiadavkami na </w:t>
-      </w:r>
-      <w:r>
-        <w:t xml:space="preserve">napájacie </w:t>
-      </w:r>
-      <w:r>
-        <w:t>napätie</w:t>
-      </w:r>
-      <w:r>
-        <w:t>.</w:t>
+        <w:t xml:space="preserve">Doska hodín disponuje vlastným napäťovým regulátorom </w:t>
+      </w:r>
+      <w:r>
+        <w:t>so</w:t>
+      </w:r>
+      <w:r>
+        <w:t xml:space="preserve"> Zenerov</w:t>
+      </w:r>
+      <w:r>
+        <w:t xml:space="preserve">ou </w:t>
+      </w:r>
+      <w:r>
+        <w:t>diód</w:t>
+      </w:r>
+      <w:r>
+        <w:t>ou</w:t>
+      </w:r>
+      <w:r>
+        <w:t>, ktorý vytvára nastaviteľné napätie (1,1 – 3,6 V) pre DCF77 prijímač — rôzne typy prijímačov totiž vyžadujú rôzne napájacie napätie.</w:t>
       </w:r>
     </w:p>
     <w:p>
       <w:r>
-        <w:t>Výstupné napätie regulátora sa nastavuje pomocou trimmera</w:t>
-      </w:r>
-      <w:r>
-        <w:t xml:space="preserve">, </w:t>
+        <w:t xml:space="preserve">Výstupné napätie regulátora sa nastavuje pomocou trimmera. S trimmerom manipulujte len v nevyhnutných prípadoch (napr. pri výmene prijímača) — </w:t>
       </w:r>
       <w:r>
         <w:rPr>
           <w:b/>
           <w:bCs/>
         </w:rPr>
-        <w:t>avšak silno neodporúčame manipulovať s týmto trimm</w:t>
-      </w:r>
-      <w:r>
-        <w:rPr>
-          <w:b/>
-          <w:bCs/>
-        </w:rPr>
-        <w:t>e</w:t>
-      </w:r>
-      <w:r>
-        <w:rPr>
-          <w:b/>
-          <w:bCs/>
-        </w:rPr>
-        <w:t>rom pokiaľ to nie je nevyhnutné</w:t>
-      </w:r>
-      <w:r>
-        <w:t xml:space="preserve"> (napr. pri zmene prijímača a</w:t>
-      </w:r>
-      <w:r>
-        <w:t> </w:t>
-      </w:r>
-      <w:r>
-        <w:t>pod</w:t>
+        <w:t>nesprávne nastavenie môže viesť k trvalému poškodeniu prijímača</w:t>
       </w:r>
       <w:r>
         <w:t>.</w:t>
-      </w:r>
-      <w:r>
-        <w:t>)</w:t>
-      </w:r>
-      <w:r>
-        <w:t>, inak môže dôjsť k trvalému poškodeniu pr</w:t>
-      </w:r>
-      <w:r>
-        <w:t>i</w:t>
-      </w:r>
-      <w:r>
-        <w:t>j</w:t>
-      </w:r>
-      <w:r>
-        <w:t>í</w:t>
-      </w:r>
-      <w:r>
-        <w:t>mača.</w:t>
       </w:r>
     </w:p>
     <w:p/>
@@ -9785,21 +10431,71 @@
       <w:pPr>
         <w:pStyle w:val="Nadpis2"/>
       </w:pPr>
-      <w:bookmarkStart w:id="14" w:name="_Toc230111776"/>
+      <w:bookmarkStart w:id="15" w:name="_Toc230184631"/>
       <w:r>
         <w:t>5. Prepojka nastavujúca napäťový zdroj DCF77 prijímača</w:t>
       </w:r>
-      <w:bookmarkEnd w:id="14"/>
+      <w:bookmarkEnd w:id="15"/>
     </w:p>
     <w:p>
       <w:r>
-        <w:t>V prípade potreby sa dá regulátor</w:t>
-      </w:r>
-      <w:r>
-        <w:t xml:space="preserve"> (4)</w:t>
-      </w:r>
-      <w:r>
-        <w:t xml:space="preserve"> pomocou prepojky obísť úplne a napájať DCF77 prijímač priamo z napájacieho zdroja samotných hodín (5V).</w:t>
+        <w:t>V prípade potreby sa dá regulátor (4) prepojkou obísť</w:t>
+      </w:r>
+      <w:r>
+        <w:t xml:space="preserve"> úplne</w:t>
+      </w:r>
+      <w:r>
+        <w:t xml:space="preserve"> a napájať prijímač priamo z</w:t>
+      </w:r>
+      <w:r>
+        <w:t>o zdroja hodín (</w:t>
+      </w:r>
+      <w:r>
+        <w:t>5 V</w:t>
+      </w:r>
+      <w:r>
+        <w:t>)</w:t>
+      </w:r>
+      <w:r>
+        <w:t xml:space="preserve">. </w:t>
+      </w:r>
+      <w:r>
+        <w:rPr>
+          <w:b/>
+          <w:bCs/>
+        </w:rPr>
+        <w:t xml:space="preserve">Pozor — priame napájanie </w:t>
+      </w:r>
+      <w:r>
+        <w:rPr>
+          <w:b/>
+          <w:bCs/>
+        </w:rPr>
+        <w:t xml:space="preserve">môže </w:t>
+      </w:r>
+      <w:r>
+        <w:rPr>
+          <w:b/>
+          <w:bCs/>
+        </w:rPr>
+        <w:t>poškod</w:t>
+      </w:r>
+      <w:r>
+        <w:rPr>
+          <w:b/>
+          <w:bCs/>
+        </w:rPr>
+        <w:t>iť</w:t>
+      </w:r>
+      <w:r>
+        <w:rPr>
+          <w:b/>
+          <w:bCs/>
+        </w:rPr>
+        <w:t xml:space="preserve"> prijímač s nižším napájacím napätím ako 5 V</w:t>
+      </w:r>
+      <w:r>
+        <w:t>.</w:t>
       </w:r>
     </w:p>
     <w:p/>
@@ -9807,21 +10503,39 @@
       <w:pPr>
         <w:pStyle w:val="Nadpis2"/>
       </w:pPr>
-      <w:bookmarkStart w:id="15" w:name="_Toc230111777"/>
+      <w:bookmarkStart w:id="16" w:name="_Toc230184632"/>
       <w:r>
         <w:t>6. Svetelný senzor pre automatické prispôsobenie jasu</w:t>
       </w:r>
-      <w:bookmarkEnd w:id="15"/>
+      <w:bookmarkEnd w:id="16"/>
     </w:p>
     <w:p>
       <w:r>
         <w:t>Hodiny</w:t>
       </w:r>
       <w:r>
-        <w:t xml:space="preserve"> si dokážu regulovať jas displeja na základe okolitého svetla (napr. cez deň je žiaduce aby displej svietil silnejšie ako v noci).</w:t>
-      </w:r>
-      <w:r>
-        <w:t xml:space="preserve"> Túto funkciu je možné vypnúť v</w:t>
+        <w:t xml:space="preserve"> si dokážu regulovať jas displeja na základe okolitého svetla (napr. cez deň je žiaduce</w:t>
+      </w:r>
+      <w:r>
+        <w:t>,</w:t>
+      </w:r>
+      <w:r>
+        <w:t xml:space="preserve"> aby displej svietil silnejšie ako v noci).</w:t>
+      </w:r>
+      <w:r>
+        <w:t xml:space="preserve"> </w:t>
+      </w:r>
+      <w:r>
+        <w:t>Pri zapnutom automatickom jas</w:t>
+      </w:r>
+      <w:r>
+        <w:t>e</w:t>
+      </w:r>
+      <w:r>
+        <w:t xml:space="preserve"> nejde nastavovať jas manuálne. </w:t>
+      </w:r>
+      <w:r>
+        <w:t>Túto funkciu je možné vypnúť v</w:t>
       </w:r>
       <w:r>
         <w:t> </w:t>
@@ -9844,36 +10558,33 @@
           <w:u w:val="single"/>
         </w:rPr>
       </w:pPr>
-      <w:bookmarkStart w:id="16" w:name="_Toc230111778"/>
+      <w:bookmarkStart w:id="17" w:name="_Toc230184633"/>
       <w:r>
         <w:t xml:space="preserve">7. Senzor prúdového odberu </w:t>
       </w:r>
       <w:r>
         <w:t>displeja</w:t>
       </w:r>
-      <w:bookmarkEnd w:id="16"/>
+      <w:bookmarkEnd w:id="17"/>
     </w:p>
     <w:p>
       <w:r>
-        <w:t>V rámci ochrany hodín aj numitronov používame priemyselný  prúdový senzor s presnosťou 0,5%. Na základe údajov z tohto senzora mikrokontr</w:t>
-      </w:r>
-      <w:r>
-        <w:t>o</w:t>
-      </w:r>
-      <w:r>
-        <w:t>l</w:t>
-      </w:r>
-      <w:r>
-        <w:t>é</w:t>
-      </w:r>
-      <w:r>
-        <w:t>r hodín vie detegovať chyby displeja (napr. vypálen</w:t>
-      </w:r>
-      <w:r>
-        <w:t xml:space="preserve">é vlákno </w:t>
-      </w:r>
-      <w:r>
-        <w:t>numitronu alebo skrat) a následne hodiny bezpečne odstaviť.</w:t>
+        <w:t xml:space="preserve">V rámci ochrany hodín aj numitronov používame priemyselný  prúdový senzor s presnosťou 0,5%. </w:t>
+      </w:r>
+      <w:r>
+        <w:t xml:space="preserve">Tento senzor umožňuje mikrokontroléru rozpoznať chyby displeja, napríklad vypálené vlákno alebo skrat, a potom </w:t>
+      </w:r>
+      <w:r>
+        <w:t xml:space="preserve">displej </w:t>
+      </w:r>
+      <w:r>
+        <w:t>hod</w:t>
+      </w:r>
+      <w:r>
+        <w:t>ín</w:t>
+      </w:r>
+      <w:r>
+        <w:t xml:space="preserve"> bezpečne vypnúť.</w:t>
       </w:r>
     </w:p>
     <w:p>
@@ -9891,11 +10602,12 @@
       <w:pPr>
         <w:pStyle w:val="Nadpis2"/>
       </w:pPr>
-      <w:bookmarkStart w:id="17" w:name="_Toc230111779"/>
+      <w:bookmarkStart w:id="18" w:name="_Toc230184634"/>
       <w:r>
         <w:rPr>
           <w:noProof/>
         </w:rPr>
+        <w:lastRenderedPageBreak/>
         <mc:AlternateContent>
           <mc:Choice Requires="wps">
             <w:drawing>
@@ -10074,11 +10786,32 @@
         </w:rPr>
         <w:t>Tlačidlo RESET</w:t>
       </w:r>
-      <w:bookmarkEnd w:id="17"/>
+      <w:bookmarkEnd w:id="18"/>
     </w:p>
     <w:p>
       <w:r>
-        <w:t>Krátkym stlačením tlačidla sa hodiny reštartujú. Ak tlačidlo podržíte počas celého spúšťania zariadenia, obnovia sa výrobné nastavenia.</w:t>
+        <w:t>Krátkym stlačením tlačidla sa hodiny reštartujú. Ak tlačidlo podržíte počas celého spúšťania zariadenia</w:t>
+      </w:r>
+      <w:r>
+        <w:t xml:space="preserve"> (indikovaného žltou farbou indikačnej LED</w:t>
+      </w:r>
+      <w:r>
+        <w:t>, viď stran</w:t>
+      </w:r>
+      <w:r>
+        <w:t>u</w:t>
+      </w:r>
+      <w:r>
+        <w:t xml:space="preserve"> 16</w:t>
+      </w:r>
+      <w:r>
+        <w:t>)</w:t>
+      </w:r>
+      <w:r>
+        <w:t>, obnovia sa výrobné nastaveni</w:t>
+      </w:r>
+      <w:r>
+        <w:t>a.</w:t>
       </w:r>
     </w:p>
     <w:p>
@@ -10096,7 +10829,7 @@
           <w:b/>
         </w:rPr>
       </w:pPr>
-      <w:bookmarkStart w:id="18" w:name="_Toc230111780"/>
+      <w:bookmarkStart w:id="19" w:name="_Toc230184635"/>
       <w:r>
         <w:rPr>
           <w:rStyle w:val="Nadpis2Char"/>
@@ -10132,7 +10865,7 @@
         </w:rPr>
         <w:t>r</w:t>
       </w:r>
-      <w:bookmarkEnd w:id="18"/>
+      <w:bookmarkEnd w:id="19"/>
     </w:p>
     <w:p>
       <w:pPr>
@@ -10367,7 +11100,7 @@
       <w:pPr>
         <w:pStyle w:val="Nadpis2"/>
       </w:pPr>
-      <w:bookmarkStart w:id="19" w:name="_Toc230111781"/>
+      <w:bookmarkStart w:id="20" w:name="_Toc230184636"/>
       <w:r>
         <w:rPr>
           <w:rFonts w:cs="Courier New"/>
@@ -10461,7 +11194,7 @@
       <w:r>
         <w:t>Záložná batéria</w:t>
       </w:r>
-      <w:bookmarkEnd w:id="19"/>
+      <w:bookmarkEnd w:id="20"/>
     </w:p>
     <w:p>
       <w:pPr>
@@ -10538,12 +11271,14 @@
       <w:pPr>
         <w:pStyle w:val="Nadpis2"/>
       </w:pPr>
+      <w:bookmarkStart w:id="21" w:name="_Toc230184637"/>
       <w:r>
         <w:t xml:space="preserve">11. </w:t>
       </w:r>
       <w:r>
         <w:t>UART zbernica</w:t>
       </w:r>
+      <w:bookmarkEnd w:id="21"/>
     </w:p>
     <w:p>
       <w:r>
@@ -10563,10 +11298,12 @@
       <w:pPr>
         <w:pStyle w:val="Nadpis2"/>
       </w:pPr>
+      <w:bookmarkStart w:id="22" w:name="_Toc230184638"/>
       <w:r>
         <w:lastRenderedPageBreak/>
         <w:t>12. ICSP zbernica</w:t>
       </w:r>
+      <w:bookmarkEnd w:id="22"/>
     </w:p>
     <w:p>
       <w:r>
@@ -10580,12 +11317,13 @@
       <w:r>
         <w:br/>
       </w:r>
+      <w:bookmarkStart w:id="23" w:name="_Toc230184639"/>
       <w:r>
         <w:t>Nočný režim</w:t>
       </w:r>
+      <w:bookmarkEnd w:id="23"/>
     </w:p>
     <w:p>
-      <w:bookmarkStart w:id="20" w:name="_Toc230111782"/>
       <w:r>
         <w:t>Režim, v ktorom je displej vypnutý, zatiaľ čo hodiny zostávajú zapnuté. Stlačením ľubovoľného tlačidla</w:t>
       </w:r>
@@ -10609,14 +11347,14 @@
       <w:r>
         <w:br/>
       </w:r>
+      <w:bookmarkStart w:id="24" w:name="_Toc230184640"/>
       <w:r>
         <w:t>Úložný priestor</w:t>
       </w:r>
-      <w:bookmarkEnd w:id="20"/>
+      <w:bookmarkEnd w:id="24"/>
     </w:p>
     <w:p>
       <w:pPr>
-        <w:pStyle w:val="Nadpis2"/>
         <w:jc w:val="center"/>
       </w:pPr>
       <w:r>
@@ -10624,9 +11362,9 @@
           <w:noProof/>
         </w:rPr>
         <w:drawing>
-          <wp:inline distT="0" distB="0" distL="0" distR="0" wp14:anchorId="489B5088" wp14:editId="1AAF9ED8">
-            <wp:extent cx="4102100" cy="1311920"/>
-            <wp:effectExtent l="0" t="0" r="0" b="2540"/>
+          <wp:inline distT="0" distB="0" distL="0" distR="0" wp14:anchorId="489B5088" wp14:editId="126C9289">
+            <wp:extent cx="3853543" cy="1232427"/>
+            <wp:effectExtent l="0" t="0" r="0" b="6350"/>
             <wp:docPr id="21665932" name="Obrázek 1"/>
             <wp:cNvGraphicFramePr>
               <a:graphicFrameLocks xmlns:a="http://schemas.openxmlformats.org/drawingml/2006/main" noChangeAspect="1"/>
@@ -10647,7 +11385,7 @@
                   <pic:spPr>
                     <a:xfrm>
                       <a:off x="0" y="0"/>
-                      <a:ext cx="4146720" cy="1326190"/>
+                      <a:ext cx="3926109" cy="1255635"/>
                     </a:xfrm>
                     <a:prstGeom prst="rect">
                       <a:avLst/>
@@ -10667,35 +11405,31 @@
           <w:sz w:val="20"/>
           <w:szCs w:val="20"/>
         </w:rPr>
-        <w:t>Obr</w:t>
+        <w:t xml:space="preserve">Obr. </w:t>
       </w:r>
       <w:r>
         <w:rPr>
           <w:sz w:val="20"/>
           <w:szCs w:val="20"/>
         </w:rPr>
-        <w:t xml:space="preserve">. </w:t>
+        <w:t>5</w:t>
       </w:r>
       <w:r>
         <w:rPr>
           <w:sz w:val="20"/>
           <w:szCs w:val="20"/>
         </w:rPr>
-        <w:t>5</w:t>
+        <w:t xml:space="preserve"> </w:t>
       </w:r>
       <w:r>
         <w:rPr>
           <w:sz w:val="20"/>
           <w:szCs w:val="20"/>
         </w:rPr>
-        <w:t xml:space="preserve"> </w:t>
-      </w:r>
-      <w:r>
-        <w:rPr>
-          <w:sz w:val="20"/>
-          <w:szCs w:val="20"/>
-        </w:rPr>
-        <w:t>Podstavec hodín s odkrytým predným krytom, uchyteným magnetmi, ktorý odhaľuje úložný priestor.</w:t>
+        <w:t>Podstavec hodín s odkrytým predným krytom, uchyteným magnetmi, ktorý odhaľuje úložný priestor</w:t>
+      </w:r>
+      <w:r>
+        <w:t>.</w:t>
       </w:r>
     </w:p>
     <w:p>
@@ -10975,7 +11709,7 @@
       <w:pPr>
         <w:pStyle w:val="Nadpis1"/>
       </w:pPr>
-      <w:bookmarkStart w:id="21" w:name="_Toc230111783"/>
+      <w:bookmarkStart w:id="25" w:name="_Toc230184641"/>
       <w:r>
         <w:t>Pr</w:t>
       </w:r>
@@ -10991,7 +11725,7 @@
       <w:r>
         <w:t>mač DCF77</w:t>
       </w:r>
-      <w:bookmarkEnd w:id="21"/>
+      <w:bookmarkEnd w:id="25"/>
     </w:p>
     <w:p>
       <w:pPr>
@@ -11185,7 +11919,7 @@
       <w:pPr>
         <w:pStyle w:val="Nadpis2"/>
       </w:pPr>
-      <w:bookmarkStart w:id="22" w:name="_Toc230111784"/>
+      <w:bookmarkStart w:id="26" w:name="_Toc230184642"/>
       <w:r>
         <w:lastRenderedPageBreak/>
         <w:t>O</w:t>
@@ -11193,7 +11927,7 @@
       <w:r>
         <w:t>rientácia prijímača</w:t>
       </w:r>
-      <w:bookmarkEnd w:id="22"/>
+      <w:bookmarkEnd w:id="26"/>
     </w:p>
     <w:p>
       <w:r>
@@ -11528,7 +12262,7 @@
       <w:pPr>
         <w:pStyle w:val="Nadpis2"/>
       </w:pPr>
-      <w:bookmarkStart w:id="23" w:name="_Toc230111785"/>
+      <w:bookmarkStart w:id="27" w:name="_Toc230184643"/>
       <w:r>
         <w:t>Automatick</w:t>
       </w:r>
@@ -11544,7 +12278,7 @@
       <w:r>
         <w:t>hodín</w:t>
       </w:r>
-      <w:bookmarkEnd w:id="23"/>
+      <w:bookmarkEnd w:id="27"/>
     </w:p>
     <w:p>
       <w:r>
@@ -11558,12 +12292,12 @@
       <w:pPr>
         <w:pStyle w:val="Nadpis2"/>
       </w:pPr>
-      <w:bookmarkStart w:id="24" w:name="_Toc230111786"/>
+      <w:bookmarkStart w:id="28" w:name="_Toc230184644"/>
       <w:r>
         <w:lastRenderedPageBreak/>
         <w:t>Stavy indikačnej LED</w:t>
       </w:r>
-      <w:bookmarkEnd w:id="24"/>
+      <w:bookmarkEnd w:id="28"/>
     </w:p>
     <w:p>
       <w:r>
@@ -12278,7 +13012,13 @@
         <w:rPr>
           <w:rFonts w:cs="Courier New"/>
         </w:rPr>
-        <w:t xml:space="preserve">indikačnej LED </w:t>
+        <w:t>indikačnej LED</w:t>
+      </w:r>
+      <w:r>
+        <w:rPr>
+          <w:rFonts w:cs="Courier New"/>
+        </w:rPr>
+        <w:t xml:space="preserve">, aby bola menej rušivá, </w:t>
       </w:r>
       <w:r>
         <w:rPr>
@@ -12334,12 +13074,12 @@
       <w:pPr>
         <w:pStyle w:val="Nadpis2"/>
       </w:pPr>
-      <w:bookmarkStart w:id="25" w:name="_Toc230111787"/>
+      <w:bookmarkStart w:id="29" w:name="_Toc230184645"/>
       <w:r>
         <w:lastRenderedPageBreak/>
         <w:t>Numitronový displej a jeho životnosť</w:t>
       </w:r>
-      <w:bookmarkEnd w:id="25"/>
+      <w:bookmarkEnd w:id="29"/>
     </w:p>
     <w:p>
       <w:r>
@@ -12542,7 +13282,118 @@
         <mc:AlternateContent>
           <mc:Choice Requires="wps">
             <w:drawing>
-              <wp:anchor distT="0" distB="0" distL="114300" distR="114300" simplePos="0" relativeHeight="251809792" behindDoc="0" locked="0" layoutInCell="1" allowOverlap="1" wp14:anchorId="341E5036" wp14:editId="21B37EB1">
+              <wp:anchor distT="0" distB="0" distL="114300" distR="114300" simplePos="0" relativeHeight="251812864" behindDoc="0" locked="0" layoutInCell="1" allowOverlap="1" wp14:anchorId="2CF3BC17" wp14:editId="65260FF4">
+                <wp:simplePos x="0" y="0"/>
+                <wp:positionH relativeFrom="column">
+                  <wp:posOffset>3086735</wp:posOffset>
+                </wp:positionH>
+                <wp:positionV relativeFrom="paragraph">
+                  <wp:posOffset>932180</wp:posOffset>
+                </wp:positionV>
+                <wp:extent cx="838200" cy="371475"/>
+                <wp:effectExtent l="0" t="0" r="0" b="0"/>
+                <wp:wrapNone/>
+                <wp:docPr id="1601367130" name="Textové pole 69"/>
+                <wp:cNvGraphicFramePr/>
+                <a:graphic xmlns:a="http://schemas.openxmlformats.org/drawingml/2006/main">
+                  <a:graphicData uri="http://schemas.microsoft.com/office/word/2010/wordprocessingShape">
+                    <wps:wsp>
+                      <wps:cNvSpPr txBox="1"/>
+                      <wps:spPr>
+                        <a:xfrm>
+                          <a:off x="0" y="0"/>
+                          <a:ext cx="838200" cy="371475"/>
+                        </a:xfrm>
+                        <a:prstGeom prst="rect">
+                          <a:avLst/>
+                        </a:prstGeom>
+                        <a:noFill/>
+                        <a:ln w="6350">
+                          <a:noFill/>
+                        </a:ln>
+                      </wps:spPr>
+                      <wps:txbx>
+                        <w:txbxContent>
+                          <w:p>
+                            <w:pPr>
+                              <w:rPr>
+                                <w:rFonts w:ascii="JetBrains Mono ExtraBold" w:hAnsi="JetBrains Mono ExtraBold" w:cs="JetBrains Mono ExtraBold"/>
+                                <w:sz w:val="16"/>
+                                <w:szCs w:val="16"/>
+                                <w:lang w:val="cs-CZ"/>
+                              </w:rPr>
+                            </w:pPr>
+                            <w:r>
+                              <w:rPr>
+                                <w:rFonts w:ascii="JetBrains Mono ExtraBold" w:hAnsi="JetBrains Mono ExtraBold" w:cs="JetBrains Mono ExtraBold"/>
+                                <w:sz w:val="16"/>
+                                <w:szCs w:val="16"/>
+                                <w:lang w:val="cs-CZ"/>
+                              </w:rPr>
+                              <w:t>Jasnosť</w:t>
+                            </w:r>
+                          </w:p>
+                        </w:txbxContent>
+                      </wps:txbx>
+                      <wps:bodyPr rot="0" spcFirstLastPara="0" vertOverflow="overflow" horzOverflow="overflow" vert="horz" wrap="square" lIns="91440" tIns="45720" rIns="91440" bIns="45720" numCol="1" spcCol="0" rtlCol="0" fromWordArt="0" anchor="t" anchorCtr="0" forceAA="0" compatLnSpc="1">
+                        <a:prstTxWarp prst="textNoShape">
+                          <a:avLst/>
+                        </a:prstTxWarp>
+                        <a:noAutofit/>
+                      </wps:bodyPr>
+                    </wps:wsp>
+                  </a:graphicData>
+                </a:graphic>
+                <wp14:sizeRelH relativeFrom="margin">
+                  <wp14:pctWidth>0</wp14:pctWidth>
+                </wp14:sizeRelH>
+                <wp14:sizeRelV relativeFrom="margin">
+                  <wp14:pctHeight>0</wp14:pctHeight>
+                </wp14:sizeRelV>
+              </wp:anchor>
+            </w:drawing>
+          </mc:Choice>
+          <mc:Fallback>
+            <w:pict>
+              <v:shape w14:anchorId="2CF3BC17" id="Textové pole 69" o:spid="_x0000_s1054" type="#_x0000_t202" style="position:absolute;left:0;text-align:left;margin-left:243.05pt;margin-top:73.4pt;width:66pt;height:29.25pt;z-index:251812864;visibility:visible;mso-wrap-style:square;mso-width-percent:0;mso-height-percent:0;mso-wrap-distance-left:9pt;mso-wrap-distance-top:0;mso-wrap-distance-right:9pt;mso-wrap-distance-bottom:0;mso-position-horizontal:absolute;mso-position-horizontal-relative:text;mso-position-vertical:absolute;mso-position-vertical-relative:text;mso-width-percent:0;mso-height-percent:0;mso-width-relative:margin;mso-height-relative:margin;v-text-anchor:top" o:gfxdata="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" filled="f" stroked="f" strokeweight=".5pt">
+                <v:textbox>
+                  <w:txbxContent>
+                    <w:p>
+                      <w:pPr>
+                        <w:rPr>
+                          <w:rFonts w:ascii="JetBrains Mono ExtraBold" w:hAnsi="JetBrains Mono ExtraBold" w:cs="JetBrains Mono ExtraBold"/>
+                          <w:sz w:val="16"/>
+                          <w:szCs w:val="16"/>
+                          <w:lang w:val="cs-CZ"/>
+                        </w:rPr>
+                      </w:pPr>
+                      <w:r>
+                        <w:rPr>
+                          <w:rFonts w:ascii="JetBrains Mono ExtraBold" w:hAnsi="JetBrains Mono ExtraBold" w:cs="JetBrains Mono ExtraBold"/>
+                          <w:sz w:val="16"/>
+                          <w:szCs w:val="16"/>
+                          <w:lang w:val="cs-CZ"/>
+                        </w:rPr>
+                        <w:t>Jasnosť</w:t>
+                      </w:r>
+                    </w:p>
+                  </w:txbxContent>
+                </v:textbox>
+              </v:shape>
+            </w:pict>
+          </mc:Fallback>
+        </mc:AlternateContent>
+      </w:r>
+      <w:r>
+        <w:rPr>
+          <w:noProof/>
+          <w:sz w:val="20"/>
+          <w:szCs w:val="20"/>
+        </w:rPr>
+        <mc:AlternateContent>
+          <mc:Choice Requires="wps">
+            <w:drawing>
+              <wp:anchor distT="0" distB="0" distL="114300" distR="114300" simplePos="0" relativeHeight="251809792" behindDoc="0" locked="0" layoutInCell="1" allowOverlap="1" wp14:anchorId="341E5036" wp14:editId="598F02D5">
                 <wp:simplePos x="0" y="0"/>
                 <wp:positionH relativeFrom="column">
                   <wp:posOffset>1349375</wp:posOffset>
@@ -12678,7 +13529,7 @@
           </mc:Choice>
           <mc:Fallback>
             <w:pict>
-              <v:shape w14:anchorId="341E5036" id="Textové pole 66" o:spid="_x0000_s1054" type="#_x0000_t202" style="position:absolute;left:0;text-align:left;margin-left:106.25pt;margin-top:127.95pt;width:231pt;height:1in;z-index:251809792;visibility:visible;mso-wrap-style:square;mso-width-percent:0;mso-height-percent:0;mso-wrap-distance-left:9pt;mso-wrap-distance-top:0;mso-wrap-distance-right:9pt;mso-wrap-distance-bottom:0;mso-position-horizontal:absolute;mso-position-horizontal-relative:text;mso-position-vertical:absolute;mso-position-vertical-relative:text;mso-width-percent:0;mso-height-percent:0;mso-width-relative:margin;mso-height-relative:margin;v-text-anchor:top" o:gfxdata="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" filled="f" stroked="f" strokeweight=".5pt">
+              <v:shape w14:anchorId="341E5036" id="Textové pole 66" o:spid="_x0000_s1055" type="#_x0000_t202" style="position:absolute;left:0;text-align:left;margin-left:106.25pt;margin-top:127.95pt;width:231pt;height:1in;z-index:251809792;visibility:visible;mso-wrap-style:square;mso-width-percent:0;mso-height-percent:0;mso-wrap-distance-left:9pt;mso-wrap-distance-top:0;mso-wrap-distance-right:9pt;mso-wrap-distance-bottom:0;mso-position-horizontal:absolute;mso-position-horizontal-relative:text;mso-position-vertical:absolute;mso-position-vertical-relative:text;mso-width-percent:0;mso-height-percent:0;mso-width-relative:margin;mso-height-relative:margin;v-text-anchor:top" o:gfxdata="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" filled="f" stroked="f" strokeweight=".5pt">
                 <v:textbox>
                   <w:txbxContent>
                     <w:p>
@@ -12761,117 +13612,6 @@
                           <w:lang w:val="cs-CZ"/>
                         </w:rPr>
                         <w:t>a</w:t>
-                      </w:r>
-                    </w:p>
-                  </w:txbxContent>
-                </v:textbox>
-              </v:shape>
-            </w:pict>
-          </mc:Fallback>
-        </mc:AlternateContent>
-      </w:r>
-      <w:r>
-        <w:rPr>
-          <w:noProof/>
-          <w:sz w:val="20"/>
-          <w:szCs w:val="20"/>
-        </w:rPr>
-        <mc:AlternateContent>
-          <mc:Choice Requires="wps">
-            <w:drawing>
-              <wp:anchor distT="0" distB="0" distL="114300" distR="114300" simplePos="0" relativeHeight="251812864" behindDoc="0" locked="0" layoutInCell="1" allowOverlap="1" wp14:anchorId="2CF3BC17" wp14:editId="386B0DB8">
-                <wp:simplePos x="0" y="0"/>
-                <wp:positionH relativeFrom="column">
-                  <wp:posOffset>3081020</wp:posOffset>
-                </wp:positionH>
-                <wp:positionV relativeFrom="paragraph">
-                  <wp:posOffset>911225</wp:posOffset>
-                </wp:positionV>
-                <wp:extent cx="838200" cy="371475"/>
-                <wp:effectExtent l="0" t="0" r="0" b="0"/>
-                <wp:wrapNone/>
-                <wp:docPr id="1601367130" name="Textové pole 69"/>
-                <wp:cNvGraphicFramePr/>
-                <a:graphic xmlns:a="http://schemas.openxmlformats.org/drawingml/2006/main">
-                  <a:graphicData uri="http://schemas.microsoft.com/office/word/2010/wordprocessingShape">
-                    <wps:wsp>
-                      <wps:cNvSpPr txBox="1"/>
-                      <wps:spPr>
-                        <a:xfrm>
-                          <a:off x="0" y="0"/>
-                          <a:ext cx="838200" cy="371475"/>
-                        </a:xfrm>
-                        <a:prstGeom prst="rect">
-                          <a:avLst/>
-                        </a:prstGeom>
-                        <a:noFill/>
-                        <a:ln w="6350">
-                          <a:noFill/>
-                        </a:ln>
-                      </wps:spPr>
-                      <wps:txbx>
-                        <w:txbxContent>
-                          <w:p>
-                            <w:pPr>
-                              <w:rPr>
-                                <w:rFonts w:ascii="JetBrains Mono ExtraBold" w:hAnsi="JetBrains Mono ExtraBold" w:cs="JetBrains Mono ExtraBold"/>
-                                <w:sz w:val="16"/>
-                                <w:szCs w:val="16"/>
-                                <w:lang w:val="cs-CZ"/>
-                              </w:rPr>
-                            </w:pPr>
-                            <w:r>
-                              <w:rPr>
-                                <w:rFonts w:ascii="JetBrains Mono ExtraBold" w:hAnsi="JetBrains Mono ExtraBold" w:cs="JetBrains Mono ExtraBold"/>
-                                <w:sz w:val="16"/>
-                                <w:szCs w:val="16"/>
-                                <w:lang w:val="cs-CZ"/>
-                              </w:rPr>
-                              <w:t>Jasnosť</w:t>
-                            </w:r>
-                          </w:p>
-                        </w:txbxContent>
-                      </wps:txbx>
-                      <wps:bodyPr rot="0" spcFirstLastPara="0" vertOverflow="overflow" horzOverflow="overflow" vert="horz" wrap="square" lIns="91440" tIns="45720" rIns="91440" bIns="45720" numCol="1" spcCol="0" rtlCol="0" fromWordArt="0" anchor="t" anchorCtr="0" forceAA="0" compatLnSpc="1">
-                        <a:prstTxWarp prst="textNoShape">
-                          <a:avLst/>
-                        </a:prstTxWarp>
-                        <a:noAutofit/>
-                      </wps:bodyPr>
-                    </wps:wsp>
-                  </a:graphicData>
-                </a:graphic>
-                <wp14:sizeRelH relativeFrom="margin">
-                  <wp14:pctWidth>0</wp14:pctWidth>
-                </wp14:sizeRelH>
-                <wp14:sizeRelV relativeFrom="margin">
-                  <wp14:pctHeight>0</wp14:pctHeight>
-                </wp14:sizeRelV>
-              </wp:anchor>
-            </w:drawing>
-          </mc:Choice>
-          <mc:Fallback>
-            <w:pict>
-              <v:shape w14:anchorId="2CF3BC17" id="Textové pole 69" o:spid="_x0000_s1055" type="#_x0000_t202" style="position:absolute;left:0;text-align:left;margin-left:242.6pt;margin-top:71.75pt;width:66pt;height:29.25pt;z-index:251812864;visibility:visible;mso-wrap-style:square;mso-width-percent:0;mso-height-percent:0;mso-wrap-distance-left:9pt;mso-wrap-distance-top:0;mso-wrap-distance-right:9pt;mso-wrap-distance-bottom:0;mso-position-horizontal:absolute;mso-position-horizontal-relative:text;mso-position-vertical:absolute;mso-position-vertical-relative:text;mso-width-percent:0;mso-height-percent:0;mso-width-relative:margin;mso-height-relative:margin;v-text-anchor:top" o:gfxdata="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" filled="f" stroked="f" strokeweight=".5pt">
-                <v:textbox>
-                  <w:txbxContent>
-                    <w:p>
-                      <w:pPr>
-                        <w:rPr>
-                          <w:rFonts w:ascii="JetBrains Mono ExtraBold" w:hAnsi="JetBrains Mono ExtraBold" w:cs="JetBrains Mono ExtraBold"/>
-                          <w:sz w:val="16"/>
-                          <w:szCs w:val="16"/>
-                          <w:lang w:val="cs-CZ"/>
-                        </w:rPr>
-                      </w:pPr>
-                      <w:r>
-                        <w:rPr>
-                          <w:rFonts w:ascii="JetBrains Mono ExtraBold" w:hAnsi="JetBrains Mono ExtraBold" w:cs="JetBrains Mono ExtraBold"/>
-                          <w:sz w:val="16"/>
-                          <w:szCs w:val="16"/>
-                          <w:lang w:val="cs-CZ"/>
-                        </w:rPr>
-                        <w:t>Jasnosť</w:t>
                       </w:r>
                     </w:p>
                   </w:txbxContent>
@@ -13498,12 +14238,12 @@
       <w:pPr>
         <w:pStyle w:val="Nadpis2"/>
       </w:pPr>
-      <w:bookmarkStart w:id="26" w:name="_Toc230111788"/>
+      <w:bookmarkStart w:id="30" w:name="_Toc230184646"/>
       <w:r>
         <w:lastRenderedPageBreak/>
         <w:t>Riešenie problémov</w:t>
       </w:r>
-      <w:bookmarkEnd w:id="26"/>
+      <w:bookmarkEnd w:id="30"/>
     </w:p>
     <w:tbl>
       <w:tblPr>
@@ -14064,11 +14804,11 @@
       <w:pPr>
         <w:pStyle w:val="Nadpis2"/>
       </w:pPr>
-      <w:bookmarkStart w:id="27" w:name="_Toc230111789"/>
+      <w:bookmarkStart w:id="31" w:name="_Toc230184647"/>
       <w:r>
         <w:t>Servis</w:t>
       </w:r>
-      <w:bookmarkEnd w:id="27"/>
+      <w:bookmarkEnd w:id="31"/>
     </w:p>
     <w:p>
       <w:pPr>
@@ -14289,7 +15029,7 @@
           <w:rFonts w:cs="Courier New"/>
         </w:rPr>
       </w:pPr>
-      <w:bookmarkStart w:id="28" w:name="_Toc230111790"/>
+      <w:bookmarkStart w:id="32" w:name="_Toc230184648"/>
       <w:r>
         <w:rPr>
           <w:noProof/>
@@ -14363,7 +15103,7 @@
       <w:r>
         <w:t>Autori projektu</w:t>
       </w:r>
-      <w:bookmarkEnd w:id="28"/>
+      <w:bookmarkEnd w:id="32"/>
     </w:p>
     <w:tbl>
       <w:tblPr>
@@ -15292,18 +16032,103 @@
         <mc:AlternateContent>
           <mc:Choice Requires="wps">
             <w:drawing>
-              <wp:anchor distT="0" distB="0" distL="114300" distR="114300" simplePos="0" relativeHeight="251801600" behindDoc="1" locked="0" layoutInCell="1" allowOverlap="1" wp14:anchorId="51546CF0" wp14:editId="6CA6DC36">
+              <wp:anchor distT="0" distB="0" distL="114300" distR="114300" simplePos="0" relativeHeight="251821056" behindDoc="1" locked="0" layoutInCell="1" allowOverlap="1" wp14:anchorId="4265174E" wp14:editId="5B1E6674">
                 <wp:simplePos x="0" y="0"/>
                 <wp:positionH relativeFrom="column">
-                  <wp:posOffset>-536575</wp:posOffset>
+                  <wp:posOffset>-554990</wp:posOffset>
                 </wp:positionH>
                 <wp:positionV relativeFrom="paragraph">
-                  <wp:posOffset>-680720</wp:posOffset>
+                  <wp:posOffset>1365885</wp:posOffset>
+                </wp:positionV>
+                <wp:extent cx="5574030" cy="918845"/>
+                <wp:effectExtent l="0" t="0" r="7620" b="0"/>
+                <wp:wrapNone/>
+                <wp:docPr id="1990107691" name="Ovál 48"/>
+                <wp:cNvGraphicFramePr/>
+                <a:graphic xmlns:a="http://schemas.openxmlformats.org/drawingml/2006/main">
+                  <a:graphicData uri="http://schemas.microsoft.com/office/word/2010/wordprocessingShape">
+                    <wps:wsp>
+                      <wps:cNvSpPr/>
+                      <wps:spPr>
+                        <a:xfrm>
+                          <a:off x="0" y="0"/>
+                          <a:ext cx="5574030" cy="918845"/>
+                        </a:xfrm>
+                        <a:prstGeom prst="ellipse">
+                          <a:avLst/>
+                        </a:prstGeom>
+                        <a:ln>
+                          <a:noFill/>
+                        </a:ln>
+                      </wps:spPr>
+                      <wps:style>
+                        <a:lnRef idx="2">
+                          <a:schemeClr val="accent1">
+                            <a:shade val="15000"/>
+                          </a:schemeClr>
+                        </a:lnRef>
+                        <a:fillRef idx="1">
+                          <a:schemeClr val="accent1"/>
+                        </a:fillRef>
+                        <a:effectRef idx="0">
+                          <a:schemeClr val="accent1"/>
+                        </a:effectRef>
+                        <a:fontRef idx="minor">
+                          <a:schemeClr val="lt1"/>
+                        </a:fontRef>
+                      </wps:style>
+                      <wps:bodyPr rot="0" spcFirstLastPara="0" vertOverflow="overflow" horzOverflow="overflow" vert="horz" wrap="square" lIns="91440" tIns="45720" rIns="91440" bIns="45720" numCol="1" spcCol="0" rtlCol="0" fromWordArt="0" anchor="ctr" anchorCtr="0" forceAA="0" compatLnSpc="1">
+                        <a:prstTxWarp prst="textNoShape">
+                          <a:avLst/>
+                        </a:prstTxWarp>
+                        <a:noAutofit/>
+                      </wps:bodyPr>
+                    </wps:wsp>
+                  </a:graphicData>
+                </a:graphic>
+                <wp14:sizeRelH relativeFrom="margin">
+                  <wp14:pctWidth>0</wp14:pctWidth>
+                </wp14:sizeRelH>
+                <wp14:sizeRelV relativeFrom="margin">
+                  <wp14:pctHeight>0</wp14:pctHeight>
+                </wp14:sizeRelV>
+              </wp:anchor>
+            </w:drawing>
+          </mc:Choice>
+          <mc:Fallback>
+            <w:pict>
+              <v:oval w14:anchorId="6C1460DC" id="Ovál 48" o:spid="_x0000_s1026" style="position:absolute;margin-left:-43.7pt;margin-top:107.55pt;width:438.9pt;height:72.35pt;z-index:-251495424;visibility:visible;mso-wrap-style:square;mso-width-percent:0;mso-height-percent:0;mso-wrap-distance-left:9pt;mso-wrap-distance-top:0;mso-wrap-distance-right:9pt;mso-wrap-distance-bottom:0;mso-position-horizontal:absolute;mso-position-horizontal-relative:text;mso-position-vertical:absolute;mso-position-vertical-relative:text;mso-width-percent:0;mso-height-percent:0;mso-width-relative:margin;mso-height-relative:margin;v-text-anchor:middle" o:gfxdata="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" fillcolor="#a5b592 [3204]" stroked="f" strokeweight="1pt">
+                <v:stroke joinstyle="miter"/>
+              </v:oval>
+            </w:pict>
+          </mc:Fallback>
+        </mc:AlternateContent>
+      </w:r>
+      <w:r>
+        <w:rPr>
+          <w:rFonts w:cs="Courier New"/>
+          <w:b/>
+          <w:bCs/>
+          <w:noProof/>
+          <w:color w:val="FFFFFF" w:themeColor="background1"/>
+          <w:sz w:val="48"/>
+          <w:szCs w:val="48"/>
+        </w:rPr>
+        <mc:AlternateContent>
+          <mc:Choice Requires="wps">
+            <w:drawing>
+              <wp:anchor distT="0" distB="0" distL="114300" distR="114300" simplePos="0" relativeHeight="251820032" behindDoc="1" locked="0" layoutInCell="1" allowOverlap="1" wp14:anchorId="40DA19B5" wp14:editId="40BCBE89">
+                <wp:simplePos x="0" y="0"/>
+                <wp:positionH relativeFrom="column">
+                  <wp:posOffset>-560705</wp:posOffset>
+                </wp:positionH>
+                <wp:positionV relativeFrom="paragraph">
+                  <wp:posOffset>-596265</wp:posOffset>
                 </wp:positionV>
                 <wp:extent cx="5474970" cy="2307590"/>
                 <wp:effectExtent l="0" t="0" r="0" b="0"/>
                 <wp:wrapNone/>
-                <wp:docPr id="1118938566" name="Obdélník 47"/>
+                <wp:docPr id="1316439692" name="Obdélník 47"/>
                 <wp:cNvGraphicFramePr/>
                 <a:graphic xmlns:a="http://schemas.openxmlformats.org/drawingml/2006/main">
                   <a:graphicData uri="http://schemas.microsoft.com/office/word/2010/wordprocessingShape">
@@ -15357,7 +16182,7 @@
           </mc:Choice>
           <mc:Fallback>
             <w:pict>
-              <v:rect w14:anchorId="4416E633" id="Obdélník 47" o:spid="_x0000_s1026" style="position:absolute;margin-left:-42.25pt;margin-top:-53.6pt;width:431.1pt;height:181.7pt;z-index:-251514880;visibility:visible;mso-wrap-style:square;mso-width-percent:0;mso-height-percent:0;mso-wrap-distance-left:9pt;mso-wrap-distance-top:0;mso-wrap-distance-right:9pt;mso-wrap-distance-bottom:0;mso-position-horizontal:absolute;mso-position-horizontal-relative:text;mso-position-vertical:absolute;mso-position-vertical-relative:text;mso-width-percent:0;mso-height-percent:0;mso-width-relative:margin;mso-height-relative:margin;v-text-anchor:middle" o:gfxdata="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" fillcolor="#a5b592 [3204]" stroked="f" strokeweight="1pt"/>
+              <v:rect w14:anchorId="30D32EFF" id="Obdélník 47" o:spid="_x0000_s1026" style="position:absolute;margin-left:-44.15pt;margin-top:-46.95pt;width:431.1pt;height:181.7pt;z-index:-251496448;visibility:visible;mso-wrap-style:square;mso-width-percent:0;mso-height-percent:0;mso-wrap-distance-left:9pt;mso-wrap-distance-top:0;mso-wrap-distance-right:9pt;mso-wrap-distance-bottom:0;mso-position-horizontal:absolute;mso-position-horizontal-relative:text;mso-position-vertical:absolute;mso-position-vertical-relative:text;mso-width-percent:0;mso-height-percent:0;mso-width-relative:margin;mso-height-relative:margin;v-text-anchor:middle" o:gfxdata="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" fillcolor="#a5b592 [3204]" stroked="f" strokeweight="1pt"/>
             </w:pict>
           </mc:Fallback>
         </mc:AlternateContent>
@@ -15402,91 +16227,6 @@
           <w:u w:val="single"/>
         </w:rPr>
       </w:pPr>
-      <w:r>
-        <w:rPr>
-          <w:rFonts w:cs="Courier New"/>
-          <w:b/>
-          <w:bCs/>
-          <w:noProof/>
-          <w:color w:val="FFFFFF" w:themeColor="background1"/>
-          <w:sz w:val="48"/>
-          <w:szCs w:val="48"/>
-        </w:rPr>
-        <mc:AlternateContent>
-          <mc:Choice Requires="wps">
-            <w:drawing>
-              <wp:anchor distT="0" distB="0" distL="114300" distR="114300" simplePos="0" relativeHeight="251802624" behindDoc="1" locked="0" layoutInCell="1" allowOverlap="1" wp14:anchorId="7F7E0412" wp14:editId="0A7F91EB">
-                <wp:simplePos x="0" y="0"/>
-                <wp:positionH relativeFrom="column">
-                  <wp:posOffset>-594360</wp:posOffset>
-                </wp:positionH>
-                <wp:positionV relativeFrom="paragraph">
-                  <wp:posOffset>187325</wp:posOffset>
-                </wp:positionV>
-                <wp:extent cx="5574030" cy="880745"/>
-                <wp:effectExtent l="0" t="0" r="7620" b="0"/>
-                <wp:wrapNone/>
-                <wp:docPr id="7256491" name="Ovál 48"/>
-                <wp:cNvGraphicFramePr/>
-                <a:graphic xmlns:a="http://schemas.openxmlformats.org/drawingml/2006/main">
-                  <a:graphicData uri="http://schemas.microsoft.com/office/word/2010/wordprocessingShape">
-                    <wps:wsp>
-                      <wps:cNvSpPr/>
-                      <wps:spPr>
-                        <a:xfrm>
-                          <a:off x="0" y="0"/>
-                          <a:ext cx="5574030" cy="880745"/>
-                        </a:xfrm>
-                        <a:prstGeom prst="ellipse">
-                          <a:avLst/>
-                        </a:prstGeom>
-                        <a:ln>
-                          <a:noFill/>
-                        </a:ln>
-                      </wps:spPr>
-                      <wps:style>
-                        <a:lnRef idx="2">
-                          <a:schemeClr val="accent1">
-                            <a:shade val="15000"/>
-                          </a:schemeClr>
-                        </a:lnRef>
-                        <a:fillRef idx="1">
-                          <a:schemeClr val="accent1"/>
-                        </a:fillRef>
-                        <a:effectRef idx="0">
-                          <a:schemeClr val="accent1"/>
-                        </a:effectRef>
-                        <a:fontRef idx="minor">
-                          <a:schemeClr val="lt1"/>
-                        </a:fontRef>
-                      </wps:style>
-                      <wps:bodyPr rot="0" spcFirstLastPara="0" vertOverflow="overflow" horzOverflow="overflow" vert="horz" wrap="square" lIns="91440" tIns="45720" rIns="91440" bIns="45720" numCol="1" spcCol="0" rtlCol="0" fromWordArt="0" anchor="ctr" anchorCtr="0" forceAA="0" compatLnSpc="1">
-                        <a:prstTxWarp prst="textNoShape">
-                          <a:avLst/>
-                        </a:prstTxWarp>
-                        <a:noAutofit/>
-                      </wps:bodyPr>
-                    </wps:wsp>
-                  </a:graphicData>
-                </a:graphic>
-                <wp14:sizeRelH relativeFrom="margin">
-                  <wp14:pctWidth>0</wp14:pctWidth>
-                </wp14:sizeRelH>
-                <wp14:sizeRelV relativeFrom="margin">
-                  <wp14:pctHeight>0</wp14:pctHeight>
-                </wp14:sizeRelV>
-              </wp:anchor>
-            </w:drawing>
-          </mc:Choice>
-          <mc:Fallback>
-            <w:pict>
-              <v:oval w14:anchorId="596FBC84" id="Ovál 48" o:spid="_x0000_s1026" style="position:absolute;margin-left:-46.8pt;margin-top:14.75pt;width:438.9pt;height:69.35pt;z-index:-251513856;visibility:visible;mso-wrap-style:square;mso-width-percent:0;mso-height-percent:0;mso-wrap-distance-left:9pt;mso-wrap-distance-top:0;mso-wrap-distance-right:9pt;mso-wrap-distance-bottom:0;mso-position-horizontal:absolute;mso-position-horizontal-relative:text;mso-position-vertical:absolute;mso-position-vertical-relative:text;mso-width-percent:0;mso-height-percent:0;mso-width-relative:margin;mso-height-relative:margin;v-text-anchor:middle" o:gfxdata="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" fillcolor="#a5b592 [3204]" stroked="f" strokeweight="1pt">
-                <v:stroke joinstyle="miter"/>
-              </v:oval>
-            </w:pict>
-          </mc:Fallback>
-        </mc:AlternateContent>
-      </w:r>
     </w:p>
     <w:p>
       <w:pPr>
@@ -16050,7 +16790,7 @@
 <w:numbering xmlns:wpc="http://schemas.microsoft.com/office/word/2010/wordprocessingCanvas" xmlns:cx="http://schemas.microsoft.com/office/drawing/2014/chartex" xmlns:cx1="http://schemas.microsoft.com/office/drawing/2015/9/8/chartex" xmlns:cx2="http://schemas.microsoft.com/office/drawing/2015/10/21/chartex" xmlns:cx3="http://schemas.microsoft.com/office/drawing/2016/5/9/chartex" xmlns:cx4="http://schemas.microsoft.com/office/drawing/2016/5/10/chartex" xmlns:cx5="http://schemas.microsoft.com/office/drawing/2016/5/11/chartex" xmlns:cx6="http://schemas.microsoft.com/office/drawing/2016/5/12/chartex" xmlns:cx7="http://schemas.microsoft.com/office/drawing/2016/5/13/chartex" xmlns:cx8="http://schemas.microsoft.com/office/drawing/2016/5/14/chartex" xmlns:mc="http://schemas.openxmlformats.org/markup-compatibility/2006" xmlns:aink="http://schemas.microsoft.com/office/drawing/2016/ink" xmlns:am3d="http://schemas.microsoft.com/office/drawing/2017/model3d" xmlns:o="urn:schemas-microsoft-com:office:office" xmlns:oel="http://schemas.microsoft.com/office/2019/extlst" xmlns:r="http://schemas.openxmlformats.org/officeDocument/2006/relationships" xmlns:m="http://schemas.openxmlformats.org/officeDocument/2006/math" xmlns:v="urn:schemas-microsoft-com:vml" xmlns:wp14="http://schemas.microsoft.com/office/word/2010/wordprocessingDrawing" xmlns:wp="http://schemas.openxmlformats.org/drawingml/2006/wordprocessingDrawing" xmlns:w10="urn:schemas-microsoft-com:office:word" xmlns:w="http://schemas.openxmlformats.org/wordprocessingml/2006/main" xmlns:w14="http://schemas.microsoft.com/office/word/2010/wordml" xmlns:w15="http://schemas.microsoft.com/office/word/2012/wordml" xmlns:w16cex="http://schemas.microsoft.com/office/word/2018/wordml/cex" xmlns:w16cid="http://schemas.microsoft.com/office/word/2016/wordml/cid" xmlns:w16="http://schemas.microsoft.com/office/word/2018/wordml" xmlns:w16du="http://schemas.microsoft.com/office/word/2023/wordml/word16du" xmlns:w16sdtdh="http://schemas.microsoft.com/office/word/2020/wordml/sdtdatahash" xmlns:w16sdtfl="http://schemas.microsoft.com/office/word/2024/wordml/sdtformatlock" xmlns:w16se="http://schemas.microsoft.com/office/word/2015/wordml/symex" xmlns:wpg="http://schemas.microsoft.com/office/word/2010/wordprocessingGroup" xmlns:wpi="http://schemas.microsoft.com/office/word/2010/wordprocessingInk" xmlns:wne="http://schemas.microsoft.com/office/word/2006/wordml" xmlns:wps="http://schemas.microsoft.com/office/word/2010/wordprocessingShape" mc:Ignorable="w14 w15 w16se w16cid w16 w16cex w16sdtdh w16sdtfl w16du wp14">
   <w:numPicBullet w:numPicBulletId="0">
     <w:pict>
-      <v:shapetype w14:anchorId="11919415" id="_x0000_t75" coordsize="21600,21600" o:spt="75" o:preferrelative="t" path="m@4@5l@4@11@9@11@9@5xe" filled="f" stroked="f">
+      <v:shapetype w14:anchorId="7A8947BC" id="_x0000_t75" coordsize="21600,21600" o:spt="75" o:preferrelative="t" path="m@4@5l@4@11@9@11@9@5xe" filled="f" stroked="f">
         <v:stroke joinstyle="miter"/>
         <v:formulas>
           <v:f eqn="if lineDrawn pixelLineWidth 0"/>
@@ -16069,7 +16809,7 @@
         <v:path o:extrusionok="f" gradientshapeok="t" o:connecttype="rect"/>
         <o:lock v:ext="edit" aspectratio="t"/>
       </v:shapetype>
-      <v:shape id="Obrázek 3" o:spid="_x0000_i1025" type="#_x0000_t75" style="width:20.3pt;height:16.6pt;visibility:visible;mso-wrap-style:square" o:bullet="t">
+      <v:shape id="Obrázek 3" o:spid="_x0000_i1025" type="#_x0000_t75" style="width:20.55pt;height:16.7pt;visibility:visible;mso-wrap-style:square" o:bullet="t">
         <v:imagedata r:id="rId1" o:title=""/>
       </v:shape>
     </w:pict>
@@ -16701,6 +17441,121 @@
     </w:lvl>
   </w:abstractNum>
   <w:abstractNum w:abstractNumId="6" w15:restartNumberingAfterBreak="0">
+    <w:nsid w:val="1DCD6E3D"/>
+    <w:multiLevelType w:val="hybridMultilevel"/>
+    <w:tmpl w:val="7F36BCC4"/>
+    <w:lvl w:ilvl="0" w:tplc="5EDC7674">
+      <w:start w:val="1"/>
+      <w:numFmt w:val="decimal"/>
+      <w:lvlText w:val="%1."/>
+      <w:lvlJc w:val="right"/>
+      <w:pPr>
+        <w:ind w:left="1068" w:hanging="360"/>
+      </w:pPr>
+      <w:rPr>
+        <w:rFonts w:ascii="Special Elite" w:hAnsi="Special Elite" w:hint="default"/>
+        <w:spacing w:val="-20"/>
+        <w:sz w:val="24"/>
+      </w:rPr>
+    </w:lvl>
+    <w:lvl w:ilvl="1" w:tplc="FFFFFFFF" w:tentative="1">
+      <w:start w:val="1"/>
+      <w:numFmt w:val="bullet"/>
+      <w:lvlText w:val="o"/>
+      <w:lvlJc w:val="left"/>
+      <w:pPr>
+        <w:ind w:left="1788" w:hanging="360"/>
+      </w:pPr>
+      <w:rPr>
+        <w:rFonts w:ascii="Courier New" w:hAnsi="Courier New" w:cs="Courier New" w:hint="default"/>
+      </w:rPr>
+    </w:lvl>
+    <w:lvl w:ilvl="2" w:tplc="FFFFFFFF" w:tentative="1">
+      <w:start w:val="1"/>
+      <w:numFmt w:val="bullet"/>
+      <w:lvlText w:val=""/>
+      <w:lvlJc w:val="left"/>
+      <w:pPr>
+        <w:ind w:left="2508" w:hanging="360"/>
+      </w:pPr>
+      <w:rPr>
+        <w:rFonts w:ascii="Wingdings" w:hAnsi="Wingdings" w:hint="default"/>
+      </w:rPr>
+    </w:lvl>
+    <w:lvl w:ilvl="3" w:tplc="FFFFFFFF" w:tentative="1">
+      <w:start w:val="1"/>
+      <w:numFmt w:val="bullet"/>
+      <w:lvlText w:val=""/>
+      <w:lvlJc w:val="left"/>
+      <w:pPr>
+        <w:ind w:left="3228" w:hanging="360"/>
+      </w:pPr>
+      <w:rPr>
+        <w:rFonts w:ascii="Symbol" w:hAnsi="Symbol" w:hint="default"/>
+      </w:rPr>
+    </w:lvl>
+    <w:lvl w:ilvl="4" w:tplc="FFFFFFFF" w:tentative="1">
+      <w:start w:val="1"/>
+      <w:numFmt w:val="bullet"/>
+      <w:lvlText w:val="o"/>
+      <w:lvlJc w:val="left"/>
+      <w:pPr>
+        <w:ind w:left="3948" w:hanging="360"/>
+      </w:pPr>
+      <w:rPr>
+        <w:rFonts w:ascii="Courier New" w:hAnsi="Courier New" w:cs="Courier New" w:hint="default"/>
+      </w:rPr>
+    </w:lvl>
+    <w:lvl w:ilvl="5" w:tplc="FFFFFFFF" w:tentative="1">
+      <w:start w:val="1"/>
+      <w:numFmt w:val="bullet"/>
+      <w:lvlText w:val=""/>
+      <w:lvlJc w:val="left"/>
+      <w:pPr>
+        <w:ind w:left="4668" w:hanging="360"/>
+      </w:pPr>
+      <w:rPr>
+        <w:rFonts w:ascii="Wingdings" w:hAnsi="Wingdings" w:hint="default"/>
+      </w:rPr>
+    </w:lvl>
+    <w:lvl w:ilvl="6" w:tplc="FFFFFFFF" w:tentative="1">
+      <w:start w:val="1"/>
+      <w:numFmt w:val="bullet"/>
+      <w:lvlText w:val=""/>
+      <w:lvlJc w:val="left"/>
+      <w:pPr>
+        <w:ind w:left="5388" w:hanging="360"/>
+      </w:pPr>
+      <w:rPr>
+        <w:rFonts w:ascii="Symbol" w:hAnsi="Symbol" w:hint="default"/>
+      </w:rPr>
+    </w:lvl>
+    <w:lvl w:ilvl="7" w:tplc="FFFFFFFF" w:tentative="1">
+      <w:start w:val="1"/>
+      <w:numFmt w:val="bullet"/>
+      <w:lvlText w:val="o"/>
+      <w:lvlJc w:val="left"/>
+      <w:pPr>
+        <w:ind w:left="6108" w:hanging="360"/>
+      </w:pPr>
+      <w:rPr>
+        <w:rFonts w:ascii="Courier New" w:hAnsi="Courier New" w:cs="Courier New" w:hint="default"/>
+      </w:rPr>
+    </w:lvl>
+    <w:lvl w:ilvl="8" w:tplc="FFFFFFFF" w:tentative="1">
+      <w:start w:val="1"/>
+      <w:numFmt w:val="bullet"/>
+      <w:lvlText w:val=""/>
+      <w:lvlJc w:val="left"/>
+      <w:pPr>
+        <w:ind w:left="6828" w:hanging="360"/>
+      </w:pPr>
+      <w:rPr>
+        <w:rFonts w:ascii="Wingdings" w:hAnsi="Wingdings" w:hint="default"/>
+      </w:rPr>
+    </w:lvl>
+  </w:abstractNum>
+  <w:abstractNum w:abstractNumId="7" w15:restartNumberingAfterBreak="0">
     <w:nsid w:val="1DF86F15"/>
     <w:multiLevelType w:val="hybridMultilevel"/>
     <w:tmpl w:val="5DBA2124"/>
@@ -16789,7 +17644,119 @@
       </w:pPr>
     </w:lvl>
   </w:abstractNum>
-  <w:abstractNum w:abstractNumId="7" w15:restartNumberingAfterBreak="0">
+  <w:abstractNum w:abstractNumId="8" w15:restartNumberingAfterBreak="0">
+    <w:nsid w:val="20435466"/>
+    <w:multiLevelType w:val="hybridMultilevel"/>
+    <w:tmpl w:val="62E8D46C"/>
+    <w:lvl w:ilvl="0" w:tplc="CCEE5000">
+      <w:numFmt w:val="bullet"/>
+      <w:lvlText w:val="-"/>
+      <w:lvlJc w:val="left"/>
+      <w:pPr>
+        <w:ind w:left="1068" w:hanging="360"/>
+      </w:pPr>
+      <w:rPr>
+        <w:rFonts w:ascii="Special Elite" w:eastAsiaTheme="minorHAnsi" w:hAnsi="Special Elite" w:cstheme="minorBidi" w:hint="default"/>
+      </w:rPr>
+    </w:lvl>
+    <w:lvl w:ilvl="1" w:tplc="041B0003" w:tentative="1">
+      <w:start w:val="1"/>
+      <w:numFmt w:val="bullet"/>
+      <w:lvlText w:val="o"/>
+      <w:lvlJc w:val="left"/>
+      <w:pPr>
+        <w:ind w:left="1788" w:hanging="360"/>
+      </w:pPr>
+      <w:rPr>
+        <w:rFonts w:ascii="Courier New" w:hAnsi="Courier New" w:cs="Courier New" w:hint="default"/>
+      </w:rPr>
+    </w:lvl>
+    <w:lvl w:ilvl="2" w:tplc="041B0005" w:tentative="1">
+      <w:start w:val="1"/>
+      <w:numFmt w:val="bullet"/>
+      <w:lvlText w:val=""/>
+      <w:lvlJc w:val="left"/>
+      <w:pPr>
+        <w:ind w:left="2508" w:hanging="360"/>
+      </w:pPr>
+      <w:rPr>
+        <w:rFonts w:ascii="Wingdings" w:hAnsi="Wingdings" w:hint="default"/>
+      </w:rPr>
+    </w:lvl>
+    <w:lvl w:ilvl="3" w:tplc="041B0001" w:tentative="1">
+      <w:start w:val="1"/>
+      <w:numFmt w:val="bullet"/>
+      <w:lvlText w:val=""/>
+      <w:lvlJc w:val="left"/>
+      <w:pPr>
+        <w:ind w:left="3228" w:hanging="360"/>
+      </w:pPr>
+      <w:rPr>
+        <w:rFonts w:ascii="Symbol" w:hAnsi="Symbol" w:hint="default"/>
+      </w:rPr>
+    </w:lvl>
+    <w:lvl w:ilvl="4" w:tplc="041B0003" w:tentative="1">
+      <w:start w:val="1"/>
+      <w:numFmt w:val="bullet"/>
+      <w:lvlText w:val="o"/>
+      <w:lvlJc w:val="left"/>
+      <w:pPr>
+        <w:ind w:left="3948" w:hanging="360"/>
+      </w:pPr>
+      <w:rPr>
+        <w:rFonts w:ascii="Courier New" w:hAnsi="Courier New" w:cs="Courier New" w:hint="default"/>
+      </w:rPr>
+    </w:lvl>
+    <w:lvl w:ilvl="5" w:tplc="041B0005" w:tentative="1">
+      <w:start w:val="1"/>
+      <w:numFmt w:val="bullet"/>
+      <w:lvlText w:val=""/>
+      <w:lvlJc w:val="left"/>
+      <w:pPr>
+        <w:ind w:left="4668" w:hanging="360"/>
+      </w:pPr>
+      <w:rPr>
+        <w:rFonts w:ascii="Wingdings" w:hAnsi="Wingdings" w:hint="default"/>
+      </w:rPr>
+    </w:lvl>
+    <w:lvl w:ilvl="6" w:tplc="041B0001" w:tentative="1">
+      <w:start w:val="1"/>
+      <w:numFmt w:val="bullet"/>
+      <w:lvlText w:val=""/>
+      <w:lvlJc w:val="left"/>
+      <w:pPr>
+        <w:ind w:left="5388" w:hanging="360"/>
+      </w:pPr>
+      <w:rPr>
+        <w:rFonts w:ascii="Symbol" w:hAnsi="Symbol" w:hint="default"/>
+      </w:rPr>
+    </w:lvl>
+    <w:lvl w:ilvl="7" w:tplc="041B0003" w:tentative="1">
+      <w:start w:val="1"/>
+      <w:numFmt w:val="bullet"/>
+      <w:lvlText w:val="o"/>
+      <w:lvlJc w:val="left"/>
+      <w:pPr>
+        <w:ind w:left="6108" w:hanging="360"/>
+      </w:pPr>
+      <w:rPr>
+        <w:rFonts w:ascii="Courier New" w:hAnsi="Courier New" w:cs="Courier New" w:hint="default"/>
+      </w:rPr>
+    </w:lvl>
+    <w:lvl w:ilvl="8" w:tplc="041B0005" w:tentative="1">
+      <w:start w:val="1"/>
+      <w:numFmt w:val="bullet"/>
+      <w:lvlText w:val=""/>
+      <w:lvlJc w:val="left"/>
+      <w:pPr>
+        <w:ind w:left="6828" w:hanging="360"/>
+      </w:pPr>
+      <w:rPr>
+        <w:rFonts w:ascii="Wingdings" w:hAnsi="Wingdings" w:hint="default"/>
+      </w:rPr>
+    </w:lvl>
+  </w:abstractNum>
+  <w:abstractNum w:abstractNumId="9" w15:restartNumberingAfterBreak="0">
     <w:nsid w:val="287D0549"/>
     <w:multiLevelType w:val="hybridMultilevel"/>
     <w:tmpl w:val="FF3099F6"/>
@@ -16875,7 +17842,7 @@
       </w:pPr>
     </w:lvl>
   </w:abstractNum>
-  <w:abstractNum w:abstractNumId="8" w15:restartNumberingAfterBreak="0">
+  <w:abstractNum w:abstractNumId="10" w15:restartNumberingAfterBreak="0">
     <w:nsid w:val="2BF04342"/>
     <w:multiLevelType w:val="hybridMultilevel"/>
     <w:tmpl w:val="C242FB12"/>
@@ -16963,7 +17930,7 @@
       </w:pPr>
     </w:lvl>
   </w:abstractNum>
-  <w:abstractNum w:abstractNumId="9" w15:restartNumberingAfterBreak="0">
+  <w:abstractNum w:abstractNumId="11" w15:restartNumberingAfterBreak="0">
     <w:nsid w:val="38D62ED5"/>
     <w:multiLevelType w:val="hybridMultilevel"/>
     <w:tmpl w:val="39F6F1D6"/>
@@ -17052,7 +18019,7 @@
       </w:pPr>
     </w:lvl>
   </w:abstractNum>
-  <w:abstractNum w:abstractNumId="10" w15:restartNumberingAfterBreak="0">
+  <w:abstractNum w:abstractNumId="12" w15:restartNumberingAfterBreak="0">
     <w:nsid w:val="3A631EAB"/>
     <w:multiLevelType w:val="hybridMultilevel"/>
     <w:tmpl w:val="DF787DC8"/>
@@ -17164,7 +18131,7 @@
       </w:rPr>
     </w:lvl>
   </w:abstractNum>
-  <w:abstractNum w:abstractNumId="11" w15:restartNumberingAfterBreak="0">
+  <w:abstractNum w:abstractNumId="13" w15:restartNumberingAfterBreak="0">
     <w:nsid w:val="42590A7B"/>
     <w:multiLevelType w:val="hybridMultilevel"/>
     <w:tmpl w:val="A364DCF8"/>
@@ -17277,7 +18244,7 @@
       </w:rPr>
     </w:lvl>
   </w:abstractNum>
-  <w:abstractNum w:abstractNumId="12" w15:restartNumberingAfterBreak="0">
+  <w:abstractNum w:abstractNumId="14" w15:restartNumberingAfterBreak="0">
     <w:nsid w:val="43A00576"/>
     <w:multiLevelType w:val="hybridMultilevel"/>
     <w:tmpl w:val="94B20EAC"/>
@@ -17389,7 +18356,7 @@
       </w:rPr>
     </w:lvl>
   </w:abstractNum>
-  <w:abstractNum w:abstractNumId="13" w15:restartNumberingAfterBreak="0">
+  <w:abstractNum w:abstractNumId="15" w15:restartNumberingAfterBreak="0">
     <w:nsid w:val="48233A6E"/>
     <w:multiLevelType w:val="hybridMultilevel"/>
     <w:tmpl w:val="B85AE2D8"/>
@@ -17502,7 +18469,7 @@
       </w:rPr>
     </w:lvl>
   </w:abstractNum>
-  <w:abstractNum w:abstractNumId="14" w15:restartNumberingAfterBreak="0">
+  <w:abstractNum w:abstractNumId="16" w15:restartNumberingAfterBreak="0">
     <w:nsid w:val="4CAB023C"/>
     <w:multiLevelType w:val="hybridMultilevel"/>
     <w:tmpl w:val="DB247AF4"/>
@@ -17614,7 +18581,7 @@
       </w:rPr>
     </w:lvl>
   </w:abstractNum>
-  <w:abstractNum w:abstractNumId="15" w15:restartNumberingAfterBreak="0">
+  <w:abstractNum w:abstractNumId="17" w15:restartNumberingAfterBreak="0">
     <w:nsid w:val="506A446F"/>
     <w:multiLevelType w:val="hybridMultilevel"/>
     <w:tmpl w:val="4DE80CD8"/>
@@ -17726,7 +18693,7 @@
       </w:rPr>
     </w:lvl>
   </w:abstractNum>
-  <w:abstractNum w:abstractNumId="16" w15:restartNumberingAfterBreak="0">
+  <w:abstractNum w:abstractNumId="18" w15:restartNumberingAfterBreak="0">
     <w:nsid w:val="55FB3D66"/>
     <w:multiLevelType w:val="hybridMultilevel"/>
     <w:tmpl w:val="9162E314"/>
@@ -17814,7 +18781,7 @@
       </w:pPr>
     </w:lvl>
   </w:abstractNum>
-  <w:abstractNum w:abstractNumId="17" w15:restartNumberingAfterBreak="0">
+  <w:abstractNum w:abstractNumId="19" w15:restartNumberingAfterBreak="0">
     <w:nsid w:val="56553734"/>
     <w:multiLevelType w:val="hybridMultilevel"/>
     <w:tmpl w:val="04B02380"/>
@@ -17927,7 +18894,7 @@
       </w:rPr>
     </w:lvl>
   </w:abstractNum>
-  <w:abstractNum w:abstractNumId="18" w15:restartNumberingAfterBreak="0">
+  <w:abstractNum w:abstractNumId="20" w15:restartNumberingAfterBreak="0">
     <w:nsid w:val="5B55278A"/>
     <w:multiLevelType w:val="multilevel"/>
     <w:tmpl w:val="3D72D35C"/>
@@ -18076,7 +19043,7 @@
       </w:rPr>
     </w:lvl>
   </w:abstractNum>
-  <w:abstractNum w:abstractNumId="19" w15:restartNumberingAfterBreak="0">
+  <w:abstractNum w:abstractNumId="21" w15:restartNumberingAfterBreak="0">
     <w:nsid w:val="5E941B75"/>
     <w:multiLevelType w:val="hybridMultilevel"/>
     <w:tmpl w:val="6E8E997A"/>
@@ -18165,7 +19132,7 @@
       </w:pPr>
     </w:lvl>
   </w:abstractNum>
-  <w:abstractNum w:abstractNumId="20" w15:restartNumberingAfterBreak="0">
+  <w:abstractNum w:abstractNumId="22" w15:restartNumberingAfterBreak="0">
     <w:nsid w:val="7EEF72C2"/>
     <w:multiLevelType w:val="hybridMultilevel"/>
     <w:tmpl w:val="D72E8AAA"/>
@@ -18254,10 +19221,10 @@
     </w:lvl>
   </w:abstractNum>
   <w:num w:numId="1" w16cid:durableId="1015428120">
-    <w:abstractNumId w:val="11"/>
+    <w:abstractNumId w:val="13"/>
   </w:num>
   <w:num w:numId="2" w16cid:durableId="999650285">
-    <w:abstractNumId w:val="7"/>
+    <w:abstractNumId w:val="9"/>
   </w:num>
   <w:num w:numId="3" w16cid:durableId="87315886">
     <w:abstractNumId w:val="3"/>
@@ -18266,55 +19233,61 @@
     <w:abstractNumId w:val="0"/>
   </w:num>
   <w:num w:numId="5" w16cid:durableId="1847863702">
-    <w:abstractNumId w:val="10"/>
+    <w:abstractNumId w:val="12"/>
   </w:num>
   <w:num w:numId="6" w16cid:durableId="1355427557">
     <w:abstractNumId w:val="4"/>
   </w:num>
   <w:num w:numId="7" w16cid:durableId="1247307226">
-    <w:abstractNumId w:val="15"/>
+    <w:abstractNumId w:val="17"/>
   </w:num>
   <w:num w:numId="8" w16cid:durableId="874386107">
-    <w:abstractNumId w:val="17"/>
+    <w:abstractNumId w:val="19"/>
   </w:num>
   <w:num w:numId="9" w16cid:durableId="1607233813">
     <w:abstractNumId w:val="1"/>
   </w:num>
   <w:num w:numId="10" w16cid:durableId="224533799">
-    <w:abstractNumId w:val="18"/>
+    <w:abstractNumId w:val="20"/>
   </w:num>
   <w:num w:numId="11" w16cid:durableId="1404447554">
-    <w:abstractNumId w:val="13"/>
+    <w:abstractNumId w:val="15"/>
   </w:num>
   <w:num w:numId="12" w16cid:durableId="1415975306">
     <w:abstractNumId w:val="2"/>
   </w:num>
   <w:num w:numId="13" w16cid:durableId="1726026792">
+    <w:abstractNumId w:val="16"/>
+  </w:num>
+  <w:num w:numId="14" w16cid:durableId="513492722">
+    <w:abstractNumId w:val="7"/>
+  </w:num>
+  <w:num w:numId="15" w16cid:durableId="1563251634">
+    <w:abstractNumId w:val="18"/>
+  </w:num>
+  <w:num w:numId="16" w16cid:durableId="1384715795">
     <w:abstractNumId w:val="14"/>
   </w:num>
-  <w:num w:numId="14" w16cid:durableId="513492722">
-    <w:abstractNumId w:val="6"/>
-  </w:num>
-  <w:num w:numId="15" w16cid:durableId="1563251634">
-    <w:abstractNumId w:val="16"/>
-  </w:num>
-  <w:num w:numId="16" w16cid:durableId="1384715795">
-    <w:abstractNumId w:val="12"/>
-  </w:num>
   <w:num w:numId="17" w16cid:durableId="176122114">
-    <w:abstractNumId w:val="19"/>
+    <w:abstractNumId w:val="21"/>
   </w:num>
   <w:num w:numId="18" w16cid:durableId="988821110">
     <w:abstractNumId w:val="5"/>
   </w:num>
   <w:num w:numId="19" w16cid:durableId="786779428">
-    <w:abstractNumId w:val="9"/>
+    <w:abstractNumId w:val="11"/>
   </w:num>
   <w:num w:numId="20" w16cid:durableId="362285662">
-    <w:abstractNumId w:val="20"/>
+    <w:abstractNumId w:val="22"/>
   </w:num>
   <w:num w:numId="21" w16cid:durableId="1898348118">
+    <w:abstractNumId w:val="10"/>
+  </w:num>
+  <w:num w:numId="22" w16cid:durableId="1029994596">
     <w:abstractNumId w:val="8"/>
+  </w:num>
+  <w:num w:numId="23" w16cid:durableId="2044790397">
+    <w:abstractNumId w:val="6"/>
   </w:num>
 </w:numbering>
 </file>
@@ -18719,7 +19692,7 @@
   <w:style w:type="paragraph" w:default="1" w:styleId="Normln">
     <w:name w:val="Normal"/>
     <w:qFormat/>
-    <w:rsid w:val="00314370"/>
+    <w:rsid w:val="003D74B4"/>
     <w:pPr>
       <w:jc w:val="both"/>
     </w:pPr>
@@ -19454,6 +20427,76 @@
       <w14:ligatures w14:val="none"/>
     </w:rPr>
   </w:style>
+  <w:style w:type="character" w:styleId="Odkaznakoment">
+    <w:name w:val="annotation reference"/>
+    <w:basedOn w:val="Standardnpsmoodstavce"/>
+    <w:uiPriority w:val="99"/>
+    <w:semiHidden/>
+    <w:unhideWhenUsed/>
+    <w:rsid w:val="00F81361"/>
+    <w:rPr>
+      <w:sz w:val="16"/>
+      <w:szCs w:val="16"/>
+    </w:rPr>
+  </w:style>
+  <w:style w:type="paragraph" w:styleId="Textkomente">
+    <w:name w:val="annotation text"/>
+    <w:basedOn w:val="Normln"/>
+    <w:link w:val="TextkomenteChar"/>
+    <w:uiPriority w:val="99"/>
+    <w:semiHidden/>
+    <w:unhideWhenUsed/>
+    <w:rsid w:val="00F81361"/>
+    <w:pPr>
+      <w:spacing w:line="240" w:lineRule="auto"/>
+    </w:pPr>
+    <w:rPr>
+      <w:sz w:val="20"/>
+      <w:szCs w:val="20"/>
+    </w:rPr>
+  </w:style>
+  <w:style w:type="character" w:customStyle="1" w:styleId="TextkomenteChar">
+    <w:name w:val="Text komentáře Char"/>
+    <w:basedOn w:val="Standardnpsmoodstavce"/>
+    <w:link w:val="Textkomente"/>
+    <w:uiPriority w:val="99"/>
+    <w:semiHidden/>
+    <w:rsid w:val="00F81361"/>
+    <w:rPr>
+      <w:rFonts w:ascii="Special Elite" w:hAnsi="Special Elite"/>
+      <w:sz w:val="20"/>
+      <w:szCs w:val="20"/>
+    </w:rPr>
+  </w:style>
+  <w:style w:type="paragraph" w:styleId="Pedmtkomente">
+    <w:name w:val="annotation subject"/>
+    <w:basedOn w:val="Textkomente"/>
+    <w:next w:val="Textkomente"/>
+    <w:link w:val="PedmtkomenteChar"/>
+    <w:uiPriority w:val="99"/>
+    <w:semiHidden/>
+    <w:unhideWhenUsed/>
+    <w:rsid w:val="00F81361"/>
+    <w:rPr>
+      <w:b/>
+      <w:bCs/>
+    </w:rPr>
+  </w:style>
+  <w:style w:type="character" w:customStyle="1" w:styleId="PedmtkomenteChar">
+    <w:name w:val="Předmět komentáře Char"/>
+    <w:basedOn w:val="TextkomenteChar"/>
+    <w:link w:val="Pedmtkomente"/>
+    <w:uiPriority w:val="99"/>
+    <w:semiHidden/>
+    <w:rsid w:val="00F81361"/>
+    <w:rPr>
+      <w:rFonts w:ascii="Special Elite" w:hAnsi="Special Elite"/>
+      <w:b/>
+      <w:bCs/>
+      <w:sz w:val="20"/>
+      <w:szCs w:val="20"/>
+    </w:rPr>
+  </w:style>
 </w:styles>
 </file>
 

</xml_diff>